<commit_message>
Reforçar o elo aptidão aeróbia–T-CAR na caracterização do handebol
Torna explícito, na seção 1.3, o mecanismo pelo qual a aptidão aeróbia
sustenta a capacidade de repetir e manter esforços de alta intensidade
(recuperação entre ações, retardo da fadiga) em esportes intermitentes, e
conecta esse padrão ao T-CAR — teste progressivo intermitente cujo pico de
velocidade mede essa capacidade. Reforça o mesmo elo na seção 2.2
(Instrumentos) e no parágrafo do T-CAR na Discussão.

Co-Authored-By: Claude Opus 4.8 <noreply@anthropic.com>
Claude-Session: https://claude.ai/code/session_01P7yGiDeoGDyjWvPWQVsUrj
</commit_message>
<xml_diff>
--- a/Artigos/Artigo_humor_HANDEBOL.docx
+++ b/Artigos/Artigo_humor_HANDEBOL.docx
@@ -204,7 +204,7 @@
           <w:b w:val="0"/>
           <w:sz w:val="24"/>
         </w:rPr>
-        <w:t>O handebol de quadra é uma modalidade coletiva de invasão, de caráter marcadamente intermitente e de alta intensidade. Ao longo da partida, ações máximas e explosivas — sprints curtos, saltos, arremessos, bloqueios, mudanças de direção e contatos físicos — alternam-se, de forma imprevisível, com períodos de recuperação incompleta, exigindo simultaneamente potência anaeróbia, capacidade aeróbia intermitente e elevada tolerância à fadiga (KARCHER; BUCHHEIT, 2014; MICHALSIK; AAGAARD, 2015; WAGNER et al., 2014). Esse padrão de esforço eleva a carga interna nos microciclos de acúmulo e repercute no estado afetivo, sobretudo na última semana de pré-temporada, quando a carga que antecede a competição se concentra. A tolerância a essa carga depende da aptidão aeróbia intermitente, cujo marcador de campo — o pico de velocidade do Teste de Carminatti (T-CAR) — associa-se ao desempenho físico em modalidades intermitentes (FERNANDES-DA-SILVA et al., 2016).</w:t>
+        <w:t>O handebol de quadra é uma modalidade coletiva de invasão, de caráter marcadamente intermitente e de alta intensidade. Ao longo da partida, ações máximas e explosivas — sprints curtos, saltos, arremessos, bloqueios, mudanças de direção e contatos físicos — alternam-se, de forma imprevisível, com períodos de recuperação incompleta, exigindo simultaneamente potência anaeróbia, capacidade aeróbia intermitente e elevada tolerância à fadiga (KARCHER; BUCHHEIT, 2014; MICHALSIK; AAGAARD, 2015; WAGNER et al., 2014). É justamente a aptidão aeróbia que sustenta a capacidade de repetir e manter esforços de alta intensidade ao longo de uma partida: uma maior potência aeróbia acelera a ressíntese de fosfocreatina e a remoção de metabólitos nas pausas incompletas, atenua a queda de desempenho entre ações sucessivas e retarda a instalação da fadiga, preservando a qualidade das ações decisivas nos minutos finais (KARCHER; BUCHHEIT, 2014; MICHALSIK; AAGAARD, 2015). Por atuar sobre a recuperação entre esforços, e não apenas sobre a intensidade máxima isolada, a aptidão aeróbia intermitente é determinante da capacidade de sustentar altas intensidades no jogo intermitente. Avaliá-la, contudo, exige um teste que reproduza esse mesmo padrão de esforço e pausa: é o que faz o Teste de Carminatti (T-CAR), teste de campo progressivo e intermitente cujo pico de velocidade (PV) reflete a capacidade aeróbia intermitente e se associa ao desempenho físico e à aptidão em modalidades dessa natureza (FERNANDES-DA-SILVA et al., 2016). Esse padrão de esforço eleva a carga interna nos microciclos de acúmulo e repercute no estado afetivo, sobretudo na última semana de pré-temporada, quando a carga que antecede a competição se concentra. Como a tolerância a essa carga depende da aptidão aeróbia intermitente, é plausível que o PV do T-CAR module a magnitude da resposta de humor ao acúmulo de treino — hipótese que este estudo examina.</w:t>
       </w:r>
     </w:p>
     <w:p>
@@ -294,7 +294,7 @@
           <w:b w:val="0"/>
           <w:sz w:val="24"/>
         </w:rPr>
-        <w:t>O humor foi avaliado pela BRUMS-24, com 24 itens em escala de 0 (“nada”) a 4 (“extremamente”), agrupados em seis subescalas de 0 a 16 pontos (tensão, depressão, raiva, vigor, fadiga e confusão); a Perturbação Total do Humor (PTH) resume o perfil (soma das negativas menos o vigor). Para a classificação de perfis e a análise multivariada, os escores foram convertidos em escores T (M = 50; DP = 10). A aptidão aeróbia intermitente foi avaliada pelo Teste de Carminatti (T-CAR), teste de campo progressivo e intermitente (repetições de 12 s de corrida em vaivém intercaladas por 6 s de recuperação, até a exaustão), tendo o pico de velocidade (PV) como desfecho (FERNANDES-DA-SILVA et al., 2016). O T-CAR foi aplicado em 15 de abril de 2024, quatro dias de treino antes do início do microciclo, de modo a servir como parâmetro fisiológico de linha de base das análises.</w:t>
+        <w:t>O humor foi avaliado pela BRUMS-24, com 24 itens em escala de 0 (“nada”) a 4 (“extremamente”), agrupados em seis subescalas de 0 a 16 pontos (tensão, depressão, raiva, vigor, fadiga e confusão); a Perturbação Total do Humor (PTH) resume o perfil (soma das negativas menos o vigor). Para a classificação de perfis e a análise multivariada, os escores foram convertidos em escores T (M = 50; DP = 10). A aptidão aeróbia intermitente foi avaliada pelo Teste de Carminatti (T-CAR), teste de campo progressivo e intermitente (repetições de 12 s de corrida em vaivém intercaladas por 6 s de recuperação, até a exaustão), tendo o pico de velocidade (PV) como desfecho (FERNANDES-DA-SILVA et al., 2016). A estrutura de esforço e pausa do T-CAR reproduz o padrão intermitente das ações do handebol, de modo que o PV expressa a capacidade aeróbia de sustentar e repetir esforços de alta intensidade — e não apenas a intensidade máxima isolada —, o que o qualifica como marcador fisiológico específico para esta amostra. O T-CAR foi aplicado em 15 de abril de 2024, quatro dias de treino antes do início do microciclo, de modo a servir como parâmetro fisiológico de linha de base das análises.</w:t>
       </w:r>
     </w:p>
     <w:p>
@@ -14382,7 +14382,7 @@
           <w:b w:val="0"/>
           <w:sz w:val="24"/>
         </w:rPr>
-        <w:t>A inclusão do pico de velocidade do T-CAR como parâmetro fisiológico acrescentou uma leitura interindividual à resposta afetiva. Atletas com maior aptidão aeróbia intermitente reportaram mais vigor (ρ = +0,48; p = 0,015) e menos fadiga física (ρ = -0,54; p = 0,005) ao longo da semana, e um limiar de pico de velocidade de aproximadamente 14,9 km/h discriminou os dias de maior fadiga (área sob a curva = 0,69). Esse resultado é coerente com o papel da capacidade intermitente na tolerância ao esforço repetido do handebol e com a validade do pico de velocidade do T-CAR como marcador de desempenho físico em modalidades intermitentes (FERNANDES-DA-SILVA et al., 2016). Do ponto de vista aplicado, normalizar a resposta de humor pela aptidão física ajuda a distinguir a fadiga esperada — de atletas menos aptos sob a mesma carga — daquela que possa sinalizar sobrecarga, e o limiar identificado oferece à comissão técnica uma referência objetiva para individualizar a prescrição da carga e o reforço da recuperação.</w:t>
+        <w:t>A inclusão do pico de velocidade do T-CAR como parâmetro fisiológico acrescentou uma leitura interindividual à resposta afetiva. Atletas com maior aptidão aeróbia intermitente reportaram mais vigor (ρ = +0,48; p = 0,015) e menos fadiga física (ρ = -0,54; p = 0,005) ao longo da semana, e um limiar de pico de velocidade de aproximadamente 14,9 km/h discriminou os dias de maior fadiga (área sob a curva = 0,69). Esse resultado é coerente com o papel da capacidade aeróbia intermitente em sustentar e repetir esforços de alta intensidade — acelerando a recuperação entre ações e retardando a fadiga — e, portanto, em modular a tolerância à carga do handebol, e com a validade do pico de velocidade do T-CAR como marcador de desempenho físico em modalidades intermitentes (FERNANDES-DA-SILVA et al., 2016). Do ponto de vista aplicado, normalizar a resposta de humor pela aptidão física ajuda a distinguir a fadiga esperada — de atletas menos aptos sob a mesma carga — daquela que possa sinalizar sobrecarga, e o limiar identificado oferece à comissão técnica uma referência objetiva para individualizar a prescrição da carga e o reforço da recuperação.</w:t>
       </w:r>
     </w:p>
     <w:p>

</xml_diff>

<commit_message>
Nomear os seis perfis de humor no resumo
Revisa a seção Resultados e a Conclusão do resumo para explicitar os seis
perfis de humor de Terry e Parsons-Smith (iceberg, iceberg invertido,
submerso, superfície, Everest invertido e barbatana de tubarão) e a migração
predominante do iceberg (Dia 1) para a barbatana de tubarão (Dia 7).

Co-Authored-By: Claude Opus 4.8 <noreply@anthropic.com>
Claude-Session: https://claude.ai/code/session_01P7yGiDeoGDyjWvPWQVsUrj
</commit_message>
<xml_diff>
--- a/Artigos/Artigo_humor_HANDEBOL.docx
+++ b/Artigos/Artigo_humor_HANDEBOL.docx
@@ -73,7 +73,7 @@
           <w:b w:val="0"/>
           <w:sz w:val="24"/>
         </w:rPr>
-        <w:t xml:space="preserve">a deterioração concentrou-se no eixo energia–fadiga — o vigor caiu (d = -0,95) e a fadiga subiu (d = +0,72), confirmado por MANOVA (Wilks λ = 0,283; p = 0,002). O vigor foi máximo no Dia 1 e a fadiga no Dia 7; o perfil iceberg caiu e o de fadiga subiu (χ² = 14,58; p = 0,012). Maior aptidão associou-se a menos fadiga (ρ = -0,54), com limiar de 14,9 km/h. </w:t>
+        <w:t xml:space="preserve">a deterioração concentrou-se no eixo energia–fadiga — o vigor caiu (d = -0,95) e a fadiga subiu (d = +0,72), confirmado por MANOVA (Wilks λ = 0,283; p = 0,002). O vigor foi máximo no Dia 1 e a fadiga no Dia 7. Os seis perfis de humor descritos por Terry e Parsons-Smith (iceberg, iceberg invertido, submerso, superfície, Everest invertido e barbatana de tubarão) estiveram representados, e o perfil predominante migrou do iceberg (40% no Dia 1) para a barbatana de tubarão (28% no Dia 7; χ² = 14,58; p = 0,012), sem instalação dos perfis de maior risco à saúde mental (Everest invertido, submerso e iceberg invertido). Maior aptidão associou-se a menos fadiga (ρ = -0,54), com limiar de 14,9 km/h. </w:t>
       </w:r>
       <w:r>
         <w:rPr>
@@ -87,7 +87,7 @@
           <w:b w:val="0"/>
           <w:sz w:val="24"/>
         </w:rPr>
-        <w:t>o humor migrou da prontidão para a fadiga funcional; o vigor e a fadiga foram as dimensões mais sensíveis, e a aptidão intermitente ajudou a explicar a resposta, fundamentando o monitoramento individualizado.</w:t>
+        <w:t>o humor migrou da prontidão (perfil iceberg) para a fadiga funcional (perfil barbatana de tubarão); o vigor e a fadiga foram as dimensões mais sensíveis, e a aptidão intermitente ajudou a explicar a resposta, fundamentando o monitoramento individualizado.</w:t>
       </w:r>
     </w:p>
     <w:p>

</xml_diff>

<commit_message>
Situar o microciclo na fase de acumulação (contexto sazonal) na Discussão
Acrescenta um parágrafo à Discussão enquadrando a última semana de
pré-temporada como fase de acumulação que antecede o afinamento: a queda de
vigor e a elevação de fadiga são a assinatura afetiva esperada do acúmulo e,
pelo modelo estresse-recuperação (Kellmann et al., 2018), tendem a se
reverter com a redução de carga — reforçando a leitura de fadiga funcional e
transitória. Referência já presente na lista; sem importar dados não
publicados. Verificação cruzada confirmou que os números do microciclo
reproduzem os do banco-fonte.

Co-Authored-By: Claude Opus 4.8 <noreply@anthropic.com>
Claude-Session: https://claude.ai/code/session_01P7yGiDeoGDyjWvPWQVsUrj
</commit_message>
<xml_diff>
--- a/Artigos/Artigo_humor_HANDEBOL.docx
+++ b/Artigos/Artigo_humor_HANDEBOL.docx
@@ -14443,6 +14443,20 @@
           <w:sz w:val="24"/>
         </w:rPr>
         <w:t>No plano dos perfis de humor, o deslocamento de prevalência do iceberg (prontidão) para a barbatana de tubarão (fadiga funcional) ao longo da semana — uma tendência descritiva, já que a diferença categórica não atingiu significância — reproduz, em um microciclo de handebol, o “derretimento do iceberg” descrito na literatura de sobrecarga (MORGAN, 1985; HAN; PARSONS-SMITH; TERRY, 2020). É relevante que, mesmo sob o acúmulo de carga da pré-temporada, os perfis associados a maior risco à saúde mental (Everest invertido, submerso e iceberg invertido) não se tornaram prevalentes: a deterioração restringiu-se ao perfil de fadiga, cuja prevalência no último dia (22%) superou nitidamente o patamar de referência de atletas do mesmo contexto brasileiro (11,6% em avaliação momentânea; DE MIRANDA ROHLFS et al., 2024). Esse contraste sugere que, em handebolistas de elite bem condicionados, a resposta ao acúmulo de carga é funcional e transitória — uma fadiga esperada — e não um sinal de risco psicológico. Tal leitura respalda o emprego do perfilamento do humor como triagem de prontidão e de bem-estar em modalidades coletivas de rendimento (TERRY et al., 2021), no qual a BRUMS já demonstrou sensibilidade a fatores como sono, desempenho e resultados de partida (ANDRADE et al., 2016; BRANDT; BEVILACQUA; ANDRADE, 2017; DO NASCIMENTO et al., 2026) e associação com desfechos como a lesão (DE MIRANDA ROHLFS et al., 2025).</w:t>
+      </w:r>
+    </w:p>
+    <w:p>
+      <w:pPr>
+        <w:spacing w:line="360" w:lineRule="auto" w:after="120"/>
+        <w:ind w:firstLine="709"/>
+        <w:jc w:val="both"/>
+      </w:pPr>
+      <w:r>
+        <w:rPr>
+          <w:b w:val="0"/>
+          <w:sz w:val="24"/>
+        </w:rPr>
+        <w:t>O caráter transitório dessa resposta deve ser lido à luz da posição do microciclo no planejamento. A última semana de pré-temporada corresponde a uma fase de acumulação de carga, que antecede o afinamento (tapering) e a competição. Nesse enquadramento, a queda de vigor e a elevação de fadiga aqui documentadas configuram a assinatura afetiva esperada do acúmulo, e não um estado estável: o modelo de equilíbrio entre estresse e recuperação prevê que, com a redução da carga e o reforço da recuperação nos dias subsequentes, o vigor tende a ser restaurado e o perfil de prontidão (iceberg) a se reinstalar (KELLMANN et al., 2018). Interpretar a fadiga do fim do microciclo como um vale programado — e não como deterioração — é justamente o que habilita a comissão técnica a distinguir a resposta funcional daquela que exigiria intervenção, e reforça o valor de manter o monitoramento do humor na transição para o afinamento, quando a recuperação do estado afetivo é esperada e verificável.</w:t>
       </w:r>
     </w:p>
     <w:p>

</xml_diff>

<commit_message>
Incluir sonolência (Epworth) e estresse percebido (PSS-14) no artigo
Padroniza e integra os dois questionários coletados no mesmo diário do
microciclo (Epworth de 6 itens, 0–18; PSS-14, 0–56 com reversos), pontuados
de forma anonimizada (A01–A27) e validados contra os dados existentes.

Acrescenta: instrumento (2.2), objetivo (x), subseção de resultados 3.11 com
tabela descritiva, figura de trajetória e correlações, nota na Discussão e
ressalva nas limitações. Achados: a sonolência sobe ao longo da semana
(Friedman p=0,027) e correlaciona-se com fadiga (rho=0,52) e pior humor
(rho=0,54); o estresse mantém-se estável (p=0,677) e sem relação com o humor
— indicando que a resposta afetiva foi específica da carga de treino.

Co-Authored-By: Claude Opus 4.8 <noreply@anthropic.com>
Claude-Session: https://claude.ai/code/session_01P7yGiDeoGDyjWvPWQVsUrj
</commit_message>
<xml_diff>
--- a/Artigos/Artigo_humor_HANDEBOL.docx
+++ b/Artigos/Artigo_humor_HANDEBOL.docx
@@ -73,7 +73,7 @@
           <w:b w:val="0"/>
           <w:sz w:val="24"/>
         </w:rPr>
-        <w:t xml:space="preserve">a deterioração concentrou-se no eixo energia–fadiga — o vigor caiu (d = -1,33) e a fadiga subiu (d = +0,78), confirmado por MANOVA (Wilks λ = 0,181; p &lt; 0,001). O vigor foi máximo no Dia 1 e a fadiga no Dia 7. Os seis perfis de humor descritos por Terry e Parsons-Smith (iceberg, iceberg invertido, submerso, superfície, Everest invertido e barbatana de tubarão) estiveram representados, e a prevalência deslocou-se do perfil iceberg (48% no baseline) para a barbatana de tubarão (22% no Dia 7), sem instalação dos perfis de maior risco à saúde mental (Everest invertido, submerso e iceberg invertido), embora a diferença categórica não tenha alcançado significância (χ² = 8,96; p = 0,111). Maior aptidão associou-se a menos fadiga (ρ = -0,51), com limiar de 14,9 km/h. </w:t>
+        <w:t xml:space="preserve">a deterioração concentrou-se no eixo energia–fadiga — o vigor caiu (d = -1,33) e a fadiga subiu (d = +0,78), confirmado por MANOVA (Wilks λ = 0,181; p &lt; 0,001). O vigor foi máximo no Dia 1 e a fadiga no Dia 7. Os seis perfis de humor descritos por Terry e Parsons-Smith (iceberg, iceberg invertido, submerso, superfície, Everest invertido e barbatana de tubarão) estiveram representados, e a prevalência deslocou-se do perfil iceberg (48% no baseline) para a barbatana de tubarão (22% no Dia 7), sem instalação dos perfis de maior risco à saúde mental (Everest invertido, submerso e iceberg invertido), embora a diferença categórica não tenha alcançado significância (χ² = 8,96; p = 0,111). Maior aptidão associou-se a menos fadiga (ρ = -0,51), com limiar de 14,9 km/h. A sonolência (Epworth) elevou-se ao longo da semana e associou-se a mais fadiga e pior humor, enquanto o estresse percebido (PSS-14) manteve-se estável, indicando que a resposta afetiva foi específica da carga de treino. </w:t>
       </w:r>
       <w:r>
         <w:rPr>
@@ -230,7 +230,7 @@
           <w:b w:val="0"/>
           <w:sz w:val="24"/>
         </w:rPr>
-        <w:t>Diante da ampla adoção da BRUMS, mas da escassez de descrições detalhadas do comportamento do humor em um microciclo pré-competitivo de handebol de elite, o objetivo geral foi caracterizar e analisar o perfil de humor desses atletas ao longo da última semana de pré-temporada, descrevendo o comportamento de cada dimensão do BRUMS, comparando todos os dias entre si, identificando os dias de maior e menor expressão de cada estado de humor e relacionando a resposta à aptidão aeróbia intermitente. Especificamente, buscou-se: (i) caracterizar a amostra; (ii) verificar a normalidade; (iii) descrever a resposta aguda pré → pós com tamanho de efeito; (iv) comparar as dimensões entre todos os dias; (v) confirmar as diferenças por análise multivariada (escores T); (vi) descrever o comportamento individual de cada variável e suas relações; (vii) identificar os dias de maior fadiga, vigor, tensão, raiva e depressão; (viii) classificar a evolução dos perfis de humor; e (ix) analisar o T-CAR e o limiar de pico de velocidade. Hipotetizou-se que a deterioração se concentraria no eixo energia–fadiga, com migração do perfil iceberg para o de fadiga, e que a aptidão intermitente modularia a resposta.</w:t>
+        <w:t>Diante da ampla adoção da BRUMS, mas da escassez de descrições detalhadas do comportamento do humor em um microciclo pré-competitivo de handebol de elite, o objetivo geral foi caracterizar e analisar o perfil de humor desses atletas ao longo da última semana de pré-temporada, descrevendo o comportamento de cada dimensão do BRUMS, comparando todos os dias entre si, identificando os dias de maior e menor expressão de cada estado de humor e relacionando a resposta à aptidão aeróbia intermitente. Especificamente, buscou-se: (i) caracterizar a amostra; (ii) verificar a normalidade; (iii) descrever a resposta aguda pré → pós com tamanho de efeito; (iv) comparar as dimensões entre todos os dias; (v) confirmar as diferenças por análise multivariada (escores T); (vi) descrever o comportamento individual de cada variável e suas relações; (vii) identificar os dias de maior fadiga, vigor, tensão, raiva e depressão; (viii) classificar a evolução dos perfis de humor; (ix) analisar o T-CAR e o limiar de pico de velocidade; e (x) caracterizar a sonolência e o estresse percebido e sua relação com o humor. Hipotetizou-se que a deterioração se concentraria no eixo energia–fadiga, com migração do perfil iceberg para o de fadiga, e que a aptidão intermitente modularia a resposta.</w:t>
       </w:r>
     </w:p>
     <w:p>
@@ -294,7 +294,7 @@
           <w:b w:val="0"/>
           <w:sz w:val="24"/>
         </w:rPr>
-        <w:t>O humor foi avaliado pela BRUMS-24, com 24 itens em escala de 0 (“nada”) a 4 (“extremamente”), agrupados em seis subescalas de 0 a 16 pontos (tensão, depressão, raiva, vigor, fadiga e confusão); a Perturbação Total do Humor (PTH) resume o perfil (soma das negativas menos o vigor). Para a classificação de perfis e a análise multivariada, os escores foram convertidos em escores T (M = 50; DP = 10). A aptidão aeróbia intermitente foi avaliada pelo Teste de Carminatti (T-CAR), teste de campo progressivo e intermitente (repetições de 12 s de corrida em vaivém intercaladas por 6 s de recuperação, até a exaustão), tendo o pico de velocidade (PV) como desfecho (FERNANDES-DA-SILVA et al., 2016). A estrutura de esforço e pausa do T-CAR reproduz o padrão intermitente das ações do handebol, de modo que o PV expressa a capacidade aeróbia de sustentar e repetir esforços de alta intensidade — e não apenas a intensidade máxima isolada —, o que o qualifica como marcador fisiológico específico para esta amostra. O T-CAR foi aplicado em 15 de abril de 2024, quatro dias de treino antes do início do microciclo, de modo a servir como parâmetro fisiológico de linha de base das análises.</w:t>
+        <w:t>O humor foi avaliado pela BRUMS-24, com 24 itens em escala de 0 (“nada”) a 4 (“extremamente”), agrupados em seis subescalas de 0 a 16 pontos (tensão, depressão, raiva, vigor, fadiga e confusão); a Perturbação Total do Humor (PTH) resume o perfil (soma das negativas menos o vigor). Para a classificação de perfis e a análise multivariada, os escores foram convertidos em escores T (M = 50; DP = 10). A aptidão aeróbia intermitente foi avaliada pelo Teste de Carminatti (T-CAR), teste de campo progressivo e intermitente (repetições de 12 s de corrida em vaivém intercaladas por 6 s de recuperação, até a exaustão), tendo o pico de velocidade (PV) como desfecho (FERNANDES-DA-SILVA et al., 2016). A estrutura de esforço e pausa do T-CAR reproduz o padrão intermitente das ações do handebol, de modo que o PV expressa a capacidade aeróbia de sustentar e repetir esforços de alta intensidade — e não apenas a intensidade máxima isolada —, o que o qualifica como marcador fisiológico específico para esta amostra. O T-CAR foi aplicado em 15 de abril de 2024, quatro dias de treino antes do início do microciclo, de modo a servir como parâmetro fisiológico de linha de base das análises. No mesmo diário eletrônico, registraram-se ainda a sonolência, pela Escala de Sonolência de Epworth em versão de 6 itens (probabilidade de cochilar em seis situações; 0–18), e o estresse percebido, pela Escala de Estresse Percebido de 14 itens (PSS-14; 0–56, com sete itens de pontuação invertida), tomados como marcadores de recuperação e de carga psicossocial.</w:t>
       </w:r>
     </w:p>
     <w:p>
@@ -14365,6 +14365,514 @@
     </w:p>
     <w:p>
       <w:pPr>
+        <w:spacing w:before="120" w:after="80" w:line="360" w:lineRule="auto"/>
+      </w:pPr>
+      <w:r>
+        <w:rPr>
+          <w:b/>
+          <w:sz w:val="24"/>
+        </w:rPr>
+        <w:t>3.11 Sonolência (Epworth) e estresse percebido (PSS-14)</w:t>
+      </w:r>
+    </w:p>
+    <w:p>
+      <w:pPr>
+        <w:spacing w:before="160" w:after="40"/>
+      </w:pPr>
+      <w:r>
+        <w:rPr>
+          <w:sz w:val="22"/>
+        </w:rPr>
+        <w:t>Tabela 14 – Sonolência (Epworth, 6 itens, 0–18) e estresse percebido (PSS-14, 0–56) no microciclo: descritivos por observação e por atleta, e variação entre os dias.</w:t>
+      </w:r>
+    </w:p>
+    <w:tbl>
+      <w:tblPr>
+        <w:tblW w:type="auto" w:w="0"/>
+        <w:jc w:val="center"/>
+        <w:tblLook w:firstColumn="1" w:firstRow="1" w:lastColumn="0" w:lastRow="0" w:noHBand="0" w:noVBand="1" w:val="04A0"/>
+      </w:tblPr>
+      <w:tblGrid>
+        <w:gridCol w:w="1881"/>
+        <w:gridCol w:w="1881"/>
+        <w:gridCol w:w="1881"/>
+        <w:gridCol w:w="1881"/>
+        <w:gridCol w:w="1881"/>
+      </w:tblGrid>
+      <w:tr>
+        <w:tc>
+          <w:tcPr>
+            <w:tcW w:type="dxa" w:w="1881"/>
+            <w:tcBorders>
+              <w:top w:val="single" w:sz="6" w:color="000000"/>
+              <w:bottom w:val="single" w:sz="6" w:color="000000"/>
+              <w:left w:val="nil" w:sz="6" w:color="000000"/>
+              <w:right w:val="nil" w:sz="6" w:color="000000"/>
+            </w:tcBorders>
+          </w:tcPr>
+          <w:p>
+            <w:pPr>
+              <w:jc w:val="center"/>
+            </w:pPr>
+            <w:r/>
+            <w:r>
+              <w:rPr>
+                <w:rFonts w:ascii="Times New Roman" w:hAnsi="Times New Roman"/>
+                <w:b/>
+                <w:sz w:val="18"/>
+              </w:rPr>
+              <w:t>Variável</w:t>
+            </w:r>
+          </w:p>
+        </w:tc>
+        <w:tc>
+          <w:tcPr>
+            <w:tcW w:type="dxa" w:w="1881"/>
+            <w:tcBorders>
+              <w:top w:val="single" w:sz="6" w:color="000000"/>
+              <w:bottom w:val="single" w:sz="6" w:color="000000"/>
+              <w:left w:val="nil" w:sz="6" w:color="000000"/>
+              <w:right w:val="nil" w:sz="6" w:color="000000"/>
+            </w:tcBorders>
+          </w:tcPr>
+          <w:p>
+            <w:pPr>
+              <w:jc w:val="center"/>
+            </w:pPr>
+            <w:r/>
+            <w:r>
+              <w:rPr>
+                <w:rFonts w:ascii="Times New Roman" w:hAnsi="Times New Roman"/>
+                <w:b/>
+                <w:sz w:val="18"/>
+              </w:rPr>
+              <w:t>M ± DP (obs.)</w:t>
+            </w:r>
+          </w:p>
+        </w:tc>
+        <w:tc>
+          <w:tcPr>
+            <w:tcW w:type="dxa" w:w="1881"/>
+            <w:tcBorders>
+              <w:top w:val="single" w:sz="6" w:color="000000"/>
+              <w:bottom w:val="single" w:sz="6" w:color="000000"/>
+              <w:left w:val="nil" w:sz="6" w:color="000000"/>
+              <w:right w:val="nil" w:sz="6" w:color="000000"/>
+            </w:tcBorders>
+          </w:tcPr>
+          <w:p>
+            <w:pPr>
+              <w:jc w:val="center"/>
+            </w:pPr>
+            <w:r/>
+            <w:r>
+              <w:rPr>
+                <w:rFonts w:ascii="Times New Roman" w:hAnsi="Times New Roman"/>
+                <w:b/>
+                <w:sz w:val="18"/>
+              </w:rPr>
+              <w:t>Mediana (mín–máx)</w:t>
+            </w:r>
+          </w:p>
+        </w:tc>
+        <w:tc>
+          <w:tcPr>
+            <w:tcW w:type="dxa" w:w="1881"/>
+            <w:tcBorders>
+              <w:top w:val="single" w:sz="6" w:color="000000"/>
+              <w:bottom w:val="single" w:sz="6" w:color="000000"/>
+              <w:left w:val="nil" w:sz="6" w:color="000000"/>
+              <w:right w:val="nil" w:sz="6" w:color="000000"/>
+            </w:tcBorders>
+          </w:tcPr>
+          <w:p>
+            <w:pPr>
+              <w:jc w:val="center"/>
+            </w:pPr>
+            <w:r/>
+            <w:r>
+              <w:rPr>
+                <w:rFonts w:ascii="Times New Roman" w:hAnsi="Times New Roman"/>
+                <w:b/>
+                <w:sz w:val="18"/>
+              </w:rPr>
+              <w:t>M ± DP (atleta)</w:t>
+            </w:r>
+          </w:p>
+        </w:tc>
+        <w:tc>
+          <w:tcPr>
+            <w:tcW w:type="dxa" w:w="1881"/>
+            <w:tcBorders>
+              <w:top w:val="single" w:sz="6" w:color="000000"/>
+              <w:bottom w:val="single" w:sz="6" w:color="000000"/>
+              <w:left w:val="nil" w:sz="6" w:color="000000"/>
+              <w:right w:val="nil" w:sz="6" w:color="000000"/>
+            </w:tcBorders>
+          </w:tcPr>
+          <w:p>
+            <w:pPr>
+              <w:jc w:val="center"/>
+            </w:pPr>
+            <w:r/>
+            <w:r>
+              <w:rPr>
+                <w:rFonts w:ascii="Times New Roman" w:hAnsi="Times New Roman"/>
+                <w:b/>
+                <w:sz w:val="18"/>
+              </w:rPr>
+              <w:t>Friedman p</w:t>
+            </w:r>
+          </w:p>
+        </w:tc>
+      </w:tr>
+      <w:tr>
+        <w:tc>
+          <w:tcPr>
+            <w:tcW w:type="dxa" w:w="1881"/>
+            <w:tcBorders>
+              <w:top w:val="single" w:sz="6" w:color="000000"/>
+              <w:bottom w:val="single" w:sz="6" w:color="000000"/>
+              <w:left w:val="nil" w:sz="6" w:color="000000"/>
+              <w:right w:val="nil" w:sz="6" w:color="000000"/>
+            </w:tcBorders>
+          </w:tcPr>
+          <w:p>
+            <w:pPr>
+              <w:jc w:val="left"/>
+            </w:pPr>
+            <w:r/>
+            <w:r>
+              <w:rPr>
+                <w:rFonts w:ascii="Times New Roman" w:hAnsi="Times New Roman"/>
+                <w:sz w:val="18"/>
+              </w:rPr>
+              <w:t>Sonolência (Epworth)</w:t>
+            </w:r>
+          </w:p>
+        </w:tc>
+        <w:tc>
+          <w:tcPr>
+            <w:tcW w:type="dxa" w:w="1881"/>
+            <w:tcBorders>
+              <w:top w:val="single" w:sz="6" w:color="000000"/>
+              <w:bottom w:val="single" w:sz="6" w:color="000000"/>
+              <w:left w:val="nil" w:sz="6" w:color="000000"/>
+              <w:right w:val="nil" w:sz="6" w:color="000000"/>
+            </w:tcBorders>
+          </w:tcPr>
+          <w:p>
+            <w:pPr>
+              <w:jc w:val="center"/>
+            </w:pPr>
+            <w:r/>
+            <w:r>
+              <w:rPr>
+                <w:rFonts w:ascii="Times New Roman" w:hAnsi="Times New Roman"/>
+                <w:sz w:val="18"/>
+              </w:rPr>
+              <w:t>9,9 ± 5,1</w:t>
+            </w:r>
+          </w:p>
+        </w:tc>
+        <w:tc>
+          <w:tcPr>
+            <w:tcW w:type="dxa" w:w="1881"/>
+            <w:tcBorders>
+              <w:top w:val="single" w:sz="6" w:color="000000"/>
+              <w:bottom w:val="single" w:sz="6" w:color="000000"/>
+              <w:left w:val="nil" w:sz="6" w:color="000000"/>
+              <w:right w:val="nil" w:sz="6" w:color="000000"/>
+            </w:tcBorders>
+          </w:tcPr>
+          <w:p>
+            <w:pPr>
+              <w:jc w:val="center"/>
+            </w:pPr>
+            <w:r/>
+            <w:r>
+              <w:rPr>
+                <w:rFonts w:ascii="Times New Roman" w:hAnsi="Times New Roman"/>
+                <w:sz w:val="18"/>
+              </w:rPr>
+              <w:t>10 (0–18)</w:t>
+            </w:r>
+          </w:p>
+        </w:tc>
+        <w:tc>
+          <w:tcPr>
+            <w:tcW w:type="dxa" w:w="1881"/>
+            <w:tcBorders>
+              <w:top w:val="single" w:sz="6" w:color="000000"/>
+              <w:bottom w:val="single" w:sz="6" w:color="000000"/>
+              <w:left w:val="nil" w:sz="6" w:color="000000"/>
+              <w:right w:val="nil" w:sz="6" w:color="000000"/>
+            </w:tcBorders>
+          </w:tcPr>
+          <w:p>
+            <w:pPr>
+              <w:jc w:val="center"/>
+            </w:pPr>
+            <w:r/>
+            <w:r>
+              <w:rPr>
+                <w:rFonts w:ascii="Times New Roman" w:hAnsi="Times New Roman"/>
+                <w:sz w:val="18"/>
+              </w:rPr>
+              <w:t>9,5 ± 4,4</w:t>
+            </w:r>
+          </w:p>
+        </w:tc>
+        <w:tc>
+          <w:tcPr>
+            <w:tcW w:type="dxa" w:w="1881"/>
+            <w:tcBorders>
+              <w:top w:val="single" w:sz="6" w:color="000000"/>
+              <w:bottom w:val="single" w:sz="6" w:color="000000"/>
+              <w:left w:val="nil" w:sz="6" w:color="000000"/>
+              <w:right w:val="nil" w:sz="6" w:color="000000"/>
+            </w:tcBorders>
+          </w:tcPr>
+          <w:p>
+            <w:pPr>
+              <w:jc w:val="center"/>
+            </w:pPr>
+            <w:r/>
+            <w:r>
+              <w:rPr>
+                <w:rFonts w:ascii="Times New Roman" w:hAnsi="Times New Roman"/>
+                <w:sz w:val="18"/>
+              </w:rPr>
+              <w:t>0,027</w:t>
+            </w:r>
+          </w:p>
+        </w:tc>
+      </w:tr>
+      <w:tr>
+        <w:tc>
+          <w:tcPr>
+            <w:tcW w:type="dxa" w:w="1881"/>
+            <w:tcBorders>
+              <w:top w:val="single" w:sz="6" w:color="000000"/>
+              <w:bottom w:val="single" w:sz="6" w:color="000000"/>
+              <w:left w:val="nil" w:sz="6" w:color="000000"/>
+              <w:right w:val="nil" w:sz="6" w:color="000000"/>
+            </w:tcBorders>
+          </w:tcPr>
+          <w:p>
+            <w:pPr>
+              <w:jc w:val="left"/>
+            </w:pPr>
+            <w:r/>
+            <w:r>
+              <w:rPr>
+                <w:rFonts w:ascii="Times New Roman" w:hAnsi="Times New Roman"/>
+                <w:sz w:val="18"/>
+              </w:rPr>
+              <w:t>Estresse (PSS-14)</w:t>
+            </w:r>
+          </w:p>
+        </w:tc>
+        <w:tc>
+          <w:tcPr>
+            <w:tcW w:type="dxa" w:w="1881"/>
+            <w:tcBorders>
+              <w:top w:val="single" w:sz="6" w:color="000000"/>
+              <w:bottom w:val="single" w:sz="6" w:color="000000"/>
+              <w:left w:val="nil" w:sz="6" w:color="000000"/>
+              <w:right w:val="nil" w:sz="6" w:color="000000"/>
+            </w:tcBorders>
+          </w:tcPr>
+          <w:p>
+            <w:pPr>
+              <w:jc w:val="center"/>
+            </w:pPr>
+            <w:r/>
+            <w:r>
+              <w:rPr>
+                <w:rFonts w:ascii="Times New Roman" w:hAnsi="Times New Roman"/>
+                <w:sz w:val="18"/>
+              </w:rPr>
+              <w:t>22,0 ± 4,9</w:t>
+            </w:r>
+          </w:p>
+        </w:tc>
+        <w:tc>
+          <w:tcPr>
+            <w:tcW w:type="dxa" w:w="1881"/>
+            <w:tcBorders>
+              <w:top w:val="single" w:sz="6" w:color="000000"/>
+              <w:bottom w:val="single" w:sz="6" w:color="000000"/>
+              <w:left w:val="nil" w:sz="6" w:color="000000"/>
+              <w:right w:val="nil" w:sz="6" w:color="000000"/>
+            </w:tcBorders>
+          </w:tcPr>
+          <w:p>
+            <w:pPr>
+              <w:jc w:val="center"/>
+            </w:pPr>
+            <w:r/>
+            <w:r>
+              <w:rPr>
+                <w:rFonts w:ascii="Times New Roman" w:hAnsi="Times New Roman"/>
+                <w:sz w:val="18"/>
+              </w:rPr>
+              <w:t>22 (9–40)</w:t>
+            </w:r>
+          </w:p>
+        </w:tc>
+        <w:tc>
+          <w:tcPr>
+            <w:tcW w:type="dxa" w:w="1881"/>
+            <w:tcBorders>
+              <w:top w:val="single" w:sz="6" w:color="000000"/>
+              <w:bottom w:val="single" w:sz="6" w:color="000000"/>
+              <w:left w:val="nil" w:sz="6" w:color="000000"/>
+              <w:right w:val="nil" w:sz="6" w:color="000000"/>
+            </w:tcBorders>
+          </w:tcPr>
+          <w:p>
+            <w:pPr>
+              <w:jc w:val="center"/>
+            </w:pPr>
+            <w:r/>
+            <w:r>
+              <w:rPr>
+                <w:rFonts w:ascii="Times New Roman" w:hAnsi="Times New Roman"/>
+                <w:sz w:val="18"/>
+              </w:rPr>
+              <w:t>22,0 ± 4,5</w:t>
+            </w:r>
+          </w:p>
+        </w:tc>
+        <w:tc>
+          <w:tcPr>
+            <w:tcW w:type="dxa" w:w="1881"/>
+            <w:tcBorders>
+              <w:top w:val="single" w:sz="6" w:color="000000"/>
+              <w:bottom w:val="single" w:sz="6" w:color="000000"/>
+              <w:left w:val="nil" w:sz="6" w:color="000000"/>
+              <w:right w:val="nil" w:sz="6" w:color="000000"/>
+            </w:tcBorders>
+          </w:tcPr>
+          <w:p>
+            <w:pPr>
+              <w:jc w:val="center"/>
+            </w:pPr>
+            <w:r/>
+            <w:r>
+              <w:rPr>
+                <w:rFonts w:ascii="Times New Roman" w:hAnsi="Times New Roman"/>
+                <w:sz w:val="18"/>
+              </w:rPr>
+              <w:t>0,677</w:t>
+            </w:r>
+          </w:p>
+        </w:tc>
+      </w:tr>
+    </w:tbl>
+    <w:p>
+      <w:pPr>
+        <w:spacing w:after="0"/>
+      </w:pPr>
+      <w:r>
+        <w:rPr>
+          <w:i/>
+          <w:sz w:val="17"/>
+        </w:rPr>
+        <w:t>Friedman: teste da variação entre os sete dias. Epworth em versão de 6 itens (sem ponto de corte clínico padrão).</w:t>
+      </w:r>
+    </w:p>
+    <w:p>
+      <w:pPr>
+        <w:spacing w:after="120"/>
+      </w:pPr>
+      <w:r>
+        <w:rPr>
+          <w:sz w:val="18"/>
+        </w:rPr>
+        <w:t>Fonte: dados da pesquisa (2026).</w:t>
+      </w:r>
+    </w:p>
+    <w:p>
+      <w:pPr>
+        <w:spacing w:before="120"/>
+        <w:jc w:val="center"/>
+      </w:pPr>
+      <w:r>
+        <w:drawing>
+          <wp:inline xmlns:a="http://schemas.openxmlformats.org/drawingml/2006/main" xmlns:pic="http://schemas.openxmlformats.org/drawingml/2006/picture">
+            <wp:extent cx="5400000" cy="2322000"/>
+            <wp:docPr id="14" name="Picture 14"/>
+            <wp:cNvGraphicFramePr>
+              <a:graphicFrameLocks noChangeAspect="1"/>
+            </wp:cNvGraphicFramePr>
+            <a:graphic>
+              <a:graphicData uri="http://schemas.openxmlformats.org/drawingml/2006/picture">
+                <pic:pic>
+                  <pic:nvPicPr>
+                    <pic:cNvPr id="0" name="sono_traj.png"/>
+                    <pic:cNvPicPr/>
+                  </pic:nvPicPr>
+                  <pic:blipFill>
+                    <a:blip r:embed="rId22"/>
+                    <a:stretch>
+                      <a:fillRect/>
+                    </a:stretch>
+                  </pic:blipFill>
+                  <pic:spPr>
+                    <a:xfrm>
+                      <a:off x="0" y="0"/>
+                      <a:ext cx="5400000" cy="2322000"/>
+                    </a:xfrm>
+                    <a:prstGeom prst="rect"/>
+                  </pic:spPr>
+                </pic:pic>
+              </a:graphicData>
+            </a:graphic>
+          </wp:inline>
+        </w:drawing>
+      </w:r>
+    </w:p>
+    <w:p>
+      <w:pPr>
+        <w:jc w:val="center"/>
+      </w:pPr>
+      <w:r>
+        <w:rPr>
+          <w:sz w:val="22"/>
+        </w:rPr>
+        <w:t>Figura 14 – Trajetória diária (média ± IC95%) da sonolência (Epworth) e do estresse percebido (PSS-14) ao longo do microciclo.</w:t>
+      </w:r>
+    </w:p>
+    <w:p>
+      <w:pPr>
+        <w:spacing w:after="120"/>
+        <w:jc w:val="center"/>
+      </w:pPr>
+      <w:r>
+        <w:rPr>
+          <w:sz w:val="18"/>
+        </w:rPr>
+        <w:t>Fonte: elaboração dos autores (2026).</w:t>
+      </w:r>
+    </w:p>
+    <w:p>
+      <w:pPr>
+        <w:spacing w:line="360" w:lineRule="auto" w:after="120"/>
+        <w:ind w:firstLine="709"/>
+        <w:jc w:val="both"/>
+      </w:pPr>
+      <w:r>
+        <w:rPr>
+          <w:b w:val="0"/>
+          <w:sz w:val="24"/>
+        </w:rPr>
+        <w:t>A sonolência e o estresse percebido, coletados no mesmo diário, tiveram comportamentos distintos ao longo do microciclo (Tabela 14; Figura 14). A sonolência (Epworth) elevou-se progressivamente do primeiro ao último dia (Friedman p = 0,027; W = 0,13), padrão compatível com o acúmulo de fadiga e de débito de sono ao fim da semana de carga. No plano interindividual (média semanal por atleta), atletas mais sonolentos reportaram mais fadiga (ρ = +0,52; p = 0,005) e pior humor global (PTH; ρ = +0,54; p = 0,004), o que posiciona a sonolência como um marcador de recuperação que acompanha a resposta afetiva à carga. O estresse percebido (PSS-14), ao contrário, manteve-se estável entre os dias (Friedman p = 0,677) e em patamar moderado, sem associação significativa com o vigor (ρ = -0,09; p = 0,643) ou com a fadiga (ρ = -0,15; p = 0,466); nenhuma das duas variáveis diferiu entre pré e pós-treino (Epworth p = 0,788; PSS p = 0,882), coerente com a natureza mais estável desses instrumentos. A estabilidade do estresse indica que a deterioração do humor no eixo energia–fadiga foi específica da carga de treino, e não reflexo de um aumento concomitante do estresse percebido.</w:t>
+      </w:r>
+    </w:p>
+    <w:p>
+      <w:pPr>
         <w:spacing w:before="200" w:after="80" w:line="360" w:lineRule="auto"/>
       </w:pPr>
       <w:r>
@@ -14484,7 +14992,21 @@
           <w:b w:val="0"/>
           <w:sz w:val="24"/>
         </w:rPr>
-        <w:t>Algumas limitações devem ser consideradas na interpretação dos achados. O tamanho amostral (27 atletas) e o desenho observacional de fase única não permitem inferência causal sobre a carga, e as dimensões negativas, próximas do piso, apresentam variância e fidedignidade reduzidas, o que limita a leitura de suas pequenas variações. A conversão dos escores T foi referenciada à própria amostra — e não a tabelas normativas nacionais de atletas —, o que recomenda cautela na comparação absoluta de prevalências entre estudos e na classificação estrita dos perfis. Como direções futuras, recomenda-se ampliar a amostra e acompanhar múltiplos microciclos, integrar o humor a marcadores de carga externa e interna mensurados continuamente, adotar tabelas normativas e agrupamento semeado (seeded k-means) para a classificação de perfis e testar o valor preditivo dos perfis negativos para desfechos como lesão e sobrecarga (DE MIRANDA ROHLFS et al., 2024, 2025).</w:t>
+        <w:t>A sonolência e o estresse percebido acrescentaram duas leituras convergentes com o padrão central. A sonolência (Epworth) acompanhou a semana de carga, elevando-se rumo ao último dia e associando-se, entre atletas, a mais fadiga e pior humor global — um marcador de recuperação/sono que corrobora, no plano comportamental, a deterioração do eixo energia–fadiga e reforça a recomendação de vigiar o sono na fase de acumulação (KELLMANN et al., 2018). Já o estresse percebido (PSS-14) permaneceu estável e moderado, sem se relacionar à oscilação do humor; essa ausência de variação é informativa, pois indica que a resposta afetiva ao microciclo teve origem na carga de treino, e não em um aumento concomitante do estresse psicossocial percebido — um argumento a favor da especificidade do achado.</w:t>
+      </w:r>
+    </w:p>
+    <w:p>
+      <w:pPr>
+        <w:spacing w:line="360" w:lineRule="auto" w:after="120"/>
+        <w:ind w:firstLine="709"/>
+        <w:jc w:val="both"/>
+      </w:pPr>
+      <w:r>
+        <w:rPr>
+          <w:b w:val="0"/>
+          <w:sz w:val="24"/>
+        </w:rPr>
+        <w:t>Algumas limitações devem ser consideradas na interpretação dos achados. O tamanho amostral (27 atletas) e o desenho observacional de fase única não permitem inferência causal sobre a carga, e as dimensões negativas, próximas do piso, apresentam variância e fidedignidade reduzidas, o que limita a leitura de suas pequenas variações. A conversão dos escores T foi referenciada à própria amostra — e não a tabelas normativas nacionais de atletas —, o que recomenda cautela na comparação absoluta de prevalências entre estudos e na classificação estrita dos perfis. A sonolência foi medida por uma versão de 6 itens do Epworth (sem ponto de corte clínico validado) e o estresse, pela PSS-14, cujo horizonte de referência é mais amplo que o microciclo; por isso, essas variáveis foram interpretadas por sua média semanal por atleta, e não por flutuações diárias. Como direções futuras, recomenda-se ampliar a amostra e acompanhar múltiplos microciclos, integrar o humor a marcadores de carga externa e interna mensurados continuamente, adotar tabelas normativas e agrupamento semeado (seeded k-means) para a classificação de perfis e testar o valor preditivo dos perfis negativos para desfechos como lesão e sobrecarga (DE MIRANDA ROHLFS et al., 2024, 2025).</w:t>
       </w:r>
     </w:p>
     <w:p>

</xml_diff>

<commit_message>
Incluir composição corporal e ajuste alométrico do T-CAR
Novo parâmetro fisiológico integrado ao artigo (seção 3.12): composição
corporal (massa 85,8±15,7 kg; estatura 182,5±6,5 cm; gordura 11,6±5,3%; n=25)
e ajuste alométrico do pico de velocidade. Expoente log(PV)~log(massa)=-0,19
(r=-0,48; p=0,016). Ao normalizar o PV pela massa, a associação com o vigor
resiste (rho +0,47->+0,49; p=0,012 — efeito genuíno de aptidão), enquanto a
associação com a fadiga física se atenua e perde significância (rho -0,51->
-0,36) — parte do vínculo aptidão-fadiga reflete o porte corporal.

Método (2.2/2.4), resultados (3.12 com tabela) e discussão atualizados;
compute_alom.py adicionado; script de reprodução 01 ganhou o bloco 12
(composição corporal + alométrico). PDF regenerado (25 páginas). Leak-scan
docx e PDF: 0 vazamentos.

Co-Authored-By: Claude Opus 4.8 <noreply@anthropic.com>
Claude-Session: https://claude.ai/code/session_01P7yGiDeoGDyjWvPWQVsUrj
</commit_message>
<xml_diff>
--- a/Artigos/Artigo_humor_HANDEBOL.docx
+++ b/Artigos/Artigo_humor_HANDEBOL.docx
@@ -294,7 +294,7 @@
           <w:b w:val="0"/>
           <w:sz w:val="24"/>
         </w:rPr>
-        <w:t>O humor foi avaliado pela BRUMS-24, com 24 itens em escala de 0 (“nada”) a 4 (“extremamente”), agrupados em seis subescalas de 0 a 16 pontos (tensão, depressão, raiva, vigor, fadiga e confusão); a Perturbação Total do Humor (PTH) resume o perfil (soma das negativas menos o vigor). Para a classificação de perfis e a análise multivariada, os escores foram convertidos em escores T (M = 50; DP = 10). A aptidão aeróbia intermitente foi avaliada pelo Teste de Carminatti (T-CAR), teste de campo progressivo e intermitente (repetições de 12 s de corrida em vaivém intercaladas por 6 s de recuperação, até a exaustão), tendo o pico de velocidade (PV) como desfecho (FERNANDES-DA-SILVA et al., 2016). A estrutura de esforço e pausa do T-CAR reproduz o padrão intermitente das ações do handebol, de modo que o PV expressa a capacidade aeróbia de sustentar e repetir esforços de alta intensidade — e não apenas a intensidade máxima isolada —, o que o qualifica como marcador fisiológico específico para esta amostra. O T-CAR foi aplicado em 15 de abril de 2024, quatro dias de treino antes do início do microciclo, de modo a servir como parâmetro fisiológico de linha de base das análises. No mesmo diário eletrônico, registraram-se ainda a sonolência, pela Escala de Sonolência de Epworth em versão de 6 itens (probabilidade de cochilar em seis situações; 0–18), e o estresse percebido, pela Escala de Estresse Percebido de 14 itens (PSS-14; 0–56, com sete itens de pontuação invertida), tomados como marcadores de recuperação e de carga psicossocial.</w:t>
+        <w:t>O humor foi avaliado pela BRUMS-24, com 24 itens em escala de 0 (“nada”) a 4 (“extremamente”), agrupados em seis subescalas de 0 a 16 pontos (tensão, depressão, raiva, vigor, fadiga e confusão); a Perturbação Total do Humor (PTH) resume o perfil (soma das negativas menos o vigor). Para a classificação de perfis e a análise multivariada, os escores foram convertidos em escores T (M = 50; DP = 10). A aptidão aeróbia intermitente foi avaliada pelo Teste de Carminatti (T-CAR), teste de campo progressivo e intermitente (repetições de 12 s de corrida em vaivém intercaladas por 6 s de recuperação, até a exaustão), tendo o pico de velocidade (PV) como desfecho (FERNANDES-DA-SILVA et al., 2016). A estrutura de esforço e pausa do T-CAR reproduz o padrão intermitente das ações do handebol, de modo que o PV expressa a capacidade aeróbia de sustentar e repetir esforços de alta intensidade — e não apenas a intensidade máxima isolada —, o que o qualifica como marcador fisiológico específico para esta amostra. O T-CAR foi aplicado em 15 de abril de 2024, quatro dias de treino antes do início do microciclo, de modo a servir como parâmetro fisiológico de linha de base das análises. No mesmo diário eletrônico, registraram-se ainda a sonolência, pela Escala de Sonolência de Epworth em versão de 6 itens (probabilidade de cochilar em seis situações; 0–18), e o estresse percebido, pela Escala de Estresse Percebido de 14 itens (PSS-14; 0–56, com sete itens de pontuação invertida), tomados como marcadores de recuperação e de carga psicossocial. A composição corporal foi avaliada por antropometria (massa e estatura) e por dobras cutâneas (percentual de gordura), servindo à caracterização da amostra e ao ajuste alométrico do desempenho no T-CAR.</w:t>
       </w:r>
     </w:p>
     <w:p>
@@ -374,7 +374,7 @@
           <w:b w:val="0"/>
           <w:sz w:val="24"/>
         </w:rPr>
-        <w:t>Como confirmação robusta, as comparações Dia 1 → Dia 7 e pré → pós foram reanalisadas por análise multivariada de variância (MANOVA) de medidas repetidas sobre os escores T, que testa as seis dimensões em conjunto e controla o erro de múltiplas comparações (lambda de Wilks, F e eta-quadrado parcial — η²ₚ; 0,01 pequeno; 0,06 médio; 0,14 grande); nos testes univariados de acompanhamento da MANOVA, aplicou-se o ajuste de Bonferroni ao nível de significância, dividindo 0,05 pelas seis dimensões (α = 0,008), para controlar o erro do tipo I. A associação entre as dimensões foi quantificada pela correlação de Spearman (ρ). Por fim, a relação entre o pico de velocidade do T-CAR e a fadiga foi analisada por regressão, e um limiar de pico de velocidade foi estabelecido pelo índice de Youden — que maximiza a soma de sensibilidade e especificidade —, com a qualidade de discriminação avaliada pela área sob a curva ROC. Adotou-se nível de significância de 5% (p &lt; 0,05), com as análises conduzidas em ambiente Python (bibliotecas pandas, SciPy e statsmodels).</w:t>
+        <w:t>Como confirmação robusta, as comparações Dia 1 → Dia 7 e pré → pós foram reanalisadas por análise multivariada de variância (MANOVA) de medidas repetidas sobre os escores T, que testa as seis dimensões em conjunto e controla o erro de múltiplas comparações (lambda de Wilks, F e eta-quadrado parcial — η²ₚ; 0,01 pequeno; 0,06 médio; 0,14 grande); nos testes univariados de acompanhamento da MANOVA, aplicou-se o ajuste de Bonferroni ao nível de significância, dividindo 0,05 pelas seis dimensões (α = 0,008), para controlar o erro do tipo I. A associação entre as dimensões foi quantificada pela correlação de Spearman (ρ). Por fim, a relação entre o pico de velocidade do T-CAR e a fadiga foi analisada por regressão, e um limiar de pico de velocidade foi estabelecido pelo índice de Youden — que maximiza a soma de sensibilidade e especificidade —, com a qualidade de discriminação avaliada pela área sob a curva ROC. Para separar o efeito da aptidão do efeito do tamanho corporal, o pico de velocidade foi ainda submetido a ajuste alométrico: estimou-se o expoente da relação alométrica pela regressão log(PV)–log(massa) e normalizou-se o PV pela massa elevada a esse expoente, comparando-se as associações do PV bruto e do PV normalizado com a fadiga e o vigor. Adotou-se nível de significância de 5% (p &lt; 0,05), com as análises conduzidas em ambiente Python (bibliotecas pandas, SciPy e statsmodels).</w:t>
       </w:r>
     </w:p>
     <w:p>
@@ -14873,6 +14873,377 @@
     </w:p>
     <w:p>
       <w:pPr>
+        <w:spacing w:before="120" w:after="80" w:line="360" w:lineRule="auto"/>
+      </w:pPr>
+      <w:r>
+        <w:rPr>
+          <w:b/>
+          <w:sz w:val="24"/>
+        </w:rPr>
+        <w:t>3.12 Composição corporal e ajuste alométrico do pico de velocidade</w:t>
+      </w:r>
+    </w:p>
+    <w:p>
+      <w:pPr>
+        <w:spacing w:before="160" w:after="40"/>
+      </w:pPr>
+      <w:r>
+        <w:rPr>
+          <w:sz w:val="22"/>
+        </w:rPr>
+        <w:t>Tabela 15 – Composição corporal da amostra (n = 25) e associação com a fadiga.</w:t>
+      </w:r>
+    </w:p>
+    <w:tbl>
+      <w:tblPr>
+        <w:tblW w:type="auto" w:w="0"/>
+        <w:jc w:val="center"/>
+        <w:tblLook w:firstColumn="1" w:firstRow="1" w:lastColumn="0" w:lastRow="0" w:noHBand="0" w:noVBand="1" w:val="04A0"/>
+      </w:tblPr>
+      <w:tblGrid>
+        <w:gridCol w:w="3135"/>
+        <w:gridCol w:w="3135"/>
+        <w:gridCol w:w="3135"/>
+      </w:tblGrid>
+      <w:tr>
+        <w:tc>
+          <w:tcPr>
+            <w:tcW w:type="dxa" w:w="3135"/>
+            <w:tcBorders>
+              <w:top w:val="single" w:sz="6" w:color="000000"/>
+              <w:bottom w:val="single" w:sz="6" w:color="000000"/>
+              <w:left w:val="nil" w:sz="6" w:color="000000"/>
+              <w:right w:val="nil" w:sz="6" w:color="000000"/>
+            </w:tcBorders>
+          </w:tcPr>
+          <w:p>
+            <w:pPr>
+              <w:jc w:val="center"/>
+            </w:pPr>
+            <w:r/>
+            <w:r>
+              <w:rPr>
+                <w:rFonts w:ascii="Times New Roman" w:hAnsi="Times New Roman"/>
+                <w:b/>
+                <w:sz w:val="18"/>
+              </w:rPr>
+              <w:t>Variável</w:t>
+            </w:r>
+          </w:p>
+        </w:tc>
+        <w:tc>
+          <w:tcPr>
+            <w:tcW w:type="dxa" w:w="3135"/>
+            <w:tcBorders>
+              <w:top w:val="single" w:sz="6" w:color="000000"/>
+              <w:bottom w:val="single" w:sz="6" w:color="000000"/>
+              <w:left w:val="nil" w:sz="6" w:color="000000"/>
+              <w:right w:val="nil" w:sz="6" w:color="000000"/>
+            </w:tcBorders>
+          </w:tcPr>
+          <w:p>
+            <w:pPr>
+              <w:jc w:val="center"/>
+            </w:pPr>
+            <w:r/>
+            <w:r>
+              <w:rPr>
+                <w:rFonts w:ascii="Times New Roman" w:hAnsi="Times New Roman"/>
+                <w:b/>
+                <w:sz w:val="18"/>
+              </w:rPr>
+              <w:t>M ± DP</w:t>
+            </w:r>
+          </w:p>
+        </w:tc>
+        <w:tc>
+          <w:tcPr>
+            <w:tcW w:type="dxa" w:w="3135"/>
+            <w:tcBorders>
+              <w:top w:val="single" w:sz="6" w:color="000000"/>
+              <w:bottom w:val="single" w:sz="6" w:color="000000"/>
+              <w:left w:val="nil" w:sz="6" w:color="000000"/>
+              <w:right w:val="nil" w:sz="6" w:color="000000"/>
+            </w:tcBorders>
+          </w:tcPr>
+          <w:p>
+            <w:pPr>
+              <w:jc w:val="center"/>
+            </w:pPr>
+            <w:r/>
+            <w:r>
+              <w:rPr>
+                <w:rFonts w:ascii="Times New Roman" w:hAnsi="Times New Roman"/>
+                <w:b/>
+                <w:sz w:val="18"/>
+              </w:rPr>
+              <w:t>Amplitude</w:t>
+            </w:r>
+          </w:p>
+        </w:tc>
+      </w:tr>
+      <w:tr>
+        <w:tc>
+          <w:tcPr>
+            <w:tcW w:type="dxa" w:w="3135"/>
+            <w:tcBorders>
+              <w:top w:val="single" w:sz="6" w:color="000000"/>
+              <w:bottom w:val="single" w:sz="6" w:color="000000"/>
+              <w:left w:val="nil" w:sz="6" w:color="000000"/>
+              <w:right w:val="nil" w:sz="6" w:color="000000"/>
+            </w:tcBorders>
+          </w:tcPr>
+          <w:p>
+            <w:pPr>
+              <w:jc w:val="left"/>
+            </w:pPr>
+            <w:r/>
+            <w:r>
+              <w:rPr>
+                <w:rFonts w:ascii="Times New Roman" w:hAnsi="Times New Roman"/>
+                <w:sz w:val="18"/>
+              </w:rPr>
+              <w:t>Massa corporal</w:t>
+            </w:r>
+          </w:p>
+        </w:tc>
+        <w:tc>
+          <w:tcPr>
+            <w:tcW w:type="dxa" w:w="3135"/>
+            <w:tcBorders>
+              <w:top w:val="single" w:sz="6" w:color="000000"/>
+              <w:bottom w:val="single" w:sz="6" w:color="000000"/>
+              <w:left w:val="nil" w:sz="6" w:color="000000"/>
+              <w:right w:val="nil" w:sz="6" w:color="000000"/>
+            </w:tcBorders>
+          </w:tcPr>
+          <w:p>
+            <w:pPr>
+              <w:jc w:val="center"/>
+            </w:pPr>
+            <w:r/>
+            <w:r>
+              <w:rPr>
+                <w:rFonts w:ascii="Times New Roman" w:hAnsi="Times New Roman"/>
+                <w:sz w:val="18"/>
+              </w:rPr>
+              <w:t>85,8 ± 15,7</w:t>
+            </w:r>
+          </w:p>
+        </w:tc>
+        <w:tc>
+          <w:tcPr>
+            <w:tcW w:type="dxa" w:w="3135"/>
+            <w:tcBorders>
+              <w:top w:val="single" w:sz="6" w:color="000000"/>
+              <w:bottom w:val="single" w:sz="6" w:color="000000"/>
+              <w:left w:val="nil" w:sz="6" w:color="000000"/>
+              <w:right w:val="nil" w:sz="6" w:color="000000"/>
+            </w:tcBorders>
+          </w:tcPr>
+          <w:p>
+            <w:pPr>
+              <w:jc w:val="center"/>
+            </w:pPr>
+            <w:r/>
+            <w:r>
+              <w:rPr>
+                <w:rFonts w:ascii="Times New Roman" w:hAnsi="Times New Roman"/>
+                <w:sz w:val="18"/>
+              </w:rPr>
+              <w:t>58,8–132,6 kg</w:t>
+            </w:r>
+          </w:p>
+        </w:tc>
+      </w:tr>
+      <w:tr>
+        <w:tc>
+          <w:tcPr>
+            <w:tcW w:type="dxa" w:w="3135"/>
+            <w:tcBorders>
+              <w:top w:val="single" w:sz="6" w:color="000000"/>
+              <w:bottom w:val="single" w:sz="6" w:color="000000"/>
+              <w:left w:val="nil" w:sz="6" w:color="000000"/>
+              <w:right w:val="nil" w:sz="6" w:color="000000"/>
+            </w:tcBorders>
+          </w:tcPr>
+          <w:p>
+            <w:pPr>
+              <w:jc w:val="left"/>
+            </w:pPr>
+            <w:r/>
+            <w:r>
+              <w:rPr>
+                <w:rFonts w:ascii="Times New Roman" w:hAnsi="Times New Roman"/>
+                <w:sz w:val="18"/>
+              </w:rPr>
+              <w:t>Estatura</w:t>
+            </w:r>
+          </w:p>
+        </w:tc>
+        <w:tc>
+          <w:tcPr>
+            <w:tcW w:type="dxa" w:w="3135"/>
+            <w:tcBorders>
+              <w:top w:val="single" w:sz="6" w:color="000000"/>
+              <w:bottom w:val="single" w:sz="6" w:color="000000"/>
+              <w:left w:val="nil" w:sz="6" w:color="000000"/>
+              <w:right w:val="nil" w:sz="6" w:color="000000"/>
+            </w:tcBorders>
+          </w:tcPr>
+          <w:p>
+            <w:pPr>
+              <w:jc w:val="center"/>
+            </w:pPr>
+            <w:r/>
+            <w:r>
+              <w:rPr>
+                <w:rFonts w:ascii="Times New Roman" w:hAnsi="Times New Roman"/>
+                <w:sz w:val="18"/>
+              </w:rPr>
+              <w:t>182,5 ± 6,5</w:t>
+            </w:r>
+          </w:p>
+        </w:tc>
+        <w:tc>
+          <w:tcPr>
+            <w:tcW w:type="dxa" w:w="3135"/>
+            <w:tcBorders>
+              <w:top w:val="single" w:sz="6" w:color="000000"/>
+              <w:bottom w:val="single" w:sz="6" w:color="000000"/>
+              <w:left w:val="nil" w:sz="6" w:color="000000"/>
+              <w:right w:val="nil" w:sz="6" w:color="000000"/>
+            </w:tcBorders>
+          </w:tcPr>
+          <w:p>
+            <w:pPr>
+              <w:jc w:val="center"/>
+            </w:pPr>
+            <w:r/>
+            <w:r>
+              <w:rPr>
+                <w:rFonts w:ascii="Times New Roman" w:hAnsi="Times New Roman"/>
+                <w:sz w:val="18"/>
+              </w:rPr>
+              <w:t>170,8–200,0 cm</w:t>
+            </w:r>
+          </w:p>
+        </w:tc>
+      </w:tr>
+      <w:tr>
+        <w:tc>
+          <w:tcPr>
+            <w:tcW w:type="dxa" w:w="3135"/>
+            <w:tcBorders>
+              <w:top w:val="single" w:sz="6" w:color="000000"/>
+              <w:bottom w:val="single" w:sz="6" w:color="000000"/>
+              <w:left w:val="nil" w:sz="6" w:color="000000"/>
+              <w:right w:val="nil" w:sz="6" w:color="000000"/>
+            </w:tcBorders>
+          </w:tcPr>
+          <w:p>
+            <w:pPr>
+              <w:jc w:val="left"/>
+            </w:pPr>
+            <w:r/>
+            <w:r>
+              <w:rPr>
+                <w:rFonts w:ascii="Times New Roman" w:hAnsi="Times New Roman"/>
+                <w:sz w:val="18"/>
+              </w:rPr>
+              <w:t>Gordura corporal</w:t>
+            </w:r>
+          </w:p>
+        </w:tc>
+        <w:tc>
+          <w:tcPr>
+            <w:tcW w:type="dxa" w:w="3135"/>
+            <w:tcBorders>
+              <w:top w:val="single" w:sz="6" w:color="000000"/>
+              <w:bottom w:val="single" w:sz="6" w:color="000000"/>
+              <w:left w:val="nil" w:sz="6" w:color="000000"/>
+              <w:right w:val="nil" w:sz="6" w:color="000000"/>
+            </w:tcBorders>
+          </w:tcPr>
+          <w:p>
+            <w:pPr>
+              <w:jc w:val="center"/>
+            </w:pPr>
+            <w:r/>
+            <w:r>
+              <w:rPr>
+                <w:rFonts w:ascii="Times New Roman" w:hAnsi="Times New Roman"/>
+                <w:sz w:val="18"/>
+              </w:rPr>
+              <w:t>11,6 ± 5,3</w:t>
+            </w:r>
+          </w:p>
+        </w:tc>
+        <w:tc>
+          <w:tcPr>
+            <w:tcW w:type="dxa" w:w="3135"/>
+            <w:tcBorders>
+              <w:top w:val="single" w:sz="6" w:color="000000"/>
+              <w:bottom w:val="single" w:sz="6" w:color="000000"/>
+              <w:left w:val="nil" w:sz="6" w:color="000000"/>
+              <w:right w:val="nil" w:sz="6" w:color="000000"/>
+            </w:tcBorders>
+          </w:tcPr>
+          <w:p>
+            <w:pPr>
+              <w:jc w:val="center"/>
+            </w:pPr>
+            <w:r/>
+            <w:r>
+              <w:rPr>
+                <w:rFonts w:ascii="Times New Roman" w:hAnsi="Times New Roman"/>
+                <w:sz w:val="18"/>
+              </w:rPr>
+              <w:t>5,0–25,0 %</w:t>
+            </w:r>
+          </w:p>
+        </w:tc>
+      </w:tr>
+    </w:tbl>
+    <w:p>
+      <w:pPr>
+        <w:spacing w:after="0"/>
+      </w:pPr>
+      <w:r>
+        <w:rPr>
+          <w:i/>
+          <w:sz w:val="17"/>
+        </w:rPr>
+        <w:t>Massa e estatura por antropometria; gordura corporal por dobras cutâneas.</w:t>
+      </w:r>
+    </w:p>
+    <w:p>
+      <w:pPr>
+        <w:spacing w:after="120"/>
+      </w:pPr>
+      <w:r>
+        <w:rPr>
+          <w:sz w:val="18"/>
+        </w:rPr>
+        <w:t>Fonte: dados da pesquisa (2026).</w:t>
+      </w:r>
+    </w:p>
+    <w:p>
+      <w:pPr>
+        <w:spacing w:line="360" w:lineRule="auto" w:after="120"/>
+        <w:ind w:firstLine="709"/>
+        <w:jc w:val="both"/>
+      </w:pPr>
+      <w:r>
+        <w:rPr>
+          <w:b w:val="0"/>
+          <w:sz w:val="24"/>
+        </w:rPr>
+        <w:t>A caracterização da composição corporal (Tabela 15) mostrou massa de 85,8 kg e gordura corporal de 11,6%. Nem a massa (ρ = +0,32 com a fadiga física; p = 0,113) nem o percentual de gordura (ρ = +0,33; p = 0,113) associaram-se significativamente à fadiga, embora com tendência positiva. Como o pico de velocidade do T-CAR depende do porte corporal, examinou-se sua escala alométrica: o expoente da relação log(PV)–log(massa) foi de -0,19 (r = -0,48; p = 0,016), confirmando que atletas mais pesados atingem menor PV. Ao normalizar o PV pela massa elevada a esse expoente (PV·massa^0,19), a associação com o vigor manteve-se praticamente inalterada (ρ = +0,49; p = 0,012), ao passo que a associação com a fadiga física atenuou-se e perdeu significância (de ρ = -0,51 para ρ = -0,36; p = 0,082). Ou seja, o vínculo entre aptidão e vigor é um efeito genuíno de capacidade aeróbia, independente do tamanho corporal, enquanto parte da relação entre aptidão e fadiga física é atribuível ao porte do atleta.</w:t>
+      </w:r>
+    </w:p>
+    <w:p>
+      <w:pPr>
         <w:spacing w:before="200" w:after="80" w:line="360" w:lineRule="auto"/>
       </w:pPr>
       <w:r>
@@ -14978,7 +15349,7 @@
           <w:b w:val="0"/>
           <w:sz w:val="24"/>
         </w:rPr>
-        <w:t>A inclusão do pico de velocidade do T-CAR como parâmetro fisiológico acrescentou uma leitura interindividual à resposta afetiva. Atletas com maior aptidão aeróbia intermitente reportaram mais vigor (ρ = +0,47; p = 0,017) e menos fadiga física (ρ = -0,51; p = 0,008) ao longo da semana, e um limiar de pico de velocidade de aproximadamente 14,9 km/h discriminou os dias de maior fadiga (área sob a curva = 0,67). Esse resultado é coerente com o papel da capacidade aeróbia intermitente em sustentar e repetir esforços de alta intensidade — acelerando a recuperação entre ações e retardando a fadiga — e, portanto, em modular a tolerância à carga do handebol, e com a validade do pico de velocidade do T-CAR como marcador de desempenho físico em modalidades intermitentes (FERNANDES-DA-SILVA et al., 2016). Do ponto de vista aplicado, normalizar a resposta de humor pela aptidão física ajuda a distinguir a fadiga esperada — de atletas menos aptos sob a mesma carga — daquela que possa sinalizar sobrecarga, e o limiar identificado oferece à comissão técnica uma referência objetiva para individualizar a prescrição da carga e o reforço da recuperação.</w:t>
+        <w:t>A inclusão do pico de velocidade do T-CAR como parâmetro fisiológico acrescentou uma leitura interindividual à resposta afetiva. Atletas com maior aptidão aeróbia intermitente reportaram mais vigor (ρ = +0,47; p = 0,017) e menos fadiga física (ρ = -0,51; p = 0,008) ao longo da semana, e um limiar de pico de velocidade de aproximadamente 14,9 km/h discriminou os dias de maior fadiga (área sob a curva = 0,67). Esse resultado é coerente com o papel da capacidade aeróbia intermitente em sustentar e repetir esforços de alta intensidade — acelerando a recuperação entre ações e retardando a fadiga — e, portanto, em modular a tolerância à carga do handebol, e com a validade do pico de velocidade do T-CAR como marcador de desempenho físico em modalidades intermitentes (FERNANDES-DA-SILVA et al., 2016). Do ponto de vista aplicado, normalizar a resposta de humor pela aptidão física ajuda a distinguir a fadiga esperada — de atletas menos aptos sob a mesma carga — daquela que possa sinalizar sobrecarga, e o limiar identificado oferece à comissão técnica uma referência objetiva para individualizar a prescrição da carga e o reforço da recuperação. O ajuste alométrico refinou essa leitura: como o pico de velocidade escala negativamente com a massa (expoente -0,19), parte da relação entre aptidão e fadiga física reflete o porte corporal e não apenas a capacidade aeróbia — ao normalizar o PV pela massa, essa associação se atenua. Já a relação entre aptidão e vigor resistiu ao ajuste, evidenciando um efeito genuíno de capacidade aeróbia sobre o estado de energia, independentemente do tamanho do atleta.</w:t>
       </w:r>
     </w:p>
     <w:p>

</xml_diff>

<commit_message>
Adicionar modelagem polinomial: derivadas e taxa de variação (BRUMS)
Nova seção 3.13: ajuste polinomial (grau 3) das médias diárias de cada
dimensão e derivação analítica das taxas de variação. Reporta R², taxa média
(pontos/dia), taxa instantânea nas bordas (P' no Dia 1 e no Dia 7), pontos
críticos (P'=0) e inflexão (P''=0). Ajustes excelentes no eixo energia-fadiga
(vigor R²=0,96; fadiga R²=0,95), fracos nas negativas de piso (depressão
R²=0,42). Vigor cai a -0,64/dia, mais rápido no início (P'(1)=-3,52) e
desacelera; inflexão ~dia 4 para vigor e fadiga (marco do meio do microciclo).

Inclui compute_deriv.py, deriv_figs.py (figura com ajuste + derivada +
inflexão), tabela e nota de método. Script de reprodução 01 ganhou o bloco 13.
PDF (26 páginas) e docx regenerados; leak-scan: 0 vazamentos.

Co-Authored-By: Claude Opus 4.8 <noreply@anthropic.com>
Claude-Session: https://claude.ai/code/session_01P7yGiDeoGDyjWvPWQVsUrj
</commit_message>
<xml_diff>
--- a/Artigos/Artigo_humor_HANDEBOL.docx
+++ b/Artigos/Artigo_humor_HANDEBOL.docx
@@ -374,7 +374,7 @@
           <w:b w:val="0"/>
           <w:sz w:val="24"/>
         </w:rPr>
-        <w:t>Como confirmação robusta, as comparações Dia 1 → Dia 7 e pré → pós foram reanalisadas por análise multivariada de variância (MANOVA) de medidas repetidas sobre os escores T, que testa as seis dimensões em conjunto e controla o erro de múltiplas comparações (lambda de Wilks, F e eta-quadrado parcial — η²ₚ; 0,01 pequeno; 0,06 médio; 0,14 grande); nos testes univariados de acompanhamento da MANOVA, aplicou-se o ajuste de Bonferroni ao nível de significância, dividindo 0,05 pelas seis dimensões (α = 0,008), para controlar o erro do tipo I. A associação entre as dimensões foi quantificada pela correlação de Spearman (ρ). Por fim, a relação entre o pico de velocidade do T-CAR e a fadiga foi analisada por regressão, e um limiar de pico de velocidade foi estabelecido pelo índice de Youden — que maximiza a soma de sensibilidade e especificidade —, com a qualidade de discriminação avaliada pela área sob a curva ROC. Para separar o efeito da aptidão do efeito do tamanho corporal, o pico de velocidade foi ainda submetido a ajuste alométrico: estimou-se o expoente da relação alométrica pela regressão log(PV)–log(massa) e normalizou-se o PV pela massa elevada a esse expoente, comparando-se as associações do PV bruto e do PV normalizado com a fadiga e o vigor. Adotou-se nível de significância de 5% (p &lt; 0,05), com as análises conduzidas em ambiente Python (bibliotecas pandas, SciPy e statsmodels).</w:t>
+        <w:t>Como confirmação robusta, as comparações Dia 1 → Dia 7 e pré → pós foram reanalisadas por análise multivariada de variância (MANOVA) de medidas repetidas sobre os escores T, que testa as seis dimensões em conjunto e controla o erro de múltiplas comparações (lambda de Wilks, F e eta-quadrado parcial — η²ₚ; 0,01 pequeno; 0,06 médio; 0,14 grande); nos testes univariados de acompanhamento da MANOVA, aplicou-se o ajuste de Bonferroni ao nível de significância, dividindo 0,05 pelas seis dimensões (α = 0,008), para controlar o erro do tipo I. A associação entre as dimensões foi quantificada pela correlação de Spearman (ρ). Por fim, a relação entre o pico de velocidade do T-CAR e a fadiga foi analisada por regressão, e um limiar de pico de velocidade foi estabelecido pelo índice de Youden — que maximiza a soma de sensibilidade e especificidade —, com a qualidade de discriminação avaliada pela área sob a curva ROC. Para separar o efeito da aptidão do efeito do tamanho corporal, o pico de velocidade foi ainda submetido a ajuste alométrico: estimou-se o expoente da relação alométrica pela regressão log(PV)–log(massa) e normalizou-se o PV pela massa elevada a esse expoente, comparando-se as associações do PV bruto e do PV normalizado com a fadiga e o vigor. A dinâmica temporal foi ainda modelada ajustando-se uma função polinomial às médias diárias de cada dimensão, da qual se obtiveram, por derivação, a taxa de variação instantânea (derivada primeira), os pontos críticos (máximos e mínimos) e o ponto de inflexão (raiz da derivada segunda). Adotou-se nível de significância de 5% (p &lt; 0,05), com as análises conduzidas em ambiente Python (bibliotecas pandas, NumPy, SciPy e statsmodels).</w:t>
       </w:r>
     </w:p>
     <w:p>
@@ -15240,6 +15240,1318 @@
           <w:sz w:val="24"/>
         </w:rPr>
         <w:t>A caracterização da composição corporal (Tabela 15) mostrou massa de 85,8 kg e gordura corporal de 11,6%. Nem a massa (ρ = +0,32 com a fadiga física; p = 0,113) nem o percentual de gordura (ρ = +0,33; p = 0,113) associaram-se significativamente à fadiga, embora com tendência positiva. Como o pico de velocidade do T-CAR depende do porte corporal, examinou-se sua escala alométrica: o expoente da relação log(PV)–log(massa) foi de -0,19 (r = -0,48; p = 0,016), confirmando que atletas mais pesados atingem menor PV. Ao normalizar o PV pela massa elevada a esse expoente (PV·massa^0,19), a associação com o vigor manteve-se praticamente inalterada (ρ = +0,49; p = 0,012), ao passo que a associação com a fadiga física atenuou-se e perdeu significância (de ρ = -0,51 para ρ = -0,36; p = 0,082). Ou seja, o vínculo entre aptidão e vigor é um efeito genuíno de capacidade aeróbia, independente do tamanho corporal, enquanto parte da relação entre aptidão e fadiga física é atribuível ao porte do atleta.</w:t>
+      </w:r>
+    </w:p>
+    <w:p>
+      <w:pPr>
+        <w:spacing w:before="120" w:after="80" w:line="360" w:lineRule="auto"/>
+      </w:pPr>
+      <w:r>
+        <w:rPr>
+          <w:b/>
+          <w:sz w:val="24"/>
+        </w:rPr>
+        <w:t>3.13 Modelagem polinomial das trajetórias: derivadas e taxa de variação</w:t>
+      </w:r>
+    </w:p>
+    <w:p>
+      <w:pPr>
+        <w:spacing w:before="160" w:after="40"/>
+      </w:pPr>
+      <w:r>
+        <w:rPr>
+          <w:sz w:val="22"/>
+        </w:rPr>
+        <w:t>Tabela 16 – Modelagem polinomial (grau 3) das médias diárias: qualidade do ajuste (R²), taxa de variação média (pontos/dia), taxa instantânea nas bordas (P′ no Dia 1 e no Dia 7) e ponto de inflexão.</w:t>
+      </w:r>
+    </w:p>
+    <w:tbl>
+      <w:tblPr>
+        <w:tblW w:type="auto" w:w="0"/>
+        <w:jc w:val="center"/>
+        <w:tblLook w:firstColumn="1" w:firstRow="1" w:lastColumn="0" w:lastRow="0" w:noHBand="0" w:noVBand="1" w:val="04A0"/>
+      </w:tblPr>
+      <w:tblGrid>
+        <w:gridCol w:w="1567"/>
+        <w:gridCol w:w="1567"/>
+        <w:gridCol w:w="1567"/>
+        <w:gridCol w:w="1567"/>
+        <w:gridCol w:w="1567"/>
+        <w:gridCol w:w="1567"/>
+      </w:tblGrid>
+      <w:tr>
+        <w:tc>
+          <w:tcPr>
+            <w:tcW w:type="dxa" w:w="1567"/>
+            <w:tcBorders>
+              <w:top w:val="single" w:sz="6" w:color="000000"/>
+              <w:bottom w:val="single" w:sz="6" w:color="000000"/>
+              <w:left w:val="nil" w:sz="6" w:color="000000"/>
+              <w:right w:val="nil" w:sz="6" w:color="000000"/>
+            </w:tcBorders>
+          </w:tcPr>
+          <w:p>
+            <w:pPr>
+              <w:jc w:val="center"/>
+            </w:pPr>
+            <w:r/>
+            <w:r>
+              <w:rPr>
+                <w:rFonts w:ascii="Times New Roman" w:hAnsi="Times New Roman"/>
+                <w:b/>
+                <w:sz w:val="18"/>
+              </w:rPr>
+              <w:t>Dimensão</w:t>
+            </w:r>
+          </w:p>
+        </w:tc>
+        <w:tc>
+          <w:tcPr>
+            <w:tcW w:type="dxa" w:w="1567"/>
+            <w:tcBorders>
+              <w:top w:val="single" w:sz="6" w:color="000000"/>
+              <w:bottom w:val="single" w:sz="6" w:color="000000"/>
+              <w:left w:val="nil" w:sz="6" w:color="000000"/>
+              <w:right w:val="nil" w:sz="6" w:color="000000"/>
+            </w:tcBorders>
+          </w:tcPr>
+          <w:p>
+            <w:pPr>
+              <w:jc w:val="center"/>
+            </w:pPr>
+            <w:r/>
+            <w:r>
+              <w:rPr>
+                <w:rFonts w:ascii="Times New Roman" w:hAnsi="Times New Roman"/>
+                <w:b/>
+                <w:sz w:val="18"/>
+              </w:rPr>
+              <w:t>R²</w:t>
+            </w:r>
+          </w:p>
+        </w:tc>
+        <w:tc>
+          <w:tcPr>
+            <w:tcW w:type="dxa" w:w="1567"/>
+            <w:tcBorders>
+              <w:top w:val="single" w:sz="6" w:color="000000"/>
+              <w:bottom w:val="single" w:sz="6" w:color="000000"/>
+              <w:left w:val="nil" w:sz="6" w:color="000000"/>
+              <w:right w:val="nil" w:sz="6" w:color="000000"/>
+            </w:tcBorders>
+          </w:tcPr>
+          <w:p>
+            <w:pPr>
+              <w:jc w:val="center"/>
+            </w:pPr>
+            <w:r/>
+            <w:r>
+              <w:rPr>
+                <w:rFonts w:ascii="Times New Roman" w:hAnsi="Times New Roman"/>
+                <w:b/>
+                <w:sz w:val="18"/>
+              </w:rPr>
+              <w:t>Taxa média/dia</w:t>
+            </w:r>
+          </w:p>
+        </w:tc>
+        <w:tc>
+          <w:tcPr>
+            <w:tcW w:type="dxa" w:w="1567"/>
+            <w:tcBorders>
+              <w:top w:val="single" w:sz="6" w:color="000000"/>
+              <w:bottom w:val="single" w:sz="6" w:color="000000"/>
+              <w:left w:val="nil" w:sz="6" w:color="000000"/>
+              <w:right w:val="nil" w:sz="6" w:color="000000"/>
+            </w:tcBorders>
+          </w:tcPr>
+          <w:p>
+            <w:pPr>
+              <w:jc w:val="center"/>
+            </w:pPr>
+            <w:r/>
+            <w:r>
+              <w:rPr>
+                <w:rFonts w:ascii="Times New Roman" w:hAnsi="Times New Roman"/>
+                <w:b/>
+                <w:sz w:val="18"/>
+              </w:rPr>
+              <w:t>P′(Dia 1)</w:t>
+            </w:r>
+          </w:p>
+        </w:tc>
+        <w:tc>
+          <w:tcPr>
+            <w:tcW w:type="dxa" w:w="1567"/>
+            <w:tcBorders>
+              <w:top w:val="single" w:sz="6" w:color="000000"/>
+              <w:bottom w:val="single" w:sz="6" w:color="000000"/>
+              <w:left w:val="nil" w:sz="6" w:color="000000"/>
+              <w:right w:val="nil" w:sz="6" w:color="000000"/>
+            </w:tcBorders>
+          </w:tcPr>
+          <w:p>
+            <w:pPr>
+              <w:jc w:val="center"/>
+            </w:pPr>
+            <w:r/>
+            <w:r>
+              <w:rPr>
+                <w:rFonts w:ascii="Times New Roman" w:hAnsi="Times New Roman"/>
+                <w:b/>
+                <w:sz w:val="18"/>
+              </w:rPr>
+              <w:t>P′(Dia 7)</w:t>
+            </w:r>
+          </w:p>
+        </w:tc>
+        <w:tc>
+          <w:tcPr>
+            <w:tcW w:type="dxa" w:w="1567"/>
+            <w:tcBorders>
+              <w:top w:val="single" w:sz="6" w:color="000000"/>
+              <w:bottom w:val="single" w:sz="6" w:color="000000"/>
+              <w:left w:val="nil" w:sz="6" w:color="000000"/>
+              <w:right w:val="nil" w:sz="6" w:color="000000"/>
+            </w:tcBorders>
+          </w:tcPr>
+          <w:p>
+            <w:pPr>
+              <w:jc w:val="center"/>
+            </w:pPr>
+            <w:r/>
+            <w:r>
+              <w:rPr>
+                <w:rFonts w:ascii="Times New Roman" w:hAnsi="Times New Roman"/>
+                <w:b/>
+                <w:sz w:val="18"/>
+              </w:rPr>
+              <w:t>Inflexão (dia)</w:t>
+            </w:r>
+          </w:p>
+        </w:tc>
+      </w:tr>
+      <w:tr>
+        <w:tc>
+          <w:tcPr>
+            <w:tcW w:type="dxa" w:w="1567"/>
+            <w:tcBorders>
+              <w:top w:val="single" w:sz="6" w:color="000000"/>
+              <w:bottom w:val="single" w:sz="6" w:color="000000"/>
+              <w:left w:val="nil" w:sz="6" w:color="000000"/>
+              <w:right w:val="nil" w:sz="6" w:color="000000"/>
+            </w:tcBorders>
+          </w:tcPr>
+          <w:p>
+            <w:pPr>
+              <w:jc w:val="left"/>
+            </w:pPr>
+            <w:r/>
+            <w:r>
+              <w:rPr>
+                <w:rFonts w:ascii="Times New Roman" w:hAnsi="Times New Roman"/>
+                <w:sz w:val="18"/>
+              </w:rPr>
+              <w:t>Vigor</w:t>
+            </w:r>
+          </w:p>
+        </w:tc>
+        <w:tc>
+          <w:tcPr>
+            <w:tcW w:type="dxa" w:w="1567"/>
+            <w:tcBorders>
+              <w:top w:val="single" w:sz="6" w:color="000000"/>
+              <w:bottom w:val="single" w:sz="6" w:color="000000"/>
+              <w:left w:val="nil" w:sz="6" w:color="000000"/>
+              <w:right w:val="nil" w:sz="6" w:color="000000"/>
+            </w:tcBorders>
+          </w:tcPr>
+          <w:p>
+            <w:pPr>
+              <w:jc w:val="center"/>
+            </w:pPr>
+            <w:r/>
+            <w:r>
+              <w:rPr>
+                <w:rFonts w:ascii="Times New Roman" w:hAnsi="Times New Roman"/>
+                <w:sz w:val="18"/>
+              </w:rPr>
+              <w:t>0,96</w:t>
+            </w:r>
+          </w:p>
+        </w:tc>
+        <w:tc>
+          <w:tcPr>
+            <w:tcW w:type="dxa" w:w="1567"/>
+            <w:tcBorders>
+              <w:top w:val="single" w:sz="6" w:color="000000"/>
+              <w:bottom w:val="single" w:sz="6" w:color="000000"/>
+              <w:left w:val="nil" w:sz="6" w:color="000000"/>
+              <w:right w:val="nil" w:sz="6" w:color="000000"/>
+            </w:tcBorders>
+          </w:tcPr>
+          <w:p>
+            <w:pPr>
+              <w:jc w:val="center"/>
+            </w:pPr>
+            <w:r/>
+            <w:r>
+              <w:rPr>
+                <w:rFonts w:ascii="Times New Roman" w:hAnsi="Times New Roman"/>
+                <w:sz w:val="18"/>
+              </w:rPr>
+              <w:t>-0,64</w:t>
+            </w:r>
+          </w:p>
+        </w:tc>
+        <w:tc>
+          <w:tcPr>
+            <w:tcW w:type="dxa" w:w="1567"/>
+            <w:tcBorders>
+              <w:top w:val="single" w:sz="6" w:color="000000"/>
+              <w:bottom w:val="single" w:sz="6" w:color="000000"/>
+              <w:left w:val="nil" w:sz="6" w:color="000000"/>
+              <w:right w:val="nil" w:sz="6" w:color="000000"/>
+            </w:tcBorders>
+          </w:tcPr>
+          <w:p>
+            <w:pPr>
+              <w:jc w:val="center"/>
+            </w:pPr>
+            <w:r/>
+            <w:r>
+              <w:rPr>
+                <w:rFonts w:ascii="Times New Roman" w:hAnsi="Times New Roman"/>
+                <w:sz w:val="18"/>
+              </w:rPr>
+              <w:t>-3,52</w:t>
+            </w:r>
+          </w:p>
+        </w:tc>
+        <w:tc>
+          <w:tcPr>
+            <w:tcW w:type="dxa" w:w="1567"/>
+            <w:tcBorders>
+              <w:top w:val="single" w:sz="6" w:color="000000"/>
+              <w:bottom w:val="single" w:sz="6" w:color="000000"/>
+              <w:left w:val="nil" w:sz="6" w:color="000000"/>
+              <w:right w:val="nil" w:sz="6" w:color="000000"/>
+            </w:tcBorders>
+          </w:tcPr>
+          <w:p>
+            <w:pPr>
+              <w:jc w:val="center"/>
+            </w:pPr>
+            <w:r/>
+            <w:r>
+              <w:rPr>
+                <w:rFonts w:ascii="Times New Roman" w:hAnsi="Times New Roman"/>
+                <w:sz w:val="18"/>
+              </w:rPr>
+              <w:t>-2,40</w:t>
+            </w:r>
+          </w:p>
+        </w:tc>
+        <w:tc>
+          <w:tcPr>
+            <w:tcW w:type="dxa" w:w="1567"/>
+            <w:tcBorders>
+              <w:top w:val="single" w:sz="6" w:color="000000"/>
+              <w:bottom w:val="single" w:sz="6" w:color="000000"/>
+              <w:left w:val="nil" w:sz="6" w:color="000000"/>
+              <w:right w:val="nil" w:sz="6" w:color="000000"/>
+            </w:tcBorders>
+          </w:tcPr>
+          <w:p>
+            <w:pPr>
+              <w:jc w:val="center"/>
+            </w:pPr>
+            <w:r/>
+            <w:r>
+              <w:rPr>
+                <w:rFonts w:ascii="Times New Roman" w:hAnsi="Times New Roman"/>
+                <w:sz w:val="18"/>
+              </w:rPr>
+              <w:t>4,2</w:t>
+            </w:r>
+          </w:p>
+        </w:tc>
+      </w:tr>
+      <w:tr>
+        <w:tc>
+          <w:tcPr>
+            <w:tcW w:type="dxa" w:w="1567"/>
+            <w:tcBorders>
+              <w:top w:val="single" w:sz="6" w:color="000000"/>
+              <w:bottom w:val="single" w:sz="6" w:color="000000"/>
+              <w:left w:val="nil" w:sz="6" w:color="000000"/>
+              <w:right w:val="nil" w:sz="6" w:color="000000"/>
+            </w:tcBorders>
+          </w:tcPr>
+          <w:p>
+            <w:pPr>
+              <w:jc w:val="left"/>
+            </w:pPr>
+            <w:r/>
+            <w:r>
+              <w:rPr>
+                <w:rFonts w:ascii="Times New Roman" w:hAnsi="Times New Roman"/>
+                <w:sz w:val="18"/>
+              </w:rPr>
+              <w:t>Fadiga</w:t>
+            </w:r>
+          </w:p>
+        </w:tc>
+        <w:tc>
+          <w:tcPr>
+            <w:tcW w:type="dxa" w:w="1567"/>
+            <w:tcBorders>
+              <w:top w:val="single" w:sz="6" w:color="000000"/>
+              <w:bottom w:val="single" w:sz="6" w:color="000000"/>
+              <w:left w:val="nil" w:sz="6" w:color="000000"/>
+              <w:right w:val="nil" w:sz="6" w:color="000000"/>
+            </w:tcBorders>
+          </w:tcPr>
+          <w:p>
+            <w:pPr>
+              <w:jc w:val="center"/>
+            </w:pPr>
+            <w:r/>
+            <w:r>
+              <w:rPr>
+                <w:rFonts w:ascii="Times New Roman" w:hAnsi="Times New Roman"/>
+                <w:sz w:val="18"/>
+              </w:rPr>
+              <w:t>0,95</w:t>
+            </w:r>
+          </w:p>
+        </w:tc>
+        <w:tc>
+          <w:tcPr>
+            <w:tcW w:type="dxa" w:w="1567"/>
+            <w:tcBorders>
+              <w:top w:val="single" w:sz="6" w:color="000000"/>
+              <w:bottom w:val="single" w:sz="6" w:color="000000"/>
+              <w:left w:val="nil" w:sz="6" w:color="000000"/>
+              <w:right w:val="nil" w:sz="6" w:color="000000"/>
+            </w:tcBorders>
+          </w:tcPr>
+          <w:p>
+            <w:pPr>
+              <w:jc w:val="center"/>
+            </w:pPr>
+            <w:r/>
+            <w:r>
+              <w:rPr>
+                <w:rFonts w:ascii="Times New Roman" w:hAnsi="Times New Roman"/>
+                <w:sz w:val="18"/>
+              </w:rPr>
+              <w:t>+0,64</w:t>
+            </w:r>
+          </w:p>
+        </w:tc>
+        <w:tc>
+          <w:tcPr>
+            <w:tcW w:type="dxa" w:w="1567"/>
+            <w:tcBorders>
+              <w:top w:val="single" w:sz="6" w:color="000000"/>
+              <w:bottom w:val="single" w:sz="6" w:color="000000"/>
+              <w:left w:val="nil" w:sz="6" w:color="000000"/>
+              <w:right w:val="nil" w:sz="6" w:color="000000"/>
+            </w:tcBorders>
+          </w:tcPr>
+          <w:p>
+            <w:pPr>
+              <w:jc w:val="center"/>
+            </w:pPr>
+            <w:r/>
+            <w:r>
+              <w:rPr>
+                <w:rFonts w:ascii="Times New Roman" w:hAnsi="Times New Roman"/>
+                <w:sz w:val="18"/>
+              </w:rPr>
+              <w:t>+2,23</w:t>
+            </w:r>
+          </w:p>
+        </w:tc>
+        <w:tc>
+          <w:tcPr>
+            <w:tcW w:type="dxa" w:w="1567"/>
+            <w:tcBorders>
+              <w:top w:val="single" w:sz="6" w:color="000000"/>
+              <w:bottom w:val="single" w:sz="6" w:color="000000"/>
+              <w:left w:val="nil" w:sz="6" w:color="000000"/>
+              <w:right w:val="nil" w:sz="6" w:color="000000"/>
+            </w:tcBorders>
+          </w:tcPr>
+          <w:p>
+            <w:pPr>
+              <w:jc w:val="center"/>
+            </w:pPr>
+            <w:r/>
+            <w:r>
+              <w:rPr>
+                <w:rFonts w:ascii="Times New Roman" w:hAnsi="Times New Roman"/>
+                <w:sz w:val="18"/>
+              </w:rPr>
+              <w:t>+2,11</w:t>
+            </w:r>
+          </w:p>
+        </w:tc>
+        <w:tc>
+          <w:tcPr>
+            <w:tcW w:type="dxa" w:w="1567"/>
+            <w:tcBorders>
+              <w:top w:val="single" w:sz="6" w:color="000000"/>
+              <w:bottom w:val="single" w:sz="6" w:color="000000"/>
+              <w:left w:val="nil" w:sz="6" w:color="000000"/>
+              <w:right w:val="nil" w:sz="6" w:color="000000"/>
+            </w:tcBorders>
+          </w:tcPr>
+          <w:p>
+            <w:pPr>
+              <w:jc w:val="center"/>
+            </w:pPr>
+            <w:r/>
+            <w:r>
+              <w:rPr>
+                <w:rFonts w:ascii="Times New Roman" w:hAnsi="Times New Roman"/>
+                <w:sz w:val="18"/>
+              </w:rPr>
+              <w:t>4,0</w:t>
+            </w:r>
+          </w:p>
+        </w:tc>
+      </w:tr>
+      <w:tr>
+        <w:tc>
+          <w:tcPr>
+            <w:tcW w:type="dxa" w:w="1567"/>
+            <w:tcBorders>
+              <w:top w:val="single" w:sz="6" w:color="000000"/>
+              <w:bottom w:val="single" w:sz="6" w:color="000000"/>
+              <w:left w:val="nil" w:sz="6" w:color="000000"/>
+              <w:right w:val="nil" w:sz="6" w:color="000000"/>
+            </w:tcBorders>
+          </w:tcPr>
+          <w:p>
+            <w:pPr>
+              <w:jc w:val="left"/>
+            </w:pPr>
+            <w:r/>
+            <w:r>
+              <w:rPr>
+                <w:rFonts w:ascii="Times New Roman" w:hAnsi="Times New Roman"/>
+                <w:sz w:val="18"/>
+              </w:rPr>
+              <w:t>PTH</w:t>
+            </w:r>
+          </w:p>
+        </w:tc>
+        <w:tc>
+          <w:tcPr>
+            <w:tcW w:type="dxa" w:w="1567"/>
+            <w:tcBorders>
+              <w:top w:val="single" w:sz="6" w:color="000000"/>
+              <w:bottom w:val="single" w:sz="6" w:color="000000"/>
+              <w:left w:val="nil" w:sz="6" w:color="000000"/>
+              <w:right w:val="nil" w:sz="6" w:color="000000"/>
+            </w:tcBorders>
+          </w:tcPr>
+          <w:p>
+            <w:pPr>
+              <w:jc w:val="center"/>
+            </w:pPr>
+            <w:r/>
+            <w:r>
+              <w:rPr>
+                <w:rFonts w:ascii="Times New Roman" w:hAnsi="Times New Roman"/>
+                <w:sz w:val="18"/>
+              </w:rPr>
+              <w:t>0,80</w:t>
+            </w:r>
+          </w:p>
+        </w:tc>
+        <w:tc>
+          <w:tcPr>
+            <w:tcW w:type="dxa" w:w="1567"/>
+            <w:tcBorders>
+              <w:top w:val="single" w:sz="6" w:color="000000"/>
+              <w:bottom w:val="single" w:sz="6" w:color="000000"/>
+              <w:left w:val="nil" w:sz="6" w:color="000000"/>
+              <w:right w:val="nil" w:sz="6" w:color="000000"/>
+            </w:tcBorders>
+          </w:tcPr>
+          <w:p>
+            <w:pPr>
+              <w:jc w:val="center"/>
+            </w:pPr>
+            <w:r/>
+            <w:r>
+              <w:rPr>
+                <w:rFonts w:ascii="Times New Roman" w:hAnsi="Times New Roman"/>
+                <w:sz w:val="18"/>
+              </w:rPr>
+              <w:t>+1,28</w:t>
+            </w:r>
+          </w:p>
+        </w:tc>
+        <w:tc>
+          <w:tcPr>
+            <w:tcW w:type="dxa" w:w="1567"/>
+            <w:tcBorders>
+              <w:top w:val="single" w:sz="6" w:color="000000"/>
+              <w:bottom w:val="single" w:sz="6" w:color="000000"/>
+              <w:left w:val="nil" w:sz="6" w:color="000000"/>
+              <w:right w:val="nil" w:sz="6" w:color="000000"/>
+            </w:tcBorders>
+          </w:tcPr>
+          <w:p>
+            <w:pPr>
+              <w:jc w:val="center"/>
+            </w:pPr>
+            <w:r/>
+            <w:r>
+              <w:rPr>
+                <w:rFonts w:ascii="Times New Roman" w:hAnsi="Times New Roman"/>
+                <w:sz w:val="18"/>
+              </w:rPr>
+              <w:t>+5,10</w:t>
+            </w:r>
+          </w:p>
+        </w:tc>
+        <w:tc>
+          <w:tcPr>
+            <w:tcW w:type="dxa" w:w="1567"/>
+            <w:tcBorders>
+              <w:top w:val="single" w:sz="6" w:color="000000"/>
+              <w:bottom w:val="single" w:sz="6" w:color="000000"/>
+              <w:left w:val="nil" w:sz="6" w:color="000000"/>
+              <w:right w:val="nil" w:sz="6" w:color="000000"/>
+            </w:tcBorders>
+          </w:tcPr>
+          <w:p>
+            <w:pPr>
+              <w:jc w:val="center"/>
+            </w:pPr>
+            <w:r/>
+            <w:r>
+              <w:rPr>
+                <w:rFonts w:ascii="Times New Roman" w:hAnsi="Times New Roman"/>
+                <w:sz w:val="18"/>
+              </w:rPr>
+              <w:t>+6,41</w:t>
+            </w:r>
+          </w:p>
+        </w:tc>
+        <w:tc>
+          <w:tcPr>
+            <w:tcW w:type="dxa" w:w="1567"/>
+            <w:tcBorders>
+              <w:top w:val="single" w:sz="6" w:color="000000"/>
+              <w:bottom w:val="single" w:sz="6" w:color="000000"/>
+              <w:left w:val="nil" w:sz="6" w:color="000000"/>
+              <w:right w:val="nil" w:sz="6" w:color="000000"/>
+            </w:tcBorders>
+          </w:tcPr>
+          <w:p>
+            <w:pPr>
+              <w:jc w:val="center"/>
+            </w:pPr>
+            <w:r/>
+            <w:r>
+              <w:rPr>
+                <w:rFonts w:ascii="Times New Roman" w:hAnsi="Times New Roman"/>
+                <w:sz w:val="18"/>
+              </w:rPr>
+              <w:t>3,9</w:t>
+            </w:r>
+          </w:p>
+        </w:tc>
+      </w:tr>
+      <w:tr>
+        <w:tc>
+          <w:tcPr>
+            <w:tcW w:type="dxa" w:w="1567"/>
+            <w:tcBorders>
+              <w:top w:val="single" w:sz="6" w:color="000000"/>
+              <w:bottom w:val="single" w:sz="6" w:color="000000"/>
+              <w:left w:val="nil" w:sz="6" w:color="000000"/>
+              <w:right w:val="nil" w:sz="6" w:color="000000"/>
+            </w:tcBorders>
+          </w:tcPr>
+          <w:p>
+            <w:pPr>
+              <w:jc w:val="left"/>
+            </w:pPr>
+            <w:r/>
+            <w:r>
+              <w:rPr>
+                <w:rFonts w:ascii="Times New Roman" w:hAnsi="Times New Roman"/>
+                <w:sz w:val="18"/>
+              </w:rPr>
+              <w:t>Tensão</w:t>
+            </w:r>
+          </w:p>
+        </w:tc>
+        <w:tc>
+          <w:tcPr>
+            <w:tcW w:type="dxa" w:w="1567"/>
+            <w:tcBorders>
+              <w:top w:val="single" w:sz="6" w:color="000000"/>
+              <w:bottom w:val="single" w:sz="6" w:color="000000"/>
+              <w:left w:val="nil" w:sz="6" w:color="000000"/>
+              <w:right w:val="nil" w:sz="6" w:color="000000"/>
+            </w:tcBorders>
+          </w:tcPr>
+          <w:p>
+            <w:pPr>
+              <w:jc w:val="center"/>
+            </w:pPr>
+            <w:r/>
+            <w:r>
+              <w:rPr>
+                <w:rFonts w:ascii="Times New Roman" w:hAnsi="Times New Roman"/>
+                <w:sz w:val="18"/>
+              </w:rPr>
+              <w:t>0,80</w:t>
+            </w:r>
+          </w:p>
+        </w:tc>
+        <w:tc>
+          <w:tcPr>
+            <w:tcW w:type="dxa" w:w="1567"/>
+            <w:tcBorders>
+              <w:top w:val="single" w:sz="6" w:color="000000"/>
+              <w:bottom w:val="single" w:sz="6" w:color="000000"/>
+              <w:left w:val="nil" w:sz="6" w:color="000000"/>
+              <w:right w:val="nil" w:sz="6" w:color="000000"/>
+            </w:tcBorders>
+          </w:tcPr>
+          <w:p>
+            <w:pPr>
+              <w:jc w:val="center"/>
+            </w:pPr>
+            <w:r/>
+            <w:r>
+              <w:rPr>
+                <w:rFonts w:ascii="Times New Roman" w:hAnsi="Times New Roman"/>
+                <w:sz w:val="18"/>
+              </w:rPr>
+              <w:t>-0,18</w:t>
+            </w:r>
+          </w:p>
+        </w:tc>
+        <w:tc>
+          <w:tcPr>
+            <w:tcW w:type="dxa" w:w="1567"/>
+            <w:tcBorders>
+              <w:top w:val="single" w:sz="6" w:color="000000"/>
+              <w:bottom w:val="single" w:sz="6" w:color="000000"/>
+              <w:left w:val="nil" w:sz="6" w:color="000000"/>
+              <w:right w:val="nil" w:sz="6" w:color="000000"/>
+            </w:tcBorders>
+          </w:tcPr>
+          <w:p>
+            <w:pPr>
+              <w:jc w:val="center"/>
+            </w:pPr>
+            <w:r/>
+            <w:r>
+              <w:rPr>
+                <w:rFonts w:ascii="Times New Roman" w:hAnsi="Times New Roman"/>
+                <w:sz w:val="18"/>
+              </w:rPr>
+              <w:t>-0,87</w:t>
+            </w:r>
+          </w:p>
+        </w:tc>
+        <w:tc>
+          <w:tcPr>
+            <w:tcW w:type="dxa" w:w="1567"/>
+            <w:tcBorders>
+              <w:top w:val="single" w:sz="6" w:color="000000"/>
+              <w:bottom w:val="single" w:sz="6" w:color="000000"/>
+              <w:left w:val="nil" w:sz="6" w:color="000000"/>
+              <w:right w:val="nil" w:sz="6" w:color="000000"/>
+            </w:tcBorders>
+          </w:tcPr>
+          <w:p>
+            <w:pPr>
+              <w:jc w:val="center"/>
+            </w:pPr>
+            <w:r/>
+            <w:r>
+              <w:rPr>
+                <w:rFonts w:ascii="Times New Roman" w:hAnsi="Times New Roman"/>
+                <w:sz w:val="18"/>
+              </w:rPr>
+              <w:t>-0,37</w:t>
+            </w:r>
+          </w:p>
+        </w:tc>
+        <w:tc>
+          <w:tcPr>
+            <w:tcW w:type="dxa" w:w="1567"/>
+            <w:tcBorders>
+              <w:top w:val="single" w:sz="6" w:color="000000"/>
+              <w:bottom w:val="single" w:sz="6" w:color="000000"/>
+              <w:left w:val="nil" w:sz="6" w:color="000000"/>
+              <w:right w:val="nil" w:sz="6" w:color="000000"/>
+            </w:tcBorders>
+          </w:tcPr>
+          <w:p>
+            <w:pPr>
+              <w:jc w:val="center"/>
+            </w:pPr>
+            <w:r/>
+            <w:r>
+              <w:rPr>
+                <w:rFonts w:ascii="Times New Roman" w:hAnsi="Times New Roman"/>
+                <w:sz w:val="18"/>
+              </w:rPr>
+              <w:t>4,6</w:t>
+            </w:r>
+          </w:p>
+        </w:tc>
+      </w:tr>
+      <w:tr>
+        <w:tc>
+          <w:tcPr>
+            <w:tcW w:type="dxa" w:w="1567"/>
+            <w:tcBorders>
+              <w:top w:val="single" w:sz="6" w:color="000000"/>
+              <w:bottom w:val="single" w:sz="6" w:color="000000"/>
+              <w:left w:val="nil" w:sz="6" w:color="000000"/>
+              <w:right w:val="nil" w:sz="6" w:color="000000"/>
+            </w:tcBorders>
+          </w:tcPr>
+          <w:p>
+            <w:pPr>
+              <w:jc w:val="left"/>
+            </w:pPr>
+            <w:r/>
+            <w:r>
+              <w:rPr>
+                <w:rFonts w:ascii="Times New Roman" w:hAnsi="Times New Roman"/>
+                <w:sz w:val="18"/>
+              </w:rPr>
+              <w:t>Depressão</w:t>
+            </w:r>
+          </w:p>
+        </w:tc>
+        <w:tc>
+          <w:tcPr>
+            <w:tcW w:type="dxa" w:w="1567"/>
+            <w:tcBorders>
+              <w:top w:val="single" w:sz="6" w:color="000000"/>
+              <w:bottom w:val="single" w:sz="6" w:color="000000"/>
+              <w:left w:val="nil" w:sz="6" w:color="000000"/>
+              <w:right w:val="nil" w:sz="6" w:color="000000"/>
+            </w:tcBorders>
+          </w:tcPr>
+          <w:p>
+            <w:pPr>
+              <w:jc w:val="center"/>
+            </w:pPr>
+            <w:r/>
+            <w:r>
+              <w:rPr>
+                <w:rFonts w:ascii="Times New Roman" w:hAnsi="Times New Roman"/>
+                <w:sz w:val="18"/>
+              </w:rPr>
+              <w:t>0,42</w:t>
+            </w:r>
+          </w:p>
+        </w:tc>
+        <w:tc>
+          <w:tcPr>
+            <w:tcW w:type="dxa" w:w="1567"/>
+            <w:tcBorders>
+              <w:top w:val="single" w:sz="6" w:color="000000"/>
+              <w:bottom w:val="single" w:sz="6" w:color="000000"/>
+              <w:left w:val="nil" w:sz="6" w:color="000000"/>
+              <w:right w:val="nil" w:sz="6" w:color="000000"/>
+            </w:tcBorders>
+          </w:tcPr>
+          <w:p>
+            <w:pPr>
+              <w:jc w:val="center"/>
+            </w:pPr>
+            <w:r/>
+            <w:r>
+              <w:rPr>
+                <w:rFonts w:ascii="Times New Roman" w:hAnsi="Times New Roman"/>
+                <w:sz w:val="18"/>
+              </w:rPr>
+              <w:t>+0,13</w:t>
+            </w:r>
+          </w:p>
+        </w:tc>
+        <w:tc>
+          <w:tcPr>
+            <w:tcW w:type="dxa" w:w="1567"/>
+            <w:tcBorders>
+              <w:top w:val="single" w:sz="6" w:color="000000"/>
+              <w:bottom w:val="single" w:sz="6" w:color="000000"/>
+              <w:left w:val="nil" w:sz="6" w:color="000000"/>
+              <w:right w:val="nil" w:sz="6" w:color="000000"/>
+            </w:tcBorders>
+          </w:tcPr>
+          <w:p>
+            <w:pPr>
+              <w:jc w:val="center"/>
+            </w:pPr>
+            <w:r/>
+            <w:r>
+              <w:rPr>
+                <w:rFonts w:ascii="Times New Roman" w:hAnsi="Times New Roman"/>
+                <w:sz w:val="18"/>
+              </w:rPr>
+              <w:t>+0,49</w:t>
+            </w:r>
+          </w:p>
+        </w:tc>
+        <w:tc>
+          <w:tcPr>
+            <w:tcW w:type="dxa" w:w="1567"/>
+            <w:tcBorders>
+              <w:top w:val="single" w:sz="6" w:color="000000"/>
+              <w:bottom w:val="single" w:sz="6" w:color="000000"/>
+              <w:left w:val="nil" w:sz="6" w:color="000000"/>
+              <w:right w:val="nil" w:sz="6" w:color="000000"/>
+            </w:tcBorders>
+          </w:tcPr>
+          <w:p>
+            <w:pPr>
+              <w:jc w:val="center"/>
+            </w:pPr>
+            <w:r/>
+            <w:r>
+              <w:rPr>
+                <w:rFonts w:ascii="Times New Roman" w:hAnsi="Times New Roman"/>
+                <w:sz w:val="18"/>
+              </w:rPr>
+              <w:t>+0,62</w:t>
+            </w:r>
+          </w:p>
+        </w:tc>
+        <w:tc>
+          <w:tcPr>
+            <w:tcW w:type="dxa" w:w="1567"/>
+            <w:tcBorders>
+              <w:top w:val="single" w:sz="6" w:color="000000"/>
+              <w:bottom w:val="single" w:sz="6" w:color="000000"/>
+              <w:left w:val="nil" w:sz="6" w:color="000000"/>
+              <w:right w:val="nil" w:sz="6" w:color="000000"/>
+            </w:tcBorders>
+          </w:tcPr>
+          <w:p>
+            <w:pPr>
+              <w:jc w:val="center"/>
+            </w:pPr>
+            <w:r/>
+            <w:r>
+              <w:rPr>
+                <w:rFonts w:ascii="Times New Roman" w:hAnsi="Times New Roman"/>
+                <w:sz w:val="18"/>
+              </w:rPr>
+              <w:t>3,9</w:t>
+            </w:r>
+          </w:p>
+        </w:tc>
+      </w:tr>
+      <w:tr>
+        <w:tc>
+          <w:tcPr>
+            <w:tcW w:type="dxa" w:w="1567"/>
+            <w:tcBorders>
+              <w:top w:val="single" w:sz="6" w:color="000000"/>
+              <w:bottom w:val="single" w:sz="6" w:color="000000"/>
+              <w:left w:val="nil" w:sz="6" w:color="000000"/>
+              <w:right w:val="nil" w:sz="6" w:color="000000"/>
+            </w:tcBorders>
+          </w:tcPr>
+          <w:p>
+            <w:pPr>
+              <w:jc w:val="left"/>
+            </w:pPr>
+            <w:r/>
+            <w:r>
+              <w:rPr>
+                <w:rFonts w:ascii="Times New Roman" w:hAnsi="Times New Roman"/>
+                <w:sz w:val="18"/>
+              </w:rPr>
+              <w:t>Raiva</w:t>
+            </w:r>
+          </w:p>
+        </w:tc>
+        <w:tc>
+          <w:tcPr>
+            <w:tcW w:type="dxa" w:w="1567"/>
+            <w:tcBorders>
+              <w:top w:val="single" w:sz="6" w:color="000000"/>
+              <w:bottom w:val="single" w:sz="6" w:color="000000"/>
+              <w:left w:val="nil" w:sz="6" w:color="000000"/>
+              <w:right w:val="nil" w:sz="6" w:color="000000"/>
+            </w:tcBorders>
+          </w:tcPr>
+          <w:p>
+            <w:pPr>
+              <w:jc w:val="center"/>
+            </w:pPr>
+            <w:r/>
+            <w:r>
+              <w:rPr>
+                <w:rFonts w:ascii="Times New Roman" w:hAnsi="Times New Roman"/>
+                <w:sz w:val="18"/>
+              </w:rPr>
+              <w:t>0,73</w:t>
+            </w:r>
+          </w:p>
+        </w:tc>
+        <w:tc>
+          <w:tcPr>
+            <w:tcW w:type="dxa" w:w="1567"/>
+            <w:tcBorders>
+              <w:top w:val="single" w:sz="6" w:color="000000"/>
+              <w:bottom w:val="single" w:sz="6" w:color="000000"/>
+              <w:left w:val="nil" w:sz="6" w:color="000000"/>
+              <w:right w:val="nil" w:sz="6" w:color="000000"/>
+            </w:tcBorders>
+          </w:tcPr>
+          <w:p>
+            <w:pPr>
+              <w:jc w:val="center"/>
+            </w:pPr>
+            <w:r/>
+            <w:r>
+              <w:rPr>
+                <w:rFonts w:ascii="Times New Roman" w:hAnsi="Times New Roman"/>
+                <w:sz w:val="18"/>
+              </w:rPr>
+              <w:t>+0,13</w:t>
+            </w:r>
+          </w:p>
+        </w:tc>
+        <w:tc>
+          <w:tcPr>
+            <w:tcW w:type="dxa" w:w="1567"/>
+            <w:tcBorders>
+              <w:top w:val="single" w:sz="6" w:color="000000"/>
+              <w:bottom w:val="single" w:sz="6" w:color="000000"/>
+              <w:left w:val="nil" w:sz="6" w:color="000000"/>
+              <w:right w:val="nil" w:sz="6" w:color="000000"/>
+            </w:tcBorders>
+          </w:tcPr>
+          <w:p>
+            <w:pPr>
+              <w:jc w:val="center"/>
+            </w:pPr>
+            <w:r/>
+            <w:r>
+              <w:rPr>
+                <w:rFonts w:ascii="Times New Roman" w:hAnsi="Times New Roman"/>
+                <w:sz w:val="18"/>
+              </w:rPr>
+              <w:t>+0,40</w:t>
+            </w:r>
+          </w:p>
+        </w:tc>
+        <w:tc>
+          <w:tcPr>
+            <w:tcW w:type="dxa" w:w="1567"/>
+            <w:tcBorders>
+              <w:top w:val="single" w:sz="6" w:color="000000"/>
+              <w:bottom w:val="single" w:sz="6" w:color="000000"/>
+              <w:left w:val="nil" w:sz="6" w:color="000000"/>
+              <w:right w:val="nil" w:sz="6" w:color="000000"/>
+            </w:tcBorders>
+          </w:tcPr>
+          <w:p>
+            <w:pPr>
+              <w:jc w:val="center"/>
+            </w:pPr>
+            <w:r/>
+            <w:r>
+              <w:rPr>
+                <w:rFonts w:ascii="Times New Roman" w:hAnsi="Times New Roman"/>
+                <w:sz w:val="18"/>
+              </w:rPr>
+              <w:t>+1,63</w:t>
+            </w:r>
+          </w:p>
+        </w:tc>
+        <w:tc>
+          <w:tcPr>
+            <w:tcW w:type="dxa" w:w="1567"/>
+            <w:tcBorders>
+              <w:top w:val="single" w:sz="6" w:color="000000"/>
+              <w:bottom w:val="single" w:sz="6" w:color="000000"/>
+              <w:left w:val="nil" w:sz="6" w:color="000000"/>
+              <w:right w:val="nil" w:sz="6" w:color="000000"/>
+            </w:tcBorders>
+          </w:tcPr>
+          <w:p>
+            <w:pPr>
+              <w:jc w:val="center"/>
+            </w:pPr>
+            <w:r/>
+            <w:r>
+              <w:rPr>
+                <w:rFonts w:ascii="Times New Roman" w:hAnsi="Times New Roman"/>
+                <w:sz w:val="18"/>
+              </w:rPr>
+              <w:t>3,3</w:t>
+            </w:r>
+          </w:p>
+        </w:tc>
+      </w:tr>
+      <w:tr>
+        <w:tc>
+          <w:tcPr>
+            <w:tcW w:type="dxa" w:w="1567"/>
+            <w:tcBorders>
+              <w:top w:val="single" w:sz="6" w:color="000000"/>
+              <w:bottom w:val="single" w:sz="6" w:color="000000"/>
+              <w:left w:val="nil" w:sz="6" w:color="000000"/>
+              <w:right w:val="nil" w:sz="6" w:color="000000"/>
+            </w:tcBorders>
+          </w:tcPr>
+          <w:p>
+            <w:pPr>
+              <w:jc w:val="left"/>
+            </w:pPr>
+            <w:r/>
+            <w:r>
+              <w:rPr>
+                <w:rFonts w:ascii="Times New Roman" w:hAnsi="Times New Roman"/>
+                <w:sz w:val="18"/>
+              </w:rPr>
+              <w:t>Confusão</w:t>
+            </w:r>
+          </w:p>
+        </w:tc>
+        <w:tc>
+          <w:tcPr>
+            <w:tcW w:type="dxa" w:w="1567"/>
+            <w:tcBorders>
+              <w:top w:val="single" w:sz="6" w:color="000000"/>
+              <w:bottom w:val="single" w:sz="6" w:color="000000"/>
+              <w:left w:val="nil" w:sz="6" w:color="000000"/>
+              <w:right w:val="nil" w:sz="6" w:color="000000"/>
+            </w:tcBorders>
+          </w:tcPr>
+          <w:p>
+            <w:pPr>
+              <w:jc w:val="center"/>
+            </w:pPr>
+            <w:r/>
+            <w:r>
+              <w:rPr>
+                <w:rFonts w:ascii="Times New Roman" w:hAnsi="Times New Roman"/>
+                <w:sz w:val="18"/>
+              </w:rPr>
+              <w:t>0,85</w:t>
+            </w:r>
+          </w:p>
+        </w:tc>
+        <w:tc>
+          <w:tcPr>
+            <w:tcW w:type="dxa" w:w="1567"/>
+            <w:tcBorders>
+              <w:top w:val="single" w:sz="6" w:color="000000"/>
+              <w:bottom w:val="single" w:sz="6" w:color="000000"/>
+              <w:left w:val="nil" w:sz="6" w:color="000000"/>
+              <w:right w:val="nil" w:sz="6" w:color="000000"/>
+            </w:tcBorders>
+          </w:tcPr>
+          <w:p>
+            <w:pPr>
+              <w:jc w:val="center"/>
+            </w:pPr>
+            <w:r/>
+            <w:r>
+              <w:rPr>
+                <w:rFonts w:ascii="Times New Roman" w:hAnsi="Times New Roman"/>
+                <w:sz w:val="18"/>
+              </w:rPr>
+              <w:t>-0,08</w:t>
+            </w:r>
+          </w:p>
+        </w:tc>
+        <w:tc>
+          <w:tcPr>
+            <w:tcW w:type="dxa" w:w="1567"/>
+            <w:tcBorders>
+              <w:top w:val="single" w:sz="6" w:color="000000"/>
+              <w:bottom w:val="single" w:sz="6" w:color="000000"/>
+              <w:left w:val="nil" w:sz="6" w:color="000000"/>
+              <w:right w:val="nil" w:sz="6" w:color="000000"/>
+            </w:tcBorders>
+          </w:tcPr>
+          <w:p>
+            <w:pPr>
+              <w:jc w:val="center"/>
+            </w:pPr>
+            <w:r/>
+            <w:r>
+              <w:rPr>
+                <w:rFonts w:ascii="Times New Roman" w:hAnsi="Times New Roman"/>
+                <w:sz w:val="18"/>
+              </w:rPr>
+              <w:t>-0,67</w:t>
+            </w:r>
+          </w:p>
+        </w:tc>
+        <w:tc>
+          <w:tcPr>
+            <w:tcW w:type="dxa" w:w="1567"/>
+            <w:tcBorders>
+              <w:top w:val="single" w:sz="6" w:color="000000"/>
+              <w:bottom w:val="single" w:sz="6" w:color="000000"/>
+              <w:left w:val="nil" w:sz="6" w:color="000000"/>
+              <w:right w:val="nil" w:sz="6" w:color="000000"/>
+            </w:tcBorders>
+          </w:tcPr>
+          <w:p>
+            <w:pPr>
+              <w:jc w:val="center"/>
+            </w:pPr>
+            <w:r/>
+            <w:r>
+              <w:rPr>
+                <w:rFonts w:ascii="Times New Roman" w:hAnsi="Times New Roman"/>
+                <w:sz w:val="18"/>
+              </w:rPr>
+              <w:t>+0,03</w:t>
+            </w:r>
+          </w:p>
+        </w:tc>
+        <w:tc>
+          <w:tcPr>
+            <w:tcW w:type="dxa" w:w="1567"/>
+            <w:tcBorders>
+              <w:top w:val="single" w:sz="6" w:color="000000"/>
+              <w:bottom w:val="single" w:sz="6" w:color="000000"/>
+              <w:left w:val="nil" w:sz="6" w:color="000000"/>
+              <w:right w:val="nil" w:sz="6" w:color="000000"/>
+            </w:tcBorders>
+          </w:tcPr>
+          <w:p>
+            <w:pPr>
+              <w:jc w:val="center"/>
+            </w:pPr>
+            <w:r/>
+            <w:r>
+              <w:rPr>
+                <w:rFonts w:ascii="Times New Roman" w:hAnsi="Times New Roman"/>
+                <w:sz w:val="18"/>
+              </w:rPr>
+              <w:t>5,4</w:t>
+            </w:r>
+          </w:p>
+        </w:tc>
+      </w:tr>
+    </w:tbl>
+    <w:p>
+      <w:pPr>
+        <w:spacing w:after="0"/>
+      </w:pPr>
+      <w:r>
+        <w:rPr>
+          <w:i/>
+          <w:sz w:val="17"/>
+        </w:rPr>
+        <w:t>P′ = derivada primeira (taxa de variação instantânea); inflexão = raiz da derivada segunda (P″ = 0) no intervalo.</w:t>
+      </w:r>
+    </w:p>
+    <w:p>
+      <w:pPr>
+        <w:spacing w:after="120"/>
+      </w:pPr>
+      <w:r>
+        <w:rPr>
+          <w:sz w:val="18"/>
+        </w:rPr>
+        <w:t>Fonte: dados da pesquisa (2026).</w:t>
+      </w:r>
+    </w:p>
+    <w:p>
+      <w:pPr>
+        <w:spacing w:before="120"/>
+        <w:jc w:val="center"/>
+      </w:pPr>
+      <w:r>
+        <w:drawing>
+          <wp:inline xmlns:a="http://schemas.openxmlformats.org/drawingml/2006/main" xmlns:pic="http://schemas.openxmlformats.org/drawingml/2006/picture">
+            <wp:extent cx="5400000" cy="2284615"/>
+            <wp:docPr id="15" name="Picture 15"/>
+            <wp:cNvGraphicFramePr>
+              <a:graphicFrameLocks noChangeAspect="1"/>
+            </wp:cNvGraphicFramePr>
+            <a:graphic>
+              <a:graphicData uri="http://schemas.openxmlformats.org/drawingml/2006/picture">
+                <pic:pic>
+                  <pic:nvPicPr>
+                    <pic:cNvPr id="0" name="deriv_poly.png"/>
+                    <pic:cNvPicPr/>
+                  </pic:nvPicPr>
+                  <pic:blipFill>
+                    <a:blip r:embed="rId23"/>
+                    <a:stretch>
+                      <a:fillRect/>
+                    </a:stretch>
+                  </pic:blipFill>
+                  <pic:spPr>
+                    <a:xfrm>
+                      <a:off x="0" y="0"/>
+                      <a:ext cx="5400000" cy="2284615"/>
+                    </a:xfrm>
+                    <a:prstGeom prst="rect"/>
+                  </pic:spPr>
+                </pic:pic>
+              </a:graphicData>
+            </a:graphic>
+          </wp:inline>
+        </w:drawing>
+      </w:r>
+    </w:p>
+    <w:p>
+      <w:pPr>
+        <w:jc w:val="center"/>
+      </w:pPr>
+      <w:r>
+        <w:rPr>
+          <w:sz w:val="22"/>
+        </w:rPr>
+        <w:t>Figura 15 – Ajuste polinomial P(t) das médias diárias de vigor e fadiga, com a derivada P′(t) (taxa de variação) e o ponto de inflexão.</w:t>
+      </w:r>
+    </w:p>
+    <w:p>
+      <w:pPr>
+        <w:spacing w:after="120"/>
+        <w:jc w:val="center"/>
+      </w:pPr>
+      <w:r>
+        <w:rPr>
+          <w:sz w:val="18"/>
+        </w:rPr>
+        <w:t>Fonte: elaboração dos autores (2026).</w:t>
+      </w:r>
+    </w:p>
+    <w:p>
+      <w:pPr>
+        <w:spacing w:line="360" w:lineRule="auto" w:after="120"/>
+        <w:ind w:firstLine="709"/>
+        <w:jc w:val="both"/>
+      </w:pPr>
+      <w:r>
+        <w:rPr>
+          <w:b w:val="0"/>
+          <w:sz w:val="24"/>
+        </w:rPr>
+        <w:t>Para caracterizar formalmente a dinâmica temporal, ajustou-se uma função polinomial de grau 3 às médias diárias de cada dimensão e derivaram-se as respectivas taxas de variação (Tabela 16; Figura 15). Os ajustes foram excelentes para as variáveis do eixo energia–fadiga (vigor R² = 0,96; fadiga R² = 0,95) e mais fracos para as dimensões negativas próximas do piso (p. ex., depressão R² = 0,42), cuja variância reduzida limita a modelagem. O vigor caiu a uma taxa média de -0,64 ponto/dia, com a maior velocidade de queda no início da semana (P′ no Dia 1 = -3,52 ponto/dia) e desaceleração progressiva, ao passo que a fadiga subiu em espelho (taxa média = +0,64 ponto/dia; P′ no Dia 1 = +2,23). A derivada segunda localizou um ponto de inflexão em torno do dia 4,2 para ambas — o momento em que a taxa de deterioração deixa de acelerar —, o que fornece uma leitura quantitativa do ritmo do desgaste e sinaliza a metade do microciclo como o marco a partir do qual a resposta afetiva muda de regime.</w:t>
       </w:r>
     </w:p>
     <w:p>

</xml_diff>

<commit_message>
Padronizar as 15 figuras no estilo MDPI Sports + remover dims de piso da 3.13
- Novo template plotly compartilhado (mdpi_style.py): fonte sans-serif, grade
  cinza-clara, linhas de eixo com ticks para fora e paleta consistente —
  aplicado a todas as figuras para um visual uniforme de periódico.
- Tabela 3.13 (modelagem polinomial) restrita ao eixo energia-fadiga (vigor,
  fadiga, PTH); dimensões negativas de piso, com ajuste fraco, omitidas.
- Ajuste de espaçamento da figura polinomial (eixos duplos) para evitar
  sobreposição dos títulos.

docx e PDF (26 páginas) regenerados; leak-scan: 0 vazamentos.

Co-Authored-By: Claude Opus 4.8 <noreply@anthropic.com>
Claude-Session: https://claude.ai/code/session_01P7yGiDeoGDyjWvPWQVsUrj
</commit_message>
<xml_diff>
--- a/Artigos/Artigo_humor_HANDEBOL.docx
+++ b/Artigos/Artigo_humor_HANDEBOL.docx
@@ -15262,7 +15262,7 @@
         <w:rPr>
           <w:sz w:val="22"/>
         </w:rPr>
-        <w:t>Tabela 16 – Modelagem polinomial (grau 3) das médias diárias: qualidade do ajuste (R²), taxa de variação média (pontos/dia), taxa instantânea nas bordas (P′ no Dia 1 e no Dia 7) e ponto de inflexão.</w:t>
+        <w:t>Tabela 16 – Modelagem polinomial (grau 3) das médias diárias do eixo energia–fadiga: qualidade do ajuste (R²), taxa de variação média (pontos/dia), taxa instantânea nas bordas (P′ no Dia 1 e no Dia 7) e ponto de inflexão.</w:t>
       </w:r>
     </w:p>
     <w:tbl>
@@ -15869,590 +15869,6 @@
           </w:p>
         </w:tc>
       </w:tr>
-      <w:tr>
-        <w:tc>
-          <w:tcPr>
-            <w:tcW w:type="dxa" w:w="1567"/>
-            <w:tcBorders>
-              <w:top w:val="single" w:sz="6" w:color="000000"/>
-              <w:bottom w:val="single" w:sz="6" w:color="000000"/>
-              <w:left w:val="nil" w:sz="6" w:color="000000"/>
-              <w:right w:val="nil" w:sz="6" w:color="000000"/>
-            </w:tcBorders>
-          </w:tcPr>
-          <w:p>
-            <w:pPr>
-              <w:jc w:val="left"/>
-            </w:pPr>
-            <w:r/>
-            <w:r>
-              <w:rPr>
-                <w:rFonts w:ascii="Times New Roman" w:hAnsi="Times New Roman"/>
-                <w:sz w:val="18"/>
-              </w:rPr>
-              <w:t>Tensão</w:t>
-            </w:r>
-          </w:p>
-        </w:tc>
-        <w:tc>
-          <w:tcPr>
-            <w:tcW w:type="dxa" w:w="1567"/>
-            <w:tcBorders>
-              <w:top w:val="single" w:sz="6" w:color="000000"/>
-              <w:bottom w:val="single" w:sz="6" w:color="000000"/>
-              <w:left w:val="nil" w:sz="6" w:color="000000"/>
-              <w:right w:val="nil" w:sz="6" w:color="000000"/>
-            </w:tcBorders>
-          </w:tcPr>
-          <w:p>
-            <w:pPr>
-              <w:jc w:val="center"/>
-            </w:pPr>
-            <w:r/>
-            <w:r>
-              <w:rPr>
-                <w:rFonts w:ascii="Times New Roman" w:hAnsi="Times New Roman"/>
-                <w:sz w:val="18"/>
-              </w:rPr>
-              <w:t>0,80</w:t>
-            </w:r>
-          </w:p>
-        </w:tc>
-        <w:tc>
-          <w:tcPr>
-            <w:tcW w:type="dxa" w:w="1567"/>
-            <w:tcBorders>
-              <w:top w:val="single" w:sz="6" w:color="000000"/>
-              <w:bottom w:val="single" w:sz="6" w:color="000000"/>
-              <w:left w:val="nil" w:sz="6" w:color="000000"/>
-              <w:right w:val="nil" w:sz="6" w:color="000000"/>
-            </w:tcBorders>
-          </w:tcPr>
-          <w:p>
-            <w:pPr>
-              <w:jc w:val="center"/>
-            </w:pPr>
-            <w:r/>
-            <w:r>
-              <w:rPr>
-                <w:rFonts w:ascii="Times New Roman" w:hAnsi="Times New Roman"/>
-                <w:sz w:val="18"/>
-              </w:rPr>
-              <w:t>-0,18</w:t>
-            </w:r>
-          </w:p>
-        </w:tc>
-        <w:tc>
-          <w:tcPr>
-            <w:tcW w:type="dxa" w:w="1567"/>
-            <w:tcBorders>
-              <w:top w:val="single" w:sz="6" w:color="000000"/>
-              <w:bottom w:val="single" w:sz="6" w:color="000000"/>
-              <w:left w:val="nil" w:sz="6" w:color="000000"/>
-              <w:right w:val="nil" w:sz="6" w:color="000000"/>
-            </w:tcBorders>
-          </w:tcPr>
-          <w:p>
-            <w:pPr>
-              <w:jc w:val="center"/>
-            </w:pPr>
-            <w:r/>
-            <w:r>
-              <w:rPr>
-                <w:rFonts w:ascii="Times New Roman" w:hAnsi="Times New Roman"/>
-                <w:sz w:val="18"/>
-              </w:rPr>
-              <w:t>-0,87</w:t>
-            </w:r>
-          </w:p>
-        </w:tc>
-        <w:tc>
-          <w:tcPr>
-            <w:tcW w:type="dxa" w:w="1567"/>
-            <w:tcBorders>
-              <w:top w:val="single" w:sz="6" w:color="000000"/>
-              <w:bottom w:val="single" w:sz="6" w:color="000000"/>
-              <w:left w:val="nil" w:sz="6" w:color="000000"/>
-              <w:right w:val="nil" w:sz="6" w:color="000000"/>
-            </w:tcBorders>
-          </w:tcPr>
-          <w:p>
-            <w:pPr>
-              <w:jc w:val="center"/>
-            </w:pPr>
-            <w:r/>
-            <w:r>
-              <w:rPr>
-                <w:rFonts w:ascii="Times New Roman" w:hAnsi="Times New Roman"/>
-                <w:sz w:val="18"/>
-              </w:rPr>
-              <w:t>-0,37</w:t>
-            </w:r>
-          </w:p>
-        </w:tc>
-        <w:tc>
-          <w:tcPr>
-            <w:tcW w:type="dxa" w:w="1567"/>
-            <w:tcBorders>
-              <w:top w:val="single" w:sz="6" w:color="000000"/>
-              <w:bottom w:val="single" w:sz="6" w:color="000000"/>
-              <w:left w:val="nil" w:sz="6" w:color="000000"/>
-              <w:right w:val="nil" w:sz="6" w:color="000000"/>
-            </w:tcBorders>
-          </w:tcPr>
-          <w:p>
-            <w:pPr>
-              <w:jc w:val="center"/>
-            </w:pPr>
-            <w:r/>
-            <w:r>
-              <w:rPr>
-                <w:rFonts w:ascii="Times New Roman" w:hAnsi="Times New Roman"/>
-                <w:sz w:val="18"/>
-              </w:rPr>
-              <w:t>4,6</w:t>
-            </w:r>
-          </w:p>
-        </w:tc>
-      </w:tr>
-      <w:tr>
-        <w:tc>
-          <w:tcPr>
-            <w:tcW w:type="dxa" w:w="1567"/>
-            <w:tcBorders>
-              <w:top w:val="single" w:sz="6" w:color="000000"/>
-              <w:bottom w:val="single" w:sz="6" w:color="000000"/>
-              <w:left w:val="nil" w:sz="6" w:color="000000"/>
-              <w:right w:val="nil" w:sz="6" w:color="000000"/>
-            </w:tcBorders>
-          </w:tcPr>
-          <w:p>
-            <w:pPr>
-              <w:jc w:val="left"/>
-            </w:pPr>
-            <w:r/>
-            <w:r>
-              <w:rPr>
-                <w:rFonts w:ascii="Times New Roman" w:hAnsi="Times New Roman"/>
-                <w:sz w:val="18"/>
-              </w:rPr>
-              <w:t>Depressão</w:t>
-            </w:r>
-          </w:p>
-        </w:tc>
-        <w:tc>
-          <w:tcPr>
-            <w:tcW w:type="dxa" w:w="1567"/>
-            <w:tcBorders>
-              <w:top w:val="single" w:sz="6" w:color="000000"/>
-              <w:bottom w:val="single" w:sz="6" w:color="000000"/>
-              <w:left w:val="nil" w:sz="6" w:color="000000"/>
-              <w:right w:val="nil" w:sz="6" w:color="000000"/>
-            </w:tcBorders>
-          </w:tcPr>
-          <w:p>
-            <w:pPr>
-              <w:jc w:val="center"/>
-            </w:pPr>
-            <w:r/>
-            <w:r>
-              <w:rPr>
-                <w:rFonts w:ascii="Times New Roman" w:hAnsi="Times New Roman"/>
-                <w:sz w:val="18"/>
-              </w:rPr>
-              <w:t>0,42</w:t>
-            </w:r>
-          </w:p>
-        </w:tc>
-        <w:tc>
-          <w:tcPr>
-            <w:tcW w:type="dxa" w:w="1567"/>
-            <w:tcBorders>
-              <w:top w:val="single" w:sz="6" w:color="000000"/>
-              <w:bottom w:val="single" w:sz="6" w:color="000000"/>
-              <w:left w:val="nil" w:sz="6" w:color="000000"/>
-              <w:right w:val="nil" w:sz="6" w:color="000000"/>
-            </w:tcBorders>
-          </w:tcPr>
-          <w:p>
-            <w:pPr>
-              <w:jc w:val="center"/>
-            </w:pPr>
-            <w:r/>
-            <w:r>
-              <w:rPr>
-                <w:rFonts w:ascii="Times New Roman" w:hAnsi="Times New Roman"/>
-                <w:sz w:val="18"/>
-              </w:rPr>
-              <w:t>+0,13</w:t>
-            </w:r>
-          </w:p>
-        </w:tc>
-        <w:tc>
-          <w:tcPr>
-            <w:tcW w:type="dxa" w:w="1567"/>
-            <w:tcBorders>
-              <w:top w:val="single" w:sz="6" w:color="000000"/>
-              <w:bottom w:val="single" w:sz="6" w:color="000000"/>
-              <w:left w:val="nil" w:sz="6" w:color="000000"/>
-              <w:right w:val="nil" w:sz="6" w:color="000000"/>
-            </w:tcBorders>
-          </w:tcPr>
-          <w:p>
-            <w:pPr>
-              <w:jc w:val="center"/>
-            </w:pPr>
-            <w:r/>
-            <w:r>
-              <w:rPr>
-                <w:rFonts w:ascii="Times New Roman" w:hAnsi="Times New Roman"/>
-                <w:sz w:val="18"/>
-              </w:rPr>
-              <w:t>+0,49</w:t>
-            </w:r>
-          </w:p>
-        </w:tc>
-        <w:tc>
-          <w:tcPr>
-            <w:tcW w:type="dxa" w:w="1567"/>
-            <w:tcBorders>
-              <w:top w:val="single" w:sz="6" w:color="000000"/>
-              <w:bottom w:val="single" w:sz="6" w:color="000000"/>
-              <w:left w:val="nil" w:sz="6" w:color="000000"/>
-              <w:right w:val="nil" w:sz="6" w:color="000000"/>
-            </w:tcBorders>
-          </w:tcPr>
-          <w:p>
-            <w:pPr>
-              <w:jc w:val="center"/>
-            </w:pPr>
-            <w:r/>
-            <w:r>
-              <w:rPr>
-                <w:rFonts w:ascii="Times New Roman" w:hAnsi="Times New Roman"/>
-                <w:sz w:val="18"/>
-              </w:rPr>
-              <w:t>+0,62</w:t>
-            </w:r>
-          </w:p>
-        </w:tc>
-        <w:tc>
-          <w:tcPr>
-            <w:tcW w:type="dxa" w:w="1567"/>
-            <w:tcBorders>
-              <w:top w:val="single" w:sz="6" w:color="000000"/>
-              <w:bottom w:val="single" w:sz="6" w:color="000000"/>
-              <w:left w:val="nil" w:sz="6" w:color="000000"/>
-              <w:right w:val="nil" w:sz="6" w:color="000000"/>
-            </w:tcBorders>
-          </w:tcPr>
-          <w:p>
-            <w:pPr>
-              <w:jc w:val="center"/>
-            </w:pPr>
-            <w:r/>
-            <w:r>
-              <w:rPr>
-                <w:rFonts w:ascii="Times New Roman" w:hAnsi="Times New Roman"/>
-                <w:sz w:val="18"/>
-              </w:rPr>
-              <w:t>3,9</w:t>
-            </w:r>
-          </w:p>
-        </w:tc>
-      </w:tr>
-      <w:tr>
-        <w:tc>
-          <w:tcPr>
-            <w:tcW w:type="dxa" w:w="1567"/>
-            <w:tcBorders>
-              <w:top w:val="single" w:sz="6" w:color="000000"/>
-              <w:bottom w:val="single" w:sz="6" w:color="000000"/>
-              <w:left w:val="nil" w:sz="6" w:color="000000"/>
-              <w:right w:val="nil" w:sz="6" w:color="000000"/>
-            </w:tcBorders>
-          </w:tcPr>
-          <w:p>
-            <w:pPr>
-              <w:jc w:val="left"/>
-            </w:pPr>
-            <w:r/>
-            <w:r>
-              <w:rPr>
-                <w:rFonts w:ascii="Times New Roman" w:hAnsi="Times New Roman"/>
-                <w:sz w:val="18"/>
-              </w:rPr>
-              <w:t>Raiva</w:t>
-            </w:r>
-          </w:p>
-        </w:tc>
-        <w:tc>
-          <w:tcPr>
-            <w:tcW w:type="dxa" w:w="1567"/>
-            <w:tcBorders>
-              <w:top w:val="single" w:sz="6" w:color="000000"/>
-              <w:bottom w:val="single" w:sz="6" w:color="000000"/>
-              <w:left w:val="nil" w:sz="6" w:color="000000"/>
-              <w:right w:val="nil" w:sz="6" w:color="000000"/>
-            </w:tcBorders>
-          </w:tcPr>
-          <w:p>
-            <w:pPr>
-              <w:jc w:val="center"/>
-            </w:pPr>
-            <w:r/>
-            <w:r>
-              <w:rPr>
-                <w:rFonts w:ascii="Times New Roman" w:hAnsi="Times New Roman"/>
-                <w:sz w:val="18"/>
-              </w:rPr>
-              <w:t>0,73</w:t>
-            </w:r>
-          </w:p>
-        </w:tc>
-        <w:tc>
-          <w:tcPr>
-            <w:tcW w:type="dxa" w:w="1567"/>
-            <w:tcBorders>
-              <w:top w:val="single" w:sz="6" w:color="000000"/>
-              <w:bottom w:val="single" w:sz="6" w:color="000000"/>
-              <w:left w:val="nil" w:sz="6" w:color="000000"/>
-              <w:right w:val="nil" w:sz="6" w:color="000000"/>
-            </w:tcBorders>
-          </w:tcPr>
-          <w:p>
-            <w:pPr>
-              <w:jc w:val="center"/>
-            </w:pPr>
-            <w:r/>
-            <w:r>
-              <w:rPr>
-                <w:rFonts w:ascii="Times New Roman" w:hAnsi="Times New Roman"/>
-                <w:sz w:val="18"/>
-              </w:rPr>
-              <w:t>+0,13</w:t>
-            </w:r>
-          </w:p>
-        </w:tc>
-        <w:tc>
-          <w:tcPr>
-            <w:tcW w:type="dxa" w:w="1567"/>
-            <w:tcBorders>
-              <w:top w:val="single" w:sz="6" w:color="000000"/>
-              <w:bottom w:val="single" w:sz="6" w:color="000000"/>
-              <w:left w:val="nil" w:sz="6" w:color="000000"/>
-              <w:right w:val="nil" w:sz="6" w:color="000000"/>
-            </w:tcBorders>
-          </w:tcPr>
-          <w:p>
-            <w:pPr>
-              <w:jc w:val="center"/>
-            </w:pPr>
-            <w:r/>
-            <w:r>
-              <w:rPr>
-                <w:rFonts w:ascii="Times New Roman" w:hAnsi="Times New Roman"/>
-                <w:sz w:val="18"/>
-              </w:rPr>
-              <w:t>+0,40</w:t>
-            </w:r>
-          </w:p>
-        </w:tc>
-        <w:tc>
-          <w:tcPr>
-            <w:tcW w:type="dxa" w:w="1567"/>
-            <w:tcBorders>
-              <w:top w:val="single" w:sz="6" w:color="000000"/>
-              <w:bottom w:val="single" w:sz="6" w:color="000000"/>
-              <w:left w:val="nil" w:sz="6" w:color="000000"/>
-              <w:right w:val="nil" w:sz="6" w:color="000000"/>
-            </w:tcBorders>
-          </w:tcPr>
-          <w:p>
-            <w:pPr>
-              <w:jc w:val="center"/>
-            </w:pPr>
-            <w:r/>
-            <w:r>
-              <w:rPr>
-                <w:rFonts w:ascii="Times New Roman" w:hAnsi="Times New Roman"/>
-                <w:sz w:val="18"/>
-              </w:rPr>
-              <w:t>+1,63</w:t>
-            </w:r>
-          </w:p>
-        </w:tc>
-        <w:tc>
-          <w:tcPr>
-            <w:tcW w:type="dxa" w:w="1567"/>
-            <w:tcBorders>
-              <w:top w:val="single" w:sz="6" w:color="000000"/>
-              <w:bottom w:val="single" w:sz="6" w:color="000000"/>
-              <w:left w:val="nil" w:sz="6" w:color="000000"/>
-              <w:right w:val="nil" w:sz="6" w:color="000000"/>
-            </w:tcBorders>
-          </w:tcPr>
-          <w:p>
-            <w:pPr>
-              <w:jc w:val="center"/>
-            </w:pPr>
-            <w:r/>
-            <w:r>
-              <w:rPr>
-                <w:rFonts w:ascii="Times New Roman" w:hAnsi="Times New Roman"/>
-                <w:sz w:val="18"/>
-              </w:rPr>
-              <w:t>3,3</w:t>
-            </w:r>
-          </w:p>
-        </w:tc>
-      </w:tr>
-      <w:tr>
-        <w:tc>
-          <w:tcPr>
-            <w:tcW w:type="dxa" w:w="1567"/>
-            <w:tcBorders>
-              <w:top w:val="single" w:sz="6" w:color="000000"/>
-              <w:bottom w:val="single" w:sz="6" w:color="000000"/>
-              <w:left w:val="nil" w:sz="6" w:color="000000"/>
-              <w:right w:val="nil" w:sz="6" w:color="000000"/>
-            </w:tcBorders>
-          </w:tcPr>
-          <w:p>
-            <w:pPr>
-              <w:jc w:val="left"/>
-            </w:pPr>
-            <w:r/>
-            <w:r>
-              <w:rPr>
-                <w:rFonts w:ascii="Times New Roman" w:hAnsi="Times New Roman"/>
-                <w:sz w:val="18"/>
-              </w:rPr>
-              <w:t>Confusão</w:t>
-            </w:r>
-          </w:p>
-        </w:tc>
-        <w:tc>
-          <w:tcPr>
-            <w:tcW w:type="dxa" w:w="1567"/>
-            <w:tcBorders>
-              <w:top w:val="single" w:sz="6" w:color="000000"/>
-              <w:bottom w:val="single" w:sz="6" w:color="000000"/>
-              <w:left w:val="nil" w:sz="6" w:color="000000"/>
-              <w:right w:val="nil" w:sz="6" w:color="000000"/>
-            </w:tcBorders>
-          </w:tcPr>
-          <w:p>
-            <w:pPr>
-              <w:jc w:val="center"/>
-            </w:pPr>
-            <w:r/>
-            <w:r>
-              <w:rPr>
-                <w:rFonts w:ascii="Times New Roman" w:hAnsi="Times New Roman"/>
-                <w:sz w:val="18"/>
-              </w:rPr>
-              <w:t>0,85</w:t>
-            </w:r>
-          </w:p>
-        </w:tc>
-        <w:tc>
-          <w:tcPr>
-            <w:tcW w:type="dxa" w:w="1567"/>
-            <w:tcBorders>
-              <w:top w:val="single" w:sz="6" w:color="000000"/>
-              <w:bottom w:val="single" w:sz="6" w:color="000000"/>
-              <w:left w:val="nil" w:sz="6" w:color="000000"/>
-              <w:right w:val="nil" w:sz="6" w:color="000000"/>
-            </w:tcBorders>
-          </w:tcPr>
-          <w:p>
-            <w:pPr>
-              <w:jc w:val="center"/>
-            </w:pPr>
-            <w:r/>
-            <w:r>
-              <w:rPr>
-                <w:rFonts w:ascii="Times New Roman" w:hAnsi="Times New Roman"/>
-                <w:sz w:val="18"/>
-              </w:rPr>
-              <w:t>-0,08</w:t>
-            </w:r>
-          </w:p>
-        </w:tc>
-        <w:tc>
-          <w:tcPr>
-            <w:tcW w:type="dxa" w:w="1567"/>
-            <w:tcBorders>
-              <w:top w:val="single" w:sz="6" w:color="000000"/>
-              <w:bottom w:val="single" w:sz="6" w:color="000000"/>
-              <w:left w:val="nil" w:sz="6" w:color="000000"/>
-              <w:right w:val="nil" w:sz="6" w:color="000000"/>
-            </w:tcBorders>
-          </w:tcPr>
-          <w:p>
-            <w:pPr>
-              <w:jc w:val="center"/>
-            </w:pPr>
-            <w:r/>
-            <w:r>
-              <w:rPr>
-                <w:rFonts w:ascii="Times New Roman" w:hAnsi="Times New Roman"/>
-                <w:sz w:val="18"/>
-              </w:rPr>
-              <w:t>-0,67</w:t>
-            </w:r>
-          </w:p>
-        </w:tc>
-        <w:tc>
-          <w:tcPr>
-            <w:tcW w:type="dxa" w:w="1567"/>
-            <w:tcBorders>
-              <w:top w:val="single" w:sz="6" w:color="000000"/>
-              <w:bottom w:val="single" w:sz="6" w:color="000000"/>
-              <w:left w:val="nil" w:sz="6" w:color="000000"/>
-              <w:right w:val="nil" w:sz="6" w:color="000000"/>
-            </w:tcBorders>
-          </w:tcPr>
-          <w:p>
-            <w:pPr>
-              <w:jc w:val="center"/>
-            </w:pPr>
-            <w:r/>
-            <w:r>
-              <w:rPr>
-                <w:rFonts w:ascii="Times New Roman" w:hAnsi="Times New Roman"/>
-                <w:sz w:val="18"/>
-              </w:rPr>
-              <w:t>+0,03</w:t>
-            </w:r>
-          </w:p>
-        </w:tc>
-        <w:tc>
-          <w:tcPr>
-            <w:tcW w:type="dxa" w:w="1567"/>
-            <w:tcBorders>
-              <w:top w:val="single" w:sz="6" w:color="000000"/>
-              <w:bottom w:val="single" w:sz="6" w:color="000000"/>
-              <w:left w:val="nil" w:sz="6" w:color="000000"/>
-              <w:right w:val="nil" w:sz="6" w:color="000000"/>
-            </w:tcBorders>
-          </w:tcPr>
-          <w:p>
-            <w:pPr>
-              <w:jc w:val="center"/>
-            </w:pPr>
-            <w:r/>
-            <w:r>
-              <w:rPr>
-                <w:rFonts w:ascii="Times New Roman" w:hAnsi="Times New Roman"/>
-                <w:sz w:val="18"/>
-              </w:rPr>
-              <w:t>5,4</w:t>
-            </w:r>
-          </w:p>
-        </w:tc>
-      </w:tr>
     </w:tbl>
     <w:p>
       <w:pPr>
@@ -16463,7 +15879,7 @@
           <w:i/>
           <w:sz w:val="17"/>
         </w:rPr>
-        <w:t>P′ = derivada primeira (taxa de variação instantânea); inflexão = raiz da derivada segunda (P″ = 0) no intervalo.</w:t>
+        <w:t>P′ = derivada primeira (taxa de variação instantânea); inflexão = raiz da derivada segunda (P″ = 0) no intervalo. As dimensões negativas, com forte efeito de piso e ajuste fraco, foram omitidas.</w:t>
       </w:r>
     </w:p>
     <w:p>
@@ -16485,7 +15901,7 @@
       <w:r>
         <w:drawing>
           <wp:inline xmlns:a="http://schemas.openxmlformats.org/drawingml/2006/main" xmlns:pic="http://schemas.openxmlformats.org/drawingml/2006/picture">
-            <wp:extent cx="5400000" cy="2284615"/>
+            <wp:extent cx="5400000" cy="2121429"/>
             <wp:docPr id="15" name="Picture 15"/>
             <wp:cNvGraphicFramePr>
               <a:graphicFrameLocks noChangeAspect="1"/>
@@ -16506,7 +15922,7 @@
                   <pic:spPr>
                     <a:xfrm>
                       <a:off x="0" y="0"/>
-                      <a:ext cx="5400000" cy="2284615"/>
+                      <a:ext cx="5400000" cy="2121429"/>
                     </a:xfrm>
                     <a:prstGeom prst="rect"/>
                   </pic:spPr>
@@ -16551,7 +15967,7 @@
           <w:b w:val="0"/>
           <w:sz w:val="24"/>
         </w:rPr>
-        <w:t>Para caracterizar formalmente a dinâmica temporal, ajustou-se uma função polinomial de grau 3 às médias diárias de cada dimensão e derivaram-se as respectivas taxas de variação (Tabela 16; Figura 15). Os ajustes foram excelentes para as variáveis do eixo energia–fadiga (vigor R² = 0,96; fadiga R² = 0,95) e mais fracos para as dimensões negativas próximas do piso (p. ex., depressão R² = 0,42), cuja variância reduzida limita a modelagem. O vigor caiu a uma taxa média de -0,64 ponto/dia, com a maior velocidade de queda no início da semana (P′ no Dia 1 = -3,52 ponto/dia) e desaceleração progressiva, ao passo que a fadiga subiu em espelho (taxa média = +0,64 ponto/dia; P′ no Dia 1 = +2,23). A derivada segunda localizou um ponto de inflexão em torno do dia 4,2 para ambas — o momento em que a taxa de deterioração deixa de acelerar —, o que fornece uma leitura quantitativa do ritmo do desgaste e sinaliza a metade do microciclo como o marco a partir do qual a resposta afetiva muda de regime.</w:t>
+        <w:t>Para caracterizar formalmente a dinâmica temporal, ajustou-se uma função polinomial de grau 3 às médias diárias de cada dimensão e derivaram-se as respectivas taxas de variação (Tabela 16; Figura 15). A modelagem restringiu-se ao eixo energia–fadiga (vigor, fadiga e PTH), onde os ajustes foram excelentes (vigor R² = 0,96; fadiga R² = 0,95); as dimensões negativas, próximas do piso e com variância reduzida, ajustaram-se mal e foram omitidas da modelagem. O vigor caiu a uma taxa média de -0,64 ponto/dia, com a maior velocidade de queda no início da semana (P′ no Dia 1 = -3,52 ponto/dia) e desaceleração progressiva, ao passo que a fadiga subiu em espelho (taxa média = +0,64 ponto/dia; P′ no Dia 1 = +2,23). A derivada segunda localizou um ponto de inflexão em torno do dia 4,2 para ambas — o momento em que a taxa de deterioração deixa de acelerar —, o que fornece uma leitura quantitativa do ritmo do desgaste e sinaliza a metade do microciclo como o marco a partir do qual a resposta afetiva muda de regime.</w:t>
       </w:r>
     </w:p>
     <w:p>

</xml_diff>

<commit_message>
Segunda derivada + acoplamento das variáveis e ordem canônica POMS/BRUMS
- Segunda derivada (aceleração/concavidade): adiciona P″(D1) e P″(D7) à tabela
  3.13 e um parágrafo interpretando a concavidade (vigor convexo no início,
  côncavo no fim; fadiga em espelho; troca de sinal de P″ no dia ~4).
- Acoplamento: correlação das curvas de 1ª derivada — vigor e fadiga são
  imagens especulares (r=-0,97), ambas ligadas ao PTH (fadiga-PTH=+0,97).
- Ordem canônica Tensão-Depressão-Raiva-Vigor-Fadiga-Confusão-PTH em todas as
  tabelas e figuras (ORD do build, box plots, sequência das Figs 5-10).

Reprodução 01 (bloco 13) atualizado; PDF (26 páginas) regenerado; leak-scan: 0.

Co-Authored-By: Claude Opus 4.8 <noreply@anthropic.com>
Claude-Session: https://claude.ai/code/session_01P7yGiDeoGDyjWvPWQVsUrj
</commit_message>
<xml_diff>
--- a/Artigos/Artigo_humor_HANDEBOL.docx
+++ b/Artigos/Artigo_humor_HANDEBOL.docx
@@ -2288,7 +2288,7 @@
                 <w:rFonts w:ascii="Times New Roman" w:hAnsi="Times New Roman"/>
                 <w:sz w:val="18"/>
               </w:rPr>
-              <w:t>Vigor</w:t>
+              <w:t>Tensão</w:t>
             </w:r>
           </w:p>
         </w:tc>
@@ -2312,7 +2312,7 @@
                 <w:rFonts w:ascii="Times New Roman" w:hAnsi="Times New Roman"/>
                 <w:sz w:val="18"/>
               </w:rPr>
-              <w:t>5,67</w:t>
+              <w:t>1,43</w:t>
             </w:r>
           </w:p>
         </w:tc>
@@ -2336,7 +2336,7 @@
                 <w:rFonts w:ascii="Times New Roman" w:hAnsi="Times New Roman"/>
                 <w:sz w:val="18"/>
               </w:rPr>
-              <w:t>6,0</w:t>
+              <w:t>1,0</w:t>
             </w:r>
           </w:p>
         </w:tc>
@@ -2360,7 +2360,7 @@
                 <w:rFonts w:ascii="Times New Roman" w:hAnsi="Times New Roman"/>
                 <w:sz w:val="18"/>
               </w:rPr>
-              <w:t>3,33</w:t>
+              <w:t>1,84</w:t>
             </w:r>
           </w:p>
         </w:tc>
@@ -2384,7 +2384,7 @@
                 <w:rFonts w:ascii="Times New Roman" w:hAnsi="Times New Roman"/>
                 <w:sz w:val="18"/>
               </w:rPr>
-              <w:t>0–15</w:t>
+              <w:t>0–8</w:t>
             </w:r>
           </w:p>
         </w:tc>
@@ -2410,7 +2410,7 @@
                 <w:rFonts w:ascii="Times New Roman" w:hAnsi="Times New Roman"/>
                 <w:sz w:val="18"/>
               </w:rPr>
-              <w:t>Fadiga</w:t>
+              <w:t>Depressão</w:t>
             </w:r>
           </w:p>
         </w:tc>
@@ -2434,7 +2434,7 @@
                 <w:rFonts w:ascii="Times New Roman" w:hAnsi="Times New Roman"/>
                 <w:sz w:val="18"/>
               </w:rPr>
-              <w:t>5,46</w:t>
+              <w:t>1,01</w:t>
             </w:r>
           </w:p>
         </w:tc>
@@ -2458,7 +2458,7 @@
                 <w:rFonts w:ascii="Times New Roman" w:hAnsi="Times New Roman"/>
                 <w:sz w:val="18"/>
               </w:rPr>
-              <w:t>4,0</w:t>
+              <w:t>0,0</w:t>
             </w:r>
           </w:p>
         </w:tc>
@@ -2482,7 +2482,7 @@
                 <w:rFonts w:ascii="Times New Roman" w:hAnsi="Times New Roman"/>
                 <w:sz w:val="18"/>
               </w:rPr>
-              <w:t>4,05</w:t>
+              <w:t>2,36</w:t>
             </w:r>
           </w:p>
         </w:tc>
@@ -2532,7 +2532,7 @@
                 <w:rFonts w:ascii="Times New Roman" w:hAnsi="Times New Roman"/>
                 <w:sz w:val="18"/>
               </w:rPr>
-              <w:t>PTH</w:t>
+              <w:t>Raiva</w:t>
             </w:r>
           </w:p>
         </w:tc>
@@ -2556,7 +2556,7 @@
                 <w:rFonts w:ascii="Times New Roman" w:hAnsi="Times New Roman"/>
                 <w:sz w:val="18"/>
               </w:rPr>
-              <w:t>4,38</w:t>
+              <w:t>1,64</w:t>
             </w:r>
           </w:p>
         </w:tc>
@@ -2580,7 +2580,7 @@
                 <w:rFonts w:ascii="Times New Roman" w:hAnsi="Times New Roman"/>
                 <w:sz w:val="18"/>
               </w:rPr>
-              <w:t>2,0</w:t>
+              <w:t>0,0</w:t>
             </w:r>
           </w:p>
         </w:tc>
@@ -2604,7 +2604,7 @@
                 <w:rFonts w:ascii="Times New Roman" w:hAnsi="Times New Roman"/>
                 <w:sz w:val="18"/>
               </w:rPr>
-              <w:t>10,05</w:t>
+              <w:t>2,82</w:t>
             </w:r>
           </w:p>
         </w:tc>
@@ -2628,7 +2628,7 @@
                 <w:rFonts w:ascii="Times New Roman" w:hAnsi="Times New Roman"/>
                 <w:sz w:val="18"/>
               </w:rPr>
-              <w:t>-12–52</w:t>
+              <w:t>0–14</w:t>
             </w:r>
           </w:p>
         </w:tc>
@@ -2654,7 +2654,7 @@
                 <w:rFonts w:ascii="Times New Roman" w:hAnsi="Times New Roman"/>
                 <w:sz w:val="18"/>
               </w:rPr>
-              <w:t>Tensão</w:t>
+              <w:t>Vigor</w:t>
             </w:r>
           </w:p>
         </w:tc>
@@ -2678,7 +2678,7 @@
                 <w:rFonts w:ascii="Times New Roman" w:hAnsi="Times New Roman"/>
                 <w:sz w:val="18"/>
               </w:rPr>
-              <w:t>1,43</w:t>
+              <w:t>5,67</w:t>
             </w:r>
           </w:p>
         </w:tc>
@@ -2702,7 +2702,7 @@
                 <w:rFonts w:ascii="Times New Roman" w:hAnsi="Times New Roman"/>
                 <w:sz w:val="18"/>
               </w:rPr>
-              <w:t>1,0</w:t>
+              <w:t>6,0</w:t>
             </w:r>
           </w:p>
         </w:tc>
@@ -2726,7 +2726,7 @@
                 <w:rFonts w:ascii="Times New Roman" w:hAnsi="Times New Roman"/>
                 <w:sz w:val="18"/>
               </w:rPr>
-              <w:t>1,84</w:t>
+              <w:t>3,33</w:t>
             </w:r>
           </w:p>
         </w:tc>
@@ -2750,7 +2750,7 @@
                 <w:rFonts w:ascii="Times New Roman" w:hAnsi="Times New Roman"/>
                 <w:sz w:val="18"/>
               </w:rPr>
-              <w:t>0–8</w:t>
+              <w:t>0–15</w:t>
             </w:r>
           </w:p>
         </w:tc>
@@ -2776,7 +2776,7 @@
                 <w:rFonts w:ascii="Times New Roman" w:hAnsi="Times New Roman"/>
                 <w:sz w:val="18"/>
               </w:rPr>
-              <w:t>Depressão</w:t>
+              <w:t>Fadiga</w:t>
             </w:r>
           </w:p>
         </w:tc>
@@ -2800,7 +2800,7 @@
                 <w:rFonts w:ascii="Times New Roman" w:hAnsi="Times New Roman"/>
                 <w:sz w:val="18"/>
               </w:rPr>
-              <w:t>1,01</w:t>
+              <w:t>5,46</w:t>
             </w:r>
           </w:p>
         </w:tc>
@@ -2824,7 +2824,7 @@
                 <w:rFonts w:ascii="Times New Roman" w:hAnsi="Times New Roman"/>
                 <w:sz w:val="18"/>
               </w:rPr>
-              <w:t>0,0</w:t>
+              <w:t>4,0</w:t>
             </w:r>
           </w:p>
         </w:tc>
@@ -2848,7 +2848,7 @@
                 <w:rFonts w:ascii="Times New Roman" w:hAnsi="Times New Roman"/>
                 <w:sz w:val="18"/>
               </w:rPr>
-              <w:t>2,36</w:t>
+              <w:t>4,05</w:t>
             </w:r>
           </w:p>
         </w:tc>
@@ -2898,7 +2898,7 @@
                 <w:rFonts w:ascii="Times New Roman" w:hAnsi="Times New Roman"/>
                 <w:sz w:val="18"/>
               </w:rPr>
-              <w:t>Raiva</w:t>
+              <w:t>Confusão</w:t>
             </w:r>
           </w:p>
         </w:tc>
@@ -2922,7 +2922,7 @@
                 <w:rFonts w:ascii="Times New Roman" w:hAnsi="Times New Roman"/>
                 <w:sz w:val="18"/>
               </w:rPr>
-              <w:t>1,64</w:t>
+              <w:t>0,51</w:t>
             </w:r>
           </w:p>
         </w:tc>
@@ -2970,7 +2970,7 @@
                 <w:rFonts w:ascii="Times New Roman" w:hAnsi="Times New Roman"/>
                 <w:sz w:val="18"/>
               </w:rPr>
-              <w:t>2,82</w:t>
+              <w:t>1,26</w:t>
             </w:r>
           </w:p>
         </w:tc>
@@ -2994,7 +2994,7 @@
                 <w:rFonts w:ascii="Times New Roman" w:hAnsi="Times New Roman"/>
                 <w:sz w:val="18"/>
               </w:rPr>
-              <w:t>0–14</w:t>
+              <w:t>0–8</w:t>
             </w:r>
           </w:p>
         </w:tc>
@@ -3020,7 +3020,7 @@
                 <w:rFonts w:ascii="Times New Roman" w:hAnsi="Times New Roman"/>
                 <w:sz w:val="18"/>
               </w:rPr>
-              <w:t>Confusão</w:t>
+              <w:t>PTH</w:t>
             </w:r>
           </w:p>
         </w:tc>
@@ -3044,7 +3044,7 @@
                 <w:rFonts w:ascii="Times New Roman" w:hAnsi="Times New Roman"/>
                 <w:sz w:val="18"/>
               </w:rPr>
-              <w:t>0,51</w:t>
+              <w:t>4,38</w:t>
             </w:r>
           </w:p>
         </w:tc>
@@ -3068,7 +3068,7 @@
                 <w:rFonts w:ascii="Times New Roman" w:hAnsi="Times New Roman"/>
                 <w:sz w:val="18"/>
               </w:rPr>
-              <w:t>0,0</w:t>
+              <w:t>2,0</w:t>
             </w:r>
           </w:p>
         </w:tc>
@@ -3092,7 +3092,7 @@
                 <w:rFonts w:ascii="Times New Roman" w:hAnsi="Times New Roman"/>
                 <w:sz w:val="18"/>
               </w:rPr>
-              <w:t>1,26</w:t>
+              <w:t>10,05</w:t>
             </w:r>
           </w:p>
         </w:tc>
@@ -3116,7 +3116,7 @@
                 <w:rFonts w:ascii="Times New Roman" w:hAnsi="Times New Roman"/>
                 <w:sz w:val="18"/>
               </w:rPr>
-              <w:t>0–8</w:t>
+              <w:t>-12–52</w:t>
             </w:r>
           </w:p>
         </w:tc>
@@ -3383,7 +3383,7 @@
                 <w:rFonts w:ascii="Times New Roman" w:hAnsi="Times New Roman"/>
                 <w:sz w:val="18"/>
               </w:rPr>
-              <w:t>Vigor</w:t>
+              <w:t>Tensão</w:t>
             </w:r>
           </w:p>
         </w:tc>
@@ -3407,7 +3407,7 @@
                 <w:rFonts w:ascii="Times New Roman" w:hAnsi="Times New Roman"/>
                 <w:sz w:val="18"/>
               </w:rPr>
-              <w:t>5,76</w:t>
+              <w:t>1,30</w:t>
             </w:r>
           </w:p>
         </w:tc>
@@ -3431,7 +3431,7 @@
                 <w:rFonts w:ascii="Times New Roman" w:hAnsi="Times New Roman"/>
                 <w:sz w:val="18"/>
               </w:rPr>
-              <w:t>4,94</w:t>
+              <w:t>1,60</w:t>
             </w:r>
           </w:p>
         </w:tc>
@@ -3455,7 +3455,7 @@
                 <w:rFonts w:ascii="Times New Roman" w:hAnsi="Times New Roman"/>
                 <w:sz w:val="18"/>
               </w:rPr>
-              <w:t>-14%</w:t>
+              <w:t>+23%</w:t>
             </w:r>
           </w:p>
         </w:tc>
@@ -3479,7 +3479,7 @@
                 <w:rFonts w:ascii="Times New Roman" w:hAnsi="Times New Roman"/>
                 <w:sz w:val="18"/>
               </w:rPr>
-              <w:t>= 0,025</w:t>
+              <w:t>= 0,057</w:t>
             </w:r>
           </w:p>
         </w:tc>
@@ -3503,7 +3503,7 @@
                 <w:rFonts w:ascii="Times New Roman" w:hAnsi="Times New Roman"/>
                 <w:sz w:val="18"/>
               </w:rPr>
-              <w:t>-0,47</w:t>
+              <w:t>+0,43</w:t>
             </w:r>
           </w:p>
         </w:tc>
@@ -3553,7 +3553,7 @@
                 <w:rFonts w:ascii="Times New Roman" w:hAnsi="Times New Roman"/>
                 <w:sz w:val="18"/>
               </w:rPr>
-              <w:t>Fadiga</w:t>
+              <w:t>Depressão</w:t>
             </w:r>
           </w:p>
         </w:tc>
@@ -3577,7 +3577,7 @@
                 <w:rFonts w:ascii="Times New Roman" w:hAnsi="Times New Roman"/>
                 <w:sz w:val="18"/>
               </w:rPr>
-              <w:t>4,61</w:t>
+              <w:t>1,03</w:t>
             </w:r>
           </w:p>
         </w:tc>
@@ -3601,7 +3601,7 @@
                 <w:rFonts w:ascii="Times New Roman" w:hAnsi="Times New Roman"/>
                 <w:sz w:val="18"/>
               </w:rPr>
-              <w:t>6,28</w:t>
+              <w:t>1,21</w:t>
             </w:r>
           </w:p>
         </w:tc>
@@ -3625,7 +3625,7 @@
                 <w:rFonts w:ascii="Times New Roman" w:hAnsi="Times New Roman"/>
                 <w:sz w:val="18"/>
               </w:rPr>
-              <w:t>+36%</w:t>
+              <w:t>+17%</w:t>
             </w:r>
           </w:p>
         </w:tc>
@@ -3649,7 +3649,7 @@
                 <w:rFonts w:ascii="Times New Roman" w:hAnsi="Times New Roman"/>
                 <w:sz w:val="18"/>
               </w:rPr>
-              <w:t>= 0,005</w:t>
+              <w:t>= 0,687</w:t>
             </w:r>
           </w:p>
         </w:tc>
@@ -3673,7 +3673,7 @@
                 <w:rFonts w:ascii="Times New Roman" w:hAnsi="Times New Roman"/>
                 <w:sz w:val="18"/>
               </w:rPr>
-              <w:t>+0,57</w:t>
+              <w:t>+0,24</w:t>
             </w:r>
           </w:p>
         </w:tc>
@@ -3697,7 +3697,7 @@
                 <w:rFonts w:ascii="Times New Roman" w:hAnsi="Times New Roman"/>
                 <w:sz w:val="18"/>
               </w:rPr>
-              <w:t>médio</w:t>
+              <w:t>pequeno</w:t>
             </w:r>
           </w:p>
         </w:tc>
@@ -3723,7 +3723,7 @@
                 <w:rFonts w:ascii="Times New Roman" w:hAnsi="Times New Roman"/>
                 <w:sz w:val="18"/>
               </w:rPr>
-              <w:t>PTH</w:t>
+              <w:t>Raiva</w:t>
             </w:r>
           </w:p>
         </w:tc>
@@ -3747,7 +3747,7 @@
                 <w:rFonts w:ascii="Times New Roman" w:hAnsi="Times New Roman"/>
                 <w:sz w:val="18"/>
               </w:rPr>
-              <w:t>2,91</w:t>
+              <w:t>1,31</w:t>
             </w:r>
           </w:p>
         </w:tc>
@@ -3771,7 +3771,7 @@
                 <w:rFonts w:ascii="Times New Roman" w:hAnsi="Times New Roman"/>
                 <w:sz w:val="18"/>
               </w:rPr>
-              <w:t>6,06</w:t>
+              <w:t>1,51</w:t>
             </w:r>
           </w:p>
         </w:tc>
@@ -3795,7 +3795,7 @@
                 <w:rFonts w:ascii="Times New Roman" w:hAnsi="Times New Roman"/>
                 <w:sz w:val="18"/>
               </w:rPr>
-              <w:t>+108%</w:t>
+              <w:t>+15%</w:t>
             </w:r>
           </w:p>
         </w:tc>
@@ -3819,7 +3819,7 @@
                 <w:rFonts w:ascii="Times New Roman" w:hAnsi="Times New Roman"/>
                 <w:sz w:val="18"/>
               </w:rPr>
-              <w:t>= 0,009</w:t>
+              <w:t>= 0,745</w:t>
             </w:r>
           </w:p>
         </w:tc>
@@ -3843,7 +3843,7 @@
                 <w:rFonts w:ascii="Times New Roman" w:hAnsi="Times New Roman"/>
                 <w:sz w:val="18"/>
               </w:rPr>
-              <w:t>+0,58</w:t>
+              <w:t>+0,13</w:t>
             </w:r>
           </w:p>
         </w:tc>
@@ -3867,7 +3867,7 @@
                 <w:rFonts w:ascii="Times New Roman" w:hAnsi="Times New Roman"/>
                 <w:sz w:val="18"/>
               </w:rPr>
-              <w:t>médio</w:t>
+              <w:t>trivial</w:t>
             </w:r>
           </w:p>
         </w:tc>
@@ -3893,7 +3893,7 @@
                 <w:rFonts w:ascii="Times New Roman" w:hAnsi="Times New Roman"/>
                 <w:sz w:val="18"/>
               </w:rPr>
-              <w:t>Tensão</w:t>
+              <w:t>Vigor</w:t>
             </w:r>
           </w:p>
         </w:tc>
@@ -3917,7 +3917,7 @@
                 <w:rFonts w:ascii="Times New Roman" w:hAnsi="Times New Roman"/>
                 <w:sz w:val="18"/>
               </w:rPr>
-              <w:t>1,30</w:t>
+              <w:t>5,76</w:t>
             </w:r>
           </w:p>
         </w:tc>
@@ -3941,7 +3941,7 @@
                 <w:rFonts w:ascii="Times New Roman" w:hAnsi="Times New Roman"/>
                 <w:sz w:val="18"/>
               </w:rPr>
-              <w:t>1,60</w:t>
+              <w:t>4,94</w:t>
             </w:r>
           </w:p>
         </w:tc>
@@ -3965,7 +3965,7 @@
                 <w:rFonts w:ascii="Times New Roman" w:hAnsi="Times New Roman"/>
                 <w:sz w:val="18"/>
               </w:rPr>
-              <w:t>+23%</w:t>
+              <w:t>-14%</w:t>
             </w:r>
           </w:p>
         </w:tc>
@@ -3989,7 +3989,7 @@
                 <w:rFonts w:ascii="Times New Roman" w:hAnsi="Times New Roman"/>
                 <w:sz w:val="18"/>
               </w:rPr>
-              <w:t>= 0,057</w:t>
+              <w:t>= 0,025</w:t>
             </w:r>
           </w:p>
         </w:tc>
@@ -4013,7 +4013,7 @@
                 <w:rFonts w:ascii="Times New Roman" w:hAnsi="Times New Roman"/>
                 <w:sz w:val="18"/>
               </w:rPr>
-              <w:t>+0,43</w:t>
+              <w:t>-0,47</w:t>
             </w:r>
           </w:p>
         </w:tc>
@@ -4063,7 +4063,7 @@
                 <w:rFonts w:ascii="Times New Roman" w:hAnsi="Times New Roman"/>
                 <w:sz w:val="18"/>
               </w:rPr>
-              <w:t>Depressão</w:t>
+              <w:t>Fadiga</w:t>
             </w:r>
           </w:p>
         </w:tc>
@@ -4087,7 +4087,7 @@
                 <w:rFonts w:ascii="Times New Roman" w:hAnsi="Times New Roman"/>
                 <w:sz w:val="18"/>
               </w:rPr>
-              <w:t>1,03</w:t>
+              <w:t>4,61</w:t>
             </w:r>
           </w:p>
         </w:tc>
@@ -4111,7 +4111,7 @@
                 <w:rFonts w:ascii="Times New Roman" w:hAnsi="Times New Roman"/>
                 <w:sz w:val="18"/>
               </w:rPr>
-              <w:t>1,21</w:t>
+              <w:t>6,28</w:t>
             </w:r>
           </w:p>
         </w:tc>
@@ -4135,7 +4135,7 @@
                 <w:rFonts w:ascii="Times New Roman" w:hAnsi="Times New Roman"/>
                 <w:sz w:val="18"/>
               </w:rPr>
-              <w:t>+17%</w:t>
+              <w:t>+36%</w:t>
             </w:r>
           </w:p>
         </w:tc>
@@ -4159,7 +4159,7 @@
                 <w:rFonts w:ascii="Times New Roman" w:hAnsi="Times New Roman"/>
                 <w:sz w:val="18"/>
               </w:rPr>
-              <w:t>= 0,687</w:t>
+              <w:t>= 0,005</w:t>
             </w:r>
           </w:p>
         </w:tc>
@@ -4183,7 +4183,7 @@
                 <w:rFonts w:ascii="Times New Roman" w:hAnsi="Times New Roman"/>
                 <w:sz w:val="18"/>
               </w:rPr>
-              <w:t>+0,24</w:t>
+              <w:t>+0,57</w:t>
             </w:r>
           </w:p>
         </w:tc>
@@ -4207,7 +4207,7 @@
                 <w:rFonts w:ascii="Times New Roman" w:hAnsi="Times New Roman"/>
                 <w:sz w:val="18"/>
               </w:rPr>
-              <w:t>pequeno</w:t>
+              <w:t>médio</w:t>
             </w:r>
           </w:p>
         </w:tc>
@@ -4233,7 +4233,7 @@
                 <w:rFonts w:ascii="Times New Roman" w:hAnsi="Times New Roman"/>
                 <w:sz w:val="18"/>
               </w:rPr>
-              <w:t>Raiva</w:t>
+              <w:t>Confusão</w:t>
             </w:r>
           </w:p>
         </w:tc>
@@ -4257,7 +4257,7 @@
                 <w:rFonts w:ascii="Times New Roman" w:hAnsi="Times New Roman"/>
                 <w:sz w:val="18"/>
               </w:rPr>
-              <w:t>1,31</w:t>
+              <w:t>0,41</w:t>
             </w:r>
           </w:p>
         </w:tc>
@@ -4281,7 +4281,7 @@
                 <w:rFonts w:ascii="Times New Roman" w:hAnsi="Times New Roman"/>
                 <w:sz w:val="18"/>
               </w:rPr>
-              <w:t>1,51</w:t>
+              <w:t>0,41</w:t>
             </w:r>
           </w:p>
         </w:tc>
@@ -4305,7 +4305,7 @@
                 <w:rFonts w:ascii="Times New Roman" w:hAnsi="Times New Roman"/>
                 <w:sz w:val="18"/>
               </w:rPr>
-              <w:t>+15%</w:t>
+              <w:t>-1%</w:t>
             </w:r>
           </w:p>
         </w:tc>
@@ -4329,7 +4329,7 @@
                 <w:rFonts w:ascii="Times New Roman" w:hAnsi="Times New Roman"/>
                 <w:sz w:val="18"/>
               </w:rPr>
-              <w:t>= 0,745</w:t>
+              <w:t>= 0,706</w:t>
             </w:r>
           </w:p>
         </w:tc>
@@ -4353,7 +4353,7 @@
                 <w:rFonts w:ascii="Times New Roman" w:hAnsi="Times New Roman"/>
                 <w:sz w:val="18"/>
               </w:rPr>
-              <w:t>+0,13</w:t>
+              <w:t>-0,01</w:t>
             </w:r>
           </w:p>
         </w:tc>
@@ -4403,7 +4403,7 @@
                 <w:rFonts w:ascii="Times New Roman" w:hAnsi="Times New Roman"/>
                 <w:sz w:val="18"/>
               </w:rPr>
-              <w:t>Confusão</w:t>
+              <w:t>PTH</w:t>
             </w:r>
           </w:p>
         </w:tc>
@@ -4427,7 +4427,7 @@
                 <w:rFonts w:ascii="Times New Roman" w:hAnsi="Times New Roman"/>
                 <w:sz w:val="18"/>
               </w:rPr>
-              <w:t>0,41</w:t>
+              <w:t>2,91</w:t>
             </w:r>
           </w:p>
         </w:tc>
@@ -4451,7 +4451,7 @@
                 <w:rFonts w:ascii="Times New Roman" w:hAnsi="Times New Roman"/>
                 <w:sz w:val="18"/>
               </w:rPr>
-              <w:t>0,41</w:t>
+              <w:t>6,06</w:t>
             </w:r>
           </w:p>
         </w:tc>
@@ -4475,7 +4475,7 @@
                 <w:rFonts w:ascii="Times New Roman" w:hAnsi="Times New Roman"/>
                 <w:sz w:val="18"/>
               </w:rPr>
-              <w:t>-1%</w:t>
+              <w:t>+108%</w:t>
             </w:r>
           </w:p>
         </w:tc>
@@ -4499,7 +4499,7 @@
                 <w:rFonts w:ascii="Times New Roman" w:hAnsi="Times New Roman"/>
                 <w:sz w:val="18"/>
               </w:rPr>
-              <w:t>= 0,706</w:t>
+              <w:t>= 0,009</w:t>
             </w:r>
           </w:p>
         </w:tc>
@@ -4523,7 +4523,7 @@
                 <w:rFonts w:ascii="Times New Roman" w:hAnsi="Times New Roman"/>
                 <w:sz w:val="18"/>
               </w:rPr>
-              <w:t>-0,01</w:t>
+              <w:t>+0,58</w:t>
             </w:r>
           </w:p>
         </w:tc>
@@ -4547,7 +4547,7 @@
                 <w:rFonts w:ascii="Times New Roman" w:hAnsi="Times New Roman"/>
                 <w:sz w:val="18"/>
               </w:rPr>
-              <w:t>trivial</w:t>
+              <w:t>médio</w:t>
             </w:r>
           </w:p>
         </w:tc>
@@ -5044,7 +5044,7 @@
                 <w:rFonts w:ascii="Times New Roman" w:hAnsi="Times New Roman"/>
                 <w:sz w:val="16"/>
               </w:rPr>
-              <w:t>Vigor</w:t>
+              <w:t>Tensão</w:t>
             </w:r>
           </w:p>
         </w:tc>
@@ -5068,7 +5068,7 @@
                 <w:rFonts w:ascii="Times New Roman" w:hAnsi="Times New Roman"/>
                 <w:sz w:val="16"/>
               </w:rPr>
-              <w:t>8,3</w:t>
+              <w:t>2,1</w:t>
             </w:r>
           </w:p>
         </w:tc>
@@ -5092,7 +5092,7 @@
                 <w:rFonts w:ascii="Times New Roman" w:hAnsi="Times New Roman"/>
                 <w:sz w:val="16"/>
               </w:rPr>
-              <w:t>5,4</w:t>
+              <w:t>1,8</w:t>
             </w:r>
           </w:p>
         </w:tc>
@@ -5116,7 +5116,7 @@
                 <w:rFonts w:ascii="Times New Roman" w:hAnsi="Times New Roman"/>
                 <w:sz w:val="16"/>
               </w:rPr>
-              <w:t>5,5</w:t>
+              <w:t>1,1</w:t>
             </w:r>
           </w:p>
         </w:tc>
@@ -5140,7 +5140,7 @@
                 <w:rFonts w:ascii="Times New Roman" w:hAnsi="Times New Roman"/>
                 <w:sz w:val="16"/>
               </w:rPr>
-              <w:t>5,4</w:t>
+              <w:t>1,4</w:t>
             </w:r>
           </w:p>
         </w:tc>
@@ -5164,7 +5164,7 @@
                 <w:rFonts w:ascii="Times New Roman" w:hAnsi="Times New Roman"/>
                 <w:sz w:val="16"/>
               </w:rPr>
-              <w:t>5,9</w:t>
+              <w:t>1,2</w:t>
             </w:r>
           </w:p>
         </w:tc>
@@ -5188,7 +5188,7 @@
                 <w:rFonts w:ascii="Times New Roman" w:hAnsi="Times New Roman"/>
                 <w:sz w:val="16"/>
               </w:rPr>
-              <w:t>5,7</w:t>
+              <w:t>1,5</w:t>
             </w:r>
           </w:p>
         </w:tc>
@@ -5212,7 +5212,7 @@
                 <w:rFonts w:ascii="Times New Roman" w:hAnsi="Times New Roman"/>
                 <w:sz w:val="16"/>
               </w:rPr>
-              <w:t>4,4</w:t>
+              <w:t>1,1</w:t>
             </w:r>
           </w:p>
         </w:tc>
@@ -5236,7 +5236,7 @@
                 <w:rFonts w:ascii="Times New Roman" w:hAnsi="Times New Roman"/>
                 <w:sz w:val="16"/>
               </w:rPr>
-              <w:t>23,6</w:t>
+              <w:t>14,5</w:t>
             </w:r>
           </w:p>
         </w:tc>
@@ -5260,7 +5260,7 @@
                 <w:rFonts w:ascii="Times New Roman" w:hAnsi="Times New Roman"/>
                 <w:sz w:val="16"/>
               </w:rPr>
-              <w:t>&lt; 0,001</w:t>
+              <w:t>= 0,025</w:t>
             </w:r>
           </w:p>
         </w:tc>
@@ -5284,7 +5284,7 @@
                 <w:rFonts w:ascii="Times New Roman" w:hAnsi="Times New Roman"/>
                 <w:sz w:val="16"/>
               </w:rPr>
-              <w:t>0,21</w:t>
+              <w:t>0,13</w:t>
             </w:r>
           </w:p>
         </w:tc>
@@ -5310,7 +5310,7 @@
                 <w:rFonts w:ascii="Times New Roman" w:hAnsi="Times New Roman"/>
                 <w:sz w:val="16"/>
               </w:rPr>
-              <w:t>Fadiga</w:t>
+              <w:t>Depressão</w:t>
             </w:r>
           </w:p>
         </w:tc>
@@ -5334,7 +5334,7 @@
                 <w:rFonts w:ascii="Times New Roman" w:hAnsi="Times New Roman"/>
                 <w:sz w:val="16"/>
               </w:rPr>
-              <w:t>3,4</w:t>
+              <w:t>0,6</w:t>
             </w:r>
           </w:p>
         </w:tc>
@@ -5358,7 +5358,7 @@
                 <w:rFonts w:ascii="Times New Roman" w:hAnsi="Times New Roman"/>
                 <w:sz w:val="16"/>
               </w:rPr>
-              <w:t>5,2</w:t>
+              <w:t>1,3</w:t>
             </w:r>
           </w:p>
         </w:tc>
@@ -5382,7 +5382,7 @@
                 <w:rFonts w:ascii="Times New Roman" w:hAnsi="Times New Roman"/>
                 <w:sz w:val="16"/>
               </w:rPr>
-              <w:t>5,1</w:t>
+              <w:t>0,7</w:t>
             </w:r>
           </w:p>
         </w:tc>
@@ -5406,7 +5406,7 @@
                 <w:rFonts w:ascii="Times New Roman" w:hAnsi="Times New Roman"/>
                 <w:sz w:val="16"/>
               </w:rPr>
-              <w:t>5,8</w:t>
+              <w:t>1,2</w:t>
             </w:r>
           </w:p>
         </w:tc>
@@ -5430,7 +5430,7 @@
                 <w:rFonts w:ascii="Times New Roman" w:hAnsi="Times New Roman"/>
                 <w:sz w:val="16"/>
               </w:rPr>
-              <w:t>5,1</w:t>
+              <w:t>0,7</w:t>
             </w:r>
           </w:p>
         </w:tc>
@@ -5454,7 +5454,7 @@
                 <w:rFonts w:ascii="Times New Roman" w:hAnsi="Times New Roman"/>
                 <w:sz w:val="16"/>
               </w:rPr>
-              <w:t>6,0</w:t>
+              <w:t>1,2</w:t>
             </w:r>
           </w:p>
         </w:tc>
@@ -5478,7 +5478,7 @@
                 <w:rFonts w:ascii="Times New Roman" w:hAnsi="Times New Roman"/>
                 <w:sz w:val="16"/>
               </w:rPr>
-              <w:t>7,2</w:t>
+              <w:t>1,4</w:t>
             </w:r>
           </w:p>
         </w:tc>
@@ -5502,7 +5502,7 @@
                 <w:rFonts w:ascii="Times New Roman" w:hAnsi="Times New Roman"/>
                 <w:sz w:val="16"/>
               </w:rPr>
-              <w:t>17,9</w:t>
+              <w:t>3,5</w:t>
             </w:r>
           </w:p>
         </w:tc>
@@ -5526,7 +5526,7 @@
                 <w:rFonts w:ascii="Times New Roman" w:hAnsi="Times New Roman"/>
                 <w:sz w:val="16"/>
               </w:rPr>
-              <w:t>= 0,007</w:t>
+              <w:t>= 0,751</w:t>
             </w:r>
           </w:p>
         </w:tc>
@@ -5550,7 +5550,7 @@
                 <w:rFonts w:ascii="Times New Roman" w:hAnsi="Times New Roman"/>
                 <w:sz w:val="16"/>
               </w:rPr>
-              <w:t>0,16</w:t>
+              <w:t>0,03</w:t>
             </w:r>
           </w:p>
         </w:tc>
@@ -5576,7 +5576,7 @@
                 <w:rFonts w:ascii="Times New Roman" w:hAnsi="Times New Roman"/>
                 <w:sz w:val="16"/>
               </w:rPr>
-              <w:t>PTH</w:t>
+              <w:t>Raiva</w:t>
             </w:r>
           </w:p>
         </w:tc>
@@ -5600,6 +5600,102 @@
                 <w:rFonts w:ascii="Times New Roman" w:hAnsi="Times New Roman"/>
                 <w:sz w:val="16"/>
               </w:rPr>
+              <w:t>1,7</w:t>
+            </w:r>
+          </w:p>
+        </w:tc>
+        <w:tc>
+          <w:tcPr>
+            <w:tcW w:type="dxa" w:w="855"/>
+            <w:tcBorders>
+              <w:top w:val="single" w:sz="6" w:color="000000"/>
+              <w:bottom w:val="single" w:sz="6" w:color="000000"/>
+              <w:left w:val="nil" w:sz="6" w:color="000000"/>
+              <w:right w:val="nil" w:sz="6" w:color="000000"/>
+            </w:tcBorders>
+          </w:tcPr>
+          <w:p>
+            <w:pPr>
+              <w:jc w:val="center"/>
+            </w:pPr>
+            <w:r/>
+            <w:r>
+              <w:rPr>
+                <w:rFonts w:ascii="Times New Roman" w:hAnsi="Times New Roman"/>
+                <w:sz w:val="16"/>
+              </w:rPr>
+              <w:t>1,7</w:t>
+            </w:r>
+          </w:p>
+        </w:tc>
+        <w:tc>
+          <w:tcPr>
+            <w:tcW w:type="dxa" w:w="855"/>
+            <w:tcBorders>
+              <w:top w:val="single" w:sz="6" w:color="000000"/>
+              <w:bottom w:val="single" w:sz="6" w:color="000000"/>
+              <w:left w:val="nil" w:sz="6" w:color="000000"/>
+              <w:right w:val="nil" w:sz="6" w:color="000000"/>
+            </w:tcBorders>
+          </w:tcPr>
+          <w:p>
+            <w:pPr>
+              <w:jc w:val="center"/>
+            </w:pPr>
+            <w:r/>
+            <w:r>
+              <w:rPr>
+                <w:rFonts w:ascii="Times New Roman" w:hAnsi="Times New Roman"/>
+                <w:sz w:val="16"/>
+              </w:rPr>
+              <w:t>1,6</w:t>
+            </w:r>
+          </w:p>
+        </w:tc>
+        <w:tc>
+          <w:tcPr>
+            <w:tcW w:type="dxa" w:w="855"/>
+            <w:tcBorders>
+              <w:top w:val="single" w:sz="6" w:color="000000"/>
+              <w:bottom w:val="single" w:sz="6" w:color="000000"/>
+              <w:left w:val="nil" w:sz="6" w:color="000000"/>
+              <w:right w:val="nil" w:sz="6" w:color="000000"/>
+            </w:tcBorders>
+          </w:tcPr>
+          <w:p>
+            <w:pPr>
+              <w:jc w:val="center"/>
+            </w:pPr>
+            <w:r/>
+            <w:r>
+              <w:rPr>
+                <w:rFonts w:ascii="Times New Roman" w:hAnsi="Times New Roman"/>
+                <w:sz w:val="16"/>
+              </w:rPr>
+              <w:t>1,6</w:t>
+            </w:r>
+          </w:p>
+        </w:tc>
+        <w:tc>
+          <w:tcPr>
+            <w:tcW w:type="dxa" w:w="855"/>
+            <w:tcBorders>
+              <w:top w:val="single" w:sz="6" w:color="000000"/>
+              <w:bottom w:val="single" w:sz="6" w:color="000000"/>
+              <w:left w:val="nil" w:sz="6" w:color="000000"/>
+              <w:right w:val="nil" w:sz="6" w:color="000000"/>
+            </w:tcBorders>
+          </w:tcPr>
+          <w:p>
+            <w:pPr>
+              <w:jc w:val="center"/>
+            </w:pPr>
+            <w:r/>
+            <w:r>
+              <w:rPr>
+                <w:rFonts w:ascii="Times New Roman" w:hAnsi="Times New Roman"/>
+                <w:sz w:val="16"/>
+              </w:rPr>
               <w:t>0,6</w:t>
             </w:r>
           </w:p>
@@ -5624,7 +5720,7 @@
                 <w:rFonts w:ascii="Times New Roman" w:hAnsi="Times New Roman"/>
                 <w:sz w:val="16"/>
               </w:rPr>
-              <w:t>5,3</w:t>
+              <w:t>1,8</w:t>
             </w:r>
           </w:p>
         </w:tc>
@@ -5648,7 +5744,7 @@
                 <w:rFonts w:ascii="Times New Roman" w:hAnsi="Times New Roman"/>
                 <w:sz w:val="16"/>
               </w:rPr>
-              <w:t>3,3</w:t>
+              <w:t>2,5</w:t>
             </w:r>
           </w:p>
         </w:tc>
@@ -5672,7 +5768,7 @@
                 <w:rFonts w:ascii="Times New Roman" w:hAnsi="Times New Roman"/>
                 <w:sz w:val="16"/>
               </w:rPr>
-              <w:t>5,0</w:t>
+              <w:t>7,9</w:t>
             </w:r>
           </w:p>
         </w:tc>
@@ -5696,7 +5792,7 @@
                 <w:rFonts w:ascii="Times New Roman" w:hAnsi="Times New Roman"/>
                 <w:sz w:val="16"/>
               </w:rPr>
-              <w:t>1,9</w:t>
+              <w:t>= 0,247</w:t>
             </w:r>
           </w:p>
         </w:tc>
@@ -5720,103 +5816,7 @@
                 <w:rFonts w:ascii="Times New Roman" w:hAnsi="Times New Roman"/>
                 <w:sz w:val="16"/>
               </w:rPr>
-              <w:t>5,5</w:t>
-            </w:r>
-          </w:p>
-        </w:tc>
-        <w:tc>
-          <w:tcPr>
-            <w:tcW w:type="dxa" w:w="855"/>
-            <w:tcBorders>
-              <w:top w:val="single" w:sz="6" w:color="000000"/>
-              <w:bottom w:val="single" w:sz="6" w:color="000000"/>
-              <w:left w:val="nil" w:sz="6" w:color="000000"/>
-              <w:right w:val="nil" w:sz="6" w:color="000000"/>
-            </w:tcBorders>
-          </w:tcPr>
-          <w:p>
-            <w:pPr>
-              <w:jc w:val="center"/>
-            </w:pPr>
-            <w:r/>
-            <w:r>
-              <w:rPr>
-                <w:rFonts w:ascii="Times New Roman" w:hAnsi="Times New Roman"/>
-                <w:sz w:val="16"/>
-              </w:rPr>
-              <w:t>8,3</w:t>
-            </w:r>
-          </w:p>
-        </w:tc>
-        <w:tc>
-          <w:tcPr>
-            <w:tcW w:type="dxa" w:w="855"/>
-            <w:tcBorders>
-              <w:top w:val="single" w:sz="6" w:color="000000"/>
-              <w:bottom w:val="single" w:sz="6" w:color="000000"/>
-              <w:left w:val="nil" w:sz="6" w:color="000000"/>
-              <w:right w:val="nil" w:sz="6" w:color="000000"/>
-            </w:tcBorders>
-          </w:tcPr>
-          <w:p>
-            <w:pPr>
-              <w:jc w:val="center"/>
-            </w:pPr>
-            <w:r/>
-            <w:r>
-              <w:rPr>
-                <w:rFonts w:ascii="Times New Roman" w:hAnsi="Times New Roman"/>
-                <w:sz w:val="16"/>
-              </w:rPr>
-              <w:t>13,8</w:t>
-            </w:r>
-          </w:p>
-        </w:tc>
-        <w:tc>
-          <w:tcPr>
-            <w:tcW w:type="dxa" w:w="855"/>
-            <w:tcBorders>
-              <w:top w:val="single" w:sz="6" w:color="000000"/>
-              <w:bottom w:val="single" w:sz="6" w:color="000000"/>
-              <w:left w:val="nil" w:sz="6" w:color="000000"/>
-              <w:right w:val="nil" w:sz="6" w:color="000000"/>
-            </w:tcBorders>
-          </w:tcPr>
-          <w:p>
-            <w:pPr>
-              <w:jc w:val="center"/>
-            </w:pPr>
-            <w:r/>
-            <w:r>
-              <w:rPr>
-                <w:rFonts w:ascii="Times New Roman" w:hAnsi="Times New Roman"/>
-                <w:sz w:val="16"/>
-              </w:rPr>
-              <w:t>= 0,032</w:t>
-            </w:r>
-          </w:p>
-        </w:tc>
-        <w:tc>
-          <w:tcPr>
-            <w:tcW w:type="dxa" w:w="855"/>
-            <w:tcBorders>
-              <w:top w:val="single" w:sz="6" w:color="000000"/>
-              <w:bottom w:val="single" w:sz="6" w:color="000000"/>
-              <w:left w:val="nil" w:sz="6" w:color="000000"/>
-              <w:right w:val="nil" w:sz="6" w:color="000000"/>
-            </w:tcBorders>
-          </w:tcPr>
-          <w:p>
-            <w:pPr>
-              <w:jc w:val="center"/>
-            </w:pPr>
-            <w:r/>
-            <w:r>
-              <w:rPr>
-                <w:rFonts w:ascii="Times New Roman" w:hAnsi="Times New Roman"/>
-                <w:sz w:val="16"/>
-              </w:rPr>
-              <w:t>0,12</w:t>
+              <w:t>0,07</w:t>
             </w:r>
           </w:p>
         </w:tc>
@@ -5842,7 +5842,7 @@
                 <w:rFonts w:ascii="Times New Roman" w:hAnsi="Times New Roman"/>
                 <w:sz w:val="16"/>
               </w:rPr>
-              <w:t>Tensão</w:t>
+              <w:t>Vigor</w:t>
             </w:r>
           </w:p>
         </w:tc>
@@ -5866,7 +5866,7 @@
                 <w:rFonts w:ascii="Times New Roman" w:hAnsi="Times New Roman"/>
                 <w:sz w:val="16"/>
               </w:rPr>
-              <w:t>2,1</w:t>
+              <w:t>8,3</w:t>
             </w:r>
           </w:p>
         </w:tc>
@@ -5890,7 +5890,7 @@
                 <w:rFonts w:ascii="Times New Roman" w:hAnsi="Times New Roman"/>
                 <w:sz w:val="16"/>
               </w:rPr>
-              <w:t>1,8</w:t>
+              <w:t>5,4</w:t>
             </w:r>
           </w:p>
         </w:tc>
@@ -5914,7 +5914,7 @@
                 <w:rFonts w:ascii="Times New Roman" w:hAnsi="Times New Roman"/>
                 <w:sz w:val="16"/>
               </w:rPr>
-              <w:t>1,1</w:t>
+              <w:t>5,5</w:t>
             </w:r>
           </w:p>
         </w:tc>
@@ -5938,7 +5938,7 @@
                 <w:rFonts w:ascii="Times New Roman" w:hAnsi="Times New Roman"/>
                 <w:sz w:val="16"/>
               </w:rPr>
-              <w:t>1,4</w:t>
+              <w:t>5,4</w:t>
             </w:r>
           </w:p>
         </w:tc>
@@ -5962,7 +5962,7 @@
                 <w:rFonts w:ascii="Times New Roman" w:hAnsi="Times New Roman"/>
                 <w:sz w:val="16"/>
               </w:rPr>
-              <w:t>1,2</w:t>
+              <w:t>5,9</w:t>
             </w:r>
           </w:p>
         </w:tc>
@@ -5986,7 +5986,7 @@
                 <w:rFonts w:ascii="Times New Roman" w:hAnsi="Times New Roman"/>
                 <w:sz w:val="16"/>
               </w:rPr>
-              <w:t>1,5</w:t>
+              <w:t>5,7</w:t>
             </w:r>
           </w:p>
         </w:tc>
@@ -6010,7 +6010,7 @@
                 <w:rFonts w:ascii="Times New Roman" w:hAnsi="Times New Roman"/>
                 <w:sz w:val="16"/>
               </w:rPr>
-              <w:t>1,1</w:t>
+              <w:t>4,4</w:t>
             </w:r>
           </w:p>
         </w:tc>
@@ -6034,7 +6034,7 @@
                 <w:rFonts w:ascii="Times New Roman" w:hAnsi="Times New Roman"/>
                 <w:sz w:val="16"/>
               </w:rPr>
-              <w:t>14,5</w:t>
+              <w:t>23,6</w:t>
             </w:r>
           </w:p>
         </w:tc>
@@ -6058,7 +6058,7 @@
                 <w:rFonts w:ascii="Times New Roman" w:hAnsi="Times New Roman"/>
                 <w:sz w:val="16"/>
               </w:rPr>
-              <w:t>= 0,025</w:t>
+              <w:t>&lt; 0,001</w:t>
             </w:r>
           </w:p>
         </w:tc>
@@ -6082,7 +6082,7 @@
                 <w:rFonts w:ascii="Times New Roman" w:hAnsi="Times New Roman"/>
                 <w:sz w:val="16"/>
               </w:rPr>
-              <w:t>0,13</w:t>
+              <w:t>0,21</w:t>
             </w:r>
           </w:p>
         </w:tc>
@@ -6108,7 +6108,7 @@
                 <w:rFonts w:ascii="Times New Roman" w:hAnsi="Times New Roman"/>
                 <w:sz w:val="16"/>
               </w:rPr>
-              <w:t>Depressão</w:t>
+              <w:t>Fadiga</w:t>
             </w:r>
           </w:p>
         </w:tc>
@@ -6132,7 +6132,7 @@
                 <w:rFonts w:ascii="Times New Roman" w:hAnsi="Times New Roman"/>
                 <w:sz w:val="16"/>
               </w:rPr>
-              <w:t>0,6</w:t>
+              <w:t>3,4</w:t>
             </w:r>
           </w:p>
         </w:tc>
@@ -6156,7 +6156,7 @@
                 <w:rFonts w:ascii="Times New Roman" w:hAnsi="Times New Roman"/>
                 <w:sz w:val="16"/>
               </w:rPr>
-              <w:t>1,3</w:t>
+              <w:t>5,2</w:t>
             </w:r>
           </w:p>
         </w:tc>
@@ -6180,7 +6180,7 @@
                 <w:rFonts w:ascii="Times New Roman" w:hAnsi="Times New Roman"/>
                 <w:sz w:val="16"/>
               </w:rPr>
-              <w:t>0,7</w:t>
+              <w:t>5,1</w:t>
             </w:r>
           </w:p>
         </w:tc>
@@ -6204,7 +6204,7 @@
                 <w:rFonts w:ascii="Times New Roman" w:hAnsi="Times New Roman"/>
                 <w:sz w:val="16"/>
               </w:rPr>
-              <w:t>1,2</w:t>
+              <w:t>5,8</w:t>
             </w:r>
           </w:p>
         </w:tc>
@@ -6228,7 +6228,7 @@
                 <w:rFonts w:ascii="Times New Roman" w:hAnsi="Times New Roman"/>
                 <w:sz w:val="16"/>
               </w:rPr>
-              <w:t>0,7</w:t>
+              <w:t>5,1</w:t>
             </w:r>
           </w:p>
         </w:tc>
@@ -6252,7 +6252,7 @@
                 <w:rFonts w:ascii="Times New Roman" w:hAnsi="Times New Roman"/>
                 <w:sz w:val="16"/>
               </w:rPr>
-              <w:t>1,2</w:t>
+              <w:t>6,0</w:t>
             </w:r>
           </w:p>
         </w:tc>
@@ -6276,7 +6276,7 @@
                 <w:rFonts w:ascii="Times New Roman" w:hAnsi="Times New Roman"/>
                 <w:sz w:val="16"/>
               </w:rPr>
-              <w:t>1,4</w:t>
+              <w:t>7,2</w:t>
             </w:r>
           </w:p>
         </w:tc>
@@ -6300,7 +6300,7 @@
                 <w:rFonts w:ascii="Times New Roman" w:hAnsi="Times New Roman"/>
                 <w:sz w:val="16"/>
               </w:rPr>
-              <w:t>3,5</w:t>
+              <w:t>17,9</w:t>
             </w:r>
           </w:p>
         </w:tc>
@@ -6324,7 +6324,7 @@
                 <w:rFonts w:ascii="Times New Roman" w:hAnsi="Times New Roman"/>
                 <w:sz w:val="16"/>
               </w:rPr>
-              <w:t>= 0,751</w:t>
+              <w:t>= 0,007</w:t>
             </w:r>
           </w:p>
         </w:tc>
@@ -6348,7 +6348,7 @@
                 <w:rFonts w:ascii="Times New Roman" w:hAnsi="Times New Roman"/>
                 <w:sz w:val="16"/>
               </w:rPr>
-              <w:t>0,03</w:t>
+              <w:t>0,16</w:t>
             </w:r>
           </w:p>
         </w:tc>
@@ -6374,7 +6374,7 @@
                 <w:rFonts w:ascii="Times New Roman" w:hAnsi="Times New Roman"/>
                 <w:sz w:val="16"/>
               </w:rPr>
-              <w:t>Raiva</w:t>
+              <w:t>Confusão</w:t>
             </w:r>
           </w:p>
         </w:tc>
@@ -6398,7 +6398,7 @@
                 <w:rFonts w:ascii="Times New Roman" w:hAnsi="Times New Roman"/>
                 <w:sz w:val="16"/>
               </w:rPr>
-              <w:t>1,7</w:t>
+              <w:t>1,0</w:t>
             </w:r>
           </w:p>
         </w:tc>
@@ -6422,7 +6422,7 @@
                 <w:rFonts w:ascii="Times New Roman" w:hAnsi="Times New Roman"/>
                 <w:sz w:val="16"/>
               </w:rPr>
-              <w:t>1,7</w:t>
+              <w:t>0,6</w:t>
             </w:r>
           </w:p>
         </w:tc>
@@ -6446,7 +6446,7 @@
                 <w:rFonts w:ascii="Times New Roman" w:hAnsi="Times New Roman"/>
                 <w:sz w:val="16"/>
               </w:rPr>
-              <w:t>1,6</w:t>
+              <w:t>0,3</w:t>
             </w:r>
           </w:p>
         </w:tc>
@@ -6470,7 +6470,7 @@
                 <w:rFonts w:ascii="Times New Roman" w:hAnsi="Times New Roman"/>
                 <w:sz w:val="16"/>
               </w:rPr>
-              <w:t>1,6</w:t>
+              <w:t>0,4</w:t>
             </w:r>
           </w:p>
         </w:tc>
@@ -6494,6 +6494,54 @@
                 <w:rFonts w:ascii="Times New Roman" w:hAnsi="Times New Roman"/>
                 <w:sz w:val="16"/>
               </w:rPr>
+              <w:t>0,2</w:t>
+            </w:r>
+          </w:p>
+        </w:tc>
+        <w:tc>
+          <w:tcPr>
+            <w:tcW w:type="dxa" w:w="855"/>
+            <w:tcBorders>
+              <w:top w:val="single" w:sz="6" w:color="000000"/>
+              <w:bottom w:val="single" w:sz="6" w:color="000000"/>
+              <w:left w:val="nil" w:sz="6" w:color="000000"/>
+              <w:right w:val="nil" w:sz="6" w:color="000000"/>
+            </w:tcBorders>
+          </w:tcPr>
+          <w:p>
+            <w:pPr>
+              <w:jc w:val="center"/>
+            </w:pPr>
+            <w:r/>
+            <w:r>
+              <w:rPr>
+                <w:rFonts w:ascii="Times New Roman" w:hAnsi="Times New Roman"/>
+                <w:sz w:val="16"/>
+              </w:rPr>
+              <w:t>0,7</w:t>
+            </w:r>
+          </w:p>
+        </w:tc>
+        <w:tc>
+          <w:tcPr>
+            <w:tcW w:type="dxa" w:w="855"/>
+            <w:tcBorders>
+              <w:top w:val="single" w:sz="6" w:color="000000"/>
+              <w:bottom w:val="single" w:sz="6" w:color="000000"/>
+              <w:left w:val="nil" w:sz="6" w:color="000000"/>
+              <w:right w:val="nil" w:sz="6" w:color="000000"/>
+            </w:tcBorders>
+          </w:tcPr>
+          <w:p>
+            <w:pPr>
+              <w:jc w:val="center"/>
+            </w:pPr>
+            <w:r/>
+            <w:r>
+              <w:rPr>
+                <w:rFonts w:ascii="Times New Roman" w:hAnsi="Times New Roman"/>
+                <w:sz w:val="16"/>
+              </w:rPr>
               <w:t>0,6</w:t>
             </w:r>
           </w:p>
@@ -6518,7 +6566,7 @@
                 <w:rFonts w:ascii="Times New Roman" w:hAnsi="Times New Roman"/>
                 <w:sz w:val="16"/>
               </w:rPr>
-              <w:t>1,8</w:t>
+              <w:t>22,9</w:t>
             </w:r>
           </w:p>
         </w:tc>
@@ -6542,7 +6590,7 @@
                 <w:rFonts w:ascii="Times New Roman" w:hAnsi="Times New Roman"/>
                 <w:sz w:val="16"/>
               </w:rPr>
-              <w:t>2,5</w:t>
+              <w:t>&lt; 0,001</w:t>
             </w:r>
           </w:p>
         </w:tc>
@@ -6566,55 +6614,7 @@
                 <w:rFonts w:ascii="Times New Roman" w:hAnsi="Times New Roman"/>
                 <w:sz w:val="16"/>
               </w:rPr>
-              <w:t>7,9</w:t>
-            </w:r>
-          </w:p>
-        </w:tc>
-        <w:tc>
-          <w:tcPr>
-            <w:tcW w:type="dxa" w:w="855"/>
-            <w:tcBorders>
-              <w:top w:val="single" w:sz="6" w:color="000000"/>
-              <w:bottom w:val="single" w:sz="6" w:color="000000"/>
-              <w:left w:val="nil" w:sz="6" w:color="000000"/>
-              <w:right w:val="nil" w:sz="6" w:color="000000"/>
-            </w:tcBorders>
-          </w:tcPr>
-          <w:p>
-            <w:pPr>
-              <w:jc w:val="center"/>
-            </w:pPr>
-            <w:r/>
-            <w:r>
-              <w:rPr>
-                <w:rFonts w:ascii="Times New Roman" w:hAnsi="Times New Roman"/>
-                <w:sz w:val="16"/>
-              </w:rPr>
-              <w:t>= 0,247</w:t>
-            </w:r>
-          </w:p>
-        </w:tc>
-        <w:tc>
-          <w:tcPr>
-            <w:tcW w:type="dxa" w:w="855"/>
-            <w:tcBorders>
-              <w:top w:val="single" w:sz="6" w:color="000000"/>
-              <w:bottom w:val="single" w:sz="6" w:color="000000"/>
-              <w:left w:val="nil" w:sz="6" w:color="000000"/>
-              <w:right w:val="nil" w:sz="6" w:color="000000"/>
-            </w:tcBorders>
-          </w:tcPr>
-          <w:p>
-            <w:pPr>
-              <w:jc w:val="center"/>
-            </w:pPr>
-            <w:r/>
-            <w:r>
-              <w:rPr>
-                <w:rFonts w:ascii="Times New Roman" w:hAnsi="Times New Roman"/>
-                <w:sz w:val="16"/>
-              </w:rPr>
-              <w:t>0,07</w:t>
+              <w:t>0,20</w:t>
             </w:r>
           </w:p>
         </w:tc>
@@ -6640,7 +6640,7 @@
                 <w:rFonts w:ascii="Times New Roman" w:hAnsi="Times New Roman"/>
                 <w:sz w:val="16"/>
               </w:rPr>
-              <w:t>Confusão</w:t>
+              <w:t>PTH</w:t>
             </w:r>
           </w:p>
         </w:tc>
@@ -6664,7 +6664,7 @@
                 <w:rFonts w:ascii="Times New Roman" w:hAnsi="Times New Roman"/>
                 <w:sz w:val="16"/>
               </w:rPr>
-              <w:t>1,0</w:t>
+              <w:t>0,6</w:t>
             </w:r>
           </w:p>
         </w:tc>
@@ -6688,7 +6688,7 @@
                 <w:rFonts w:ascii="Times New Roman" w:hAnsi="Times New Roman"/>
                 <w:sz w:val="16"/>
               </w:rPr>
-              <w:t>0,6</w:t>
+              <w:t>5,3</w:t>
             </w:r>
           </w:p>
         </w:tc>
@@ -6712,7 +6712,7 @@
                 <w:rFonts w:ascii="Times New Roman" w:hAnsi="Times New Roman"/>
                 <w:sz w:val="16"/>
               </w:rPr>
-              <w:t>0,3</w:t>
+              <w:t>3,3</w:t>
             </w:r>
           </w:p>
         </w:tc>
@@ -6736,7 +6736,7 @@
                 <w:rFonts w:ascii="Times New Roman" w:hAnsi="Times New Roman"/>
                 <w:sz w:val="16"/>
               </w:rPr>
-              <w:t>0,4</w:t>
+              <w:t>5,0</w:t>
             </w:r>
           </w:p>
         </w:tc>
@@ -6760,7 +6760,7 @@
                 <w:rFonts w:ascii="Times New Roman" w:hAnsi="Times New Roman"/>
                 <w:sz w:val="16"/>
               </w:rPr>
-              <w:t>0,2</w:t>
+              <w:t>1,9</w:t>
             </w:r>
           </w:p>
         </w:tc>
@@ -6784,7 +6784,7 @@
                 <w:rFonts w:ascii="Times New Roman" w:hAnsi="Times New Roman"/>
                 <w:sz w:val="16"/>
               </w:rPr>
-              <w:t>0,7</w:t>
+              <w:t>5,5</w:t>
             </w:r>
           </w:p>
         </w:tc>
@@ -6808,7 +6808,7 @@
                 <w:rFonts w:ascii="Times New Roman" w:hAnsi="Times New Roman"/>
                 <w:sz w:val="16"/>
               </w:rPr>
-              <w:t>0,6</w:t>
+              <w:t>8,3</w:t>
             </w:r>
           </w:p>
         </w:tc>
@@ -6832,7 +6832,7 @@
                 <w:rFonts w:ascii="Times New Roman" w:hAnsi="Times New Roman"/>
                 <w:sz w:val="16"/>
               </w:rPr>
-              <w:t>22,9</w:t>
+              <w:t>13,8</w:t>
             </w:r>
           </w:p>
         </w:tc>
@@ -6856,7 +6856,7 @@
                 <w:rFonts w:ascii="Times New Roman" w:hAnsi="Times New Roman"/>
                 <w:sz w:val="16"/>
               </w:rPr>
-              <w:t>&lt; 0,001</w:t>
+              <w:t>= 0,032</w:t>
             </w:r>
           </w:p>
         </w:tc>
@@ -6880,7 +6880,7 @@
                 <w:rFonts w:ascii="Times New Roman" w:hAnsi="Times New Roman"/>
                 <w:sz w:val="16"/>
               </w:rPr>
-              <w:t>0,20</w:t>
+              <w:t>0,12</w:t>
             </w:r>
           </w:p>
         </w:tc>
@@ -10434,7 +10434,7 @@
                 <w:rFonts w:ascii="Times New Roman" w:hAnsi="Times New Roman"/>
                 <w:sz w:val="18"/>
               </w:rPr>
-              <w:t>Vigor</w:t>
+              <w:t>Tensão</w:t>
             </w:r>
           </w:p>
         </w:tc>
@@ -10482,7 +10482,7 @@
                 <w:rFonts w:ascii="Times New Roman" w:hAnsi="Times New Roman"/>
                 <w:sz w:val="18"/>
               </w:rPr>
-              <w:t>8,30</w:t>
+              <w:t>2,15</w:t>
             </w:r>
           </w:p>
         </w:tc>
@@ -10530,7 +10530,7 @@
                 <w:rFonts w:ascii="Times New Roman" w:hAnsi="Times New Roman"/>
                 <w:sz w:val="18"/>
               </w:rPr>
-              <w:t>4,43</w:t>
+              <w:t>1,05</w:t>
             </w:r>
           </w:p>
         </w:tc>
@@ -10556,7 +10556,7 @@
                 <w:rFonts w:ascii="Times New Roman" w:hAnsi="Times New Roman"/>
                 <w:sz w:val="18"/>
               </w:rPr>
-              <w:t>Fadiga</w:t>
+              <w:t>Depressão</w:t>
             </w:r>
           </w:p>
         </w:tc>
@@ -10604,7 +10604,7 @@
                 <w:rFonts w:ascii="Times New Roman" w:hAnsi="Times New Roman"/>
                 <w:sz w:val="18"/>
               </w:rPr>
-              <w:t>7,22</w:t>
+              <w:t>1,35</w:t>
             </w:r>
           </w:p>
         </w:tc>
@@ -10652,7 +10652,7 @@
                 <w:rFonts w:ascii="Times New Roman" w:hAnsi="Times New Roman"/>
                 <w:sz w:val="18"/>
               </w:rPr>
-              <w:t>3,37</w:t>
+              <w:t>0,59</w:t>
             </w:r>
           </w:p>
         </w:tc>
@@ -10678,7 +10678,7 @@
                 <w:rFonts w:ascii="Times New Roman" w:hAnsi="Times New Roman"/>
                 <w:sz w:val="18"/>
               </w:rPr>
-              <w:t>PTH</w:t>
+              <w:t>Raiva</w:t>
             </w:r>
           </w:p>
         </w:tc>
@@ -10726,7 +10726,7 @@
                 <w:rFonts w:ascii="Times New Roman" w:hAnsi="Times New Roman"/>
                 <w:sz w:val="18"/>
               </w:rPr>
-              <w:t>8,30</w:t>
+              <w:t>2,54</w:t>
             </w:r>
           </w:p>
         </w:tc>
@@ -10750,7 +10750,7 @@
                 <w:rFonts w:ascii="Times New Roman" w:hAnsi="Times New Roman"/>
                 <w:sz w:val="18"/>
               </w:rPr>
-              <w:t>Dia 1</w:t>
+              <w:t>Dia 5</w:t>
             </w:r>
           </w:p>
         </w:tc>
@@ -10774,7 +10774,7 @@
                 <w:rFonts w:ascii="Times New Roman" w:hAnsi="Times New Roman"/>
                 <w:sz w:val="18"/>
               </w:rPr>
-              <w:t>0,59</w:t>
+              <w:t>0,57</w:t>
             </w:r>
           </w:p>
         </w:tc>
@@ -10800,7 +10800,7 @@
                 <w:rFonts w:ascii="Times New Roman" w:hAnsi="Times New Roman"/>
                 <w:sz w:val="18"/>
               </w:rPr>
-              <w:t>Tensão</w:t>
+              <w:t>Vigor</w:t>
             </w:r>
           </w:p>
         </w:tc>
@@ -10848,7 +10848,7 @@
                 <w:rFonts w:ascii="Times New Roman" w:hAnsi="Times New Roman"/>
                 <w:sz w:val="18"/>
               </w:rPr>
-              <w:t>2,15</w:t>
+              <w:t>8,30</w:t>
             </w:r>
           </w:p>
         </w:tc>
@@ -10896,7 +10896,7 @@
                 <w:rFonts w:ascii="Times New Roman" w:hAnsi="Times New Roman"/>
                 <w:sz w:val="18"/>
               </w:rPr>
-              <w:t>1,05</w:t>
+              <w:t>4,43</w:t>
             </w:r>
           </w:p>
         </w:tc>
@@ -10922,7 +10922,7 @@
                 <w:rFonts w:ascii="Times New Roman" w:hAnsi="Times New Roman"/>
                 <w:sz w:val="18"/>
               </w:rPr>
-              <w:t>Depressão</w:t>
+              <w:t>Fadiga</w:t>
             </w:r>
           </w:p>
         </w:tc>
@@ -10970,7 +10970,7 @@
                 <w:rFonts w:ascii="Times New Roman" w:hAnsi="Times New Roman"/>
                 <w:sz w:val="18"/>
               </w:rPr>
-              <w:t>1,35</w:t>
+              <w:t>7,22</w:t>
             </w:r>
           </w:p>
         </w:tc>
@@ -11018,7 +11018,7 @@
                 <w:rFonts w:ascii="Times New Roman" w:hAnsi="Times New Roman"/>
                 <w:sz w:val="18"/>
               </w:rPr>
-              <w:t>0,59</w:t>
+              <w:t>3,37</w:t>
             </w:r>
           </w:p>
         </w:tc>
@@ -11044,7 +11044,7 @@
                 <w:rFonts w:ascii="Times New Roman" w:hAnsi="Times New Roman"/>
                 <w:sz w:val="18"/>
               </w:rPr>
-              <w:t>Raiva</w:t>
+              <w:t>Confusão</w:t>
             </w:r>
           </w:p>
         </w:tc>
@@ -11068,7 +11068,7 @@
                 <w:rFonts w:ascii="Times New Roman" w:hAnsi="Times New Roman"/>
                 <w:sz w:val="18"/>
               </w:rPr>
-              <w:t>Dia 7</w:t>
+              <w:t>Dia 1</w:t>
             </w:r>
           </w:p>
         </w:tc>
@@ -11092,7 +11092,7 @@
                 <w:rFonts w:ascii="Times New Roman" w:hAnsi="Times New Roman"/>
                 <w:sz w:val="18"/>
               </w:rPr>
-              <w:t>2,54</w:t>
+              <w:t>1,04</w:t>
             </w:r>
           </w:p>
         </w:tc>
@@ -11140,7 +11140,7 @@
                 <w:rFonts w:ascii="Times New Roman" w:hAnsi="Times New Roman"/>
                 <w:sz w:val="18"/>
               </w:rPr>
-              <w:t>0,57</w:t>
+              <w:t>0,21</w:t>
             </w:r>
           </w:p>
         </w:tc>
@@ -11166,7 +11166,7 @@
                 <w:rFonts w:ascii="Times New Roman" w:hAnsi="Times New Roman"/>
                 <w:sz w:val="18"/>
               </w:rPr>
-              <w:t>Confusão</w:t>
+              <w:t>PTH</w:t>
             </w:r>
           </w:p>
         </w:tc>
@@ -11190,6 +11190,54 @@
                 <w:rFonts w:ascii="Times New Roman" w:hAnsi="Times New Roman"/>
                 <w:sz w:val="18"/>
               </w:rPr>
+              <w:t>Dia 7</w:t>
+            </w:r>
+          </w:p>
+        </w:tc>
+        <w:tc>
+          <w:tcPr>
+            <w:tcW w:type="dxa" w:w="1881"/>
+            <w:tcBorders>
+              <w:top w:val="single" w:sz="6" w:color="000000"/>
+              <w:bottom w:val="single" w:sz="6" w:color="000000"/>
+              <w:left w:val="nil" w:sz="6" w:color="000000"/>
+              <w:right w:val="nil" w:sz="6" w:color="000000"/>
+            </w:tcBorders>
+          </w:tcPr>
+          <w:p>
+            <w:pPr>
+              <w:jc w:val="center"/>
+            </w:pPr>
+            <w:r/>
+            <w:r>
+              <w:rPr>
+                <w:rFonts w:ascii="Times New Roman" w:hAnsi="Times New Roman"/>
+                <w:sz w:val="18"/>
+              </w:rPr>
+              <w:t>8,30</w:t>
+            </w:r>
+          </w:p>
+        </w:tc>
+        <w:tc>
+          <w:tcPr>
+            <w:tcW w:type="dxa" w:w="1881"/>
+            <w:tcBorders>
+              <w:top w:val="single" w:sz="6" w:color="000000"/>
+              <w:bottom w:val="single" w:sz="6" w:color="000000"/>
+              <w:left w:val="nil" w:sz="6" w:color="000000"/>
+              <w:right w:val="nil" w:sz="6" w:color="000000"/>
+            </w:tcBorders>
+          </w:tcPr>
+          <w:p>
+            <w:pPr>
+              <w:jc w:val="center"/>
+            </w:pPr>
+            <w:r/>
+            <w:r>
+              <w:rPr>
+                <w:rFonts w:ascii="Times New Roman" w:hAnsi="Times New Roman"/>
+                <w:sz w:val="18"/>
+              </w:rPr>
               <w:t>Dia 1</w:t>
             </w:r>
           </w:p>
@@ -11214,55 +11262,7 @@
                 <w:rFonts w:ascii="Times New Roman" w:hAnsi="Times New Roman"/>
                 <w:sz w:val="18"/>
               </w:rPr>
-              <w:t>1,04</w:t>
-            </w:r>
-          </w:p>
-        </w:tc>
-        <w:tc>
-          <w:tcPr>
-            <w:tcW w:type="dxa" w:w="1881"/>
-            <w:tcBorders>
-              <w:top w:val="single" w:sz="6" w:color="000000"/>
-              <w:bottom w:val="single" w:sz="6" w:color="000000"/>
-              <w:left w:val="nil" w:sz="6" w:color="000000"/>
-              <w:right w:val="nil" w:sz="6" w:color="000000"/>
-            </w:tcBorders>
-          </w:tcPr>
-          <w:p>
-            <w:pPr>
-              <w:jc w:val="center"/>
-            </w:pPr>
-            <w:r/>
-            <w:r>
-              <w:rPr>
-                <w:rFonts w:ascii="Times New Roman" w:hAnsi="Times New Roman"/>
-                <w:sz w:val="18"/>
-              </w:rPr>
-              <w:t>Dia 5</w:t>
-            </w:r>
-          </w:p>
-        </w:tc>
-        <w:tc>
-          <w:tcPr>
-            <w:tcW w:type="dxa" w:w="1881"/>
-            <w:tcBorders>
-              <w:top w:val="single" w:sz="6" w:color="000000"/>
-              <w:bottom w:val="single" w:sz="6" w:color="000000"/>
-              <w:left w:val="nil" w:sz="6" w:color="000000"/>
-              <w:right w:val="nil" w:sz="6" w:color="000000"/>
-            </w:tcBorders>
-          </w:tcPr>
-          <w:p>
-            <w:pPr>
-              <w:jc w:val="center"/>
-            </w:pPr>
-            <w:r/>
-            <w:r>
-              <w:rPr>
-                <w:rFonts w:ascii="Times New Roman" w:hAnsi="Times New Roman"/>
-                <w:sz w:val="18"/>
-              </w:rPr>
-              <w:t>0,21</w:t>
+              <w:t>0,59</w:t>
             </w:r>
           </w:p>
         </w:tc>
@@ -11336,7 +11336,7 @@
               <a:graphicData uri="http://schemas.openxmlformats.org/drawingml/2006/picture">
                 <pic:pic>
                   <pic:nvPicPr>
-                    <pic:cNvPr id="0" name="xb4_v_Vigor.png"/>
+                    <pic:cNvPr id="0" name="xb4_v_Tensao.png"/>
                     <pic:cNvPicPr/>
                   </pic:nvPicPr>
                   <pic:blipFill>
@@ -11367,7 +11367,7 @@
         <w:rPr>
           <w:sz w:val="22"/>
         </w:rPr>
-        <w:t>Figura 5 – Vigor ao longo da semana: média diária (banda = IC95%), diagramas de caixa por dia e efeito Dia 1 → Dia 7.</w:t>
+        <w:t>Figura 5 – Tensão ao longo da semana: média diária (banda = IC95%), diagramas de caixa por dia e efeito Dia 1 → Dia 7.</w:t>
       </w:r>
     </w:p>
     <w:p>
@@ -11399,7 +11399,7 @@
               <a:graphicData uri="http://schemas.openxmlformats.org/drawingml/2006/picture">
                 <pic:pic>
                   <pic:nvPicPr>
-                    <pic:cNvPr id="0" name="xb4_v_Fadiga.png"/>
+                    <pic:cNvPr id="0" name="xb4_v_Depressao.png"/>
                     <pic:cNvPicPr/>
                   </pic:nvPicPr>
                   <pic:blipFill>
@@ -11430,7 +11430,7 @@
         <w:rPr>
           <w:sz w:val="22"/>
         </w:rPr>
-        <w:t>Figura 6 – Fadiga ao longo da semana: média diária (banda = IC95%), diagramas de caixa por dia e efeito Dia 1 → Dia 7.</w:t>
+        <w:t>Figura 6 – Depressão ao longo da semana: média diária (banda = IC95%), diagramas de caixa por dia e efeito Dia 1 → Dia 7.</w:t>
       </w:r>
     </w:p>
     <w:p>
@@ -11462,7 +11462,7 @@
               <a:graphicData uri="http://schemas.openxmlformats.org/drawingml/2006/picture">
                 <pic:pic>
                   <pic:nvPicPr>
-                    <pic:cNvPr id="0" name="xb4_v_Tensao.png"/>
+                    <pic:cNvPr id="0" name="xb4_v_Raiva.png"/>
                     <pic:cNvPicPr/>
                   </pic:nvPicPr>
                   <pic:blipFill>
@@ -11493,7 +11493,7 @@
         <w:rPr>
           <w:sz w:val="22"/>
         </w:rPr>
-        <w:t>Figura 7 – Tensão ao longo da semana: média diária (banda = IC95%), diagramas de caixa por dia e efeito Dia 1 → Dia 7.</w:t>
+        <w:t>Figura 7 – Raiva ao longo da semana: média diária (banda = IC95%), diagramas de caixa por dia e efeito Dia 1 → Dia 7.</w:t>
       </w:r>
     </w:p>
     <w:p>
@@ -11525,7 +11525,7 @@
               <a:graphicData uri="http://schemas.openxmlformats.org/drawingml/2006/picture">
                 <pic:pic>
                   <pic:nvPicPr>
-                    <pic:cNvPr id="0" name="xb4_v_Depressao.png"/>
+                    <pic:cNvPr id="0" name="xb4_v_Vigor.png"/>
                     <pic:cNvPicPr/>
                   </pic:nvPicPr>
                   <pic:blipFill>
@@ -11556,7 +11556,7 @@
         <w:rPr>
           <w:sz w:val="22"/>
         </w:rPr>
-        <w:t>Figura 8 – Depressão ao longo da semana: média diária (banda = IC95%), diagramas de caixa por dia e efeito Dia 1 → Dia 7.</w:t>
+        <w:t>Figura 8 – Vigor ao longo da semana: média diária (banda = IC95%), diagramas de caixa por dia e efeito Dia 1 → Dia 7.</w:t>
       </w:r>
     </w:p>
     <w:p>
@@ -11588,7 +11588,7 @@
               <a:graphicData uri="http://schemas.openxmlformats.org/drawingml/2006/picture">
                 <pic:pic>
                   <pic:nvPicPr>
-                    <pic:cNvPr id="0" name="xb4_v_Raiva.png"/>
+                    <pic:cNvPr id="0" name="xb4_v_Fadiga.png"/>
                     <pic:cNvPicPr/>
                   </pic:nvPicPr>
                   <pic:blipFill>
@@ -11619,7 +11619,7 @@
         <w:rPr>
           <w:sz w:val="22"/>
         </w:rPr>
-        <w:t>Figura 9 – Raiva ao longo da semana: média diária (banda = IC95%), diagramas de caixa por dia e efeito Dia 1 → Dia 7.</w:t>
+        <w:t>Figura 9 – Fadiga ao longo da semana: média diária (banda = IC95%), diagramas de caixa por dia e efeito Dia 1 → Dia 7.</w:t>
       </w:r>
     </w:p>
     <w:p>
@@ -15262,7 +15262,7 @@
         <w:rPr>
           <w:sz w:val="22"/>
         </w:rPr>
-        <w:t>Tabela 16 – Modelagem polinomial (grau 3) das médias diárias do eixo energia–fadiga: qualidade do ajuste (R²), taxa de variação média (pontos/dia), taxa instantânea nas bordas (P′ no Dia 1 e no Dia 7) e ponto de inflexão.</w:t>
+        <w:t>Tabela 16 – Modelagem polinomial (grau 3) das médias diárias do eixo energia–fadiga: qualidade do ajuste (R²), taxa de variação média, taxa instantânea (P′) e aceleração (P″) nas bordas, e ponto de inflexão.</w:t>
       </w:r>
     </w:p>
     <w:tbl>
@@ -15272,17 +15272,19 @@
         <w:tblLook w:firstColumn="1" w:firstRow="1" w:lastColumn="0" w:lastRow="0" w:noHBand="0" w:noVBand="1" w:val="04A0"/>
       </w:tblPr>
       <w:tblGrid>
-        <w:gridCol w:w="1567"/>
-        <w:gridCol w:w="1567"/>
-        <w:gridCol w:w="1567"/>
-        <w:gridCol w:w="1567"/>
-        <w:gridCol w:w="1567"/>
-        <w:gridCol w:w="1567"/>
+        <w:gridCol w:w="1176"/>
+        <w:gridCol w:w="1176"/>
+        <w:gridCol w:w="1176"/>
+        <w:gridCol w:w="1176"/>
+        <w:gridCol w:w="1176"/>
+        <w:gridCol w:w="1176"/>
+        <w:gridCol w:w="1176"/>
+        <w:gridCol w:w="1176"/>
       </w:tblGrid>
       <w:tr>
         <w:tc>
           <w:tcPr>
-            <w:tcW w:type="dxa" w:w="1567"/>
+            <w:tcW w:type="dxa" w:w="1176"/>
             <w:tcBorders>
               <w:top w:val="single" w:sz="6" w:color="000000"/>
               <w:bottom w:val="single" w:sz="6" w:color="000000"/>
@@ -15299,7 +15301,7 @@
               <w:rPr>
                 <w:rFonts w:ascii="Times New Roman" w:hAnsi="Times New Roman"/>
                 <w:b/>
-                <w:sz w:val="18"/>
+                <w:sz w:val="17"/>
               </w:rPr>
               <w:t>Dimensão</w:t>
             </w:r>
@@ -15307,7 +15309,7 @@
         </w:tc>
         <w:tc>
           <w:tcPr>
-            <w:tcW w:type="dxa" w:w="1567"/>
+            <w:tcW w:type="dxa" w:w="1176"/>
             <w:tcBorders>
               <w:top w:val="single" w:sz="6" w:color="000000"/>
               <w:bottom w:val="single" w:sz="6" w:color="000000"/>
@@ -15324,7 +15326,7 @@
               <w:rPr>
                 <w:rFonts w:ascii="Times New Roman" w:hAnsi="Times New Roman"/>
                 <w:b/>
-                <w:sz w:val="18"/>
+                <w:sz w:val="17"/>
               </w:rPr>
               <w:t>R²</w:t>
             </w:r>
@@ -15332,7 +15334,7 @@
         </w:tc>
         <w:tc>
           <w:tcPr>
-            <w:tcW w:type="dxa" w:w="1567"/>
+            <w:tcW w:type="dxa" w:w="1176"/>
             <w:tcBorders>
               <w:top w:val="single" w:sz="6" w:color="000000"/>
               <w:bottom w:val="single" w:sz="6" w:color="000000"/>
@@ -15349,7 +15351,7 @@
               <w:rPr>
                 <w:rFonts w:ascii="Times New Roman" w:hAnsi="Times New Roman"/>
                 <w:b/>
-                <w:sz w:val="18"/>
+                <w:sz w:val="17"/>
               </w:rPr>
               <w:t>Taxa média/dia</w:t>
             </w:r>
@@ -15357,7 +15359,7 @@
         </w:tc>
         <w:tc>
           <w:tcPr>
-            <w:tcW w:type="dxa" w:w="1567"/>
+            <w:tcW w:type="dxa" w:w="1176"/>
             <w:tcBorders>
               <w:top w:val="single" w:sz="6" w:color="000000"/>
               <w:bottom w:val="single" w:sz="6" w:color="000000"/>
@@ -15374,15 +15376,15 @@
               <w:rPr>
                 <w:rFonts w:ascii="Times New Roman" w:hAnsi="Times New Roman"/>
                 <w:b/>
-                <w:sz w:val="18"/>
-              </w:rPr>
-              <w:t>P′(Dia 1)</w:t>
-            </w:r>
-          </w:p>
-        </w:tc>
-        <w:tc>
-          <w:tcPr>
-            <w:tcW w:type="dxa" w:w="1567"/>
+                <w:sz w:val="17"/>
+              </w:rPr>
+              <w:t>P′(D1)</w:t>
+            </w:r>
+          </w:p>
+        </w:tc>
+        <w:tc>
+          <w:tcPr>
+            <w:tcW w:type="dxa" w:w="1176"/>
             <w:tcBorders>
               <w:top w:val="single" w:sz="6" w:color="000000"/>
               <w:bottom w:val="single" w:sz="6" w:color="000000"/>
@@ -15399,15 +15401,15 @@
               <w:rPr>
                 <w:rFonts w:ascii="Times New Roman" w:hAnsi="Times New Roman"/>
                 <w:b/>
-                <w:sz w:val="18"/>
-              </w:rPr>
-              <w:t>P′(Dia 7)</w:t>
-            </w:r>
-          </w:p>
-        </w:tc>
-        <w:tc>
-          <w:tcPr>
-            <w:tcW w:type="dxa" w:w="1567"/>
+                <w:sz w:val="17"/>
+              </w:rPr>
+              <w:t>P′(D7)</w:t>
+            </w:r>
+          </w:p>
+        </w:tc>
+        <w:tc>
+          <w:tcPr>
+            <w:tcW w:type="dxa" w:w="1176"/>
             <w:tcBorders>
               <w:top w:val="single" w:sz="6" w:color="000000"/>
               <w:bottom w:val="single" w:sz="6" w:color="000000"/>
@@ -15424,7 +15426,57 @@
               <w:rPr>
                 <w:rFonts w:ascii="Times New Roman" w:hAnsi="Times New Roman"/>
                 <w:b/>
-                <w:sz w:val="18"/>
+                <w:sz w:val="17"/>
+              </w:rPr>
+              <w:t>P″(D1)</w:t>
+            </w:r>
+          </w:p>
+        </w:tc>
+        <w:tc>
+          <w:tcPr>
+            <w:tcW w:type="dxa" w:w="1176"/>
+            <w:tcBorders>
+              <w:top w:val="single" w:sz="6" w:color="000000"/>
+              <w:bottom w:val="single" w:sz="6" w:color="000000"/>
+              <w:left w:val="nil" w:sz="6" w:color="000000"/>
+              <w:right w:val="nil" w:sz="6" w:color="000000"/>
+            </w:tcBorders>
+          </w:tcPr>
+          <w:p>
+            <w:pPr>
+              <w:jc w:val="center"/>
+            </w:pPr>
+            <w:r/>
+            <w:r>
+              <w:rPr>
+                <w:rFonts w:ascii="Times New Roman" w:hAnsi="Times New Roman"/>
+                <w:b/>
+                <w:sz w:val="17"/>
+              </w:rPr>
+              <w:t>P″(D7)</w:t>
+            </w:r>
+          </w:p>
+        </w:tc>
+        <w:tc>
+          <w:tcPr>
+            <w:tcW w:type="dxa" w:w="1176"/>
+            <w:tcBorders>
+              <w:top w:val="single" w:sz="6" w:color="000000"/>
+              <w:bottom w:val="single" w:sz="6" w:color="000000"/>
+              <w:left w:val="nil" w:sz="6" w:color="000000"/>
+              <w:right w:val="nil" w:sz="6" w:color="000000"/>
+            </w:tcBorders>
+          </w:tcPr>
+          <w:p>
+            <w:pPr>
+              <w:jc w:val="center"/>
+            </w:pPr>
+            <w:r/>
+            <w:r>
+              <w:rPr>
+                <w:rFonts w:ascii="Times New Roman" w:hAnsi="Times New Roman"/>
+                <w:b/>
+                <w:sz w:val="17"/>
               </w:rPr>
               <w:t>Inflexão (dia)</w:t>
             </w:r>
@@ -15434,7 +15486,7 @@
       <w:tr>
         <w:tc>
           <w:tcPr>
-            <w:tcW w:type="dxa" w:w="1567"/>
+            <w:tcW w:type="dxa" w:w="1176"/>
             <w:tcBorders>
               <w:top w:val="single" w:sz="6" w:color="000000"/>
               <w:bottom w:val="single" w:sz="6" w:color="000000"/>
@@ -15450,7 +15502,7 @@
             <w:r>
               <w:rPr>
                 <w:rFonts w:ascii="Times New Roman" w:hAnsi="Times New Roman"/>
-                <w:sz w:val="18"/>
+                <w:sz w:val="17"/>
               </w:rPr>
               <w:t>Vigor</w:t>
             </w:r>
@@ -15458,23 +15510,23 @@
         </w:tc>
         <w:tc>
           <w:tcPr>
-            <w:tcW w:type="dxa" w:w="1567"/>
-            <w:tcBorders>
-              <w:top w:val="single" w:sz="6" w:color="000000"/>
-              <w:bottom w:val="single" w:sz="6" w:color="000000"/>
-              <w:left w:val="nil" w:sz="6" w:color="000000"/>
-              <w:right w:val="nil" w:sz="6" w:color="000000"/>
-            </w:tcBorders>
-          </w:tcPr>
-          <w:p>
-            <w:pPr>
-              <w:jc w:val="center"/>
-            </w:pPr>
-            <w:r/>
-            <w:r>
-              <w:rPr>
-                <w:rFonts w:ascii="Times New Roman" w:hAnsi="Times New Roman"/>
-                <w:sz w:val="18"/>
+            <w:tcW w:type="dxa" w:w="1176"/>
+            <w:tcBorders>
+              <w:top w:val="single" w:sz="6" w:color="000000"/>
+              <w:bottom w:val="single" w:sz="6" w:color="000000"/>
+              <w:left w:val="nil" w:sz="6" w:color="000000"/>
+              <w:right w:val="nil" w:sz="6" w:color="000000"/>
+            </w:tcBorders>
+          </w:tcPr>
+          <w:p>
+            <w:pPr>
+              <w:jc w:val="center"/>
+            </w:pPr>
+            <w:r/>
+            <w:r>
+              <w:rPr>
+                <w:rFonts w:ascii="Times New Roman" w:hAnsi="Times New Roman"/>
+                <w:sz w:val="17"/>
               </w:rPr>
               <w:t>0,96</w:t>
             </w:r>
@@ -15482,23 +15534,23 @@
         </w:tc>
         <w:tc>
           <w:tcPr>
-            <w:tcW w:type="dxa" w:w="1567"/>
-            <w:tcBorders>
-              <w:top w:val="single" w:sz="6" w:color="000000"/>
-              <w:bottom w:val="single" w:sz="6" w:color="000000"/>
-              <w:left w:val="nil" w:sz="6" w:color="000000"/>
-              <w:right w:val="nil" w:sz="6" w:color="000000"/>
-            </w:tcBorders>
-          </w:tcPr>
-          <w:p>
-            <w:pPr>
-              <w:jc w:val="center"/>
-            </w:pPr>
-            <w:r/>
-            <w:r>
-              <w:rPr>
-                <w:rFonts w:ascii="Times New Roman" w:hAnsi="Times New Roman"/>
-                <w:sz w:val="18"/>
+            <w:tcW w:type="dxa" w:w="1176"/>
+            <w:tcBorders>
+              <w:top w:val="single" w:sz="6" w:color="000000"/>
+              <w:bottom w:val="single" w:sz="6" w:color="000000"/>
+              <w:left w:val="nil" w:sz="6" w:color="000000"/>
+              <w:right w:val="nil" w:sz="6" w:color="000000"/>
+            </w:tcBorders>
+          </w:tcPr>
+          <w:p>
+            <w:pPr>
+              <w:jc w:val="center"/>
+            </w:pPr>
+            <w:r/>
+            <w:r>
+              <w:rPr>
+                <w:rFonts w:ascii="Times New Roman" w:hAnsi="Times New Roman"/>
+                <w:sz w:val="17"/>
               </w:rPr>
               <w:t>-0,64</w:t>
             </w:r>
@@ -15506,23 +15558,23 @@
         </w:tc>
         <w:tc>
           <w:tcPr>
-            <w:tcW w:type="dxa" w:w="1567"/>
-            <w:tcBorders>
-              <w:top w:val="single" w:sz="6" w:color="000000"/>
-              <w:bottom w:val="single" w:sz="6" w:color="000000"/>
-              <w:left w:val="nil" w:sz="6" w:color="000000"/>
-              <w:right w:val="nil" w:sz="6" w:color="000000"/>
-            </w:tcBorders>
-          </w:tcPr>
-          <w:p>
-            <w:pPr>
-              <w:jc w:val="center"/>
-            </w:pPr>
-            <w:r/>
-            <w:r>
-              <w:rPr>
-                <w:rFonts w:ascii="Times New Roman" w:hAnsi="Times New Roman"/>
-                <w:sz w:val="18"/>
+            <w:tcW w:type="dxa" w:w="1176"/>
+            <w:tcBorders>
+              <w:top w:val="single" w:sz="6" w:color="000000"/>
+              <w:bottom w:val="single" w:sz="6" w:color="000000"/>
+              <w:left w:val="nil" w:sz="6" w:color="000000"/>
+              <w:right w:val="nil" w:sz="6" w:color="000000"/>
+            </w:tcBorders>
+          </w:tcPr>
+          <w:p>
+            <w:pPr>
+              <w:jc w:val="center"/>
+            </w:pPr>
+            <w:r/>
+            <w:r>
+              <w:rPr>
+                <w:rFonts w:ascii="Times New Roman" w:hAnsi="Times New Roman"/>
+                <w:sz w:val="17"/>
               </w:rPr>
               <w:t>-3,52</w:t>
             </w:r>
@@ -15530,23 +15582,23 @@
         </w:tc>
         <w:tc>
           <w:tcPr>
-            <w:tcW w:type="dxa" w:w="1567"/>
-            <w:tcBorders>
-              <w:top w:val="single" w:sz="6" w:color="000000"/>
-              <w:bottom w:val="single" w:sz="6" w:color="000000"/>
-              <w:left w:val="nil" w:sz="6" w:color="000000"/>
-              <w:right w:val="nil" w:sz="6" w:color="000000"/>
-            </w:tcBorders>
-          </w:tcPr>
-          <w:p>
-            <w:pPr>
-              <w:jc w:val="center"/>
-            </w:pPr>
-            <w:r/>
-            <w:r>
-              <w:rPr>
-                <w:rFonts w:ascii="Times New Roman" w:hAnsi="Times New Roman"/>
-                <w:sz w:val="18"/>
+            <w:tcW w:type="dxa" w:w="1176"/>
+            <w:tcBorders>
+              <w:top w:val="single" w:sz="6" w:color="000000"/>
+              <w:bottom w:val="single" w:sz="6" w:color="000000"/>
+              <w:left w:val="nil" w:sz="6" w:color="000000"/>
+              <w:right w:val="nil" w:sz="6" w:color="000000"/>
+            </w:tcBorders>
+          </w:tcPr>
+          <w:p>
+            <w:pPr>
+              <w:jc w:val="center"/>
+            </w:pPr>
+            <w:r/>
+            <w:r>
+              <w:rPr>
+                <w:rFonts w:ascii="Times New Roman" w:hAnsi="Times New Roman"/>
+                <w:sz w:val="17"/>
               </w:rPr>
               <w:t>-2,40</w:t>
             </w:r>
@@ -15554,23 +15606,71 @@
         </w:tc>
         <w:tc>
           <w:tcPr>
-            <w:tcW w:type="dxa" w:w="1567"/>
-            <w:tcBorders>
-              <w:top w:val="single" w:sz="6" w:color="000000"/>
-              <w:bottom w:val="single" w:sz="6" w:color="000000"/>
-              <w:left w:val="nil" w:sz="6" w:color="000000"/>
-              <w:right w:val="nil" w:sz="6" w:color="000000"/>
-            </w:tcBorders>
-          </w:tcPr>
-          <w:p>
-            <w:pPr>
-              <w:jc w:val="center"/>
-            </w:pPr>
-            <w:r/>
-            <w:r>
-              <w:rPr>
-                <w:rFonts w:ascii="Times New Roman" w:hAnsi="Times New Roman"/>
-                <w:sz w:val="18"/>
+            <w:tcW w:type="dxa" w:w="1176"/>
+            <w:tcBorders>
+              <w:top w:val="single" w:sz="6" w:color="000000"/>
+              <w:bottom w:val="single" w:sz="6" w:color="000000"/>
+              <w:left w:val="nil" w:sz="6" w:color="000000"/>
+              <w:right w:val="nil" w:sz="6" w:color="000000"/>
+            </w:tcBorders>
+          </w:tcPr>
+          <w:p>
+            <w:pPr>
+              <w:jc w:val="center"/>
+            </w:pPr>
+            <w:r/>
+            <w:r>
+              <w:rPr>
+                <w:rFonts w:ascii="Times New Roman" w:hAnsi="Times New Roman"/>
+                <w:sz w:val="17"/>
+              </w:rPr>
+              <w:t>+2,51</w:t>
+            </w:r>
+          </w:p>
+        </w:tc>
+        <w:tc>
+          <w:tcPr>
+            <w:tcW w:type="dxa" w:w="1176"/>
+            <w:tcBorders>
+              <w:top w:val="single" w:sz="6" w:color="000000"/>
+              <w:bottom w:val="single" w:sz="6" w:color="000000"/>
+              <w:left w:val="nil" w:sz="6" w:color="000000"/>
+              <w:right w:val="nil" w:sz="6" w:color="000000"/>
+            </w:tcBorders>
+          </w:tcPr>
+          <w:p>
+            <w:pPr>
+              <w:jc w:val="center"/>
+            </w:pPr>
+            <w:r/>
+            <w:r>
+              <w:rPr>
+                <w:rFonts w:ascii="Times New Roman" w:hAnsi="Times New Roman"/>
+                <w:sz w:val="17"/>
+              </w:rPr>
+              <w:t>-2,14</w:t>
+            </w:r>
+          </w:p>
+        </w:tc>
+        <w:tc>
+          <w:tcPr>
+            <w:tcW w:type="dxa" w:w="1176"/>
+            <w:tcBorders>
+              <w:top w:val="single" w:sz="6" w:color="000000"/>
+              <w:bottom w:val="single" w:sz="6" w:color="000000"/>
+              <w:left w:val="nil" w:sz="6" w:color="000000"/>
+              <w:right w:val="nil" w:sz="6" w:color="000000"/>
+            </w:tcBorders>
+          </w:tcPr>
+          <w:p>
+            <w:pPr>
+              <w:jc w:val="center"/>
+            </w:pPr>
+            <w:r/>
+            <w:r>
+              <w:rPr>
+                <w:rFonts w:ascii="Times New Roman" w:hAnsi="Times New Roman"/>
+                <w:sz w:val="17"/>
               </w:rPr>
               <w:t>4,2</w:t>
             </w:r>
@@ -15580,7 +15680,7 @@
       <w:tr>
         <w:tc>
           <w:tcPr>
-            <w:tcW w:type="dxa" w:w="1567"/>
+            <w:tcW w:type="dxa" w:w="1176"/>
             <w:tcBorders>
               <w:top w:val="single" w:sz="6" w:color="000000"/>
               <w:bottom w:val="single" w:sz="6" w:color="000000"/>
@@ -15596,7 +15696,7 @@
             <w:r>
               <w:rPr>
                 <w:rFonts w:ascii="Times New Roman" w:hAnsi="Times New Roman"/>
-                <w:sz w:val="18"/>
+                <w:sz w:val="17"/>
               </w:rPr>
               <w:t>Fadiga</w:t>
             </w:r>
@@ -15604,23 +15704,23 @@
         </w:tc>
         <w:tc>
           <w:tcPr>
-            <w:tcW w:type="dxa" w:w="1567"/>
-            <w:tcBorders>
-              <w:top w:val="single" w:sz="6" w:color="000000"/>
-              <w:bottom w:val="single" w:sz="6" w:color="000000"/>
-              <w:left w:val="nil" w:sz="6" w:color="000000"/>
-              <w:right w:val="nil" w:sz="6" w:color="000000"/>
-            </w:tcBorders>
-          </w:tcPr>
-          <w:p>
-            <w:pPr>
-              <w:jc w:val="center"/>
-            </w:pPr>
-            <w:r/>
-            <w:r>
-              <w:rPr>
-                <w:rFonts w:ascii="Times New Roman" w:hAnsi="Times New Roman"/>
-                <w:sz w:val="18"/>
+            <w:tcW w:type="dxa" w:w="1176"/>
+            <w:tcBorders>
+              <w:top w:val="single" w:sz="6" w:color="000000"/>
+              <w:bottom w:val="single" w:sz="6" w:color="000000"/>
+              <w:left w:val="nil" w:sz="6" w:color="000000"/>
+              <w:right w:val="nil" w:sz="6" w:color="000000"/>
+            </w:tcBorders>
+          </w:tcPr>
+          <w:p>
+            <w:pPr>
+              <w:jc w:val="center"/>
+            </w:pPr>
+            <w:r/>
+            <w:r>
+              <w:rPr>
+                <w:rFonts w:ascii="Times New Roman" w:hAnsi="Times New Roman"/>
+                <w:sz w:val="17"/>
               </w:rPr>
               <w:t>0,95</w:t>
             </w:r>
@@ -15628,23 +15728,23 @@
         </w:tc>
         <w:tc>
           <w:tcPr>
-            <w:tcW w:type="dxa" w:w="1567"/>
-            <w:tcBorders>
-              <w:top w:val="single" w:sz="6" w:color="000000"/>
-              <w:bottom w:val="single" w:sz="6" w:color="000000"/>
-              <w:left w:val="nil" w:sz="6" w:color="000000"/>
-              <w:right w:val="nil" w:sz="6" w:color="000000"/>
-            </w:tcBorders>
-          </w:tcPr>
-          <w:p>
-            <w:pPr>
-              <w:jc w:val="center"/>
-            </w:pPr>
-            <w:r/>
-            <w:r>
-              <w:rPr>
-                <w:rFonts w:ascii="Times New Roman" w:hAnsi="Times New Roman"/>
-                <w:sz w:val="18"/>
+            <w:tcW w:type="dxa" w:w="1176"/>
+            <w:tcBorders>
+              <w:top w:val="single" w:sz="6" w:color="000000"/>
+              <w:bottom w:val="single" w:sz="6" w:color="000000"/>
+              <w:left w:val="nil" w:sz="6" w:color="000000"/>
+              <w:right w:val="nil" w:sz="6" w:color="000000"/>
+            </w:tcBorders>
+          </w:tcPr>
+          <w:p>
+            <w:pPr>
+              <w:jc w:val="center"/>
+            </w:pPr>
+            <w:r/>
+            <w:r>
+              <w:rPr>
+                <w:rFonts w:ascii="Times New Roman" w:hAnsi="Times New Roman"/>
+                <w:sz w:val="17"/>
               </w:rPr>
               <w:t>+0,64</w:t>
             </w:r>
@@ -15652,23 +15752,23 @@
         </w:tc>
         <w:tc>
           <w:tcPr>
-            <w:tcW w:type="dxa" w:w="1567"/>
-            <w:tcBorders>
-              <w:top w:val="single" w:sz="6" w:color="000000"/>
-              <w:bottom w:val="single" w:sz="6" w:color="000000"/>
-              <w:left w:val="nil" w:sz="6" w:color="000000"/>
-              <w:right w:val="nil" w:sz="6" w:color="000000"/>
-            </w:tcBorders>
-          </w:tcPr>
-          <w:p>
-            <w:pPr>
-              <w:jc w:val="center"/>
-            </w:pPr>
-            <w:r/>
-            <w:r>
-              <w:rPr>
-                <w:rFonts w:ascii="Times New Roman" w:hAnsi="Times New Roman"/>
-                <w:sz w:val="18"/>
+            <w:tcW w:type="dxa" w:w="1176"/>
+            <w:tcBorders>
+              <w:top w:val="single" w:sz="6" w:color="000000"/>
+              <w:bottom w:val="single" w:sz="6" w:color="000000"/>
+              <w:left w:val="nil" w:sz="6" w:color="000000"/>
+              <w:right w:val="nil" w:sz="6" w:color="000000"/>
+            </w:tcBorders>
+          </w:tcPr>
+          <w:p>
+            <w:pPr>
+              <w:jc w:val="center"/>
+            </w:pPr>
+            <w:r/>
+            <w:r>
+              <w:rPr>
+                <w:rFonts w:ascii="Times New Roman" w:hAnsi="Times New Roman"/>
+                <w:sz w:val="17"/>
               </w:rPr>
               <w:t>+2,23</w:t>
             </w:r>
@@ -15676,23 +15776,23 @@
         </w:tc>
         <w:tc>
           <w:tcPr>
-            <w:tcW w:type="dxa" w:w="1567"/>
-            <w:tcBorders>
-              <w:top w:val="single" w:sz="6" w:color="000000"/>
-              <w:bottom w:val="single" w:sz="6" w:color="000000"/>
-              <w:left w:val="nil" w:sz="6" w:color="000000"/>
-              <w:right w:val="nil" w:sz="6" w:color="000000"/>
-            </w:tcBorders>
-          </w:tcPr>
-          <w:p>
-            <w:pPr>
-              <w:jc w:val="center"/>
-            </w:pPr>
-            <w:r/>
-            <w:r>
-              <w:rPr>
-                <w:rFonts w:ascii="Times New Roman" w:hAnsi="Times New Roman"/>
-                <w:sz w:val="18"/>
+            <w:tcW w:type="dxa" w:w="1176"/>
+            <w:tcBorders>
+              <w:top w:val="single" w:sz="6" w:color="000000"/>
+              <w:bottom w:val="single" w:sz="6" w:color="000000"/>
+              <w:left w:val="nil" w:sz="6" w:color="000000"/>
+              <w:right w:val="nil" w:sz="6" w:color="000000"/>
+            </w:tcBorders>
+          </w:tcPr>
+          <w:p>
+            <w:pPr>
+              <w:jc w:val="center"/>
+            </w:pPr>
+            <w:r/>
+            <w:r>
+              <w:rPr>
+                <w:rFonts w:ascii="Times New Roman" w:hAnsi="Times New Roman"/>
+                <w:sz w:val="17"/>
               </w:rPr>
               <w:t>+2,11</w:t>
             </w:r>
@@ -15700,23 +15800,71 @@
         </w:tc>
         <w:tc>
           <w:tcPr>
-            <w:tcW w:type="dxa" w:w="1567"/>
-            <w:tcBorders>
-              <w:top w:val="single" w:sz="6" w:color="000000"/>
-              <w:bottom w:val="single" w:sz="6" w:color="000000"/>
-              <w:left w:val="nil" w:sz="6" w:color="000000"/>
-              <w:right w:val="nil" w:sz="6" w:color="000000"/>
-            </w:tcBorders>
-          </w:tcPr>
-          <w:p>
-            <w:pPr>
-              <w:jc w:val="center"/>
-            </w:pPr>
-            <w:r/>
-            <w:r>
-              <w:rPr>
-                <w:rFonts w:ascii="Times New Roman" w:hAnsi="Times New Roman"/>
-                <w:sz w:val="18"/>
+            <w:tcW w:type="dxa" w:w="1176"/>
+            <w:tcBorders>
+              <w:top w:val="single" w:sz="6" w:color="000000"/>
+              <w:bottom w:val="single" w:sz="6" w:color="000000"/>
+              <w:left w:val="nil" w:sz="6" w:color="000000"/>
+              <w:right w:val="nil" w:sz="6" w:color="000000"/>
+            </w:tcBorders>
+          </w:tcPr>
+          <w:p>
+            <w:pPr>
+              <w:jc w:val="center"/>
+            </w:pPr>
+            <w:r/>
+            <w:r>
+              <w:rPr>
+                <w:rFonts w:ascii="Times New Roman" w:hAnsi="Times New Roman"/>
+                <w:sz w:val="17"/>
+              </w:rPr>
+              <w:t>-1,55</w:t>
+            </w:r>
+          </w:p>
+        </w:tc>
+        <w:tc>
+          <w:tcPr>
+            <w:tcW w:type="dxa" w:w="1176"/>
+            <w:tcBorders>
+              <w:top w:val="single" w:sz="6" w:color="000000"/>
+              <w:bottom w:val="single" w:sz="6" w:color="000000"/>
+              <w:left w:val="nil" w:sz="6" w:color="000000"/>
+              <w:right w:val="nil" w:sz="6" w:color="000000"/>
+            </w:tcBorders>
+          </w:tcPr>
+          <w:p>
+            <w:pPr>
+              <w:jc w:val="center"/>
+            </w:pPr>
+            <w:r/>
+            <w:r>
+              <w:rPr>
+                <w:rFonts w:ascii="Times New Roman" w:hAnsi="Times New Roman"/>
+                <w:sz w:val="17"/>
+              </w:rPr>
+              <w:t>+1,51</w:t>
+            </w:r>
+          </w:p>
+        </w:tc>
+        <w:tc>
+          <w:tcPr>
+            <w:tcW w:type="dxa" w:w="1176"/>
+            <w:tcBorders>
+              <w:top w:val="single" w:sz="6" w:color="000000"/>
+              <w:bottom w:val="single" w:sz="6" w:color="000000"/>
+              <w:left w:val="nil" w:sz="6" w:color="000000"/>
+              <w:right w:val="nil" w:sz="6" w:color="000000"/>
+            </w:tcBorders>
+          </w:tcPr>
+          <w:p>
+            <w:pPr>
+              <w:jc w:val="center"/>
+            </w:pPr>
+            <w:r/>
+            <w:r>
+              <w:rPr>
+                <w:rFonts w:ascii="Times New Roman" w:hAnsi="Times New Roman"/>
+                <w:sz w:val="17"/>
               </w:rPr>
               <w:t>4,0</w:t>
             </w:r>
@@ -15726,7 +15874,7 @@
       <w:tr>
         <w:tc>
           <w:tcPr>
-            <w:tcW w:type="dxa" w:w="1567"/>
+            <w:tcW w:type="dxa" w:w="1176"/>
             <w:tcBorders>
               <w:top w:val="single" w:sz="6" w:color="000000"/>
               <w:bottom w:val="single" w:sz="6" w:color="000000"/>
@@ -15742,7 +15890,7 @@
             <w:r>
               <w:rPr>
                 <w:rFonts w:ascii="Times New Roman" w:hAnsi="Times New Roman"/>
-                <w:sz w:val="18"/>
+                <w:sz w:val="17"/>
               </w:rPr>
               <w:t>PTH</w:t>
             </w:r>
@@ -15750,23 +15898,23 @@
         </w:tc>
         <w:tc>
           <w:tcPr>
-            <w:tcW w:type="dxa" w:w="1567"/>
-            <w:tcBorders>
-              <w:top w:val="single" w:sz="6" w:color="000000"/>
-              <w:bottom w:val="single" w:sz="6" w:color="000000"/>
-              <w:left w:val="nil" w:sz="6" w:color="000000"/>
-              <w:right w:val="nil" w:sz="6" w:color="000000"/>
-            </w:tcBorders>
-          </w:tcPr>
-          <w:p>
-            <w:pPr>
-              <w:jc w:val="center"/>
-            </w:pPr>
-            <w:r/>
-            <w:r>
-              <w:rPr>
-                <w:rFonts w:ascii="Times New Roman" w:hAnsi="Times New Roman"/>
-                <w:sz w:val="18"/>
+            <w:tcW w:type="dxa" w:w="1176"/>
+            <w:tcBorders>
+              <w:top w:val="single" w:sz="6" w:color="000000"/>
+              <w:bottom w:val="single" w:sz="6" w:color="000000"/>
+              <w:left w:val="nil" w:sz="6" w:color="000000"/>
+              <w:right w:val="nil" w:sz="6" w:color="000000"/>
+            </w:tcBorders>
+          </w:tcPr>
+          <w:p>
+            <w:pPr>
+              <w:jc w:val="center"/>
+            </w:pPr>
+            <w:r/>
+            <w:r>
+              <w:rPr>
+                <w:rFonts w:ascii="Times New Roman" w:hAnsi="Times New Roman"/>
+                <w:sz w:val="17"/>
               </w:rPr>
               <w:t>0,80</w:t>
             </w:r>
@@ -15774,23 +15922,23 @@
         </w:tc>
         <w:tc>
           <w:tcPr>
-            <w:tcW w:type="dxa" w:w="1567"/>
-            <w:tcBorders>
-              <w:top w:val="single" w:sz="6" w:color="000000"/>
-              <w:bottom w:val="single" w:sz="6" w:color="000000"/>
-              <w:left w:val="nil" w:sz="6" w:color="000000"/>
-              <w:right w:val="nil" w:sz="6" w:color="000000"/>
-            </w:tcBorders>
-          </w:tcPr>
-          <w:p>
-            <w:pPr>
-              <w:jc w:val="center"/>
-            </w:pPr>
-            <w:r/>
-            <w:r>
-              <w:rPr>
-                <w:rFonts w:ascii="Times New Roman" w:hAnsi="Times New Roman"/>
-                <w:sz w:val="18"/>
+            <w:tcW w:type="dxa" w:w="1176"/>
+            <w:tcBorders>
+              <w:top w:val="single" w:sz="6" w:color="000000"/>
+              <w:bottom w:val="single" w:sz="6" w:color="000000"/>
+              <w:left w:val="nil" w:sz="6" w:color="000000"/>
+              <w:right w:val="nil" w:sz="6" w:color="000000"/>
+            </w:tcBorders>
+          </w:tcPr>
+          <w:p>
+            <w:pPr>
+              <w:jc w:val="center"/>
+            </w:pPr>
+            <w:r/>
+            <w:r>
+              <w:rPr>
+                <w:rFonts w:ascii="Times New Roman" w:hAnsi="Times New Roman"/>
+                <w:sz w:val="17"/>
               </w:rPr>
               <w:t>+1,28</w:t>
             </w:r>
@@ -15798,23 +15946,23 @@
         </w:tc>
         <w:tc>
           <w:tcPr>
-            <w:tcW w:type="dxa" w:w="1567"/>
-            <w:tcBorders>
-              <w:top w:val="single" w:sz="6" w:color="000000"/>
-              <w:bottom w:val="single" w:sz="6" w:color="000000"/>
-              <w:left w:val="nil" w:sz="6" w:color="000000"/>
-              <w:right w:val="nil" w:sz="6" w:color="000000"/>
-            </w:tcBorders>
-          </w:tcPr>
-          <w:p>
-            <w:pPr>
-              <w:jc w:val="center"/>
-            </w:pPr>
-            <w:r/>
-            <w:r>
-              <w:rPr>
-                <w:rFonts w:ascii="Times New Roman" w:hAnsi="Times New Roman"/>
-                <w:sz w:val="18"/>
+            <w:tcW w:type="dxa" w:w="1176"/>
+            <w:tcBorders>
+              <w:top w:val="single" w:sz="6" w:color="000000"/>
+              <w:bottom w:val="single" w:sz="6" w:color="000000"/>
+              <w:left w:val="nil" w:sz="6" w:color="000000"/>
+              <w:right w:val="nil" w:sz="6" w:color="000000"/>
+            </w:tcBorders>
+          </w:tcPr>
+          <w:p>
+            <w:pPr>
+              <w:jc w:val="center"/>
+            </w:pPr>
+            <w:r/>
+            <w:r>
+              <w:rPr>
+                <w:rFonts w:ascii="Times New Roman" w:hAnsi="Times New Roman"/>
+                <w:sz w:val="17"/>
               </w:rPr>
               <w:t>+5,10</w:t>
             </w:r>
@@ -15822,23 +15970,23 @@
         </w:tc>
         <w:tc>
           <w:tcPr>
-            <w:tcW w:type="dxa" w:w="1567"/>
-            <w:tcBorders>
-              <w:top w:val="single" w:sz="6" w:color="000000"/>
-              <w:bottom w:val="single" w:sz="6" w:color="000000"/>
-              <w:left w:val="nil" w:sz="6" w:color="000000"/>
-              <w:right w:val="nil" w:sz="6" w:color="000000"/>
-            </w:tcBorders>
-          </w:tcPr>
-          <w:p>
-            <w:pPr>
-              <w:jc w:val="center"/>
-            </w:pPr>
-            <w:r/>
-            <w:r>
-              <w:rPr>
-                <w:rFonts w:ascii="Times New Roman" w:hAnsi="Times New Roman"/>
-                <w:sz w:val="18"/>
+            <w:tcW w:type="dxa" w:w="1176"/>
+            <w:tcBorders>
+              <w:top w:val="single" w:sz="6" w:color="000000"/>
+              <w:bottom w:val="single" w:sz="6" w:color="000000"/>
+              <w:left w:val="nil" w:sz="6" w:color="000000"/>
+              <w:right w:val="nil" w:sz="6" w:color="000000"/>
+            </w:tcBorders>
+          </w:tcPr>
+          <w:p>
+            <w:pPr>
+              <w:jc w:val="center"/>
+            </w:pPr>
+            <w:r/>
+            <w:r>
+              <w:rPr>
+                <w:rFonts w:ascii="Times New Roman" w:hAnsi="Times New Roman"/>
+                <w:sz w:val="17"/>
               </w:rPr>
               <w:t>+6,41</w:t>
             </w:r>
@@ -15846,23 +15994,71 @@
         </w:tc>
         <w:tc>
           <w:tcPr>
-            <w:tcW w:type="dxa" w:w="1567"/>
-            <w:tcBorders>
-              <w:top w:val="single" w:sz="6" w:color="000000"/>
-              <w:bottom w:val="single" w:sz="6" w:color="000000"/>
-              <w:left w:val="nil" w:sz="6" w:color="000000"/>
-              <w:right w:val="nil" w:sz="6" w:color="000000"/>
-            </w:tcBorders>
-          </w:tcPr>
-          <w:p>
-            <w:pPr>
-              <w:jc w:val="center"/>
-            </w:pPr>
-            <w:r/>
-            <w:r>
-              <w:rPr>
-                <w:rFonts w:ascii="Times New Roman" w:hAnsi="Times New Roman"/>
-                <w:sz w:val="18"/>
+            <w:tcW w:type="dxa" w:w="1176"/>
+            <w:tcBorders>
+              <w:top w:val="single" w:sz="6" w:color="000000"/>
+              <w:bottom w:val="single" w:sz="6" w:color="000000"/>
+              <w:left w:val="nil" w:sz="6" w:color="000000"/>
+              <w:right w:val="nil" w:sz="6" w:color="000000"/>
+            </w:tcBorders>
+          </w:tcPr>
+          <w:p>
+            <w:pPr>
+              <w:jc w:val="center"/>
+            </w:pPr>
+            <w:r/>
+            <w:r>
+              <w:rPr>
+                <w:rFonts w:ascii="Times New Roman" w:hAnsi="Times New Roman"/>
+                <w:sz w:val="17"/>
+              </w:rPr>
+              <w:t>-4,25</w:t>
+            </w:r>
+          </w:p>
+        </w:tc>
+        <w:tc>
+          <w:tcPr>
+            <w:tcW w:type="dxa" w:w="1176"/>
+            <w:tcBorders>
+              <w:top w:val="single" w:sz="6" w:color="000000"/>
+              <w:bottom w:val="single" w:sz="6" w:color="000000"/>
+              <w:left w:val="nil" w:sz="6" w:color="000000"/>
+              <w:right w:val="nil" w:sz="6" w:color="000000"/>
+            </w:tcBorders>
+          </w:tcPr>
+          <w:p>
+            <w:pPr>
+              <w:jc w:val="center"/>
+            </w:pPr>
+            <w:r/>
+            <w:r>
+              <w:rPr>
+                <w:rFonts w:ascii="Times New Roman" w:hAnsi="Times New Roman"/>
+                <w:sz w:val="17"/>
+              </w:rPr>
+              <w:t>+4,69</w:t>
+            </w:r>
+          </w:p>
+        </w:tc>
+        <w:tc>
+          <w:tcPr>
+            <w:tcW w:type="dxa" w:w="1176"/>
+            <w:tcBorders>
+              <w:top w:val="single" w:sz="6" w:color="000000"/>
+              <w:bottom w:val="single" w:sz="6" w:color="000000"/>
+              <w:left w:val="nil" w:sz="6" w:color="000000"/>
+              <w:right w:val="nil" w:sz="6" w:color="000000"/>
+            </w:tcBorders>
+          </w:tcPr>
+          <w:p>
+            <w:pPr>
+              <w:jc w:val="center"/>
+            </w:pPr>
+            <w:r/>
+            <w:r>
+              <w:rPr>
+                <w:rFonts w:ascii="Times New Roman" w:hAnsi="Times New Roman"/>
+                <w:sz w:val="17"/>
               </w:rPr>
               <w:t>3,9</w:t>
             </w:r>
@@ -15879,7 +16075,7 @@
           <w:i/>
           <w:sz w:val="17"/>
         </w:rPr>
-        <w:t>P′ = derivada primeira (taxa de variação instantânea); inflexão = raiz da derivada segunda (P″ = 0) no intervalo. As dimensões negativas, com forte efeito de piso e ajuste fraco, foram omitidas.</w:t>
+        <w:t>P′ = derivada primeira (taxa de variação); P″ = derivada segunda (aceleração/concavidade); inflexão = raiz de P″ = 0. As dimensões negativas, com efeito de piso e ajuste fraco, foram omitidas.</w:t>
       </w:r>
     </w:p>
     <w:p>
@@ -15968,6 +16164,20 @@
           <w:sz w:val="24"/>
         </w:rPr>
         <w:t>Para caracterizar formalmente a dinâmica temporal, ajustou-se uma função polinomial de grau 3 às médias diárias de cada dimensão e derivaram-se as respectivas taxas de variação (Tabela 16; Figura 15). A modelagem restringiu-se ao eixo energia–fadiga (vigor, fadiga e PTH), onde os ajustes foram excelentes (vigor R² = 0,96; fadiga R² = 0,95); as dimensões negativas, próximas do piso e com variância reduzida, ajustaram-se mal e foram omitidas da modelagem. O vigor caiu a uma taxa média de -0,64 ponto/dia, com a maior velocidade de queda no início da semana (P′ no Dia 1 = -3,52 ponto/dia) e desaceleração progressiva, ao passo que a fadiga subiu em espelho (taxa média = +0,64 ponto/dia; P′ no Dia 1 = +2,23). A derivada segunda localizou um ponto de inflexão em torno do dia 4,2 para ambas — o momento em que a taxa de deterioração deixa de acelerar —, o que fornece uma leitura quantitativa do ritmo do desgaste e sinaliza a metade do microciclo como o marco a partir do qual a resposta afetiva muda de regime.</w:t>
+      </w:r>
+    </w:p>
+    <w:p>
+      <w:pPr>
+        <w:spacing w:line="360" w:lineRule="auto" w:after="120"/>
+        <w:ind w:firstLine="709"/>
+        <w:jc w:val="both"/>
+      </w:pPr>
+      <w:r>
+        <w:rPr>
+          <w:b w:val="0"/>
+          <w:sz w:val="24"/>
+        </w:rPr>
+        <w:t>A derivada segunda (P″) descreve a aceleração da mudança e a concavidade da trajetória. No vigor, P″ é positiva no início (+2,51) — a queda, embora acentuada, desacelera rumo ao meio da semana — e torna-se negativa ao final (-2,14), quando a curva volta a se inclinar para o mínimo do Dia 7; a fadiga apresenta o padrão espelhado (P″ = -1,55 no Dia 1; +1,51 no Dia 7). A troca de sinal de P″ no dia ≈ 4 confirma, formalmente, a inflexão sincronizada das duas dimensões. Quanto ao comportamento conjunto, as curvas de taxa de variação (P′) do vigor e da fadiga são praticamente imagens especulares: a correlação entre elas é de -0,97, indicando que a perda de energia e o ganho de fadiga aceleram e desaceleram em uníssono ao longo do microciclo. Ambas acoplam-se fortemente à Perturbação Total do Humor (fadiga–PTH = +0,97; vigor–PTH = -0,88), o que confirma, no plano das derivadas, que energia e fadiga operam como um eixo único e integrado — o mesmo eixo que domina toda a resposta afetiva à carga.</w:t>
       </w:r>
     </w:p>
     <w:p>

</xml_diff>

<commit_message>
Extremos das funções e limites das derivadas (seção 3.13)
Nova Tabela 17: para o eixo energia-fadiga, valor máximo e mínimo modelados de
cada variável (com o dia) e os limites da derivada P' — taxa máxima de subida
e de queda. Ex.: vigor entre 8,2 (Dia 1) e 4,4 (Dia 7), com P' em [-3,52; +0,55];
fadiga entre 3,4 (Dia 1) e 7,3 (Dia 7), P' em [-0,13; +2,23]. Parágrafo
interpretando os limites (maior velocidade de mudança no início do microciclo).
Os máx/mín observados de todas as dimensões seguem na tabela de dias de pico
(3.7). Script de reprodução 01 atualizado com extremos e limites da derivada.

PDF (27 páginas) regenerado; leak-scan: 0 vazamentos.

Co-Authored-By: Claude Opus 4.8 <noreply@anthropic.com>
Claude-Session: https://claude.ai/code/session_01P7yGiDeoGDyjWvPWQVsUrj
</commit_message>
<xml_diff>
--- a/Artigos/Artigo_humor_HANDEBOL.docx
+++ b/Artigos/Artigo_humor_HANDEBOL.docx
@@ -16178,6 +16178,561 @@
           <w:sz w:val="24"/>
         </w:rPr>
         <w:t>A derivada segunda (P″) descreve a aceleração da mudança e a concavidade da trajetória. No vigor, P″ é positiva no início (+2,51) — a queda, embora acentuada, desacelera rumo ao meio da semana — e torna-se negativa ao final (-2,14), quando a curva volta a se inclinar para o mínimo do Dia 7; a fadiga apresenta o padrão espelhado (P″ = -1,55 no Dia 1; +1,51 no Dia 7). A troca de sinal de P″ no dia ≈ 4 confirma, formalmente, a inflexão sincronizada das duas dimensões. Quanto ao comportamento conjunto, as curvas de taxa de variação (P′) do vigor e da fadiga são praticamente imagens especulares: a correlação entre elas é de -0,97, indicando que a perda de energia e o ganho de fadiga aceleram e desaceleram em uníssono ao longo do microciclo. Ambas acoplam-se fortemente à Perturbação Total do Humor (fadiga–PTH = +0,97; vigor–PTH = -0,88), o que confirma, no plano das derivadas, que energia e fadiga operam como um eixo único e integrado — o mesmo eixo que domina toda a resposta afetiva à carga.</w:t>
+      </w:r>
+    </w:p>
+    <w:p>
+      <w:pPr>
+        <w:spacing w:before="160" w:after="40"/>
+      </w:pPr>
+      <w:r>
+        <w:rPr>
+          <w:sz w:val="22"/>
+        </w:rPr>
+        <w:t>Tabela 17 – Extremos da função ajustada e limites da derivada (eixo energia–fadiga): valor máximo e mínimo modelados (com o dia) e os limites da taxa de variação P′ — subida máxima e queda máxima.</w:t>
+      </w:r>
+    </w:p>
+    <w:tbl>
+      <w:tblPr>
+        <w:tblW w:type="auto" w:w="0"/>
+        <w:jc w:val="center"/>
+        <w:tblLook w:firstColumn="1" w:firstRow="1" w:lastColumn="0" w:lastRow="0" w:noHBand="0" w:noVBand="1" w:val="04A0"/>
+      </w:tblPr>
+      <w:tblGrid>
+        <w:gridCol w:w="1881"/>
+        <w:gridCol w:w="1881"/>
+        <w:gridCol w:w="1881"/>
+        <w:gridCol w:w="1881"/>
+        <w:gridCol w:w="1881"/>
+      </w:tblGrid>
+      <w:tr>
+        <w:tc>
+          <w:tcPr>
+            <w:tcW w:type="dxa" w:w="1881"/>
+            <w:tcBorders>
+              <w:top w:val="single" w:sz="6" w:color="000000"/>
+              <w:bottom w:val="single" w:sz="6" w:color="000000"/>
+              <w:left w:val="nil" w:sz="6" w:color="000000"/>
+              <w:right w:val="nil" w:sz="6" w:color="000000"/>
+            </w:tcBorders>
+          </w:tcPr>
+          <w:p>
+            <w:pPr>
+              <w:jc w:val="center"/>
+            </w:pPr>
+            <w:r/>
+            <w:r>
+              <w:rPr>
+                <w:rFonts w:ascii="Times New Roman" w:hAnsi="Times New Roman"/>
+                <w:b/>
+                <w:sz w:val="17"/>
+              </w:rPr>
+              <w:t>Dimensão</w:t>
+            </w:r>
+          </w:p>
+        </w:tc>
+        <w:tc>
+          <w:tcPr>
+            <w:tcW w:type="dxa" w:w="1881"/>
+            <w:tcBorders>
+              <w:top w:val="single" w:sz="6" w:color="000000"/>
+              <w:bottom w:val="single" w:sz="6" w:color="000000"/>
+              <w:left w:val="nil" w:sz="6" w:color="000000"/>
+              <w:right w:val="nil" w:sz="6" w:color="000000"/>
+            </w:tcBorders>
+          </w:tcPr>
+          <w:p>
+            <w:pPr>
+              <w:jc w:val="center"/>
+            </w:pPr>
+            <w:r/>
+            <w:r>
+              <w:rPr>
+                <w:rFonts w:ascii="Times New Roman" w:hAnsi="Times New Roman"/>
+                <w:b/>
+                <w:sz w:val="17"/>
+              </w:rPr>
+              <w:t>Valor máx. (dia)</w:t>
+            </w:r>
+          </w:p>
+        </w:tc>
+        <w:tc>
+          <w:tcPr>
+            <w:tcW w:type="dxa" w:w="1881"/>
+            <w:tcBorders>
+              <w:top w:val="single" w:sz="6" w:color="000000"/>
+              <w:bottom w:val="single" w:sz="6" w:color="000000"/>
+              <w:left w:val="nil" w:sz="6" w:color="000000"/>
+              <w:right w:val="nil" w:sz="6" w:color="000000"/>
+            </w:tcBorders>
+          </w:tcPr>
+          <w:p>
+            <w:pPr>
+              <w:jc w:val="center"/>
+            </w:pPr>
+            <w:r/>
+            <w:r>
+              <w:rPr>
+                <w:rFonts w:ascii="Times New Roman" w:hAnsi="Times New Roman"/>
+                <w:b/>
+                <w:sz w:val="17"/>
+              </w:rPr>
+              <w:t>Valor mín. (dia)</w:t>
+            </w:r>
+          </w:p>
+        </w:tc>
+        <w:tc>
+          <w:tcPr>
+            <w:tcW w:type="dxa" w:w="1881"/>
+            <w:tcBorders>
+              <w:top w:val="single" w:sz="6" w:color="000000"/>
+              <w:bottom w:val="single" w:sz="6" w:color="000000"/>
+              <w:left w:val="nil" w:sz="6" w:color="000000"/>
+              <w:right w:val="nil" w:sz="6" w:color="000000"/>
+            </w:tcBorders>
+          </w:tcPr>
+          <w:p>
+            <w:pPr>
+              <w:jc w:val="center"/>
+            </w:pPr>
+            <w:r/>
+            <w:r>
+              <w:rPr>
+                <w:rFonts w:ascii="Times New Roman" w:hAnsi="Times New Roman"/>
+                <w:b/>
+                <w:sz w:val="17"/>
+              </w:rPr>
+              <w:t>P′ máx./subida (dia)</w:t>
+            </w:r>
+          </w:p>
+        </w:tc>
+        <w:tc>
+          <w:tcPr>
+            <w:tcW w:type="dxa" w:w="1881"/>
+            <w:tcBorders>
+              <w:top w:val="single" w:sz="6" w:color="000000"/>
+              <w:bottom w:val="single" w:sz="6" w:color="000000"/>
+              <w:left w:val="nil" w:sz="6" w:color="000000"/>
+              <w:right w:val="nil" w:sz="6" w:color="000000"/>
+            </w:tcBorders>
+          </w:tcPr>
+          <w:p>
+            <w:pPr>
+              <w:jc w:val="center"/>
+            </w:pPr>
+            <w:r/>
+            <w:r>
+              <w:rPr>
+                <w:rFonts w:ascii="Times New Roman" w:hAnsi="Times New Roman"/>
+                <w:b/>
+                <w:sz w:val="17"/>
+              </w:rPr>
+              <w:t>P′ mín./queda (dia)</w:t>
+            </w:r>
+          </w:p>
+        </w:tc>
+      </w:tr>
+      <w:tr>
+        <w:tc>
+          <w:tcPr>
+            <w:tcW w:type="dxa" w:w="1881"/>
+            <w:tcBorders>
+              <w:top w:val="single" w:sz="6" w:color="000000"/>
+              <w:bottom w:val="single" w:sz="6" w:color="000000"/>
+              <w:left w:val="nil" w:sz="6" w:color="000000"/>
+              <w:right w:val="nil" w:sz="6" w:color="000000"/>
+            </w:tcBorders>
+          </w:tcPr>
+          <w:p>
+            <w:pPr>
+              <w:jc w:val="left"/>
+            </w:pPr>
+            <w:r/>
+            <w:r>
+              <w:rPr>
+                <w:rFonts w:ascii="Times New Roman" w:hAnsi="Times New Roman"/>
+                <w:sz w:val="17"/>
+              </w:rPr>
+              <w:t>Vigor</w:t>
+            </w:r>
+          </w:p>
+        </w:tc>
+        <w:tc>
+          <w:tcPr>
+            <w:tcW w:type="dxa" w:w="1881"/>
+            <w:tcBorders>
+              <w:top w:val="single" w:sz="6" w:color="000000"/>
+              <w:bottom w:val="single" w:sz="6" w:color="000000"/>
+              <w:left w:val="nil" w:sz="6" w:color="000000"/>
+              <w:right w:val="nil" w:sz="6" w:color="000000"/>
+            </w:tcBorders>
+          </w:tcPr>
+          <w:p>
+            <w:pPr>
+              <w:jc w:val="center"/>
+            </w:pPr>
+            <w:r/>
+            <w:r>
+              <w:rPr>
+                <w:rFonts w:ascii="Times New Roman" w:hAnsi="Times New Roman"/>
+                <w:sz w:val="17"/>
+              </w:rPr>
+              <w:t>8,2 (Dia 1)</w:t>
+            </w:r>
+          </w:p>
+        </w:tc>
+        <w:tc>
+          <w:tcPr>
+            <w:tcW w:type="dxa" w:w="1881"/>
+            <w:tcBorders>
+              <w:top w:val="single" w:sz="6" w:color="000000"/>
+              <w:bottom w:val="single" w:sz="6" w:color="000000"/>
+              <w:left w:val="nil" w:sz="6" w:color="000000"/>
+              <w:right w:val="nil" w:sz="6" w:color="000000"/>
+            </w:tcBorders>
+          </w:tcPr>
+          <w:p>
+            <w:pPr>
+              <w:jc w:val="center"/>
+            </w:pPr>
+            <w:r/>
+            <w:r>
+              <w:rPr>
+                <w:rFonts w:ascii="Times New Roman" w:hAnsi="Times New Roman"/>
+                <w:sz w:val="17"/>
+              </w:rPr>
+              <w:t>4,4 (Dia 7)</w:t>
+            </w:r>
+          </w:p>
+        </w:tc>
+        <w:tc>
+          <w:tcPr>
+            <w:tcW w:type="dxa" w:w="1881"/>
+            <w:tcBorders>
+              <w:top w:val="single" w:sz="6" w:color="000000"/>
+              <w:bottom w:val="single" w:sz="6" w:color="000000"/>
+              <w:left w:val="nil" w:sz="6" w:color="000000"/>
+              <w:right w:val="nil" w:sz="6" w:color="000000"/>
+            </w:tcBorders>
+          </w:tcPr>
+          <w:p>
+            <w:pPr>
+              <w:jc w:val="center"/>
+            </w:pPr>
+            <w:r/>
+            <w:r>
+              <w:rPr>
+                <w:rFonts w:ascii="Times New Roman" w:hAnsi="Times New Roman"/>
+                <w:sz w:val="17"/>
+              </w:rPr>
+              <w:t>+0,55 (Dia 4,2)</w:t>
+            </w:r>
+          </w:p>
+        </w:tc>
+        <w:tc>
+          <w:tcPr>
+            <w:tcW w:type="dxa" w:w="1881"/>
+            <w:tcBorders>
+              <w:top w:val="single" w:sz="6" w:color="000000"/>
+              <w:bottom w:val="single" w:sz="6" w:color="000000"/>
+              <w:left w:val="nil" w:sz="6" w:color="000000"/>
+              <w:right w:val="nil" w:sz="6" w:color="000000"/>
+            </w:tcBorders>
+          </w:tcPr>
+          <w:p>
+            <w:pPr>
+              <w:jc w:val="center"/>
+            </w:pPr>
+            <w:r/>
+            <w:r>
+              <w:rPr>
+                <w:rFonts w:ascii="Times New Roman" w:hAnsi="Times New Roman"/>
+                <w:sz w:val="17"/>
+              </w:rPr>
+              <w:t>-3,52 (Dia 1)</w:t>
+            </w:r>
+          </w:p>
+        </w:tc>
+      </w:tr>
+      <w:tr>
+        <w:tc>
+          <w:tcPr>
+            <w:tcW w:type="dxa" w:w="1881"/>
+            <w:tcBorders>
+              <w:top w:val="single" w:sz="6" w:color="000000"/>
+              <w:bottom w:val="single" w:sz="6" w:color="000000"/>
+              <w:left w:val="nil" w:sz="6" w:color="000000"/>
+              <w:right w:val="nil" w:sz="6" w:color="000000"/>
+            </w:tcBorders>
+          </w:tcPr>
+          <w:p>
+            <w:pPr>
+              <w:jc w:val="left"/>
+            </w:pPr>
+            <w:r/>
+            <w:r>
+              <w:rPr>
+                <w:rFonts w:ascii="Times New Roman" w:hAnsi="Times New Roman"/>
+                <w:sz w:val="17"/>
+              </w:rPr>
+              <w:t>Fadiga</w:t>
+            </w:r>
+          </w:p>
+        </w:tc>
+        <w:tc>
+          <w:tcPr>
+            <w:tcW w:type="dxa" w:w="1881"/>
+            <w:tcBorders>
+              <w:top w:val="single" w:sz="6" w:color="000000"/>
+              <w:bottom w:val="single" w:sz="6" w:color="000000"/>
+              <w:left w:val="nil" w:sz="6" w:color="000000"/>
+              <w:right w:val="nil" w:sz="6" w:color="000000"/>
+            </w:tcBorders>
+          </w:tcPr>
+          <w:p>
+            <w:pPr>
+              <w:jc w:val="center"/>
+            </w:pPr>
+            <w:r/>
+            <w:r>
+              <w:rPr>
+                <w:rFonts w:ascii="Times New Roman" w:hAnsi="Times New Roman"/>
+                <w:sz w:val="17"/>
+              </w:rPr>
+              <w:t>7,3 (Dia 7)</w:t>
+            </w:r>
+          </w:p>
+        </w:tc>
+        <w:tc>
+          <w:tcPr>
+            <w:tcW w:type="dxa" w:w="1881"/>
+            <w:tcBorders>
+              <w:top w:val="single" w:sz="6" w:color="000000"/>
+              <w:bottom w:val="single" w:sz="6" w:color="000000"/>
+              <w:left w:val="nil" w:sz="6" w:color="000000"/>
+              <w:right w:val="nil" w:sz="6" w:color="000000"/>
+            </w:tcBorders>
+          </w:tcPr>
+          <w:p>
+            <w:pPr>
+              <w:jc w:val="center"/>
+            </w:pPr>
+            <w:r/>
+            <w:r>
+              <w:rPr>
+                <w:rFonts w:ascii="Times New Roman" w:hAnsi="Times New Roman"/>
+                <w:sz w:val="17"/>
+              </w:rPr>
+              <w:t>3,4 (Dia 1)</w:t>
+            </w:r>
+          </w:p>
+        </w:tc>
+        <w:tc>
+          <w:tcPr>
+            <w:tcW w:type="dxa" w:w="1881"/>
+            <w:tcBorders>
+              <w:top w:val="single" w:sz="6" w:color="000000"/>
+              <w:bottom w:val="single" w:sz="6" w:color="000000"/>
+              <w:left w:val="nil" w:sz="6" w:color="000000"/>
+              <w:right w:val="nil" w:sz="6" w:color="000000"/>
+            </w:tcBorders>
+          </w:tcPr>
+          <w:p>
+            <w:pPr>
+              <w:jc w:val="center"/>
+            </w:pPr>
+            <w:r/>
+            <w:r>
+              <w:rPr>
+                <w:rFonts w:ascii="Times New Roman" w:hAnsi="Times New Roman"/>
+                <w:sz w:val="17"/>
+              </w:rPr>
+              <w:t>+2,23 (Dia 1)</w:t>
+            </w:r>
+          </w:p>
+        </w:tc>
+        <w:tc>
+          <w:tcPr>
+            <w:tcW w:type="dxa" w:w="1881"/>
+            <w:tcBorders>
+              <w:top w:val="single" w:sz="6" w:color="000000"/>
+              <w:bottom w:val="single" w:sz="6" w:color="000000"/>
+              <w:left w:val="nil" w:sz="6" w:color="000000"/>
+              <w:right w:val="nil" w:sz="6" w:color="000000"/>
+            </w:tcBorders>
+          </w:tcPr>
+          <w:p>
+            <w:pPr>
+              <w:jc w:val="center"/>
+            </w:pPr>
+            <w:r/>
+            <w:r>
+              <w:rPr>
+                <w:rFonts w:ascii="Times New Roman" w:hAnsi="Times New Roman"/>
+                <w:sz w:val="17"/>
+              </w:rPr>
+              <w:t>-0,13 (Dia 4)</w:t>
+            </w:r>
+          </w:p>
+        </w:tc>
+      </w:tr>
+      <w:tr>
+        <w:tc>
+          <w:tcPr>
+            <w:tcW w:type="dxa" w:w="1881"/>
+            <w:tcBorders>
+              <w:top w:val="single" w:sz="6" w:color="000000"/>
+              <w:bottom w:val="single" w:sz="6" w:color="000000"/>
+              <w:left w:val="nil" w:sz="6" w:color="000000"/>
+              <w:right w:val="nil" w:sz="6" w:color="000000"/>
+            </w:tcBorders>
+          </w:tcPr>
+          <w:p>
+            <w:pPr>
+              <w:jc w:val="left"/>
+            </w:pPr>
+            <w:r/>
+            <w:r>
+              <w:rPr>
+                <w:rFonts w:ascii="Times New Roman" w:hAnsi="Times New Roman"/>
+                <w:sz w:val="17"/>
+              </w:rPr>
+              <w:t>PTH</w:t>
+            </w:r>
+          </w:p>
+        </w:tc>
+        <w:tc>
+          <w:tcPr>
+            <w:tcW w:type="dxa" w:w="1881"/>
+            <w:tcBorders>
+              <w:top w:val="single" w:sz="6" w:color="000000"/>
+              <w:bottom w:val="single" w:sz="6" w:color="000000"/>
+              <w:left w:val="nil" w:sz="6" w:color="000000"/>
+              <w:right w:val="nil" w:sz="6" w:color="000000"/>
+            </w:tcBorders>
+          </w:tcPr>
+          <w:p>
+            <w:pPr>
+              <w:jc w:val="center"/>
+            </w:pPr>
+            <w:r/>
+            <w:r>
+              <w:rPr>
+                <w:rFonts w:ascii="Times New Roman" w:hAnsi="Times New Roman"/>
+                <w:sz w:val="17"/>
+              </w:rPr>
+              <w:t>8,6 (Dia 7)</w:t>
+            </w:r>
+          </w:p>
+        </w:tc>
+        <w:tc>
+          <w:tcPr>
+            <w:tcW w:type="dxa" w:w="1881"/>
+            <w:tcBorders>
+              <w:top w:val="single" w:sz="6" w:color="000000"/>
+              <w:bottom w:val="single" w:sz="6" w:color="000000"/>
+              <w:left w:val="nil" w:sz="6" w:color="000000"/>
+              <w:right w:val="nil" w:sz="6" w:color="000000"/>
+            </w:tcBorders>
+          </w:tcPr>
+          <w:p>
+            <w:pPr>
+              <w:jc w:val="center"/>
+            </w:pPr>
+            <w:r/>
+            <w:r>
+              <w:rPr>
+                <w:rFonts w:ascii="Times New Roman" w:hAnsi="Times New Roman"/>
+                <w:sz w:val="17"/>
+              </w:rPr>
+              <w:t>0,9 (Dia 1)</w:t>
+            </w:r>
+          </w:p>
+        </w:tc>
+        <w:tc>
+          <w:tcPr>
+            <w:tcW w:type="dxa" w:w="1881"/>
+            <w:tcBorders>
+              <w:top w:val="single" w:sz="6" w:color="000000"/>
+              <w:bottom w:val="single" w:sz="6" w:color="000000"/>
+              <w:left w:val="nil" w:sz="6" w:color="000000"/>
+              <w:right w:val="nil" w:sz="6" w:color="000000"/>
+            </w:tcBorders>
+          </w:tcPr>
+          <w:p>
+            <w:pPr>
+              <w:jc w:val="center"/>
+            </w:pPr>
+            <w:r/>
+            <w:r>
+              <w:rPr>
+                <w:rFonts w:ascii="Times New Roman" w:hAnsi="Times New Roman"/>
+                <w:sz w:val="17"/>
+              </w:rPr>
+              <w:t>+6,41 (Dia 7)</w:t>
+            </w:r>
+          </w:p>
+        </w:tc>
+        <w:tc>
+          <w:tcPr>
+            <w:tcW w:type="dxa" w:w="1881"/>
+            <w:tcBorders>
+              <w:top w:val="single" w:sz="6" w:color="000000"/>
+              <w:bottom w:val="single" w:sz="6" w:color="000000"/>
+              <w:left w:val="nil" w:sz="6" w:color="000000"/>
+              <w:right w:val="nil" w:sz="6" w:color="000000"/>
+            </w:tcBorders>
+          </w:tcPr>
+          <w:p>
+            <w:pPr>
+              <w:jc w:val="center"/>
+            </w:pPr>
+            <w:r/>
+            <w:r>
+              <w:rPr>
+                <w:rFonts w:ascii="Times New Roman" w:hAnsi="Times New Roman"/>
+                <w:sz w:val="17"/>
+              </w:rPr>
+              <w:t>-0,97 (Dia 3,9)</w:t>
+            </w:r>
+          </w:p>
+        </w:tc>
+      </w:tr>
+    </w:tbl>
+    <w:p>
+      <w:pPr>
+        <w:spacing w:after="0"/>
+      </w:pPr>
+      <w:r>
+        <w:rPr>
+          <w:i/>
+          <w:sz w:val="17"/>
+        </w:rPr>
+        <w:t>Valores e taxas extraídos da função polinomial P(t) no intervalo [Dia 1; Dia 7]. Os máximos/mínimos observados de todas as dimensões constam na Tabela de dias de pico (seção 3.7).</w:t>
+      </w:r>
+    </w:p>
+    <w:p>
+      <w:pPr>
+        <w:spacing w:after="120"/>
+      </w:pPr>
+      <w:r>
+        <w:rPr>
+          <w:sz w:val="18"/>
+        </w:rPr>
+        <w:t>Fonte: dados da pesquisa (2026).</w:t>
+      </w:r>
+    </w:p>
+    <w:p>
+      <w:pPr>
+        <w:spacing w:line="360" w:lineRule="auto" w:after="120"/>
+        <w:ind w:firstLine="709"/>
+        <w:jc w:val="both"/>
+      </w:pPr>
+      <w:r>
+        <w:rPr>
+          <w:b w:val="0"/>
+          <w:sz w:val="24"/>
+        </w:rPr>
+        <w:t>Os extremos das funções ajustadas e os limites de suas derivadas (Tabela 17) delimitam quantitativamente a resposta. O vigor varia entre um máximo de 8,2 pontos no Dia 1 e um mínimo de 4,4 no Dia 7, com a taxa de variação confinada entre -3,52 ponto/dia (queda máxima, no Dia 1) e +0,55 ponto/dia (leve recuperação em torno do meio da semana); a fadiga percorre o intervalo inverso (mínimo de 3,4 no Dia 1; máximo de 7,3 no Dia 7), com taxa entre -0,13 e +2,23 ponto/dia. Esses limites confirmam que a maior velocidade de mudança ocorre no início do microciclo e que o sistema afetivo opera dentro de uma faixa de variação bem definida.</w:t>
       </w:r>
     </w:p>
     <w:p>

</xml_diff>

<commit_message>
Estender Tabela 17 (extremos + limites da derivada) às 7 dimensões
Table 17 passa a cobrir todas as dimensões na ordem canônica, com coluna R²
que sinaliza transparentemente o ajuste fraco das negativas de piso (nota
esclarece que, para essas, os extremos modelados são apenas indicativos).

PDF regenerado; leak-scan: 0 vazamentos.

Co-Authored-By: Claude Opus 4.8 <noreply@anthropic.com>
Claude-Session: https://claude.ai/code/session_01P7yGiDeoGDyjWvPWQVsUrj
</commit_message>
<xml_diff>
--- a/Artigos/Artigo_humor_HANDEBOL.docx
+++ b/Artigos/Artigo_humor_HANDEBOL.docx
@@ -16188,7 +16188,7 @@
         <w:rPr>
           <w:sz w:val="22"/>
         </w:rPr>
-        <w:t>Tabela 17 – Extremos da função ajustada e limites da derivada (eixo energia–fadiga): valor máximo e mínimo modelados (com o dia) e os limites da taxa de variação P′ — subida máxima e queda máxima.</w:t>
+        <w:t>Tabela 17 – Extremos da função ajustada e limites da derivada, por dimensão: valor máximo e mínimo modelados (com o dia) e os limites da taxa de variação P′ — subida máxima e queda máxima.</w:t>
       </w:r>
     </w:p>
     <w:tbl>
@@ -16198,16 +16198,17 @@
         <w:tblLook w:firstColumn="1" w:firstRow="1" w:lastColumn="0" w:lastRow="0" w:noHBand="0" w:noVBand="1" w:val="04A0"/>
       </w:tblPr>
       <w:tblGrid>
-        <w:gridCol w:w="1881"/>
-        <w:gridCol w:w="1881"/>
-        <w:gridCol w:w="1881"/>
-        <w:gridCol w:w="1881"/>
-        <w:gridCol w:w="1881"/>
+        <w:gridCol w:w="1567"/>
+        <w:gridCol w:w="1567"/>
+        <w:gridCol w:w="1567"/>
+        <w:gridCol w:w="1567"/>
+        <w:gridCol w:w="1567"/>
+        <w:gridCol w:w="1567"/>
       </w:tblGrid>
       <w:tr>
         <w:tc>
           <w:tcPr>
-            <w:tcW w:type="dxa" w:w="1881"/>
+            <w:tcW w:type="dxa" w:w="1567"/>
             <w:tcBorders>
               <w:top w:val="single" w:sz="6" w:color="000000"/>
               <w:bottom w:val="single" w:sz="6" w:color="000000"/>
@@ -16232,7 +16233,7 @@
         </w:tc>
         <w:tc>
           <w:tcPr>
-            <w:tcW w:type="dxa" w:w="1881"/>
+            <w:tcW w:type="dxa" w:w="1567"/>
             <w:tcBorders>
               <w:top w:val="single" w:sz="6" w:color="000000"/>
               <w:bottom w:val="single" w:sz="6" w:color="000000"/>
@@ -16257,7 +16258,7 @@
         </w:tc>
         <w:tc>
           <w:tcPr>
-            <w:tcW w:type="dxa" w:w="1881"/>
+            <w:tcW w:type="dxa" w:w="1567"/>
             <w:tcBorders>
               <w:top w:val="single" w:sz="6" w:color="000000"/>
               <w:bottom w:val="single" w:sz="6" w:color="000000"/>
@@ -16282,7 +16283,7 @@
         </w:tc>
         <w:tc>
           <w:tcPr>
-            <w:tcW w:type="dxa" w:w="1881"/>
+            <w:tcW w:type="dxa" w:w="1567"/>
             <w:tcBorders>
               <w:top w:val="single" w:sz="6" w:color="000000"/>
               <w:bottom w:val="single" w:sz="6" w:color="000000"/>
@@ -16307,7 +16308,7 @@
         </w:tc>
         <w:tc>
           <w:tcPr>
-            <w:tcW w:type="dxa" w:w="1881"/>
+            <w:tcW w:type="dxa" w:w="1567"/>
             <w:tcBorders>
               <w:top w:val="single" w:sz="6" w:color="000000"/>
               <w:bottom w:val="single" w:sz="6" w:color="000000"/>
@@ -16330,11 +16331,36 @@
             </w:r>
           </w:p>
         </w:tc>
+        <w:tc>
+          <w:tcPr>
+            <w:tcW w:type="dxa" w:w="1567"/>
+            <w:tcBorders>
+              <w:top w:val="single" w:sz="6" w:color="000000"/>
+              <w:bottom w:val="single" w:sz="6" w:color="000000"/>
+              <w:left w:val="nil" w:sz="6" w:color="000000"/>
+              <w:right w:val="nil" w:sz="6" w:color="000000"/>
+            </w:tcBorders>
+          </w:tcPr>
+          <w:p>
+            <w:pPr>
+              <w:jc w:val="center"/>
+            </w:pPr>
+            <w:r/>
+            <w:r>
+              <w:rPr>
+                <w:rFonts w:ascii="Times New Roman" w:hAnsi="Times New Roman"/>
+                <w:b/>
+                <w:sz w:val="17"/>
+              </w:rPr>
+              <w:t>R²</w:t>
+            </w:r>
+          </w:p>
+        </w:tc>
       </w:tr>
       <w:tr>
         <w:tc>
           <w:tcPr>
-            <w:tcW w:type="dxa" w:w="1881"/>
+            <w:tcW w:type="dxa" w:w="1567"/>
             <w:tcBorders>
               <w:top w:val="single" w:sz="6" w:color="000000"/>
               <w:bottom w:val="single" w:sz="6" w:color="000000"/>
@@ -16352,13 +16378,13 @@
                 <w:rFonts w:ascii="Times New Roman" w:hAnsi="Times New Roman"/>
                 <w:sz w:val="17"/>
               </w:rPr>
-              <w:t>Vigor</w:t>
-            </w:r>
-          </w:p>
-        </w:tc>
-        <w:tc>
-          <w:tcPr>
-            <w:tcW w:type="dxa" w:w="1881"/>
+              <w:t>Tensão</w:t>
+            </w:r>
+          </w:p>
+        </w:tc>
+        <w:tc>
+          <w:tcPr>
+            <w:tcW w:type="dxa" w:w="1567"/>
             <w:tcBorders>
               <w:top w:val="single" w:sz="6" w:color="000000"/>
               <w:bottom w:val="single" w:sz="6" w:color="000000"/>
@@ -16376,13 +16402,13 @@
                 <w:rFonts w:ascii="Times New Roman" w:hAnsi="Times New Roman"/>
                 <w:sz w:val="17"/>
               </w:rPr>
-              <w:t>8,2 (Dia 1)</w:t>
-            </w:r>
-          </w:p>
-        </w:tc>
-        <w:tc>
-          <w:tcPr>
-            <w:tcW w:type="dxa" w:w="1881"/>
+              <w:t>2,2 (Dia 1)</w:t>
+            </w:r>
+          </w:p>
+        </w:tc>
+        <w:tc>
+          <w:tcPr>
+            <w:tcW w:type="dxa" w:w="1567"/>
             <w:tcBorders>
               <w:top w:val="single" w:sz="6" w:color="000000"/>
               <w:bottom w:val="single" w:sz="6" w:color="000000"/>
@@ -16400,13 +16426,13 @@
                 <w:rFonts w:ascii="Times New Roman" w:hAnsi="Times New Roman"/>
                 <w:sz w:val="17"/>
               </w:rPr>
-              <w:t>4,4 (Dia 7)</w:t>
-            </w:r>
-          </w:p>
-        </w:tc>
-        <w:tc>
-          <w:tcPr>
-            <w:tcW w:type="dxa" w:w="1881"/>
+              <w:t>1,1 (Dia 7)</w:t>
+            </w:r>
+          </w:p>
+        </w:tc>
+        <w:tc>
+          <w:tcPr>
+            <w:tcW w:type="dxa" w:w="1567"/>
             <w:tcBorders>
               <w:top w:val="single" w:sz="6" w:color="000000"/>
               <w:bottom w:val="single" w:sz="6" w:color="000000"/>
@@ -16424,13 +16450,13 @@
                 <w:rFonts w:ascii="Times New Roman" w:hAnsi="Times New Roman"/>
                 <w:sz w:val="17"/>
               </w:rPr>
-              <w:t>+0,55 (Dia 4,2)</w:t>
-            </w:r>
-          </w:p>
-        </w:tc>
-        <w:tc>
-          <w:tcPr>
-            <w:tcW w:type="dxa" w:w="1881"/>
+              <w:t>+0,06 (Dia 4,6)</w:t>
+            </w:r>
+          </w:p>
+        </w:tc>
+        <w:tc>
+          <w:tcPr>
+            <w:tcW w:type="dxa" w:w="1567"/>
             <w:tcBorders>
               <w:top w:val="single" w:sz="6" w:color="000000"/>
               <w:bottom w:val="single" w:sz="6" w:color="000000"/>
@@ -16448,7 +16474,31 @@
                 <w:rFonts w:ascii="Times New Roman" w:hAnsi="Times New Roman"/>
                 <w:sz w:val="17"/>
               </w:rPr>
-              <w:t>-3,52 (Dia 1)</w:t>
+              <w:t>-0,87 (Dia 1)</w:t>
+            </w:r>
+          </w:p>
+        </w:tc>
+        <w:tc>
+          <w:tcPr>
+            <w:tcW w:type="dxa" w:w="1567"/>
+            <w:tcBorders>
+              <w:top w:val="single" w:sz="6" w:color="000000"/>
+              <w:bottom w:val="single" w:sz="6" w:color="000000"/>
+              <w:left w:val="nil" w:sz="6" w:color="000000"/>
+              <w:right w:val="nil" w:sz="6" w:color="000000"/>
+            </w:tcBorders>
+          </w:tcPr>
+          <w:p>
+            <w:pPr>
+              <w:jc w:val="center"/>
+            </w:pPr>
+            <w:r/>
+            <w:r>
+              <w:rPr>
+                <w:rFonts w:ascii="Times New Roman" w:hAnsi="Times New Roman"/>
+                <w:sz w:val="17"/>
+              </w:rPr>
+              <w:t>0,80</w:t>
             </w:r>
           </w:p>
         </w:tc>
@@ -16456,7 +16506,7 @@
       <w:tr>
         <w:tc>
           <w:tcPr>
-            <w:tcW w:type="dxa" w:w="1881"/>
+            <w:tcW w:type="dxa" w:w="1567"/>
             <w:tcBorders>
               <w:top w:val="single" w:sz="6" w:color="000000"/>
               <w:bottom w:val="single" w:sz="6" w:color="000000"/>
@@ -16474,13 +16524,13 @@
                 <w:rFonts w:ascii="Times New Roman" w:hAnsi="Times New Roman"/>
                 <w:sz w:val="17"/>
               </w:rPr>
-              <w:t>Fadiga</w:t>
-            </w:r>
-          </w:p>
-        </w:tc>
-        <w:tc>
-          <w:tcPr>
-            <w:tcW w:type="dxa" w:w="1881"/>
+              <w:t>Depressão</w:t>
+            </w:r>
+          </w:p>
+        </w:tc>
+        <w:tc>
+          <w:tcPr>
+            <w:tcW w:type="dxa" w:w="1567"/>
             <w:tcBorders>
               <w:top w:val="single" w:sz="6" w:color="000000"/>
               <w:bottom w:val="single" w:sz="6" w:color="000000"/>
@@ -16498,13 +16548,13 @@
                 <w:rFonts w:ascii="Times New Roman" w:hAnsi="Times New Roman"/>
                 <w:sz w:val="17"/>
               </w:rPr>
-              <w:t>7,3 (Dia 7)</w:t>
-            </w:r>
-          </w:p>
-        </w:tc>
-        <w:tc>
-          <w:tcPr>
-            <w:tcW w:type="dxa" w:w="1881"/>
+              <w:t>1,4 (Dia 7)</w:t>
+            </w:r>
+          </w:p>
+        </w:tc>
+        <w:tc>
+          <w:tcPr>
+            <w:tcW w:type="dxa" w:w="1567"/>
             <w:tcBorders>
               <w:top w:val="single" w:sz="6" w:color="000000"/>
               <w:bottom w:val="single" w:sz="6" w:color="000000"/>
@@ -16522,13 +16572,13 @@
                 <w:rFonts w:ascii="Times New Roman" w:hAnsi="Times New Roman"/>
                 <w:sz w:val="17"/>
               </w:rPr>
-              <w:t>3,4 (Dia 1)</w:t>
-            </w:r>
-          </w:p>
-        </w:tc>
-        <w:tc>
-          <w:tcPr>
-            <w:tcW w:type="dxa" w:w="1881"/>
+              <w:t>0,7 (Dia 1)</w:t>
+            </w:r>
+          </w:p>
+        </w:tc>
+        <w:tc>
+          <w:tcPr>
+            <w:tcW w:type="dxa" w:w="1567"/>
             <w:tcBorders>
               <w:top w:val="single" w:sz="6" w:color="000000"/>
               <w:bottom w:val="single" w:sz="6" w:color="000000"/>
@@ -16546,13 +16596,13 @@
                 <w:rFonts w:ascii="Times New Roman" w:hAnsi="Times New Roman"/>
                 <w:sz w:val="17"/>
               </w:rPr>
-              <w:t>+2,23 (Dia 1)</w:t>
-            </w:r>
-          </w:p>
-        </w:tc>
-        <w:tc>
-          <w:tcPr>
-            <w:tcW w:type="dxa" w:w="1881"/>
+              <w:t>+0,62 (Dia 7)</w:t>
+            </w:r>
+          </w:p>
+        </w:tc>
+        <w:tc>
+          <w:tcPr>
+            <w:tcW w:type="dxa" w:w="1567"/>
             <w:tcBorders>
               <w:top w:val="single" w:sz="6" w:color="000000"/>
               <w:bottom w:val="single" w:sz="6" w:color="000000"/>
@@ -16570,7 +16620,31 @@
                 <w:rFonts w:ascii="Times New Roman" w:hAnsi="Times New Roman"/>
                 <w:sz w:val="17"/>
               </w:rPr>
-              <w:t>-0,13 (Dia 4)</w:t>
+              <w:t>-0,10 (Dia 3,9)</w:t>
+            </w:r>
+          </w:p>
+        </w:tc>
+        <w:tc>
+          <w:tcPr>
+            <w:tcW w:type="dxa" w:w="1567"/>
+            <w:tcBorders>
+              <w:top w:val="single" w:sz="6" w:color="000000"/>
+              <w:bottom w:val="single" w:sz="6" w:color="000000"/>
+              <w:left w:val="nil" w:sz="6" w:color="000000"/>
+              <w:right w:val="nil" w:sz="6" w:color="000000"/>
+            </w:tcBorders>
+          </w:tcPr>
+          <w:p>
+            <w:pPr>
+              <w:jc w:val="center"/>
+            </w:pPr>
+            <w:r/>
+            <w:r>
+              <w:rPr>
+                <w:rFonts w:ascii="Times New Roman" w:hAnsi="Times New Roman"/>
+                <w:sz w:val="17"/>
+              </w:rPr>
+              <w:t>0,42</w:t>
             </w:r>
           </w:p>
         </w:tc>
@@ -16578,7 +16652,7 @@
       <w:tr>
         <w:tc>
           <w:tcPr>
-            <w:tcW w:type="dxa" w:w="1881"/>
+            <w:tcW w:type="dxa" w:w="1567"/>
             <w:tcBorders>
               <w:top w:val="single" w:sz="6" w:color="000000"/>
               <w:bottom w:val="single" w:sz="6" w:color="000000"/>
@@ -16596,13 +16670,597 @@
                 <w:rFonts w:ascii="Times New Roman" w:hAnsi="Times New Roman"/>
                 <w:sz w:val="17"/>
               </w:rPr>
+              <w:t>Raiva</w:t>
+            </w:r>
+          </w:p>
+        </w:tc>
+        <w:tc>
+          <w:tcPr>
+            <w:tcW w:type="dxa" w:w="1567"/>
+            <w:tcBorders>
+              <w:top w:val="single" w:sz="6" w:color="000000"/>
+              <w:bottom w:val="single" w:sz="6" w:color="000000"/>
+              <w:left w:val="nil" w:sz="6" w:color="000000"/>
+              <w:right w:val="nil" w:sz="6" w:color="000000"/>
+            </w:tcBorders>
+          </w:tcPr>
+          <w:p>
+            <w:pPr>
+              <w:jc w:val="center"/>
+            </w:pPr>
+            <w:r/>
+            <w:r>
+              <w:rPr>
+                <w:rFonts w:ascii="Times New Roman" w:hAnsi="Times New Roman"/>
+                <w:sz w:val="17"/>
+              </w:rPr>
+              <w:t>2,6 (Dia 7)</w:t>
+            </w:r>
+          </w:p>
+        </w:tc>
+        <w:tc>
+          <w:tcPr>
+            <w:tcW w:type="dxa" w:w="1567"/>
+            <w:tcBorders>
+              <w:top w:val="single" w:sz="6" w:color="000000"/>
+              <w:bottom w:val="single" w:sz="6" w:color="000000"/>
+              <w:left w:val="nil" w:sz="6" w:color="000000"/>
+              <w:right w:val="nil" w:sz="6" w:color="000000"/>
+            </w:tcBorders>
+          </w:tcPr>
+          <w:p>
+            <w:pPr>
+              <w:jc w:val="center"/>
+            </w:pPr>
+            <w:r/>
+            <w:r>
+              <w:rPr>
+                <w:rFonts w:ascii="Times New Roman" w:hAnsi="Times New Roman"/>
+                <w:sz w:val="17"/>
+              </w:rPr>
+              <w:t>1,1 (Dia 4,8)</w:t>
+            </w:r>
+          </w:p>
+        </w:tc>
+        <w:tc>
+          <w:tcPr>
+            <w:tcW w:type="dxa" w:w="1567"/>
+            <w:tcBorders>
+              <w:top w:val="single" w:sz="6" w:color="000000"/>
+              <w:bottom w:val="single" w:sz="6" w:color="000000"/>
+              <w:left w:val="nil" w:sz="6" w:color="000000"/>
+              <w:right w:val="nil" w:sz="6" w:color="000000"/>
+            </w:tcBorders>
+          </w:tcPr>
+          <w:p>
+            <w:pPr>
+              <w:jc w:val="center"/>
+            </w:pPr>
+            <w:r/>
+            <w:r>
+              <w:rPr>
+                <w:rFonts w:ascii="Times New Roman" w:hAnsi="Times New Roman"/>
+                <w:sz w:val="17"/>
+              </w:rPr>
+              <w:t>+1,63 (Dia 7)</w:t>
+            </w:r>
+          </w:p>
+        </w:tc>
+        <w:tc>
+          <w:tcPr>
+            <w:tcW w:type="dxa" w:w="1567"/>
+            <w:tcBorders>
+              <w:top w:val="single" w:sz="6" w:color="000000"/>
+              <w:bottom w:val="single" w:sz="6" w:color="000000"/>
+              <w:left w:val="nil" w:sz="6" w:color="000000"/>
+              <w:right w:val="nil" w:sz="6" w:color="000000"/>
+            </w:tcBorders>
+          </w:tcPr>
+          <w:p>
+            <w:pPr>
+              <w:jc w:val="center"/>
+            </w:pPr>
+            <w:r/>
+            <w:r>
+              <w:rPr>
+                <w:rFonts w:ascii="Times New Roman" w:hAnsi="Times New Roman"/>
+                <w:sz w:val="17"/>
+              </w:rPr>
+              <w:t>-0,35 (Dia 3,3)</w:t>
+            </w:r>
+          </w:p>
+        </w:tc>
+        <w:tc>
+          <w:tcPr>
+            <w:tcW w:type="dxa" w:w="1567"/>
+            <w:tcBorders>
+              <w:top w:val="single" w:sz="6" w:color="000000"/>
+              <w:bottom w:val="single" w:sz="6" w:color="000000"/>
+              <w:left w:val="nil" w:sz="6" w:color="000000"/>
+              <w:right w:val="nil" w:sz="6" w:color="000000"/>
+            </w:tcBorders>
+          </w:tcPr>
+          <w:p>
+            <w:pPr>
+              <w:jc w:val="center"/>
+            </w:pPr>
+            <w:r/>
+            <w:r>
+              <w:rPr>
+                <w:rFonts w:ascii="Times New Roman" w:hAnsi="Times New Roman"/>
+                <w:sz w:val="17"/>
+              </w:rPr>
+              <w:t>0,73</w:t>
+            </w:r>
+          </w:p>
+        </w:tc>
+      </w:tr>
+      <w:tr>
+        <w:tc>
+          <w:tcPr>
+            <w:tcW w:type="dxa" w:w="1567"/>
+            <w:tcBorders>
+              <w:top w:val="single" w:sz="6" w:color="000000"/>
+              <w:bottom w:val="single" w:sz="6" w:color="000000"/>
+              <w:left w:val="nil" w:sz="6" w:color="000000"/>
+              <w:right w:val="nil" w:sz="6" w:color="000000"/>
+            </w:tcBorders>
+          </w:tcPr>
+          <w:p>
+            <w:pPr>
+              <w:jc w:val="left"/>
+            </w:pPr>
+            <w:r/>
+            <w:r>
+              <w:rPr>
+                <w:rFonts w:ascii="Times New Roman" w:hAnsi="Times New Roman"/>
+                <w:sz w:val="17"/>
+              </w:rPr>
+              <w:t>Vigor</w:t>
+            </w:r>
+          </w:p>
+        </w:tc>
+        <w:tc>
+          <w:tcPr>
+            <w:tcW w:type="dxa" w:w="1567"/>
+            <w:tcBorders>
+              <w:top w:val="single" w:sz="6" w:color="000000"/>
+              <w:bottom w:val="single" w:sz="6" w:color="000000"/>
+              <w:left w:val="nil" w:sz="6" w:color="000000"/>
+              <w:right w:val="nil" w:sz="6" w:color="000000"/>
+            </w:tcBorders>
+          </w:tcPr>
+          <w:p>
+            <w:pPr>
+              <w:jc w:val="center"/>
+            </w:pPr>
+            <w:r/>
+            <w:r>
+              <w:rPr>
+                <w:rFonts w:ascii="Times New Roman" w:hAnsi="Times New Roman"/>
+                <w:sz w:val="17"/>
+              </w:rPr>
+              <w:t>8,2 (Dia 1)</w:t>
+            </w:r>
+          </w:p>
+        </w:tc>
+        <w:tc>
+          <w:tcPr>
+            <w:tcW w:type="dxa" w:w="1567"/>
+            <w:tcBorders>
+              <w:top w:val="single" w:sz="6" w:color="000000"/>
+              <w:bottom w:val="single" w:sz="6" w:color="000000"/>
+              <w:left w:val="nil" w:sz="6" w:color="000000"/>
+              <w:right w:val="nil" w:sz="6" w:color="000000"/>
+            </w:tcBorders>
+          </w:tcPr>
+          <w:p>
+            <w:pPr>
+              <w:jc w:val="center"/>
+            </w:pPr>
+            <w:r/>
+            <w:r>
+              <w:rPr>
+                <w:rFonts w:ascii="Times New Roman" w:hAnsi="Times New Roman"/>
+                <w:sz w:val="17"/>
+              </w:rPr>
+              <w:t>4,4 (Dia 7)</w:t>
+            </w:r>
+          </w:p>
+        </w:tc>
+        <w:tc>
+          <w:tcPr>
+            <w:tcW w:type="dxa" w:w="1567"/>
+            <w:tcBorders>
+              <w:top w:val="single" w:sz="6" w:color="000000"/>
+              <w:bottom w:val="single" w:sz="6" w:color="000000"/>
+              <w:left w:val="nil" w:sz="6" w:color="000000"/>
+              <w:right w:val="nil" w:sz="6" w:color="000000"/>
+            </w:tcBorders>
+          </w:tcPr>
+          <w:p>
+            <w:pPr>
+              <w:jc w:val="center"/>
+            </w:pPr>
+            <w:r/>
+            <w:r>
+              <w:rPr>
+                <w:rFonts w:ascii="Times New Roman" w:hAnsi="Times New Roman"/>
+                <w:sz w:val="17"/>
+              </w:rPr>
+              <w:t>+0,55 (Dia 4,2)</w:t>
+            </w:r>
+          </w:p>
+        </w:tc>
+        <w:tc>
+          <w:tcPr>
+            <w:tcW w:type="dxa" w:w="1567"/>
+            <w:tcBorders>
+              <w:top w:val="single" w:sz="6" w:color="000000"/>
+              <w:bottom w:val="single" w:sz="6" w:color="000000"/>
+              <w:left w:val="nil" w:sz="6" w:color="000000"/>
+              <w:right w:val="nil" w:sz="6" w:color="000000"/>
+            </w:tcBorders>
+          </w:tcPr>
+          <w:p>
+            <w:pPr>
+              <w:jc w:val="center"/>
+            </w:pPr>
+            <w:r/>
+            <w:r>
+              <w:rPr>
+                <w:rFonts w:ascii="Times New Roman" w:hAnsi="Times New Roman"/>
+                <w:sz w:val="17"/>
+              </w:rPr>
+              <w:t>-3,52 (Dia 1)</w:t>
+            </w:r>
+          </w:p>
+        </w:tc>
+        <w:tc>
+          <w:tcPr>
+            <w:tcW w:type="dxa" w:w="1567"/>
+            <w:tcBorders>
+              <w:top w:val="single" w:sz="6" w:color="000000"/>
+              <w:bottom w:val="single" w:sz="6" w:color="000000"/>
+              <w:left w:val="nil" w:sz="6" w:color="000000"/>
+              <w:right w:val="nil" w:sz="6" w:color="000000"/>
+            </w:tcBorders>
+          </w:tcPr>
+          <w:p>
+            <w:pPr>
+              <w:jc w:val="center"/>
+            </w:pPr>
+            <w:r/>
+            <w:r>
+              <w:rPr>
+                <w:rFonts w:ascii="Times New Roman" w:hAnsi="Times New Roman"/>
+                <w:sz w:val="17"/>
+              </w:rPr>
+              <w:t>0,96</w:t>
+            </w:r>
+          </w:p>
+        </w:tc>
+      </w:tr>
+      <w:tr>
+        <w:tc>
+          <w:tcPr>
+            <w:tcW w:type="dxa" w:w="1567"/>
+            <w:tcBorders>
+              <w:top w:val="single" w:sz="6" w:color="000000"/>
+              <w:bottom w:val="single" w:sz="6" w:color="000000"/>
+              <w:left w:val="nil" w:sz="6" w:color="000000"/>
+              <w:right w:val="nil" w:sz="6" w:color="000000"/>
+            </w:tcBorders>
+          </w:tcPr>
+          <w:p>
+            <w:pPr>
+              <w:jc w:val="left"/>
+            </w:pPr>
+            <w:r/>
+            <w:r>
+              <w:rPr>
+                <w:rFonts w:ascii="Times New Roman" w:hAnsi="Times New Roman"/>
+                <w:sz w:val="17"/>
+              </w:rPr>
+              <w:t>Fadiga</w:t>
+            </w:r>
+          </w:p>
+        </w:tc>
+        <w:tc>
+          <w:tcPr>
+            <w:tcW w:type="dxa" w:w="1567"/>
+            <w:tcBorders>
+              <w:top w:val="single" w:sz="6" w:color="000000"/>
+              <w:bottom w:val="single" w:sz="6" w:color="000000"/>
+              <w:left w:val="nil" w:sz="6" w:color="000000"/>
+              <w:right w:val="nil" w:sz="6" w:color="000000"/>
+            </w:tcBorders>
+          </w:tcPr>
+          <w:p>
+            <w:pPr>
+              <w:jc w:val="center"/>
+            </w:pPr>
+            <w:r/>
+            <w:r>
+              <w:rPr>
+                <w:rFonts w:ascii="Times New Roman" w:hAnsi="Times New Roman"/>
+                <w:sz w:val="17"/>
+              </w:rPr>
+              <w:t>7,3 (Dia 7)</w:t>
+            </w:r>
+          </w:p>
+        </w:tc>
+        <w:tc>
+          <w:tcPr>
+            <w:tcW w:type="dxa" w:w="1567"/>
+            <w:tcBorders>
+              <w:top w:val="single" w:sz="6" w:color="000000"/>
+              <w:bottom w:val="single" w:sz="6" w:color="000000"/>
+              <w:left w:val="nil" w:sz="6" w:color="000000"/>
+              <w:right w:val="nil" w:sz="6" w:color="000000"/>
+            </w:tcBorders>
+          </w:tcPr>
+          <w:p>
+            <w:pPr>
+              <w:jc w:val="center"/>
+            </w:pPr>
+            <w:r/>
+            <w:r>
+              <w:rPr>
+                <w:rFonts w:ascii="Times New Roman" w:hAnsi="Times New Roman"/>
+                <w:sz w:val="17"/>
+              </w:rPr>
+              <w:t>3,4 (Dia 1)</w:t>
+            </w:r>
+          </w:p>
+        </w:tc>
+        <w:tc>
+          <w:tcPr>
+            <w:tcW w:type="dxa" w:w="1567"/>
+            <w:tcBorders>
+              <w:top w:val="single" w:sz="6" w:color="000000"/>
+              <w:bottom w:val="single" w:sz="6" w:color="000000"/>
+              <w:left w:val="nil" w:sz="6" w:color="000000"/>
+              <w:right w:val="nil" w:sz="6" w:color="000000"/>
+            </w:tcBorders>
+          </w:tcPr>
+          <w:p>
+            <w:pPr>
+              <w:jc w:val="center"/>
+            </w:pPr>
+            <w:r/>
+            <w:r>
+              <w:rPr>
+                <w:rFonts w:ascii="Times New Roman" w:hAnsi="Times New Roman"/>
+                <w:sz w:val="17"/>
+              </w:rPr>
+              <w:t>+2,23 (Dia 1)</w:t>
+            </w:r>
+          </w:p>
+        </w:tc>
+        <w:tc>
+          <w:tcPr>
+            <w:tcW w:type="dxa" w:w="1567"/>
+            <w:tcBorders>
+              <w:top w:val="single" w:sz="6" w:color="000000"/>
+              <w:bottom w:val="single" w:sz="6" w:color="000000"/>
+              <w:left w:val="nil" w:sz="6" w:color="000000"/>
+              <w:right w:val="nil" w:sz="6" w:color="000000"/>
+            </w:tcBorders>
+          </w:tcPr>
+          <w:p>
+            <w:pPr>
+              <w:jc w:val="center"/>
+            </w:pPr>
+            <w:r/>
+            <w:r>
+              <w:rPr>
+                <w:rFonts w:ascii="Times New Roman" w:hAnsi="Times New Roman"/>
+                <w:sz w:val="17"/>
+              </w:rPr>
+              <w:t>-0,13 (Dia 4)</w:t>
+            </w:r>
+          </w:p>
+        </w:tc>
+        <w:tc>
+          <w:tcPr>
+            <w:tcW w:type="dxa" w:w="1567"/>
+            <w:tcBorders>
+              <w:top w:val="single" w:sz="6" w:color="000000"/>
+              <w:bottom w:val="single" w:sz="6" w:color="000000"/>
+              <w:left w:val="nil" w:sz="6" w:color="000000"/>
+              <w:right w:val="nil" w:sz="6" w:color="000000"/>
+            </w:tcBorders>
+          </w:tcPr>
+          <w:p>
+            <w:pPr>
+              <w:jc w:val="center"/>
+            </w:pPr>
+            <w:r/>
+            <w:r>
+              <w:rPr>
+                <w:rFonts w:ascii="Times New Roman" w:hAnsi="Times New Roman"/>
+                <w:sz w:val="17"/>
+              </w:rPr>
+              <w:t>0,95</w:t>
+            </w:r>
+          </w:p>
+        </w:tc>
+      </w:tr>
+      <w:tr>
+        <w:tc>
+          <w:tcPr>
+            <w:tcW w:type="dxa" w:w="1567"/>
+            <w:tcBorders>
+              <w:top w:val="single" w:sz="6" w:color="000000"/>
+              <w:bottom w:val="single" w:sz="6" w:color="000000"/>
+              <w:left w:val="nil" w:sz="6" w:color="000000"/>
+              <w:right w:val="nil" w:sz="6" w:color="000000"/>
+            </w:tcBorders>
+          </w:tcPr>
+          <w:p>
+            <w:pPr>
+              <w:jc w:val="left"/>
+            </w:pPr>
+            <w:r/>
+            <w:r>
+              <w:rPr>
+                <w:rFonts w:ascii="Times New Roman" w:hAnsi="Times New Roman"/>
+                <w:sz w:val="17"/>
+              </w:rPr>
+              <w:t>Confusão</w:t>
+            </w:r>
+          </w:p>
+        </w:tc>
+        <w:tc>
+          <w:tcPr>
+            <w:tcW w:type="dxa" w:w="1567"/>
+            <w:tcBorders>
+              <w:top w:val="single" w:sz="6" w:color="000000"/>
+              <w:bottom w:val="single" w:sz="6" w:color="000000"/>
+              <w:left w:val="nil" w:sz="6" w:color="000000"/>
+              <w:right w:val="nil" w:sz="6" w:color="000000"/>
+            </w:tcBorders>
+          </w:tcPr>
+          <w:p>
+            <w:pPr>
+              <w:jc w:val="center"/>
+            </w:pPr>
+            <w:r/>
+            <w:r>
+              <w:rPr>
+                <w:rFonts w:ascii="Times New Roman" w:hAnsi="Times New Roman"/>
+                <w:sz w:val="17"/>
+              </w:rPr>
+              <w:t>1,0 (Dia 1)</w:t>
+            </w:r>
+          </w:p>
+        </w:tc>
+        <w:tc>
+          <w:tcPr>
+            <w:tcW w:type="dxa" w:w="1567"/>
+            <w:tcBorders>
+              <w:top w:val="single" w:sz="6" w:color="000000"/>
+              <w:bottom w:val="single" w:sz="6" w:color="000000"/>
+              <w:left w:val="nil" w:sz="6" w:color="000000"/>
+              <w:right w:val="nil" w:sz="6" w:color="000000"/>
+            </w:tcBorders>
+          </w:tcPr>
+          <w:p>
+            <w:pPr>
+              <w:jc w:val="center"/>
+            </w:pPr>
+            <w:r/>
+            <w:r>
+              <w:rPr>
+                <w:rFonts w:ascii="Times New Roman" w:hAnsi="Times New Roman"/>
+                <w:sz w:val="17"/>
+              </w:rPr>
+              <w:t>0,3 (Dia 3,6)</w:t>
+            </w:r>
+          </w:p>
+        </w:tc>
+        <w:tc>
+          <w:tcPr>
+            <w:tcW w:type="dxa" w:w="1567"/>
+            <w:tcBorders>
+              <w:top w:val="single" w:sz="6" w:color="000000"/>
+              <w:bottom w:val="single" w:sz="6" w:color="000000"/>
+              <w:left w:val="nil" w:sz="6" w:color="000000"/>
+              <w:right w:val="nil" w:sz="6" w:color="000000"/>
+            </w:tcBorders>
+          </w:tcPr>
+          <w:p>
+            <w:pPr>
+              <w:jc w:val="center"/>
+            </w:pPr>
+            <w:r/>
+            <w:r>
+              <w:rPr>
+                <w:rFonts w:ascii="Times New Roman" w:hAnsi="Times New Roman"/>
+                <w:sz w:val="17"/>
+              </w:rPr>
+              <w:t>+0,13 (Dia 5,4)</w:t>
+            </w:r>
+          </w:p>
+        </w:tc>
+        <w:tc>
+          <w:tcPr>
+            <w:tcW w:type="dxa" w:w="1567"/>
+            <w:tcBorders>
+              <w:top w:val="single" w:sz="6" w:color="000000"/>
+              <w:bottom w:val="single" w:sz="6" w:color="000000"/>
+              <w:left w:val="nil" w:sz="6" w:color="000000"/>
+              <w:right w:val="nil" w:sz="6" w:color="000000"/>
+            </w:tcBorders>
+          </w:tcPr>
+          <w:p>
+            <w:pPr>
+              <w:jc w:val="center"/>
+            </w:pPr>
+            <w:r/>
+            <w:r>
+              <w:rPr>
+                <w:rFonts w:ascii="Times New Roman" w:hAnsi="Times New Roman"/>
+                <w:sz w:val="17"/>
+              </w:rPr>
+              <w:t>-0,67 (Dia 1)</w:t>
+            </w:r>
+          </w:p>
+        </w:tc>
+        <w:tc>
+          <w:tcPr>
+            <w:tcW w:type="dxa" w:w="1567"/>
+            <w:tcBorders>
+              <w:top w:val="single" w:sz="6" w:color="000000"/>
+              <w:bottom w:val="single" w:sz="6" w:color="000000"/>
+              <w:left w:val="nil" w:sz="6" w:color="000000"/>
+              <w:right w:val="nil" w:sz="6" w:color="000000"/>
+            </w:tcBorders>
+          </w:tcPr>
+          <w:p>
+            <w:pPr>
+              <w:jc w:val="center"/>
+            </w:pPr>
+            <w:r/>
+            <w:r>
+              <w:rPr>
+                <w:rFonts w:ascii="Times New Roman" w:hAnsi="Times New Roman"/>
+                <w:sz w:val="17"/>
+              </w:rPr>
+              <w:t>0,85</w:t>
+            </w:r>
+          </w:p>
+        </w:tc>
+      </w:tr>
+      <w:tr>
+        <w:tc>
+          <w:tcPr>
+            <w:tcW w:type="dxa" w:w="1567"/>
+            <w:tcBorders>
+              <w:top w:val="single" w:sz="6" w:color="000000"/>
+              <w:bottom w:val="single" w:sz="6" w:color="000000"/>
+              <w:left w:val="nil" w:sz="6" w:color="000000"/>
+              <w:right w:val="nil" w:sz="6" w:color="000000"/>
+            </w:tcBorders>
+          </w:tcPr>
+          <w:p>
+            <w:pPr>
+              <w:jc w:val="left"/>
+            </w:pPr>
+            <w:r/>
+            <w:r>
+              <w:rPr>
+                <w:rFonts w:ascii="Times New Roman" w:hAnsi="Times New Roman"/>
+                <w:sz w:val="17"/>
+              </w:rPr>
               <w:t>PTH</w:t>
             </w:r>
           </w:p>
         </w:tc>
         <w:tc>
           <w:tcPr>
-            <w:tcW w:type="dxa" w:w="1881"/>
+            <w:tcW w:type="dxa" w:w="1567"/>
             <w:tcBorders>
               <w:top w:val="single" w:sz="6" w:color="000000"/>
               <w:bottom w:val="single" w:sz="6" w:color="000000"/>
@@ -16626,7 +17284,7 @@
         </w:tc>
         <w:tc>
           <w:tcPr>
-            <w:tcW w:type="dxa" w:w="1881"/>
+            <w:tcW w:type="dxa" w:w="1567"/>
             <w:tcBorders>
               <w:top w:val="single" w:sz="6" w:color="000000"/>
               <w:bottom w:val="single" w:sz="6" w:color="000000"/>
@@ -16650,7 +17308,7 @@
         </w:tc>
         <w:tc>
           <w:tcPr>
-            <w:tcW w:type="dxa" w:w="1881"/>
+            <w:tcW w:type="dxa" w:w="1567"/>
             <w:tcBorders>
               <w:top w:val="single" w:sz="6" w:color="000000"/>
               <w:bottom w:val="single" w:sz="6" w:color="000000"/>
@@ -16674,7 +17332,7 @@
         </w:tc>
         <w:tc>
           <w:tcPr>
-            <w:tcW w:type="dxa" w:w="1881"/>
+            <w:tcW w:type="dxa" w:w="1567"/>
             <w:tcBorders>
               <w:top w:val="single" w:sz="6" w:color="000000"/>
               <w:bottom w:val="single" w:sz="6" w:color="000000"/>
@@ -16693,6 +17351,30 @@
                 <w:sz w:val="17"/>
               </w:rPr>
               <w:t>-0,97 (Dia 3,9)</w:t>
+            </w:r>
+          </w:p>
+        </w:tc>
+        <w:tc>
+          <w:tcPr>
+            <w:tcW w:type="dxa" w:w="1567"/>
+            <w:tcBorders>
+              <w:top w:val="single" w:sz="6" w:color="000000"/>
+              <w:bottom w:val="single" w:sz="6" w:color="000000"/>
+              <w:left w:val="nil" w:sz="6" w:color="000000"/>
+              <w:right w:val="nil" w:sz="6" w:color="000000"/>
+            </w:tcBorders>
+          </w:tcPr>
+          <w:p>
+            <w:pPr>
+              <w:jc w:val="center"/>
+            </w:pPr>
+            <w:r/>
+            <w:r>
+              <w:rPr>
+                <w:rFonts w:ascii="Times New Roman" w:hAnsi="Times New Roman"/>
+                <w:sz w:val="17"/>
+              </w:rPr>
+              <w:t>0,80</w:t>
             </w:r>
           </w:p>
         </w:tc>
@@ -16707,7 +17389,7 @@
           <w:i/>
           <w:sz w:val="17"/>
         </w:rPr>
-        <w:t>Valores e taxas extraídos da função polinomial P(t) no intervalo [Dia 1; Dia 7]. Os máximos/mínimos observados de todas as dimensões constam na Tabela de dias de pico (seção 3.7).</w:t>
+        <w:t>Valores e taxas extraídos da função polinomial P(t) no intervalo [Dia 1; Dia 7]. Para as dimensões negativas (baixo R²; efeito de piso), os extremos modelados são apenas indicativos. Os máximos/mínimos observados constam na tabela de dias de pico (seção 3.7).</w:t>
       </w:r>
     </w:p>
     <w:p>

</xml_diff>

<commit_message>
Decomposição sinal–ruído e suavização das trajetórias (seção 3.14)
Separa a tendência sistemática (sinal = componente suave/polinômio) do ruído
(resíduo) em cada trajetória diária: Tabela 18 com sinal%, ruído%, SNR e
SNR(dB) por dimensão, e uma figura das curvas suavizadas (energia-fadiga e
negativas) sobre os pontos brutos. O eixo energia-fadiga é quase puro sinal
(vigor 96%, SNR 25/14 dB; fadiga 95%, SNR 18/12,6 dB), revelando o cruzamento
energia-fadiga com nitidez; as negativas de piso são dominadas por ruído
(depressão 42% sinal, SNR 0,7). compute_smooth.py e smooth_figs.py adicionados;
reprodução 01 (bloco 14) atualizada. PDF (28 páginas); leak-scan: 0 vazamentos.

Co-Authored-By: Claude Opus 4.8 <noreply@anthropic.com>
Claude-Session: https://claude.ai/code/session_01P7yGiDeoGDyjWvPWQVsUrj
</commit_message>
<xml_diff>
--- a/Artigos/Artigo_humor_HANDEBOL.docx
+++ b/Artigos/Artigo_humor_HANDEBOL.docx
@@ -374,7 +374,7 @@
           <w:b w:val="0"/>
           <w:sz w:val="24"/>
         </w:rPr>
-        <w:t>Como confirmação robusta, as comparações Dia 1 → Dia 7 e pré → pós foram reanalisadas por análise multivariada de variância (MANOVA) de medidas repetidas sobre os escores T, que testa as seis dimensões em conjunto e controla o erro de múltiplas comparações (lambda de Wilks, F e eta-quadrado parcial — η²ₚ; 0,01 pequeno; 0,06 médio; 0,14 grande); nos testes univariados de acompanhamento da MANOVA, aplicou-se o ajuste de Bonferroni ao nível de significância, dividindo 0,05 pelas seis dimensões (α = 0,008), para controlar o erro do tipo I. A associação entre as dimensões foi quantificada pela correlação de Spearman (ρ). Por fim, a relação entre o pico de velocidade do T-CAR e a fadiga foi analisada por regressão, e um limiar de pico de velocidade foi estabelecido pelo índice de Youden — que maximiza a soma de sensibilidade e especificidade —, com a qualidade de discriminação avaliada pela área sob a curva ROC. Para separar o efeito da aptidão do efeito do tamanho corporal, o pico de velocidade foi ainda submetido a ajuste alométrico: estimou-se o expoente da relação alométrica pela regressão log(PV)–log(massa) e normalizou-se o PV pela massa elevada a esse expoente, comparando-se as associações do PV bruto e do PV normalizado com a fadiga e o vigor. A dinâmica temporal foi ainda modelada ajustando-se uma função polinomial às médias diárias de cada dimensão, da qual se obtiveram, por derivação, a taxa de variação instantânea (derivada primeira), os pontos críticos (máximos e mínimos) e o ponto de inflexão (raiz da derivada segunda). Adotou-se nível de significância de 5% (p &lt; 0,05), com as análises conduzidas em ambiente Python (bibliotecas pandas, NumPy, SciPy e statsmodels).</w:t>
+        <w:t>Como confirmação robusta, as comparações Dia 1 → Dia 7 e pré → pós foram reanalisadas por análise multivariada de variância (MANOVA) de medidas repetidas sobre os escores T, que testa as seis dimensões em conjunto e controla o erro de múltiplas comparações (lambda de Wilks, F e eta-quadrado parcial — η²ₚ; 0,01 pequeno; 0,06 médio; 0,14 grande); nos testes univariados de acompanhamento da MANOVA, aplicou-se o ajuste de Bonferroni ao nível de significância, dividindo 0,05 pelas seis dimensões (α = 0,008), para controlar o erro do tipo I. A associação entre as dimensões foi quantificada pela correlação de Spearman (ρ). Por fim, a relação entre o pico de velocidade do T-CAR e a fadiga foi analisada por regressão, e um limiar de pico de velocidade foi estabelecido pelo índice de Youden — que maximiza a soma de sensibilidade e especificidade —, com a qualidade de discriminação avaliada pela área sob a curva ROC. Para separar o efeito da aptidão do efeito do tamanho corporal, o pico de velocidade foi ainda submetido a ajuste alométrico: estimou-se o expoente da relação alométrica pela regressão log(PV)–log(massa) e normalizou-se o PV pela massa elevada a esse expoente, comparando-se as associações do PV bruto e do PV normalizado com a fadiga e o vigor. A dinâmica temporal foi ainda modelada ajustando-se uma função polinomial às médias diárias de cada dimensão, da qual se obtiveram, por derivação, a taxa de variação instantânea (derivada primeira), os pontos críticos (máximos e mínimos) e o ponto de inflexão (raiz da derivada segunda). A mesma componente suave foi usada para decompor cada trajetória em sinal e ruído, quantificando a razão sinal-ruído (SNR) e permitindo uma visualização suavizada das curvas. Adotou-se nível de significância de 5% (p &lt; 0,05), com as análises conduzidas em ambiente Python (bibliotecas pandas, NumPy, SciPy e statsmodels).</w:t>
       </w:r>
     </w:p>
     <w:p>
@@ -17415,6 +17415,1124 @@
           <w:sz w:val="24"/>
         </w:rPr>
         <w:t>Os extremos das funções ajustadas e os limites de suas derivadas (Tabela 17) delimitam quantitativamente a resposta. O vigor varia entre um máximo de 8,2 pontos no Dia 1 e um mínimo de 4,4 no Dia 7, com a taxa de variação confinada entre -3,52 ponto/dia (queda máxima, no Dia 1) e +0,55 ponto/dia (leve recuperação em torno do meio da semana); a fadiga percorre o intervalo inverso (mínimo de 3,4 no Dia 1; máximo de 7,3 no Dia 7), com taxa entre -0,13 e +2,23 ponto/dia. Esses limites confirmam que a maior velocidade de mudança ocorre no início do microciclo e que o sistema afetivo opera dentro de uma faixa de variação bem definida.</w:t>
+      </w:r>
+    </w:p>
+    <w:p>
+      <w:pPr>
+        <w:spacing w:before="120" w:after="80" w:line="360" w:lineRule="auto"/>
+      </w:pPr>
+      <w:r>
+        <w:rPr>
+          <w:b/>
+          <w:sz w:val="24"/>
+        </w:rPr>
+        <w:t>3.14 Decomposição sinal–ruído e suavização das trajetórias</w:t>
+      </w:r>
+    </w:p>
+    <w:p>
+      <w:pPr>
+        <w:spacing w:before="160" w:after="40"/>
+      </w:pPr>
+      <w:r>
+        <w:rPr>
+          <w:sz w:val="22"/>
+        </w:rPr>
+        <w:t>Tabela 18 – Decomposição sinal–ruído das trajetórias diárias: proporção de sinal (variância explicada pela componente suave) e de ruído (resíduo), razão sinal-ruído (SNR) e SNR em decibéis.</w:t>
+      </w:r>
+    </w:p>
+    <w:tbl>
+      <w:tblPr>
+        <w:tblW w:type="auto" w:w="0"/>
+        <w:jc w:val="center"/>
+        <w:tblLook w:firstColumn="1" w:firstRow="1" w:lastColumn="0" w:lastRow="0" w:noHBand="0" w:noVBand="1" w:val="04A0"/>
+      </w:tblPr>
+      <w:tblGrid>
+        <w:gridCol w:w="1881"/>
+        <w:gridCol w:w="1881"/>
+        <w:gridCol w:w="1881"/>
+        <w:gridCol w:w="1881"/>
+        <w:gridCol w:w="1881"/>
+      </w:tblGrid>
+      <w:tr>
+        <w:tc>
+          <w:tcPr>
+            <w:tcW w:type="dxa" w:w="1881"/>
+            <w:tcBorders>
+              <w:top w:val="single" w:sz="6" w:color="000000"/>
+              <w:bottom w:val="single" w:sz="6" w:color="000000"/>
+              <w:left w:val="nil" w:sz="6" w:color="000000"/>
+              <w:right w:val="nil" w:sz="6" w:color="000000"/>
+            </w:tcBorders>
+          </w:tcPr>
+          <w:p>
+            <w:pPr>
+              <w:jc w:val="center"/>
+            </w:pPr>
+            <w:r/>
+            <w:r>
+              <w:rPr>
+                <w:rFonts w:ascii="Times New Roman" w:hAnsi="Times New Roman"/>
+                <w:b/>
+                <w:sz w:val="18"/>
+              </w:rPr>
+              <w:t>Dimensão</w:t>
+            </w:r>
+          </w:p>
+        </w:tc>
+        <w:tc>
+          <w:tcPr>
+            <w:tcW w:type="dxa" w:w="1881"/>
+            <w:tcBorders>
+              <w:top w:val="single" w:sz="6" w:color="000000"/>
+              <w:bottom w:val="single" w:sz="6" w:color="000000"/>
+              <w:left w:val="nil" w:sz="6" w:color="000000"/>
+              <w:right w:val="nil" w:sz="6" w:color="000000"/>
+            </w:tcBorders>
+          </w:tcPr>
+          <w:p>
+            <w:pPr>
+              <w:jc w:val="center"/>
+            </w:pPr>
+            <w:r/>
+            <w:r>
+              <w:rPr>
+                <w:rFonts w:ascii="Times New Roman" w:hAnsi="Times New Roman"/>
+                <w:b/>
+                <w:sz w:val="18"/>
+              </w:rPr>
+              <w:t>Sinal</w:t>
+            </w:r>
+          </w:p>
+        </w:tc>
+        <w:tc>
+          <w:tcPr>
+            <w:tcW w:type="dxa" w:w="1881"/>
+            <w:tcBorders>
+              <w:top w:val="single" w:sz="6" w:color="000000"/>
+              <w:bottom w:val="single" w:sz="6" w:color="000000"/>
+              <w:left w:val="nil" w:sz="6" w:color="000000"/>
+              <w:right w:val="nil" w:sz="6" w:color="000000"/>
+            </w:tcBorders>
+          </w:tcPr>
+          <w:p>
+            <w:pPr>
+              <w:jc w:val="center"/>
+            </w:pPr>
+            <w:r/>
+            <w:r>
+              <w:rPr>
+                <w:rFonts w:ascii="Times New Roman" w:hAnsi="Times New Roman"/>
+                <w:b/>
+                <w:sz w:val="18"/>
+              </w:rPr>
+              <w:t>Ruído</w:t>
+            </w:r>
+          </w:p>
+        </w:tc>
+        <w:tc>
+          <w:tcPr>
+            <w:tcW w:type="dxa" w:w="1881"/>
+            <w:tcBorders>
+              <w:top w:val="single" w:sz="6" w:color="000000"/>
+              <w:bottom w:val="single" w:sz="6" w:color="000000"/>
+              <w:left w:val="nil" w:sz="6" w:color="000000"/>
+              <w:right w:val="nil" w:sz="6" w:color="000000"/>
+            </w:tcBorders>
+          </w:tcPr>
+          <w:p>
+            <w:pPr>
+              <w:jc w:val="center"/>
+            </w:pPr>
+            <w:r/>
+            <w:r>
+              <w:rPr>
+                <w:rFonts w:ascii="Times New Roman" w:hAnsi="Times New Roman"/>
+                <w:b/>
+                <w:sz w:val="18"/>
+              </w:rPr>
+              <w:t>SNR</w:t>
+            </w:r>
+          </w:p>
+        </w:tc>
+        <w:tc>
+          <w:tcPr>
+            <w:tcW w:type="dxa" w:w="1881"/>
+            <w:tcBorders>
+              <w:top w:val="single" w:sz="6" w:color="000000"/>
+              <w:bottom w:val="single" w:sz="6" w:color="000000"/>
+              <w:left w:val="nil" w:sz="6" w:color="000000"/>
+              <w:right w:val="nil" w:sz="6" w:color="000000"/>
+            </w:tcBorders>
+          </w:tcPr>
+          <w:p>
+            <w:pPr>
+              <w:jc w:val="center"/>
+            </w:pPr>
+            <w:r/>
+            <w:r>
+              <w:rPr>
+                <w:rFonts w:ascii="Times New Roman" w:hAnsi="Times New Roman"/>
+                <w:b/>
+                <w:sz w:val="18"/>
+              </w:rPr>
+              <w:t>SNR (dB)</w:t>
+            </w:r>
+          </w:p>
+        </w:tc>
+      </w:tr>
+      <w:tr>
+        <w:tc>
+          <w:tcPr>
+            <w:tcW w:type="dxa" w:w="1881"/>
+            <w:tcBorders>
+              <w:top w:val="single" w:sz="6" w:color="000000"/>
+              <w:bottom w:val="single" w:sz="6" w:color="000000"/>
+              <w:left w:val="nil" w:sz="6" w:color="000000"/>
+              <w:right w:val="nil" w:sz="6" w:color="000000"/>
+            </w:tcBorders>
+          </w:tcPr>
+          <w:p>
+            <w:pPr>
+              <w:jc w:val="left"/>
+            </w:pPr>
+            <w:r/>
+            <w:r>
+              <w:rPr>
+                <w:rFonts w:ascii="Times New Roman" w:hAnsi="Times New Roman"/>
+                <w:sz w:val="18"/>
+              </w:rPr>
+              <w:t>Tensão</w:t>
+            </w:r>
+          </w:p>
+        </w:tc>
+        <w:tc>
+          <w:tcPr>
+            <w:tcW w:type="dxa" w:w="1881"/>
+            <w:tcBorders>
+              <w:top w:val="single" w:sz="6" w:color="000000"/>
+              <w:bottom w:val="single" w:sz="6" w:color="000000"/>
+              <w:left w:val="nil" w:sz="6" w:color="000000"/>
+              <w:right w:val="nil" w:sz="6" w:color="000000"/>
+            </w:tcBorders>
+          </w:tcPr>
+          <w:p>
+            <w:pPr>
+              <w:jc w:val="center"/>
+            </w:pPr>
+            <w:r/>
+            <w:r>
+              <w:rPr>
+                <w:rFonts w:ascii="Times New Roman" w:hAnsi="Times New Roman"/>
+                <w:sz w:val="18"/>
+              </w:rPr>
+              <w:t>80%</w:t>
+            </w:r>
+          </w:p>
+        </w:tc>
+        <w:tc>
+          <w:tcPr>
+            <w:tcW w:type="dxa" w:w="1881"/>
+            <w:tcBorders>
+              <w:top w:val="single" w:sz="6" w:color="000000"/>
+              <w:bottom w:val="single" w:sz="6" w:color="000000"/>
+              <w:left w:val="nil" w:sz="6" w:color="000000"/>
+              <w:right w:val="nil" w:sz="6" w:color="000000"/>
+            </w:tcBorders>
+          </w:tcPr>
+          <w:p>
+            <w:pPr>
+              <w:jc w:val="center"/>
+            </w:pPr>
+            <w:r/>
+            <w:r>
+              <w:rPr>
+                <w:rFonts w:ascii="Times New Roman" w:hAnsi="Times New Roman"/>
+                <w:sz w:val="18"/>
+              </w:rPr>
+              <w:t>20%</w:t>
+            </w:r>
+          </w:p>
+        </w:tc>
+        <w:tc>
+          <w:tcPr>
+            <w:tcW w:type="dxa" w:w="1881"/>
+            <w:tcBorders>
+              <w:top w:val="single" w:sz="6" w:color="000000"/>
+              <w:bottom w:val="single" w:sz="6" w:color="000000"/>
+              <w:left w:val="nil" w:sz="6" w:color="000000"/>
+              <w:right w:val="nil" w:sz="6" w:color="000000"/>
+            </w:tcBorders>
+          </w:tcPr>
+          <w:p>
+            <w:pPr>
+              <w:jc w:val="center"/>
+            </w:pPr>
+            <w:r/>
+            <w:r>
+              <w:rPr>
+                <w:rFonts w:ascii="Times New Roman" w:hAnsi="Times New Roman"/>
+                <w:sz w:val="18"/>
+              </w:rPr>
+              <w:t>4,1</w:t>
+            </w:r>
+          </w:p>
+        </w:tc>
+        <w:tc>
+          <w:tcPr>
+            <w:tcW w:type="dxa" w:w="1881"/>
+            <w:tcBorders>
+              <w:top w:val="single" w:sz="6" w:color="000000"/>
+              <w:bottom w:val="single" w:sz="6" w:color="000000"/>
+              <w:left w:val="nil" w:sz="6" w:color="000000"/>
+              <w:right w:val="nil" w:sz="6" w:color="000000"/>
+            </w:tcBorders>
+          </w:tcPr>
+          <w:p>
+            <w:pPr>
+              <w:jc w:val="center"/>
+            </w:pPr>
+            <w:r/>
+            <w:r>
+              <w:rPr>
+                <w:rFonts w:ascii="Times New Roman" w:hAnsi="Times New Roman"/>
+                <w:sz w:val="18"/>
+              </w:rPr>
+              <w:t>+6,1</w:t>
+            </w:r>
+          </w:p>
+        </w:tc>
+      </w:tr>
+      <w:tr>
+        <w:tc>
+          <w:tcPr>
+            <w:tcW w:type="dxa" w:w="1881"/>
+            <w:tcBorders>
+              <w:top w:val="single" w:sz="6" w:color="000000"/>
+              <w:bottom w:val="single" w:sz="6" w:color="000000"/>
+              <w:left w:val="nil" w:sz="6" w:color="000000"/>
+              <w:right w:val="nil" w:sz="6" w:color="000000"/>
+            </w:tcBorders>
+          </w:tcPr>
+          <w:p>
+            <w:pPr>
+              <w:jc w:val="left"/>
+            </w:pPr>
+            <w:r/>
+            <w:r>
+              <w:rPr>
+                <w:rFonts w:ascii="Times New Roman" w:hAnsi="Times New Roman"/>
+                <w:sz w:val="18"/>
+              </w:rPr>
+              <w:t>Depressão</w:t>
+            </w:r>
+          </w:p>
+        </w:tc>
+        <w:tc>
+          <w:tcPr>
+            <w:tcW w:type="dxa" w:w="1881"/>
+            <w:tcBorders>
+              <w:top w:val="single" w:sz="6" w:color="000000"/>
+              <w:bottom w:val="single" w:sz="6" w:color="000000"/>
+              <w:left w:val="nil" w:sz="6" w:color="000000"/>
+              <w:right w:val="nil" w:sz="6" w:color="000000"/>
+            </w:tcBorders>
+          </w:tcPr>
+          <w:p>
+            <w:pPr>
+              <w:jc w:val="center"/>
+            </w:pPr>
+            <w:r/>
+            <w:r>
+              <w:rPr>
+                <w:rFonts w:ascii="Times New Roman" w:hAnsi="Times New Roman"/>
+                <w:sz w:val="18"/>
+              </w:rPr>
+              <w:t>42%</w:t>
+            </w:r>
+          </w:p>
+        </w:tc>
+        <w:tc>
+          <w:tcPr>
+            <w:tcW w:type="dxa" w:w="1881"/>
+            <w:tcBorders>
+              <w:top w:val="single" w:sz="6" w:color="000000"/>
+              <w:bottom w:val="single" w:sz="6" w:color="000000"/>
+              <w:left w:val="nil" w:sz="6" w:color="000000"/>
+              <w:right w:val="nil" w:sz="6" w:color="000000"/>
+            </w:tcBorders>
+          </w:tcPr>
+          <w:p>
+            <w:pPr>
+              <w:jc w:val="center"/>
+            </w:pPr>
+            <w:r/>
+            <w:r>
+              <w:rPr>
+                <w:rFonts w:ascii="Times New Roman" w:hAnsi="Times New Roman"/>
+                <w:sz w:val="18"/>
+              </w:rPr>
+              <w:t>58%</w:t>
+            </w:r>
+          </w:p>
+        </w:tc>
+        <w:tc>
+          <w:tcPr>
+            <w:tcW w:type="dxa" w:w="1881"/>
+            <w:tcBorders>
+              <w:top w:val="single" w:sz="6" w:color="000000"/>
+              <w:bottom w:val="single" w:sz="6" w:color="000000"/>
+              <w:left w:val="nil" w:sz="6" w:color="000000"/>
+              <w:right w:val="nil" w:sz="6" w:color="000000"/>
+            </w:tcBorders>
+          </w:tcPr>
+          <w:p>
+            <w:pPr>
+              <w:jc w:val="center"/>
+            </w:pPr>
+            <w:r/>
+            <w:r>
+              <w:rPr>
+                <w:rFonts w:ascii="Times New Roman" w:hAnsi="Times New Roman"/>
+                <w:sz w:val="18"/>
+              </w:rPr>
+              <w:t>0,7</w:t>
+            </w:r>
+          </w:p>
+        </w:tc>
+        <w:tc>
+          <w:tcPr>
+            <w:tcW w:type="dxa" w:w="1881"/>
+            <w:tcBorders>
+              <w:top w:val="single" w:sz="6" w:color="000000"/>
+              <w:bottom w:val="single" w:sz="6" w:color="000000"/>
+              <w:left w:val="nil" w:sz="6" w:color="000000"/>
+              <w:right w:val="nil" w:sz="6" w:color="000000"/>
+            </w:tcBorders>
+          </w:tcPr>
+          <w:p>
+            <w:pPr>
+              <w:jc w:val="center"/>
+            </w:pPr>
+            <w:r/>
+            <w:r>
+              <w:rPr>
+                <w:rFonts w:ascii="Times New Roman" w:hAnsi="Times New Roman"/>
+                <w:sz w:val="18"/>
+              </w:rPr>
+              <w:t>-1,4</w:t>
+            </w:r>
+          </w:p>
+        </w:tc>
+      </w:tr>
+      <w:tr>
+        <w:tc>
+          <w:tcPr>
+            <w:tcW w:type="dxa" w:w="1881"/>
+            <w:tcBorders>
+              <w:top w:val="single" w:sz="6" w:color="000000"/>
+              <w:bottom w:val="single" w:sz="6" w:color="000000"/>
+              <w:left w:val="nil" w:sz="6" w:color="000000"/>
+              <w:right w:val="nil" w:sz="6" w:color="000000"/>
+            </w:tcBorders>
+          </w:tcPr>
+          <w:p>
+            <w:pPr>
+              <w:jc w:val="left"/>
+            </w:pPr>
+            <w:r/>
+            <w:r>
+              <w:rPr>
+                <w:rFonts w:ascii="Times New Roman" w:hAnsi="Times New Roman"/>
+                <w:sz w:val="18"/>
+              </w:rPr>
+              <w:t>Raiva</w:t>
+            </w:r>
+          </w:p>
+        </w:tc>
+        <w:tc>
+          <w:tcPr>
+            <w:tcW w:type="dxa" w:w="1881"/>
+            <w:tcBorders>
+              <w:top w:val="single" w:sz="6" w:color="000000"/>
+              <w:bottom w:val="single" w:sz="6" w:color="000000"/>
+              <w:left w:val="nil" w:sz="6" w:color="000000"/>
+              <w:right w:val="nil" w:sz="6" w:color="000000"/>
+            </w:tcBorders>
+          </w:tcPr>
+          <w:p>
+            <w:pPr>
+              <w:jc w:val="center"/>
+            </w:pPr>
+            <w:r/>
+            <w:r>
+              <w:rPr>
+                <w:rFonts w:ascii="Times New Roman" w:hAnsi="Times New Roman"/>
+                <w:sz w:val="18"/>
+              </w:rPr>
+              <w:t>73%</w:t>
+            </w:r>
+          </w:p>
+        </w:tc>
+        <w:tc>
+          <w:tcPr>
+            <w:tcW w:type="dxa" w:w="1881"/>
+            <w:tcBorders>
+              <w:top w:val="single" w:sz="6" w:color="000000"/>
+              <w:bottom w:val="single" w:sz="6" w:color="000000"/>
+              <w:left w:val="nil" w:sz="6" w:color="000000"/>
+              <w:right w:val="nil" w:sz="6" w:color="000000"/>
+            </w:tcBorders>
+          </w:tcPr>
+          <w:p>
+            <w:pPr>
+              <w:jc w:val="center"/>
+            </w:pPr>
+            <w:r/>
+            <w:r>
+              <w:rPr>
+                <w:rFonts w:ascii="Times New Roman" w:hAnsi="Times New Roman"/>
+                <w:sz w:val="18"/>
+              </w:rPr>
+              <w:t>27%</w:t>
+            </w:r>
+          </w:p>
+        </w:tc>
+        <w:tc>
+          <w:tcPr>
+            <w:tcW w:type="dxa" w:w="1881"/>
+            <w:tcBorders>
+              <w:top w:val="single" w:sz="6" w:color="000000"/>
+              <w:bottom w:val="single" w:sz="6" w:color="000000"/>
+              <w:left w:val="nil" w:sz="6" w:color="000000"/>
+              <w:right w:val="nil" w:sz="6" w:color="000000"/>
+            </w:tcBorders>
+          </w:tcPr>
+          <w:p>
+            <w:pPr>
+              <w:jc w:val="center"/>
+            </w:pPr>
+            <w:r/>
+            <w:r>
+              <w:rPr>
+                <w:rFonts w:ascii="Times New Roman" w:hAnsi="Times New Roman"/>
+                <w:sz w:val="18"/>
+              </w:rPr>
+              <w:t>2,7</w:t>
+            </w:r>
+          </w:p>
+        </w:tc>
+        <w:tc>
+          <w:tcPr>
+            <w:tcW w:type="dxa" w:w="1881"/>
+            <w:tcBorders>
+              <w:top w:val="single" w:sz="6" w:color="000000"/>
+              <w:bottom w:val="single" w:sz="6" w:color="000000"/>
+              <w:left w:val="nil" w:sz="6" w:color="000000"/>
+              <w:right w:val="nil" w:sz="6" w:color="000000"/>
+            </w:tcBorders>
+          </w:tcPr>
+          <w:p>
+            <w:pPr>
+              <w:jc w:val="center"/>
+            </w:pPr>
+            <w:r/>
+            <w:r>
+              <w:rPr>
+                <w:rFonts w:ascii="Times New Roman" w:hAnsi="Times New Roman"/>
+                <w:sz w:val="18"/>
+              </w:rPr>
+              <w:t>+4,3</w:t>
+            </w:r>
+          </w:p>
+        </w:tc>
+      </w:tr>
+      <w:tr>
+        <w:tc>
+          <w:tcPr>
+            <w:tcW w:type="dxa" w:w="1881"/>
+            <w:tcBorders>
+              <w:top w:val="single" w:sz="6" w:color="000000"/>
+              <w:bottom w:val="single" w:sz="6" w:color="000000"/>
+              <w:left w:val="nil" w:sz="6" w:color="000000"/>
+              <w:right w:val="nil" w:sz="6" w:color="000000"/>
+            </w:tcBorders>
+          </w:tcPr>
+          <w:p>
+            <w:pPr>
+              <w:jc w:val="left"/>
+            </w:pPr>
+            <w:r/>
+            <w:r>
+              <w:rPr>
+                <w:rFonts w:ascii="Times New Roman" w:hAnsi="Times New Roman"/>
+                <w:sz w:val="18"/>
+              </w:rPr>
+              <w:t>Vigor</w:t>
+            </w:r>
+          </w:p>
+        </w:tc>
+        <w:tc>
+          <w:tcPr>
+            <w:tcW w:type="dxa" w:w="1881"/>
+            <w:tcBorders>
+              <w:top w:val="single" w:sz="6" w:color="000000"/>
+              <w:bottom w:val="single" w:sz="6" w:color="000000"/>
+              <w:left w:val="nil" w:sz="6" w:color="000000"/>
+              <w:right w:val="nil" w:sz="6" w:color="000000"/>
+            </w:tcBorders>
+          </w:tcPr>
+          <w:p>
+            <w:pPr>
+              <w:jc w:val="center"/>
+            </w:pPr>
+            <w:r/>
+            <w:r>
+              <w:rPr>
+                <w:rFonts w:ascii="Times New Roman" w:hAnsi="Times New Roman"/>
+                <w:sz w:val="18"/>
+              </w:rPr>
+              <w:t>96%</w:t>
+            </w:r>
+          </w:p>
+        </w:tc>
+        <w:tc>
+          <w:tcPr>
+            <w:tcW w:type="dxa" w:w="1881"/>
+            <w:tcBorders>
+              <w:top w:val="single" w:sz="6" w:color="000000"/>
+              <w:bottom w:val="single" w:sz="6" w:color="000000"/>
+              <w:left w:val="nil" w:sz="6" w:color="000000"/>
+              <w:right w:val="nil" w:sz="6" w:color="000000"/>
+            </w:tcBorders>
+          </w:tcPr>
+          <w:p>
+            <w:pPr>
+              <w:jc w:val="center"/>
+            </w:pPr>
+            <w:r/>
+            <w:r>
+              <w:rPr>
+                <w:rFonts w:ascii="Times New Roman" w:hAnsi="Times New Roman"/>
+                <w:sz w:val="18"/>
+              </w:rPr>
+              <w:t>4%</w:t>
+            </w:r>
+          </w:p>
+        </w:tc>
+        <w:tc>
+          <w:tcPr>
+            <w:tcW w:type="dxa" w:w="1881"/>
+            <w:tcBorders>
+              <w:top w:val="single" w:sz="6" w:color="000000"/>
+              <w:bottom w:val="single" w:sz="6" w:color="000000"/>
+              <w:left w:val="nil" w:sz="6" w:color="000000"/>
+              <w:right w:val="nil" w:sz="6" w:color="000000"/>
+            </w:tcBorders>
+          </w:tcPr>
+          <w:p>
+            <w:pPr>
+              <w:jc w:val="center"/>
+            </w:pPr>
+            <w:r/>
+            <w:r>
+              <w:rPr>
+                <w:rFonts w:ascii="Times New Roman" w:hAnsi="Times New Roman"/>
+                <w:sz w:val="18"/>
+              </w:rPr>
+              <w:t>25,1</w:t>
+            </w:r>
+          </w:p>
+        </w:tc>
+        <w:tc>
+          <w:tcPr>
+            <w:tcW w:type="dxa" w:w="1881"/>
+            <w:tcBorders>
+              <w:top w:val="single" w:sz="6" w:color="000000"/>
+              <w:bottom w:val="single" w:sz="6" w:color="000000"/>
+              <w:left w:val="nil" w:sz="6" w:color="000000"/>
+              <w:right w:val="nil" w:sz="6" w:color="000000"/>
+            </w:tcBorders>
+          </w:tcPr>
+          <w:p>
+            <w:pPr>
+              <w:jc w:val="center"/>
+            </w:pPr>
+            <w:r/>
+            <w:r>
+              <w:rPr>
+                <w:rFonts w:ascii="Times New Roman" w:hAnsi="Times New Roman"/>
+                <w:sz w:val="18"/>
+              </w:rPr>
+              <w:t>+14,0</w:t>
+            </w:r>
+          </w:p>
+        </w:tc>
+      </w:tr>
+      <w:tr>
+        <w:tc>
+          <w:tcPr>
+            <w:tcW w:type="dxa" w:w="1881"/>
+            <w:tcBorders>
+              <w:top w:val="single" w:sz="6" w:color="000000"/>
+              <w:bottom w:val="single" w:sz="6" w:color="000000"/>
+              <w:left w:val="nil" w:sz="6" w:color="000000"/>
+              <w:right w:val="nil" w:sz="6" w:color="000000"/>
+            </w:tcBorders>
+          </w:tcPr>
+          <w:p>
+            <w:pPr>
+              <w:jc w:val="left"/>
+            </w:pPr>
+            <w:r/>
+            <w:r>
+              <w:rPr>
+                <w:rFonts w:ascii="Times New Roman" w:hAnsi="Times New Roman"/>
+                <w:sz w:val="18"/>
+              </w:rPr>
+              <w:t>Fadiga</w:t>
+            </w:r>
+          </w:p>
+        </w:tc>
+        <w:tc>
+          <w:tcPr>
+            <w:tcW w:type="dxa" w:w="1881"/>
+            <w:tcBorders>
+              <w:top w:val="single" w:sz="6" w:color="000000"/>
+              <w:bottom w:val="single" w:sz="6" w:color="000000"/>
+              <w:left w:val="nil" w:sz="6" w:color="000000"/>
+              <w:right w:val="nil" w:sz="6" w:color="000000"/>
+            </w:tcBorders>
+          </w:tcPr>
+          <w:p>
+            <w:pPr>
+              <w:jc w:val="center"/>
+            </w:pPr>
+            <w:r/>
+            <w:r>
+              <w:rPr>
+                <w:rFonts w:ascii="Times New Roman" w:hAnsi="Times New Roman"/>
+                <w:sz w:val="18"/>
+              </w:rPr>
+              <w:t>95%</w:t>
+            </w:r>
+          </w:p>
+        </w:tc>
+        <w:tc>
+          <w:tcPr>
+            <w:tcW w:type="dxa" w:w="1881"/>
+            <w:tcBorders>
+              <w:top w:val="single" w:sz="6" w:color="000000"/>
+              <w:bottom w:val="single" w:sz="6" w:color="000000"/>
+              <w:left w:val="nil" w:sz="6" w:color="000000"/>
+              <w:right w:val="nil" w:sz="6" w:color="000000"/>
+            </w:tcBorders>
+          </w:tcPr>
+          <w:p>
+            <w:pPr>
+              <w:jc w:val="center"/>
+            </w:pPr>
+            <w:r/>
+            <w:r>
+              <w:rPr>
+                <w:rFonts w:ascii="Times New Roman" w:hAnsi="Times New Roman"/>
+                <w:sz w:val="18"/>
+              </w:rPr>
+              <w:t>5%</w:t>
+            </w:r>
+          </w:p>
+        </w:tc>
+        <w:tc>
+          <w:tcPr>
+            <w:tcW w:type="dxa" w:w="1881"/>
+            <w:tcBorders>
+              <w:top w:val="single" w:sz="6" w:color="000000"/>
+              <w:bottom w:val="single" w:sz="6" w:color="000000"/>
+              <w:left w:val="nil" w:sz="6" w:color="000000"/>
+              <w:right w:val="nil" w:sz="6" w:color="000000"/>
+            </w:tcBorders>
+          </w:tcPr>
+          <w:p>
+            <w:pPr>
+              <w:jc w:val="center"/>
+            </w:pPr>
+            <w:r/>
+            <w:r>
+              <w:rPr>
+                <w:rFonts w:ascii="Times New Roman" w:hAnsi="Times New Roman"/>
+                <w:sz w:val="18"/>
+              </w:rPr>
+              <w:t>18,1</w:t>
+            </w:r>
+          </w:p>
+        </w:tc>
+        <w:tc>
+          <w:tcPr>
+            <w:tcW w:type="dxa" w:w="1881"/>
+            <w:tcBorders>
+              <w:top w:val="single" w:sz="6" w:color="000000"/>
+              <w:bottom w:val="single" w:sz="6" w:color="000000"/>
+              <w:left w:val="nil" w:sz="6" w:color="000000"/>
+              <w:right w:val="nil" w:sz="6" w:color="000000"/>
+            </w:tcBorders>
+          </w:tcPr>
+          <w:p>
+            <w:pPr>
+              <w:jc w:val="center"/>
+            </w:pPr>
+            <w:r/>
+            <w:r>
+              <w:rPr>
+                <w:rFonts w:ascii="Times New Roman" w:hAnsi="Times New Roman"/>
+                <w:sz w:val="18"/>
+              </w:rPr>
+              <w:t>+12,6</w:t>
+            </w:r>
+          </w:p>
+        </w:tc>
+      </w:tr>
+      <w:tr>
+        <w:tc>
+          <w:tcPr>
+            <w:tcW w:type="dxa" w:w="1881"/>
+            <w:tcBorders>
+              <w:top w:val="single" w:sz="6" w:color="000000"/>
+              <w:bottom w:val="single" w:sz="6" w:color="000000"/>
+              <w:left w:val="nil" w:sz="6" w:color="000000"/>
+              <w:right w:val="nil" w:sz="6" w:color="000000"/>
+            </w:tcBorders>
+          </w:tcPr>
+          <w:p>
+            <w:pPr>
+              <w:jc w:val="left"/>
+            </w:pPr>
+            <w:r/>
+            <w:r>
+              <w:rPr>
+                <w:rFonts w:ascii="Times New Roman" w:hAnsi="Times New Roman"/>
+                <w:sz w:val="18"/>
+              </w:rPr>
+              <w:t>Confusão</w:t>
+            </w:r>
+          </w:p>
+        </w:tc>
+        <w:tc>
+          <w:tcPr>
+            <w:tcW w:type="dxa" w:w="1881"/>
+            <w:tcBorders>
+              <w:top w:val="single" w:sz="6" w:color="000000"/>
+              <w:bottom w:val="single" w:sz="6" w:color="000000"/>
+              <w:left w:val="nil" w:sz="6" w:color="000000"/>
+              <w:right w:val="nil" w:sz="6" w:color="000000"/>
+            </w:tcBorders>
+          </w:tcPr>
+          <w:p>
+            <w:pPr>
+              <w:jc w:val="center"/>
+            </w:pPr>
+            <w:r/>
+            <w:r>
+              <w:rPr>
+                <w:rFonts w:ascii="Times New Roman" w:hAnsi="Times New Roman"/>
+                <w:sz w:val="18"/>
+              </w:rPr>
+              <w:t>85%</w:t>
+            </w:r>
+          </w:p>
+        </w:tc>
+        <w:tc>
+          <w:tcPr>
+            <w:tcW w:type="dxa" w:w="1881"/>
+            <w:tcBorders>
+              <w:top w:val="single" w:sz="6" w:color="000000"/>
+              <w:bottom w:val="single" w:sz="6" w:color="000000"/>
+              <w:left w:val="nil" w:sz="6" w:color="000000"/>
+              <w:right w:val="nil" w:sz="6" w:color="000000"/>
+            </w:tcBorders>
+          </w:tcPr>
+          <w:p>
+            <w:pPr>
+              <w:jc w:val="center"/>
+            </w:pPr>
+            <w:r/>
+            <w:r>
+              <w:rPr>
+                <w:rFonts w:ascii="Times New Roman" w:hAnsi="Times New Roman"/>
+                <w:sz w:val="18"/>
+              </w:rPr>
+              <w:t>15%</w:t>
+            </w:r>
+          </w:p>
+        </w:tc>
+        <w:tc>
+          <w:tcPr>
+            <w:tcW w:type="dxa" w:w="1881"/>
+            <w:tcBorders>
+              <w:top w:val="single" w:sz="6" w:color="000000"/>
+              <w:bottom w:val="single" w:sz="6" w:color="000000"/>
+              <w:left w:val="nil" w:sz="6" w:color="000000"/>
+              <w:right w:val="nil" w:sz="6" w:color="000000"/>
+            </w:tcBorders>
+          </w:tcPr>
+          <w:p>
+            <w:pPr>
+              <w:jc w:val="center"/>
+            </w:pPr>
+            <w:r/>
+            <w:r>
+              <w:rPr>
+                <w:rFonts w:ascii="Times New Roman" w:hAnsi="Times New Roman"/>
+                <w:sz w:val="18"/>
+              </w:rPr>
+              <w:t>5,6</w:t>
+            </w:r>
+          </w:p>
+        </w:tc>
+        <w:tc>
+          <w:tcPr>
+            <w:tcW w:type="dxa" w:w="1881"/>
+            <w:tcBorders>
+              <w:top w:val="single" w:sz="6" w:color="000000"/>
+              <w:bottom w:val="single" w:sz="6" w:color="000000"/>
+              <w:left w:val="nil" w:sz="6" w:color="000000"/>
+              <w:right w:val="nil" w:sz="6" w:color="000000"/>
+            </w:tcBorders>
+          </w:tcPr>
+          <w:p>
+            <w:pPr>
+              <w:jc w:val="center"/>
+            </w:pPr>
+            <w:r/>
+            <w:r>
+              <w:rPr>
+                <w:rFonts w:ascii="Times New Roman" w:hAnsi="Times New Roman"/>
+                <w:sz w:val="18"/>
+              </w:rPr>
+              <w:t>+7,4</w:t>
+            </w:r>
+          </w:p>
+        </w:tc>
+      </w:tr>
+      <w:tr>
+        <w:tc>
+          <w:tcPr>
+            <w:tcW w:type="dxa" w:w="1881"/>
+            <w:tcBorders>
+              <w:top w:val="single" w:sz="6" w:color="000000"/>
+              <w:bottom w:val="single" w:sz="6" w:color="000000"/>
+              <w:left w:val="nil" w:sz="6" w:color="000000"/>
+              <w:right w:val="nil" w:sz="6" w:color="000000"/>
+            </w:tcBorders>
+          </w:tcPr>
+          <w:p>
+            <w:pPr>
+              <w:jc w:val="left"/>
+            </w:pPr>
+            <w:r/>
+            <w:r>
+              <w:rPr>
+                <w:rFonts w:ascii="Times New Roman" w:hAnsi="Times New Roman"/>
+                <w:sz w:val="18"/>
+              </w:rPr>
+              <w:t>PTH</w:t>
+            </w:r>
+          </w:p>
+        </w:tc>
+        <w:tc>
+          <w:tcPr>
+            <w:tcW w:type="dxa" w:w="1881"/>
+            <w:tcBorders>
+              <w:top w:val="single" w:sz="6" w:color="000000"/>
+              <w:bottom w:val="single" w:sz="6" w:color="000000"/>
+              <w:left w:val="nil" w:sz="6" w:color="000000"/>
+              <w:right w:val="nil" w:sz="6" w:color="000000"/>
+            </w:tcBorders>
+          </w:tcPr>
+          <w:p>
+            <w:pPr>
+              <w:jc w:val="center"/>
+            </w:pPr>
+            <w:r/>
+            <w:r>
+              <w:rPr>
+                <w:rFonts w:ascii="Times New Roman" w:hAnsi="Times New Roman"/>
+                <w:sz w:val="18"/>
+              </w:rPr>
+              <w:t>80%</w:t>
+            </w:r>
+          </w:p>
+        </w:tc>
+        <w:tc>
+          <w:tcPr>
+            <w:tcW w:type="dxa" w:w="1881"/>
+            <w:tcBorders>
+              <w:top w:val="single" w:sz="6" w:color="000000"/>
+              <w:bottom w:val="single" w:sz="6" w:color="000000"/>
+              <w:left w:val="nil" w:sz="6" w:color="000000"/>
+              <w:right w:val="nil" w:sz="6" w:color="000000"/>
+            </w:tcBorders>
+          </w:tcPr>
+          <w:p>
+            <w:pPr>
+              <w:jc w:val="center"/>
+            </w:pPr>
+            <w:r/>
+            <w:r>
+              <w:rPr>
+                <w:rFonts w:ascii="Times New Roman" w:hAnsi="Times New Roman"/>
+                <w:sz w:val="18"/>
+              </w:rPr>
+              <w:t>20%</w:t>
+            </w:r>
+          </w:p>
+        </w:tc>
+        <w:tc>
+          <w:tcPr>
+            <w:tcW w:type="dxa" w:w="1881"/>
+            <w:tcBorders>
+              <w:top w:val="single" w:sz="6" w:color="000000"/>
+              <w:bottom w:val="single" w:sz="6" w:color="000000"/>
+              <w:left w:val="nil" w:sz="6" w:color="000000"/>
+              <w:right w:val="nil" w:sz="6" w:color="000000"/>
+            </w:tcBorders>
+          </w:tcPr>
+          <w:p>
+            <w:pPr>
+              <w:jc w:val="center"/>
+            </w:pPr>
+            <w:r/>
+            <w:r>
+              <w:rPr>
+                <w:rFonts w:ascii="Times New Roman" w:hAnsi="Times New Roman"/>
+                <w:sz w:val="18"/>
+              </w:rPr>
+              <w:t>4,0</w:t>
+            </w:r>
+          </w:p>
+        </w:tc>
+        <w:tc>
+          <w:tcPr>
+            <w:tcW w:type="dxa" w:w="1881"/>
+            <w:tcBorders>
+              <w:top w:val="single" w:sz="6" w:color="000000"/>
+              <w:bottom w:val="single" w:sz="6" w:color="000000"/>
+              <w:left w:val="nil" w:sz="6" w:color="000000"/>
+              <w:right w:val="nil" w:sz="6" w:color="000000"/>
+            </w:tcBorders>
+          </w:tcPr>
+          <w:p>
+            <w:pPr>
+              <w:jc w:val="center"/>
+            </w:pPr>
+            <w:r/>
+            <w:r>
+              <w:rPr>
+                <w:rFonts w:ascii="Times New Roman" w:hAnsi="Times New Roman"/>
+                <w:sz w:val="18"/>
+              </w:rPr>
+              <w:t>+6,1</w:t>
+            </w:r>
+          </w:p>
+        </w:tc>
+      </w:tr>
+    </w:tbl>
+    <w:p>
+      <w:pPr>
+        <w:spacing w:after="0"/>
+      </w:pPr>
+      <w:r>
+        <w:rPr>
+          <w:i/>
+          <w:sz w:val="17"/>
+        </w:rPr>
+        <w:t>Sinal = componente suave (polinômio ajustado); ruído = resíduo em torno do sinal. SNR = variância do sinal / variância do ruído.</w:t>
+      </w:r>
+    </w:p>
+    <w:p>
+      <w:pPr>
+        <w:spacing w:after="120"/>
+      </w:pPr>
+      <w:r>
+        <w:rPr>
+          <w:sz w:val="18"/>
+        </w:rPr>
+        <w:t>Fonte: dados da pesquisa (2026).</w:t>
+      </w:r>
+    </w:p>
+    <w:p>
+      <w:pPr>
+        <w:spacing w:before="120"/>
+        <w:jc w:val="center"/>
+      </w:pPr>
+      <w:r>
+        <w:drawing>
+          <wp:inline xmlns:a="http://schemas.openxmlformats.org/drawingml/2006/main" xmlns:pic="http://schemas.openxmlformats.org/drawingml/2006/picture">
+            <wp:extent cx="5400000" cy="2121429"/>
+            <wp:docPr id="16" name="Picture 16"/>
+            <wp:cNvGraphicFramePr>
+              <a:graphicFrameLocks noChangeAspect="1"/>
+            </wp:cNvGraphicFramePr>
+            <a:graphic>
+              <a:graphicData uri="http://schemas.openxmlformats.org/drawingml/2006/picture">
+                <pic:pic>
+                  <pic:nvPicPr>
+                    <pic:cNvPr id="0" name="smooth_signal.png"/>
+                    <pic:cNvPicPr/>
+                  </pic:nvPicPr>
+                  <pic:blipFill>
+                    <a:blip r:embed="rId24"/>
+                    <a:stretch>
+                      <a:fillRect/>
+                    </a:stretch>
+                  </pic:blipFill>
+                  <pic:spPr>
+                    <a:xfrm>
+                      <a:off x="0" y="0"/>
+                      <a:ext cx="5400000" cy="2121429"/>
+                    </a:xfrm>
+                    <a:prstGeom prst="rect"/>
+                  </pic:spPr>
+                </pic:pic>
+              </a:graphicData>
+            </a:graphic>
+          </wp:inline>
+        </w:drawing>
+      </w:r>
+    </w:p>
+    <w:p>
+      <w:pPr>
+        <w:jc w:val="center"/>
+      </w:pPr>
+      <w:r>
+        <w:rPr>
+          <w:sz w:val="22"/>
+        </w:rPr>
+        <w:t>Figura 16 – Trajetórias diárias suavizadas: sinal (curva) sobreposto às médias diárias observadas (pontos), separando a tendência do ruído. A) eixo energia–fadiga; B) subescalas negativas.</w:t>
+      </w:r>
+    </w:p>
+    <w:p>
+      <w:pPr>
+        <w:spacing w:after="120"/>
+        <w:jc w:val="center"/>
+      </w:pPr>
+      <w:r>
+        <w:rPr>
+          <w:sz w:val="18"/>
+        </w:rPr>
+        <w:t>Fonte: elaboração dos autores (2026).</w:t>
+      </w:r>
+    </w:p>
+    <w:p>
+      <w:pPr>
+        <w:spacing w:line="360" w:lineRule="auto" w:after="120"/>
+        <w:ind w:firstLine="709"/>
+        <w:jc w:val="both"/>
+      </w:pPr>
+      <w:r>
+        <w:rPr>
+          <w:b w:val="0"/>
+          <w:sz w:val="24"/>
+        </w:rPr>
+        <w:t>Para separar a tendência sistemática (sinal) do ruído de amostragem e obter uma leitura visual mais limpa, cada trajetória diária foi decomposta em uma componente suave — a função polinomial ajustada — e um resíduo (Tabela 18; Figura 16). A suavização é altamente informativa no eixo energia–fadiga: o vigor e a fadiga são quase inteiramente sinal (96% e 95% da variância; razão sinal-ruído de 25,1 e 18,1, ou +14,0 e +12,6 dB), de modo que suas curvas suavizadas revelam com nitidez o cruzamento energia–fadiga em torno da metade da semana. Nas dimensões negativas, próximas do piso, a fração de ruído é muito maior — na depressão, o ruído (58%) supera o sinal (42%; SNR = 0,7), o que explica por que suas oscilações diárias não devem ser sobreinterpretadas. Em termos aplicados, a decomposição indica que o monitoramento deve priorizar o vigor e a fadiga, cujo sinal é robusto, e tratar as pequenas variações das dimensões negativas com a devida cautela.</w:t>
       </w:r>
     </w:p>
     <w:p>

</xml_diff>

<commit_message>
Modelagem por atleta, curva de 13 pontos e auditoria de robustez
- 3.15 Modelagem individual: taxa por atleta (vigor -0,48/dia, 78% esperado;
  24/27 com >=4 dias; 19/27 com 7 dias) + figura spaghetti.
- 3.16 Alta resolução: curva de 13 pontos (baseline + pré/pós), dinâmica
  intradiária + figura.
- 3.17 Auditoria de robustez: após filtrar 11 outliers (Mahalanobis, 3,8%),
  nada muda (vigor dz -1,33->-1,32; MANOVA Wilks 0,181->0,180). Conclusões
  robustas ao ruído.

Scripts compute_audit/compute_indiv/indiv_figs/pts13_figs adicionados;
reprodução 01 (blocos 15-16) atualizada. PDF (30 páginas); leak-scan: 0.

Co-Authored-By: Claude Opus 4.8 <noreply@anthropic.com>
Claude-Session: https://claude.ai/code/session_01P7yGiDeoGDyjWvPWQVsUrj
</commit_message>
<xml_diff>
--- a/Artigos/Artigo_humor_HANDEBOL.docx
+++ b/Artigos/Artigo_humor_HANDEBOL.docx
@@ -18533,6 +18533,777 @@
           <w:sz w:val="24"/>
         </w:rPr>
         <w:t>Para separar a tendência sistemática (sinal) do ruído de amostragem e obter uma leitura visual mais limpa, cada trajetória diária foi decomposta em uma componente suave — a função polinomial ajustada — e um resíduo (Tabela 18; Figura 16). A suavização é altamente informativa no eixo energia–fadiga: o vigor e a fadiga são quase inteiramente sinal (96% e 95% da variância; razão sinal-ruído de 25,1 e 18,1, ou +14,0 e +12,6 dB), de modo que suas curvas suavizadas revelam com nitidez o cruzamento energia–fadiga em torno da metade da semana. Nas dimensões negativas, próximas do piso, a fração de ruído é muito maior — na depressão, o ruído (58%) supera o sinal (42%; SNR = 0,7), o que explica por que suas oscilações diárias não devem ser sobreinterpretadas. Em termos aplicados, a decomposição indica que o monitoramento deve priorizar o vigor e a fadiga, cujo sinal é robusto, e tratar as pequenas variações das dimensões negativas com a devida cautela.</w:t>
+      </w:r>
+    </w:p>
+    <w:p>
+      <w:pPr>
+        <w:spacing w:before="120" w:after="80" w:line="360" w:lineRule="auto"/>
+      </w:pPr>
+      <w:r>
+        <w:rPr>
+          <w:b/>
+          <w:sz w:val="24"/>
+        </w:rPr>
+        <w:t>3.15 Modelagem individual: trajetórias por atleta</w:t>
+      </w:r>
+    </w:p>
+    <w:p>
+      <w:pPr>
+        <w:spacing w:before="120"/>
+        <w:jc w:val="center"/>
+      </w:pPr>
+      <w:r>
+        <w:drawing>
+          <wp:inline xmlns:a="http://schemas.openxmlformats.org/drawingml/2006/main" xmlns:pic="http://schemas.openxmlformats.org/drawingml/2006/picture">
+            <wp:extent cx="5400000" cy="2121429"/>
+            <wp:docPr id="17" name="Picture 17"/>
+            <wp:cNvGraphicFramePr>
+              <a:graphicFrameLocks noChangeAspect="1"/>
+            </wp:cNvGraphicFramePr>
+            <a:graphic>
+              <a:graphicData uri="http://schemas.openxmlformats.org/drawingml/2006/picture">
+                <pic:pic>
+                  <pic:nvPicPr>
+                    <pic:cNvPr id="0" name="indiv_spaghetti.png"/>
+                    <pic:cNvPicPr/>
+                  </pic:nvPicPr>
+                  <pic:blipFill>
+                    <a:blip r:embed="rId25"/>
+                    <a:stretch>
+                      <a:fillRect/>
+                    </a:stretch>
+                  </pic:blipFill>
+                  <pic:spPr>
+                    <a:xfrm>
+                      <a:off x="0" y="0"/>
+                      <a:ext cx="5400000" cy="2121429"/>
+                    </a:xfrm>
+                    <a:prstGeom prst="rect"/>
+                  </pic:spPr>
+                </pic:pic>
+              </a:graphicData>
+            </a:graphic>
+          </wp:inline>
+        </w:drawing>
+      </w:r>
+    </w:p>
+    <w:p>
+      <w:pPr>
+        <w:jc w:val="center"/>
+      </w:pPr>
+      <w:r>
+        <w:rPr>
+          <w:sz w:val="22"/>
+        </w:rPr>
+        <w:t>Figura 17 – Trajetórias individuais de vigor e fadiga por atleta (linhas finas) e a média do grupo (linha grossa), evidenciando a heterogeneidade da resposta.</w:t>
+      </w:r>
+    </w:p>
+    <w:p>
+      <w:pPr>
+        <w:spacing w:after="120"/>
+        <w:jc w:val="center"/>
+      </w:pPr>
+      <w:r>
+        <w:rPr>
+          <w:sz w:val="18"/>
+        </w:rPr>
+        <w:t>Fonte: elaboração dos autores (2026).</w:t>
+      </w:r>
+    </w:p>
+    <w:p>
+      <w:pPr>
+        <w:spacing w:line="360" w:lineRule="auto" w:after="120"/>
+        <w:ind w:firstLine="709"/>
+        <w:jc w:val="both"/>
+      </w:pPr>
+      <w:r>
+        <w:rPr>
+          <w:b w:val="0"/>
+          <w:sz w:val="24"/>
+        </w:rPr>
+        <w:t>Além da tendência do grupo, a resposta foi modelada por atleta, ajustando-se a cada participante a sua própria trajetória ao longo da semana (Figura 17). A cobertura permitiu a modelagem individual: 19 dos 27 atletas responderam nos sete dias e 24 têm dados suficientes (≥ 4 dias) para um ajuste polinomial individual; para todos foi possível estimar a taxa de variação individual. Em média, o vigor caiu -0,48 ponto/dia (DP 0,52) e a fadiga subiu +0,39 ponto/dia (DP 0,67), mas com nítida heterogeneidade entre atletas: 78% apresentaram a queda esperada de vigor e 78% o aumento esperado de fadiga, enquanto os demais mantiveram-se estáveis ou responderam na direção oposta. Essa dispersão das inclinações individuais mostra que a média do grupo convive com respondedores e não respondedores, reforçando o valor do monitoramento individualizado — a mesma carga produz trajetórias afetivas distintas.</w:t>
+      </w:r>
+    </w:p>
+    <w:p>
+      <w:pPr>
+        <w:spacing w:before="120" w:after="80" w:line="360" w:lineRule="auto"/>
+      </w:pPr>
+      <w:r>
+        <w:rPr>
+          <w:b/>
+          <w:sz w:val="24"/>
+        </w:rPr>
+        <w:t>3.16 Trajetória em alta resolução: 13 pontos pré/pós</w:t>
+      </w:r>
+    </w:p>
+    <w:p>
+      <w:pPr>
+        <w:spacing w:before="120"/>
+        <w:jc w:val="center"/>
+      </w:pPr>
+      <w:r>
+        <w:drawing>
+          <wp:inline xmlns:a="http://schemas.openxmlformats.org/drawingml/2006/main" xmlns:pic="http://schemas.openxmlformats.org/drawingml/2006/picture">
+            <wp:extent cx="5580000" cy="2291786"/>
+            <wp:docPr id="18" name="Picture 18"/>
+            <wp:cNvGraphicFramePr>
+              <a:graphicFrameLocks noChangeAspect="1"/>
+            </wp:cNvGraphicFramePr>
+            <a:graphic>
+              <a:graphicData uri="http://schemas.openxmlformats.org/drawingml/2006/picture">
+                <pic:pic>
+                  <pic:nvPicPr>
+                    <pic:cNvPr id="0" name="pts13_curve.png"/>
+                    <pic:cNvPicPr/>
+                  </pic:nvPicPr>
+                  <pic:blipFill>
+                    <a:blip r:embed="rId26"/>
+                    <a:stretch>
+                      <a:fillRect/>
+                    </a:stretch>
+                  </pic:blipFill>
+                  <pic:spPr>
+                    <a:xfrm>
+                      <a:off x="0" y="0"/>
+                      <a:ext cx="5580000" cy="2291786"/>
+                    </a:xfrm>
+                    <a:prstGeom prst="rect"/>
+                  </pic:spPr>
+                </pic:pic>
+              </a:graphicData>
+            </a:graphic>
+          </wp:inline>
+        </w:drawing>
+      </w:r>
+    </w:p>
+    <w:p>
+      <w:pPr>
+        <w:jc w:val="center"/>
+      </w:pPr>
+      <w:r>
+        <w:rPr>
+          <w:sz w:val="22"/>
+        </w:rPr>
+        <w:t>Figura 18 – Trajetória do grupo em 13 pontos temporais (baseline + pré e pós-treino de cada dia), revelando a dinâmica intradiária além da média diária.</w:t>
+      </w:r>
+    </w:p>
+    <w:p>
+      <w:pPr>
+        <w:spacing w:after="120"/>
+        <w:jc w:val="center"/>
+      </w:pPr>
+      <w:r>
+        <w:rPr>
+          <w:sz w:val="18"/>
+        </w:rPr>
+        <w:t>Fonte: elaboração dos autores (2026).</w:t>
+      </w:r>
+    </w:p>
+    <w:p>
+      <w:pPr>
+        <w:spacing w:line="360" w:lineRule="auto" w:after="120"/>
+        <w:ind w:firstLine="709"/>
+        <w:jc w:val="both"/>
+      </w:pPr>
+      <w:r>
+        <w:rPr>
+          <w:b w:val="0"/>
+          <w:sz w:val="24"/>
+        </w:rPr>
+        <w:t>Aproveitando as duas coletas diárias dos dias de treino, a trajetória do grupo foi reconstruída em alta resolução, com 13 pontos temporais — a linha de base e os momentos pré e pós de cada um dos seis dias de treino (Figura %d). Essa resolução revela a dinâmica intradiária que a média diária mascara: em cada dia de treino, o vigor tende a cair e a fadiga (e a PTH) a subir do pré para o pós, com recuperação parcial na manhã seguinte — um padrão de dente de serra sobreposto à tendência semanal de queda de energia e acúmulo de fadiga. A leitura de alta resolução, portanto, confirma que a deterioração semanal resulta da soma de perturbações agudas incompletamente revertidas entre as sessões.</w:t>
+      </w:r>
+    </w:p>
+    <w:p>
+      <w:pPr>
+        <w:spacing w:before="120" w:after="80" w:line="360" w:lineRule="auto"/>
+      </w:pPr>
+      <w:r>
+        <w:rPr>
+          <w:b/>
+          <w:sz w:val="24"/>
+        </w:rPr>
+        <w:t>3.17 Auditoria de robustez: filtragem de sinal e ruído</w:t>
+      </w:r>
+    </w:p>
+    <w:p>
+      <w:pPr>
+        <w:spacing w:before="160" w:after="40"/>
+      </w:pPr>
+      <w:r>
+        <w:rPr>
+          <w:sz w:val="22"/>
+        </w:rPr>
+        <w:t>Tabela 19 – Auditoria de robustez: principais resultados antes e depois da remoção de 11 observações atípicas (3.8% do total) por distância de Mahalanobis.</w:t>
+      </w:r>
+    </w:p>
+    <w:tbl>
+      <w:tblPr>
+        <w:tblW w:type="auto" w:w="0"/>
+        <w:jc w:val="center"/>
+        <w:tblLook w:firstColumn="1" w:firstRow="1" w:lastColumn="0" w:lastRow="0" w:noHBand="0" w:noVBand="1" w:val="04A0"/>
+      </w:tblPr>
+      <w:tblGrid>
+        <w:gridCol w:w="3135"/>
+        <w:gridCol w:w="3135"/>
+        <w:gridCol w:w="3135"/>
+      </w:tblGrid>
+      <w:tr>
+        <w:tc>
+          <w:tcPr>
+            <w:tcW w:type="dxa" w:w="3135"/>
+            <w:tcBorders>
+              <w:top w:val="single" w:sz="6" w:color="000000"/>
+              <w:bottom w:val="single" w:sz="6" w:color="000000"/>
+              <w:left w:val="nil" w:sz="6" w:color="000000"/>
+              <w:right w:val="nil" w:sz="6" w:color="000000"/>
+            </w:tcBorders>
+          </w:tcPr>
+          <w:p>
+            <w:pPr>
+              <w:jc w:val="center"/>
+            </w:pPr>
+            <w:r/>
+            <w:r>
+              <w:rPr>
+                <w:rFonts w:ascii="Times New Roman" w:hAnsi="Times New Roman"/>
+                <w:b/>
+                <w:sz w:val="18"/>
+              </w:rPr>
+              <w:t>Métrica</w:t>
+            </w:r>
+          </w:p>
+        </w:tc>
+        <w:tc>
+          <w:tcPr>
+            <w:tcW w:type="dxa" w:w="3135"/>
+            <w:tcBorders>
+              <w:top w:val="single" w:sz="6" w:color="000000"/>
+              <w:bottom w:val="single" w:sz="6" w:color="000000"/>
+              <w:left w:val="nil" w:sz="6" w:color="000000"/>
+              <w:right w:val="nil" w:sz="6" w:color="000000"/>
+            </w:tcBorders>
+          </w:tcPr>
+          <w:p>
+            <w:pPr>
+              <w:jc w:val="center"/>
+            </w:pPr>
+            <w:r/>
+            <w:r>
+              <w:rPr>
+                <w:rFonts w:ascii="Times New Roman" w:hAnsi="Times New Roman"/>
+                <w:b/>
+                <w:sz w:val="18"/>
+              </w:rPr>
+              <w:t>Dados brutos</w:t>
+            </w:r>
+          </w:p>
+        </w:tc>
+        <w:tc>
+          <w:tcPr>
+            <w:tcW w:type="dxa" w:w="3135"/>
+            <w:tcBorders>
+              <w:top w:val="single" w:sz="6" w:color="000000"/>
+              <w:bottom w:val="single" w:sz="6" w:color="000000"/>
+              <w:left w:val="nil" w:sz="6" w:color="000000"/>
+              <w:right w:val="nil" w:sz="6" w:color="000000"/>
+            </w:tcBorders>
+          </w:tcPr>
+          <w:p>
+            <w:pPr>
+              <w:jc w:val="center"/>
+            </w:pPr>
+            <w:r/>
+            <w:r>
+              <w:rPr>
+                <w:rFonts w:ascii="Times New Roman" w:hAnsi="Times New Roman"/>
+                <w:b/>
+                <w:sz w:val="18"/>
+              </w:rPr>
+              <w:t>Dados filtrados</w:t>
+            </w:r>
+          </w:p>
+        </w:tc>
+      </w:tr>
+      <w:tr>
+        <w:tc>
+          <w:tcPr>
+            <w:tcW w:type="dxa" w:w="3135"/>
+            <w:tcBorders>
+              <w:top w:val="single" w:sz="6" w:color="000000"/>
+              <w:bottom w:val="single" w:sz="6" w:color="000000"/>
+              <w:left w:val="nil" w:sz="6" w:color="000000"/>
+              <w:right w:val="nil" w:sz="6" w:color="000000"/>
+            </w:tcBorders>
+          </w:tcPr>
+          <w:p>
+            <w:pPr>
+              <w:jc w:val="left"/>
+            </w:pPr>
+            <w:r/>
+            <w:r>
+              <w:rPr>
+                <w:rFonts w:ascii="Times New Roman" w:hAnsi="Times New Roman"/>
+                <w:sz w:val="18"/>
+              </w:rPr>
+              <w:t>Vigor D1→D7 (dz)</w:t>
+            </w:r>
+          </w:p>
+        </w:tc>
+        <w:tc>
+          <w:tcPr>
+            <w:tcW w:type="dxa" w:w="3135"/>
+            <w:tcBorders>
+              <w:top w:val="single" w:sz="6" w:color="000000"/>
+              <w:bottom w:val="single" w:sz="6" w:color="000000"/>
+              <w:left w:val="nil" w:sz="6" w:color="000000"/>
+              <w:right w:val="nil" w:sz="6" w:color="000000"/>
+            </w:tcBorders>
+          </w:tcPr>
+          <w:p>
+            <w:pPr>
+              <w:jc w:val="center"/>
+            </w:pPr>
+            <w:r/>
+            <w:r>
+              <w:rPr>
+                <w:rFonts w:ascii="Times New Roman" w:hAnsi="Times New Roman"/>
+                <w:sz w:val="18"/>
+              </w:rPr>
+              <w:t>-1,33</w:t>
+            </w:r>
+          </w:p>
+        </w:tc>
+        <w:tc>
+          <w:tcPr>
+            <w:tcW w:type="dxa" w:w="3135"/>
+            <w:tcBorders>
+              <w:top w:val="single" w:sz="6" w:color="000000"/>
+              <w:bottom w:val="single" w:sz="6" w:color="000000"/>
+              <w:left w:val="nil" w:sz="6" w:color="000000"/>
+              <w:right w:val="nil" w:sz="6" w:color="000000"/>
+            </w:tcBorders>
+          </w:tcPr>
+          <w:p>
+            <w:pPr>
+              <w:jc w:val="center"/>
+            </w:pPr>
+            <w:r/>
+            <w:r>
+              <w:rPr>
+                <w:rFonts w:ascii="Times New Roman" w:hAnsi="Times New Roman"/>
+                <w:sz w:val="18"/>
+              </w:rPr>
+              <w:t>-1,32</w:t>
+            </w:r>
+          </w:p>
+        </w:tc>
+      </w:tr>
+      <w:tr>
+        <w:tc>
+          <w:tcPr>
+            <w:tcW w:type="dxa" w:w="3135"/>
+            <w:tcBorders>
+              <w:top w:val="single" w:sz="6" w:color="000000"/>
+              <w:bottom w:val="single" w:sz="6" w:color="000000"/>
+              <w:left w:val="nil" w:sz="6" w:color="000000"/>
+              <w:right w:val="nil" w:sz="6" w:color="000000"/>
+            </w:tcBorders>
+          </w:tcPr>
+          <w:p>
+            <w:pPr>
+              <w:jc w:val="left"/>
+            </w:pPr>
+            <w:r/>
+            <w:r>
+              <w:rPr>
+                <w:rFonts w:ascii="Times New Roman" w:hAnsi="Times New Roman"/>
+                <w:sz w:val="18"/>
+              </w:rPr>
+              <w:t>Fadiga D1→D7 (dz)</w:t>
+            </w:r>
+          </w:p>
+        </w:tc>
+        <w:tc>
+          <w:tcPr>
+            <w:tcW w:type="dxa" w:w="3135"/>
+            <w:tcBorders>
+              <w:top w:val="single" w:sz="6" w:color="000000"/>
+              <w:bottom w:val="single" w:sz="6" w:color="000000"/>
+              <w:left w:val="nil" w:sz="6" w:color="000000"/>
+              <w:right w:val="nil" w:sz="6" w:color="000000"/>
+            </w:tcBorders>
+          </w:tcPr>
+          <w:p>
+            <w:pPr>
+              <w:jc w:val="center"/>
+            </w:pPr>
+            <w:r/>
+            <w:r>
+              <w:rPr>
+                <w:rFonts w:ascii="Times New Roman" w:hAnsi="Times New Roman"/>
+                <w:sz w:val="18"/>
+              </w:rPr>
+              <w:t>+0,78</w:t>
+            </w:r>
+          </w:p>
+        </w:tc>
+        <w:tc>
+          <w:tcPr>
+            <w:tcW w:type="dxa" w:w="3135"/>
+            <w:tcBorders>
+              <w:top w:val="single" w:sz="6" w:color="000000"/>
+              <w:bottom w:val="single" w:sz="6" w:color="000000"/>
+              <w:left w:val="nil" w:sz="6" w:color="000000"/>
+              <w:right w:val="nil" w:sz="6" w:color="000000"/>
+            </w:tcBorders>
+          </w:tcPr>
+          <w:p>
+            <w:pPr>
+              <w:jc w:val="center"/>
+            </w:pPr>
+            <w:r/>
+            <w:r>
+              <w:rPr>
+                <w:rFonts w:ascii="Times New Roman" w:hAnsi="Times New Roman"/>
+                <w:sz w:val="18"/>
+              </w:rPr>
+              <w:t>+0,73</w:t>
+            </w:r>
+          </w:p>
+        </w:tc>
+      </w:tr>
+      <w:tr>
+        <w:tc>
+          <w:tcPr>
+            <w:tcW w:type="dxa" w:w="3135"/>
+            <w:tcBorders>
+              <w:top w:val="single" w:sz="6" w:color="000000"/>
+              <w:bottom w:val="single" w:sz="6" w:color="000000"/>
+              <w:left w:val="nil" w:sz="6" w:color="000000"/>
+              <w:right w:val="nil" w:sz="6" w:color="000000"/>
+            </w:tcBorders>
+          </w:tcPr>
+          <w:p>
+            <w:pPr>
+              <w:jc w:val="left"/>
+            </w:pPr>
+            <w:r/>
+            <w:r>
+              <w:rPr>
+                <w:rFonts w:ascii="Times New Roman" w:hAnsi="Times New Roman"/>
+                <w:sz w:val="18"/>
+              </w:rPr>
+              <w:t>MANOVA (Wilks λ)</w:t>
+            </w:r>
+          </w:p>
+        </w:tc>
+        <w:tc>
+          <w:tcPr>
+            <w:tcW w:type="dxa" w:w="3135"/>
+            <w:tcBorders>
+              <w:top w:val="single" w:sz="6" w:color="000000"/>
+              <w:bottom w:val="single" w:sz="6" w:color="000000"/>
+              <w:left w:val="nil" w:sz="6" w:color="000000"/>
+              <w:right w:val="nil" w:sz="6" w:color="000000"/>
+            </w:tcBorders>
+          </w:tcPr>
+          <w:p>
+            <w:pPr>
+              <w:jc w:val="center"/>
+            </w:pPr>
+            <w:r/>
+            <w:r>
+              <w:rPr>
+                <w:rFonts w:ascii="Times New Roman" w:hAnsi="Times New Roman"/>
+                <w:sz w:val="18"/>
+              </w:rPr>
+              <w:t>0,181</w:t>
+            </w:r>
+          </w:p>
+        </w:tc>
+        <w:tc>
+          <w:tcPr>
+            <w:tcW w:type="dxa" w:w="3135"/>
+            <w:tcBorders>
+              <w:top w:val="single" w:sz="6" w:color="000000"/>
+              <w:bottom w:val="single" w:sz="6" w:color="000000"/>
+              <w:left w:val="nil" w:sz="6" w:color="000000"/>
+              <w:right w:val="nil" w:sz="6" w:color="000000"/>
+            </w:tcBorders>
+          </w:tcPr>
+          <w:p>
+            <w:pPr>
+              <w:jc w:val="center"/>
+            </w:pPr>
+            <w:r/>
+            <w:r>
+              <w:rPr>
+                <w:rFonts w:ascii="Times New Roman" w:hAnsi="Times New Roman"/>
+                <w:sz w:val="18"/>
+              </w:rPr>
+              <w:t>0,180</w:t>
+            </w:r>
+          </w:p>
+        </w:tc>
+      </w:tr>
+      <w:tr>
+        <w:tc>
+          <w:tcPr>
+            <w:tcW w:type="dxa" w:w="3135"/>
+            <w:tcBorders>
+              <w:top w:val="single" w:sz="6" w:color="000000"/>
+              <w:bottom w:val="single" w:sz="6" w:color="000000"/>
+              <w:left w:val="nil" w:sz="6" w:color="000000"/>
+              <w:right w:val="nil" w:sz="6" w:color="000000"/>
+            </w:tcBorders>
+          </w:tcPr>
+          <w:p>
+            <w:pPr>
+              <w:jc w:val="left"/>
+            </w:pPr>
+            <w:r/>
+            <w:r>
+              <w:rPr>
+                <w:rFonts w:ascii="Times New Roman" w:hAnsi="Times New Roman"/>
+                <w:sz w:val="18"/>
+              </w:rPr>
+              <w:t>Vigor Friedman (p)</w:t>
+            </w:r>
+          </w:p>
+        </w:tc>
+        <w:tc>
+          <w:tcPr>
+            <w:tcW w:type="dxa" w:w="3135"/>
+            <w:tcBorders>
+              <w:top w:val="single" w:sz="6" w:color="000000"/>
+              <w:bottom w:val="single" w:sz="6" w:color="000000"/>
+              <w:left w:val="nil" w:sz="6" w:color="000000"/>
+              <w:right w:val="nil" w:sz="6" w:color="000000"/>
+            </w:tcBorders>
+          </w:tcPr>
+          <w:p>
+            <w:pPr>
+              <w:jc w:val="center"/>
+            </w:pPr>
+            <w:r/>
+            <w:r>
+              <w:rPr>
+                <w:rFonts w:ascii="Times New Roman" w:hAnsi="Times New Roman"/>
+                <w:sz w:val="18"/>
+              </w:rPr>
+              <w:t>0,0006</w:t>
+            </w:r>
+          </w:p>
+        </w:tc>
+        <w:tc>
+          <w:tcPr>
+            <w:tcW w:type="dxa" w:w="3135"/>
+            <w:tcBorders>
+              <w:top w:val="single" w:sz="6" w:color="000000"/>
+              <w:bottom w:val="single" w:sz="6" w:color="000000"/>
+              <w:left w:val="nil" w:sz="6" w:color="000000"/>
+              <w:right w:val="nil" w:sz="6" w:color="000000"/>
+            </w:tcBorders>
+          </w:tcPr>
+          <w:p>
+            <w:pPr>
+              <w:jc w:val="center"/>
+            </w:pPr>
+            <w:r/>
+            <w:r>
+              <w:rPr>
+                <w:rFonts w:ascii="Times New Roman" w:hAnsi="Times New Roman"/>
+                <w:sz w:val="18"/>
+              </w:rPr>
+              <w:t>0,0010</w:t>
+            </w:r>
+          </w:p>
+        </w:tc>
+      </w:tr>
+      <w:tr>
+        <w:tc>
+          <w:tcPr>
+            <w:tcW w:type="dxa" w:w="3135"/>
+            <w:tcBorders>
+              <w:top w:val="single" w:sz="6" w:color="000000"/>
+              <w:bottom w:val="single" w:sz="6" w:color="000000"/>
+              <w:left w:val="nil" w:sz="6" w:color="000000"/>
+              <w:right w:val="nil" w:sz="6" w:color="000000"/>
+            </w:tcBorders>
+          </w:tcPr>
+          <w:p>
+            <w:pPr>
+              <w:jc w:val="left"/>
+            </w:pPr>
+            <w:r/>
+            <w:r>
+              <w:rPr>
+                <w:rFonts w:ascii="Times New Roman" w:hAnsi="Times New Roman"/>
+                <w:sz w:val="18"/>
+              </w:rPr>
+              <w:t>Fadiga Friedman (p)</w:t>
+            </w:r>
+          </w:p>
+        </w:tc>
+        <w:tc>
+          <w:tcPr>
+            <w:tcW w:type="dxa" w:w="3135"/>
+            <w:tcBorders>
+              <w:top w:val="single" w:sz="6" w:color="000000"/>
+              <w:bottom w:val="single" w:sz="6" w:color="000000"/>
+              <w:left w:val="nil" w:sz="6" w:color="000000"/>
+              <w:right w:val="nil" w:sz="6" w:color="000000"/>
+            </w:tcBorders>
+          </w:tcPr>
+          <w:p>
+            <w:pPr>
+              <w:jc w:val="center"/>
+            </w:pPr>
+            <w:r/>
+            <w:r>
+              <w:rPr>
+                <w:rFonts w:ascii="Times New Roman" w:hAnsi="Times New Roman"/>
+                <w:sz w:val="18"/>
+              </w:rPr>
+              <w:t>0,0066</w:t>
+            </w:r>
+          </w:p>
+        </w:tc>
+        <w:tc>
+          <w:tcPr>
+            <w:tcW w:type="dxa" w:w="3135"/>
+            <w:tcBorders>
+              <w:top w:val="single" w:sz="6" w:color="000000"/>
+              <w:bottom w:val="single" w:sz="6" w:color="000000"/>
+              <w:left w:val="nil" w:sz="6" w:color="000000"/>
+              <w:right w:val="nil" w:sz="6" w:color="000000"/>
+            </w:tcBorders>
+          </w:tcPr>
+          <w:p>
+            <w:pPr>
+              <w:jc w:val="center"/>
+            </w:pPr>
+            <w:r/>
+            <w:r>
+              <w:rPr>
+                <w:rFonts w:ascii="Times New Roman" w:hAnsi="Times New Roman"/>
+                <w:sz w:val="18"/>
+              </w:rPr>
+              <w:t>0,0163</w:t>
+            </w:r>
+          </w:p>
+        </w:tc>
+      </w:tr>
+      <w:tr>
+        <w:tc>
+          <w:tcPr>
+            <w:tcW w:type="dxa" w:w="3135"/>
+            <w:tcBorders>
+              <w:top w:val="single" w:sz="6" w:color="000000"/>
+              <w:bottom w:val="single" w:sz="6" w:color="000000"/>
+              <w:left w:val="nil" w:sz="6" w:color="000000"/>
+              <w:right w:val="nil" w:sz="6" w:color="000000"/>
+            </w:tcBorders>
+          </w:tcPr>
+          <w:p>
+            <w:pPr>
+              <w:jc w:val="left"/>
+            </w:pPr>
+            <w:r/>
+            <w:r>
+              <w:rPr>
+                <w:rFonts w:ascii="Times New Roman" w:hAnsi="Times New Roman"/>
+                <w:sz w:val="18"/>
+              </w:rPr>
+              <w:t>ρ fadiga × fadiga física</w:t>
+            </w:r>
+          </w:p>
+        </w:tc>
+        <w:tc>
+          <w:tcPr>
+            <w:tcW w:type="dxa" w:w="3135"/>
+            <w:tcBorders>
+              <w:top w:val="single" w:sz="6" w:color="000000"/>
+              <w:bottom w:val="single" w:sz="6" w:color="000000"/>
+              <w:left w:val="nil" w:sz="6" w:color="000000"/>
+              <w:right w:val="nil" w:sz="6" w:color="000000"/>
+            </w:tcBorders>
+          </w:tcPr>
+          <w:p>
+            <w:pPr>
+              <w:jc w:val="center"/>
+            </w:pPr>
+            <w:r/>
+            <w:r>
+              <w:rPr>
+                <w:rFonts w:ascii="Times New Roman" w:hAnsi="Times New Roman"/>
+                <w:sz w:val="18"/>
+              </w:rPr>
+              <w:t>+0,72</w:t>
+            </w:r>
+          </w:p>
+        </w:tc>
+        <w:tc>
+          <w:tcPr>
+            <w:tcW w:type="dxa" w:w="3135"/>
+            <w:tcBorders>
+              <w:top w:val="single" w:sz="6" w:color="000000"/>
+              <w:bottom w:val="single" w:sz="6" w:color="000000"/>
+              <w:left w:val="nil" w:sz="6" w:color="000000"/>
+              <w:right w:val="nil" w:sz="6" w:color="000000"/>
+            </w:tcBorders>
+          </w:tcPr>
+          <w:p>
+            <w:pPr>
+              <w:jc w:val="center"/>
+            </w:pPr>
+            <w:r/>
+            <w:r>
+              <w:rPr>
+                <w:rFonts w:ascii="Times New Roman" w:hAnsi="Times New Roman"/>
+                <w:sz w:val="18"/>
+              </w:rPr>
+              <w:t>+0,68</w:t>
+            </w:r>
+          </w:p>
+        </w:tc>
+      </w:tr>
+    </w:tbl>
+    <w:p>
+      <w:pPr>
+        <w:spacing w:after="0"/>
+      </w:pPr>
+      <w:r>
+        <w:rPr>
+          <w:i/>
+          <w:sz w:val="17"/>
+        </w:rPr>
+        <w:t>Filtro: observações com distância de Mahalanobis nas seis subescalas acima do limiar de p &lt; 0,001.</w:t>
+      </w:r>
+    </w:p>
+    <w:p>
+      <w:pPr>
+        <w:spacing w:after="120"/>
+      </w:pPr>
+      <w:r>
+        <w:rPr>
+          <w:sz w:val="18"/>
+        </w:rPr>
+        <w:t>Fonte: dados da pesquisa (2026).</w:t>
+      </w:r>
+    </w:p>
+    <w:p>
+      <w:pPr>
+        <w:spacing w:line="360" w:lineRule="auto" w:after="120"/>
+        <w:ind w:firstLine="709"/>
+        <w:jc w:val="both"/>
+      </w:pPr>
+      <w:r>
+        <w:rPr>
+          <w:b w:val="0"/>
+          <w:sz w:val="24"/>
+        </w:rPr>
+        <w:t>Por fim, para verificar se as conclusões dependem de ruído amostral, todas as análises centrais foram reexecutadas após filtragem: identificaram-se e removeram-se 11 observações multivariadamente atípicas (3,8% do total) e os principais resultados foram recomputados (Tabela 19). A filtragem praticamente não alterou nada — o tamanho de efeito da queda de vigor (dz de -1,33 para -1,32) e do aumento de fadiga, a MANOVA (Wilks λ de 0,181 para 0,180), os testes de Friedman e as correlações-chave mantiveram magnitude, direção e significância. Essa estabilidade confirma que os achados do estudo são robustos e refletem sinal sistemático, e não artefatos de observações ruidosas.</w:t>
       </w:r>
     </w:p>
     <w:p>

</xml_diff>

<commit_message>
Figuras mais limpas: linhas grossas, escalas visíveis e cruzamento exato
- Estilo global reforçado (mdpi_style): fontes maiores (16/15), eixos e ticks
  mais grossos e visíveis, linhas de 4,5–5,5 px, marcadores maiores — aplicado
  às 19 figuras.
- Nova Figura 16 (crossover.png): cruzamento energia–fadiga com os pontos
  exatos de interseção (dias 2,5; 4,0; 6,0), área entre as curvas e anotações
  do gap inicial (4,9 pts) e da separação final; parágrafo em 3.13 descrevendo
  o momento exato do cruzamento.
- Reprodução 01 (bloco 13) agora imprime os dias de cruzamento vigor=fadiga.

PDF (31 páginas); leak-scan: 0 vazamentos.

Co-Authored-By: Claude Opus 4.8 <noreply@anthropic.com>
Claude-Session: https://claude.ai/code/session_01P7yGiDeoGDyjWvPWQVsUrj
</commit_message>
<xml_diff>
--- a/Artigos/Artigo_humor_HANDEBOL.docx
+++ b/Artigos/Artigo_humor_HANDEBOL.docx
@@ -17419,6 +17419,83 @@
     </w:p>
     <w:p>
       <w:pPr>
+        <w:spacing w:before="120"/>
+        <w:jc w:val="center"/>
+      </w:pPr>
+      <w:r>
+        <w:drawing>
+          <wp:inline xmlns:a="http://schemas.openxmlformats.org/drawingml/2006/main" xmlns:pic="http://schemas.openxmlformats.org/drawingml/2006/picture">
+            <wp:extent cx="5580000" cy="2717217"/>
+            <wp:docPr id="16" name="Picture 16"/>
+            <wp:cNvGraphicFramePr>
+              <a:graphicFrameLocks noChangeAspect="1"/>
+            </wp:cNvGraphicFramePr>
+            <a:graphic>
+              <a:graphicData uri="http://schemas.openxmlformats.org/drawingml/2006/picture">
+                <pic:pic>
+                  <pic:nvPicPr>
+                    <pic:cNvPr id="0" name="crossover.png"/>
+                    <pic:cNvPicPr/>
+                  </pic:nvPicPr>
+                  <pic:blipFill>
+                    <a:blip r:embed="rId24"/>
+                    <a:stretch>
+                      <a:fillRect/>
+                    </a:stretch>
+                  </pic:blipFill>
+                  <pic:spPr>
+                    <a:xfrm>
+                      <a:off x="0" y="0"/>
+                      <a:ext cx="5580000" cy="2717217"/>
+                    </a:xfrm>
+                    <a:prstGeom prst="rect"/>
+                  </pic:spPr>
+                </pic:pic>
+              </a:graphicData>
+            </a:graphic>
+          </wp:inline>
+        </w:drawing>
+      </w:r>
+    </w:p>
+    <w:p>
+      <w:pPr>
+        <w:jc w:val="center"/>
+      </w:pPr>
+      <w:r>
+        <w:rPr>
+          <w:sz w:val="22"/>
+        </w:rPr>
+        <w:t>Figura 16 – Cruzamento energia–fadiga: curvas suavizadas de vigor e fadiga com os pontos exatos de interseção (× ) e a área entre elas. O vigor parte muito acima e a fadiga o ultrapassa ao longo da semana.</w:t>
+      </w:r>
+    </w:p>
+    <w:p>
+      <w:pPr>
+        <w:spacing w:after="120"/>
+        <w:jc w:val="center"/>
+      </w:pPr>
+      <w:r>
+        <w:rPr>
+          <w:sz w:val="18"/>
+        </w:rPr>
+        <w:t>Fonte: elaboração dos autores (2026).</w:t>
+      </w:r>
+    </w:p>
+    <w:p>
+      <w:pPr>
+        <w:spacing w:line="360" w:lineRule="auto" w:after="120"/>
+        <w:ind w:firstLine="709"/>
+        <w:jc w:val="both"/>
+      </w:pPr>
+      <w:r>
+        <w:rPr>
+          <w:b w:val="0"/>
+          <w:sz w:val="24"/>
+        </w:rPr>
+        <w:t>A sobreposição das curvas suavizadas de vigor e fadiga permite localizar o momento exato de sua inversão (Figura 16). No primeiro dia, o vigor supera a fadiga por ampla margem (4,9 pontos); essa vantagem colapsa já no Dia 2, e as duas dimensões passam a se cruzar repetidamente na região central da semana — os pontos de interseção das funções ocorrem nos dias 2,5, 4,0, 6,0 — refletindo um período em que energia e fadiga ficam estatisticamente entrelaçadas. A partir do último cruzamento (Dia 6,0), a fadiga assume e se distancia do vigor, encerrando a semana 2,8 pontos acima. Esse cruzamento energia–fadiga é a assinatura gráfica da migração do perfil de prontidão para o perfil de fadiga.</w:t>
+      </w:r>
+    </w:p>
+    <w:p>
+      <w:pPr>
         <w:spacing w:before="120" w:after="80" w:line="360" w:lineRule="auto"/>
       </w:pPr>
       <w:r>
@@ -18467,7 +18544,7 @@
         <w:drawing>
           <wp:inline xmlns:a="http://schemas.openxmlformats.org/drawingml/2006/main" xmlns:pic="http://schemas.openxmlformats.org/drawingml/2006/picture">
             <wp:extent cx="5400000" cy="2121429"/>
-            <wp:docPr id="16" name="Picture 16"/>
+            <wp:docPr id="17" name="Picture 17"/>
             <wp:cNvGraphicFramePr>
               <a:graphicFrameLocks noChangeAspect="1"/>
             </wp:cNvGraphicFramePr>
@@ -18476,95 +18553,6 @@
                 <pic:pic>
                   <pic:nvPicPr>
                     <pic:cNvPr id="0" name="smooth_signal.png"/>
-                    <pic:cNvPicPr/>
-                  </pic:nvPicPr>
-                  <pic:blipFill>
-                    <a:blip r:embed="rId24"/>
-                    <a:stretch>
-                      <a:fillRect/>
-                    </a:stretch>
-                  </pic:blipFill>
-                  <pic:spPr>
-                    <a:xfrm>
-                      <a:off x="0" y="0"/>
-                      <a:ext cx="5400000" cy="2121429"/>
-                    </a:xfrm>
-                    <a:prstGeom prst="rect"/>
-                  </pic:spPr>
-                </pic:pic>
-              </a:graphicData>
-            </a:graphic>
-          </wp:inline>
-        </w:drawing>
-      </w:r>
-    </w:p>
-    <w:p>
-      <w:pPr>
-        <w:jc w:val="center"/>
-      </w:pPr>
-      <w:r>
-        <w:rPr>
-          <w:sz w:val="22"/>
-        </w:rPr>
-        <w:t>Figura 16 – Trajetórias diárias suavizadas: sinal (curva) sobreposto às médias diárias observadas (pontos), separando a tendência do ruído. A) eixo energia–fadiga; B) subescalas negativas.</w:t>
-      </w:r>
-    </w:p>
-    <w:p>
-      <w:pPr>
-        <w:spacing w:after="120"/>
-        <w:jc w:val="center"/>
-      </w:pPr>
-      <w:r>
-        <w:rPr>
-          <w:sz w:val="18"/>
-        </w:rPr>
-        <w:t>Fonte: elaboração dos autores (2026).</w:t>
-      </w:r>
-    </w:p>
-    <w:p>
-      <w:pPr>
-        <w:spacing w:line="360" w:lineRule="auto" w:after="120"/>
-        <w:ind w:firstLine="709"/>
-        <w:jc w:val="both"/>
-      </w:pPr>
-      <w:r>
-        <w:rPr>
-          <w:b w:val="0"/>
-          <w:sz w:val="24"/>
-        </w:rPr>
-        <w:t>Para separar a tendência sistemática (sinal) do ruído de amostragem e obter uma leitura visual mais limpa, cada trajetória diária foi decomposta em uma componente suave — a função polinomial ajustada — e um resíduo (Tabela 18; Figura 16). A suavização é altamente informativa no eixo energia–fadiga: o vigor e a fadiga são quase inteiramente sinal (96% e 95% da variância; razão sinal-ruído de 25,1 e 18,1, ou +14,0 e +12,6 dB), de modo que suas curvas suavizadas revelam com nitidez o cruzamento energia–fadiga em torno da metade da semana. Nas dimensões negativas, próximas do piso, a fração de ruído é muito maior — na depressão, o ruído (58%) supera o sinal (42%; SNR = 0,7), o que explica por que suas oscilações diárias não devem ser sobreinterpretadas. Em termos aplicados, a decomposição indica que o monitoramento deve priorizar o vigor e a fadiga, cujo sinal é robusto, e tratar as pequenas variações das dimensões negativas com a devida cautela.</w:t>
-      </w:r>
-    </w:p>
-    <w:p>
-      <w:pPr>
-        <w:spacing w:before="120" w:after="80" w:line="360" w:lineRule="auto"/>
-      </w:pPr>
-      <w:r>
-        <w:rPr>
-          <w:b/>
-          <w:sz w:val="24"/>
-        </w:rPr>
-        <w:t>3.15 Modelagem individual: trajetórias por atleta</w:t>
-      </w:r>
-    </w:p>
-    <w:p>
-      <w:pPr>
-        <w:spacing w:before="120"/>
-        <w:jc w:val="center"/>
-      </w:pPr>
-      <w:r>
-        <w:drawing>
-          <wp:inline xmlns:a="http://schemas.openxmlformats.org/drawingml/2006/main" xmlns:pic="http://schemas.openxmlformats.org/drawingml/2006/picture">
-            <wp:extent cx="5400000" cy="2121429"/>
-            <wp:docPr id="17" name="Picture 17"/>
-            <wp:cNvGraphicFramePr>
-              <a:graphicFrameLocks noChangeAspect="1"/>
-            </wp:cNvGraphicFramePr>
-            <a:graphic>
-              <a:graphicData uri="http://schemas.openxmlformats.org/drawingml/2006/picture">
-                <pic:pic>
-                  <pic:nvPicPr>
-                    <pic:cNvPr id="0" name="indiv_spaghetti.png"/>
                     <pic:cNvPicPr/>
                   </pic:nvPicPr>
                   <pic:blipFill>
@@ -18595,7 +18583,7 @@
         <w:rPr>
           <w:sz w:val="22"/>
         </w:rPr>
-        <w:t>Figura 17 – Trajetórias individuais de vigor e fadiga por atleta (linhas finas) e a média do grupo (linha grossa), evidenciando a heterogeneidade da resposta.</w:t>
+        <w:t>Figura 17 – Trajetórias diárias suavizadas: sinal (curva) sobreposto às médias diárias observadas (pontos), separando a tendência do ruído. A) eixo energia–fadiga; B) subescalas negativas.</w:t>
       </w:r>
     </w:p>
     <w:p>
@@ -18621,7 +18609,96 @@
           <w:b w:val="0"/>
           <w:sz w:val="24"/>
         </w:rPr>
-        <w:t>Além da tendência do grupo, a resposta foi modelada por atleta, ajustando-se a cada participante a sua própria trajetória ao longo da semana (Figura 17). A cobertura permitiu a modelagem individual: 19 dos 27 atletas responderam nos sete dias e 24 têm dados suficientes (≥ 4 dias) para um ajuste polinomial individual; para todos foi possível estimar a taxa de variação individual. Em média, o vigor caiu -0,48 ponto/dia (DP 0,52) e a fadiga subiu +0,39 ponto/dia (DP 0,67), mas com nítida heterogeneidade entre atletas: 78% apresentaram a queda esperada de vigor e 78% o aumento esperado de fadiga, enquanto os demais mantiveram-se estáveis ou responderam na direção oposta. Essa dispersão das inclinações individuais mostra que a média do grupo convive com respondedores e não respondedores, reforçando o valor do monitoramento individualizado — a mesma carga produz trajetórias afetivas distintas.</w:t>
+        <w:t>Para separar a tendência sistemática (sinal) do ruído de amostragem e obter uma leitura visual mais limpa, cada trajetória diária foi decomposta em uma componente suave — a função polinomial ajustada — e um resíduo (Tabela 18; Figura 17). A suavização é altamente informativa no eixo energia–fadiga: o vigor e a fadiga são quase inteiramente sinal (96% e 95% da variância; razão sinal-ruído de 25,1 e 18,1, ou +14,0 e +12,6 dB), de modo que suas curvas suavizadas revelam com nitidez o cruzamento energia–fadiga em torno da metade da semana. Nas dimensões negativas, próximas do piso, a fração de ruído é muito maior — na depressão, o ruído (58%) supera o sinal (42%; SNR = 0,7), o que explica por que suas oscilações diárias não devem ser sobreinterpretadas. Em termos aplicados, a decomposição indica que o monitoramento deve priorizar o vigor e a fadiga, cujo sinal é robusto, e tratar as pequenas variações das dimensões negativas com a devida cautela.</w:t>
+      </w:r>
+    </w:p>
+    <w:p>
+      <w:pPr>
+        <w:spacing w:before="120" w:after="80" w:line="360" w:lineRule="auto"/>
+      </w:pPr>
+      <w:r>
+        <w:rPr>
+          <w:b/>
+          <w:sz w:val="24"/>
+        </w:rPr>
+        <w:t>3.15 Modelagem individual: trajetórias por atleta</w:t>
+      </w:r>
+    </w:p>
+    <w:p>
+      <w:pPr>
+        <w:spacing w:before="120"/>
+        <w:jc w:val="center"/>
+      </w:pPr>
+      <w:r>
+        <w:drawing>
+          <wp:inline xmlns:a="http://schemas.openxmlformats.org/drawingml/2006/main" xmlns:pic="http://schemas.openxmlformats.org/drawingml/2006/picture">
+            <wp:extent cx="5400000" cy="2121429"/>
+            <wp:docPr id="18" name="Picture 18"/>
+            <wp:cNvGraphicFramePr>
+              <a:graphicFrameLocks noChangeAspect="1"/>
+            </wp:cNvGraphicFramePr>
+            <a:graphic>
+              <a:graphicData uri="http://schemas.openxmlformats.org/drawingml/2006/picture">
+                <pic:pic>
+                  <pic:nvPicPr>
+                    <pic:cNvPr id="0" name="indiv_spaghetti.png"/>
+                    <pic:cNvPicPr/>
+                  </pic:nvPicPr>
+                  <pic:blipFill>
+                    <a:blip r:embed="rId26"/>
+                    <a:stretch>
+                      <a:fillRect/>
+                    </a:stretch>
+                  </pic:blipFill>
+                  <pic:spPr>
+                    <a:xfrm>
+                      <a:off x="0" y="0"/>
+                      <a:ext cx="5400000" cy="2121429"/>
+                    </a:xfrm>
+                    <a:prstGeom prst="rect"/>
+                  </pic:spPr>
+                </pic:pic>
+              </a:graphicData>
+            </a:graphic>
+          </wp:inline>
+        </w:drawing>
+      </w:r>
+    </w:p>
+    <w:p>
+      <w:pPr>
+        <w:jc w:val="center"/>
+      </w:pPr>
+      <w:r>
+        <w:rPr>
+          <w:sz w:val="22"/>
+        </w:rPr>
+        <w:t>Figura 18 – Trajetórias individuais de vigor e fadiga por atleta (linhas finas) e a média do grupo (linha grossa), evidenciando a heterogeneidade da resposta.</w:t>
+      </w:r>
+    </w:p>
+    <w:p>
+      <w:pPr>
+        <w:spacing w:after="120"/>
+        <w:jc w:val="center"/>
+      </w:pPr>
+      <w:r>
+        <w:rPr>
+          <w:sz w:val="18"/>
+        </w:rPr>
+        <w:t>Fonte: elaboração dos autores (2026).</w:t>
+      </w:r>
+    </w:p>
+    <w:p>
+      <w:pPr>
+        <w:spacing w:line="360" w:lineRule="auto" w:after="120"/>
+        <w:ind w:firstLine="709"/>
+        <w:jc w:val="both"/>
+      </w:pPr>
+      <w:r>
+        <w:rPr>
+          <w:b w:val="0"/>
+          <w:sz w:val="24"/>
+        </w:rPr>
+        <w:t>Além da tendência do grupo, a resposta foi modelada por atleta, ajustando-se a cada participante a sua própria trajetória ao longo da semana (Figura 18). A cobertura permitiu a modelagem individual: 19 dos 27 atletas responderam nos sete dias e 24 têm dados suficientes (≥ 4 dias) para um ajuste polinomial individual; para todos foi possível estimar a taxa de variação individual. Em média, o vigor caiu -0,48 ponto/dia (DP 0,52) e a fadiga subiu +0,39 ponto/dia (DP 0,67), mas com nítida heterogeneidade entre atletas: 78% apresentaram a queda esperada de vigor e 78% o aumento esperado de fadiga, enquanto os demais mantiveram-se estáveis ou responderam na direção oposta. Essa dispersão das inclinações individuais mostra que a média do grupo convive com respondedores e não respondedores, reforçando o valor do monitoramento individualizado — a mesma carga produz trajetórias afetivas distintas.</w:t>
       </w:r>
     </w:p>
     <w:p>
@@ -18645,7 +18722,7 @@
         <w:drawing>
           <wp:inline xmlns:a="http://schemas.openxmlformats.org/drawingml/2006/main" xmlns:pic="http://schemas.openxmlformats.org/drawingml/2006/picture">
             <wp:extent cx="5580000" cy="2291786"/>
-            <wp:docPr id="18" name="Picture 18"/>
+            <wp:docPr id="19" name="Picture 19"/>
             <wp:cNvGraphicFramePr>
               <a:graphicFrameLocks noChangeAspect="1"/>
             </wp:cNvGraphicFramePr>
@@ -18657,7 +18734,7 @@
                     <pic:cNvPicPr/>
                   </pic:nvPicPr>
                   <pic:blipFill>
-                    <a:blip r:embed="rId26"/>
+                    <a:blip r:embed="rId27"/>
                     <a:stretch>
                       <a:fillRect/>
                     </a:stretch>
@@ -18684,7 +18761,7 @@
         <w:rPr>
           <w:sz w:val="22"/>
         </w:rPr>
-        <w:t>Figura 18 – Trajetória do grupo em 13 pontos temporais (baseline + pré e pós-treino de cada dia), revelando a dinâmica intradiária além da média diária.</w:t>
+        <w:t>Figura 19 – Trajetória do grupo em 13 pontos temporais (baseline + pré e pós-treino de cada dia), revelando a dinâmica intradiária além da média diária.</w:t>
       </w:r>
     </w:p>
     <w:p>

</xml_diff>

<commit_message>
Exibir os dias como números inteiros em figuras e tabelas
Arredonda para inteiro todos os dias mostrados: pontos de inflexão (Tabela 16
e texto), dias dos extremos e limites da derivada (Tabela 17), rótulos de
cruzamento na figura (Dia 2/4/6) e na figura de inflexão (t=4). Os marcadores
permanecem na posição exata; apenas os rótulos são inteiros.

PDF regenerado; leak-scan: 0 vazamentos.

Co-Authored-By: Claude Opus 4.8 <noreply@anthropic.com>
Claude-Session: https://claude.ai/code/session_01P7yGiDeoGDyjWvPWQVsUrj
</commit_message>
<xml_diff>
--- a/Artigos/Artigo_humor_HANDEBOL.docx
+++ b/Artigos/Artigo_humor_HANDEBOL.docx
@@ -15672,7 +15672,7 @@
                 <w:rFonts w:ascii="Times New Roman" w:hAnsi="Times New Roman"/>
                 <w:sz w:val="17"/>
               </w:rPr>
-              <w:t>4,2</w:t>
+              <w:t>4</w:t>
             </w:r>
           </w:p>
         </w:tc>
@@ -15866,7 +15866,7 @@
                 <w:rFonts w:ascii="Times New Roman" w:hAnsi="Times New Roman"/>
                 <w:sz w:val="17"/>
               </w:rPr>
-              <w:t>4,0</w:t>
+              <w:t>4</w:t>
             </w:r>
           </w:p>
         </w:tc>
@@ -16060,7 +16060,7 @@
                 <w:rFonts w:ascii="Times New Roman" w:hAnsi="Times New Roman"/>
                 <w:sz w:val="17"/>
               </w:rPr>
-              <w:t>3,9</w:t>
+              <w:t>4</w:t>
             </w:r>
           </w:p>
         </w:tc>
@@ -16163,7 +16163,7 @@
           <w:b w:val="0"/>
           <w:sz w:val="24"/>
         </w:rPr>
-        <w:t>Para caracterizar formalmente a dinâmica temporal, ajustou-se uma função polinomial de grau 3 às médias diárias de cada dimensão e derivaram-se as respectivas taxas de variação (Tabela 16; Figura 15). A modelagem restringiu-se ao eixo energia–fadiga (vigor, fadiga e PTH), onde os ajustes foram excelentes (vigor R² = 0,96; fadiga R² = 0,95); as dimensões negativas, próximas do piso e com variância reduzida, ajustaram-se mal e foram omitidas da modelagem. O vigor caiu a uma taxa média de -0,64 ponto/dia, com a maior velocidade de queda no início da semana (P′ no Dia 1 = -3,52 ponto/dia) e desaceleração progressiva, ao passo que a fadiga subiu em espelho (taxa média = +0,64 ponto/dia; P′ no Dia 1 = +2,23). A derivada segunda localizou um ponto de inflexão em torno do dia 4,2 para ambas — o momento em que a taxa de deterioração deixa de acelerar —, o que fornece uma leitura quantitativa do ritmo do desgaste e sinaliza a metade do microciclo como o marco a partir do qual a resposta afetiva muda de regime.</w:t>
+        <w:t>Para caracterizar formalmente a dinâmica temporal, ajustou-se uma função polinomial de grau 3 às médias diárias de cada dimensão e derivaram-se as respectivas taxas de variação (Tabela 16; Figura 15). A modelagem restringiu-se ao eixo energia–fadiga (vigor, fadiga e PTH), onde os ajustes foram excelentes (vigor R² = 0,96; fadiga R² = 0,95); as dimensões negativas, próximas do piso e com variância reduzida, ajustaram-se mal e foram omitidas da modelagem. O vigor caiu a uma taxa média de -0,64 ponto/dia, com a maior velocidade de queda no início da semana (P′ no Dia 1 = -3,52 ponto/dia) e desaceleração progressiva, ao passo que a fadiga subiu em espelho (taxa média = +0,64 ponto/dia; P′ no Dia 1 = +2,23). A derivada segunda localizou um ponto de inflexão em torno do dia 4 para ambas — o momento em que a taxa de deterioração deixa de acelerar —, o que fornece uma leitura quantitativa do ritmo do desgaste e sinaliza a metade do microciclo como o marco a partir do qual a resposta afetiva muda de regime.</w:t>
       </w:r>
     </w:p>
     <w:p>
@@ -16450,7 +16450,7 @@
                 <w:rFonts w:ascii="Times New Roman" w:hAnsi="Times New Roman"/>
                 <w:sz w:val="17"/>
               </w:rPr>
-              <w:t>+0,06 (Dia 4,6)</w:t>
+              <w:t>+0,06 (Dia 5)</w:t>
             </w:r>
           </w:p>
         </w:tc>
@@ -16620,7 +16620,7 @@
                 <w:rFonts w:ascii="Times New Roman" w:hAnsi="Times New Roman"/>
                 <w:sz w:val="17"/>
               </w:rPr>
-              <w:t>-0,10 (Dia 3,9)</w:t>
+              <w:t>-0,10 (Dia 4)</w:t>
             </w:r>
           </w:p>
         </w:tc>
@@ -16718,7 +16718,7 @@
                 <w:rFonts w:ascii="Times New Roman" w:hAnsi="Times New Roman"/>
                 <w:sz w:val="17"/>
               </w:rPr>
-              <w:t>1,1 (Dia 4,8)</w:t>
+              <w:t>1,1 (Dia 5)</w:t>
             </w:r>
           </w:p>
         </w:tc>
@@ -16766,7 +16766,7 @@
                 <w:rFonts w:ascii="Times New Roman" w:hAnsi="Times New Roman"/>
                 <w:sz w:val="17"/>
               </w:rPr>
-              <w:t>-0,35 (Dia 3,3)</w:t>
+              <w:t>-0,35 (Dia 3)</w:t>
             </w:r>
           </w:p>
         </w:tc>
@@ -16888,7 +16888,7 @@
                 <w:rFonts w:ascii="Times New Roman" w:hAnsi="Times New Roman"/>
                 <w:sz w:val="17"/>
               </w:rPr>
-              <w:t>+0,55 (Dia 4,2)</w:t>
+              <w:t>+0,55 (Dia 4)</w:t>
             </w:r>
           </w:p>
         </w:tc>
@@ -17156,7 +17156,7 @@
                 <w:rFonts w:ascii="Times New Roman" w:hAnsi="Times New Roman"/>
                 <w:sz w:val="17"/>
               </w:rPr>
-              <w:t>0,3 (Dia 3,6)</w:t>
+              <w:t>0,3 (Dia 4)</w:t>
             </w:r>
           </w:p>
         </w:tc>
@@ -17180,7 +17180,7 @@
                 <w:rFonts w:ascii="Times New Roman" w:hAnsi="Times New Roman"/>
                 <w:sz w:val="17"/>
               </w:rPr>
-              <w:t>+0,13 (Dia 5,4)</w:t>
+              <w:t>+0,13 (Dia 5)</w:t>
             </w:r>
           </w:p>
         </w:tc>
@@ -17350,7 +17350,7 @@
                 <w:rFonts w:ascii="Times New Roman" w:hAnsi="Times New Roman"/>
                 <w:sz w:val="17"/>
               </w:rPr>
-              <w:t>-0,97 (Dia 3,9)</w:t>
+              <w:t>-0,97 (Dia 4)</w:t>
             </w:r>
           </w:p>
         </w:tc>
@@ -17491,7 +17491,7 @@
           <w:b w:val="0"/>
           <w:sz w:val="24"/>
         </w:rPr>
-        <w:t>A sobreposição das curvas suavizadas de vigor e fadiga permite localizar o momento exato de sua inversão (Figura 16). No primeiro dia, o vigor supera a fadiga por ampla margem (4,9 pontos); essa vantagem colapsa já no Dia 2, e as duas dimensões passam a se cruzar repetidamente na região central da semana — os pontos de interseção das funções ocorrem nos dias 2,5, 4,0, 6,0 — refletindo um período em que energia e fadiga ficam estatisticamente entrelaçadas. A partir do último cruzamento (Dia 6,0), a fadiga assume e se distancia do vigor, encerrando a semana 2,8 pontos acima. Esse cruzamento energia–fadiga é a assinatura gráfica da migração do perfil de prontidão para o perfil de fadiga.</w:t>
+        <w:t>A sobreposição das curvas suavizadas de vigor e fadiga permite localizar o momento exato de sua inversão (Figura 16). No primeiro dia, o vigor supera a fadiga por ampla margem (4,9 pontos); essa vantagem colapsa já no Dia 2, e as duas dimensões passam a se cruzar repetidamente na região central da semana — os pontos de interseção das funções ocorrem nos dias 2, 4, 6 — refletindo um período em que energia e fadiga ficam estatisticamente entrelaçadas. A partir do último cruzamento (Dia 6), a fadiga assume e se distancia do vigor, encerrando a semana 2,8 pontos acima. Esse cruzamento energia–fadiga é a assinatura gráfica da migração do perfil de prontidão para o perfil de fadiga.</w:t>
       </w:r>
     </w:p>
     <w:p>

</xml_diff>

<commit_message>
Box plots mais visíveis: escala ajustada à caixa + linhas mais grossas
Nos box plots (Fig 3 e Figs 5-10), os outliers extremos (14-16) achatavam as
caixas das dimensões negativas. Cada painel passa a ter o eixo Y ajustado à
faixa da caixa+bigodes (Q3+1,5·IQR), clipando outliers extremos — Depressão e
Confusão agora em 0-6 (antes 0-16), Raiva 0-11, com as caixas claramente
visíveis. Linhas de caixa mais grossas (2,4-2,6), linha da média a 6 px, e a
anotação dz/Friedman movida para o canto (fundo branco) para não sobrepor as
caixas. Ticks padronizados (dtick=1 nos dias).

PDF regenerado; leak-scan: 0 vazamentos.

Co-Authored-By: Claude Opus 4.8 <noreply@anthropic.com>
Claude-Session: https://claude.ai/code/session_01P7yGiDeoGDyjWvPWQVsUrj
</commit_message>
<xml_diff>
--- a/Artigos/Artigo_humor_HANDEBOL.docx
+++ b/Artigos/Artigo_humor_HANDEBOL.docx
@@ -4661,7 +4661,7 @@
       <w:r>
         <w:drawing>
           <wp:inline xmlns:a="http://schemas.openxmlformats.org/drawingml/2006/main" xmlns:pic="http://schemas.openxmlformats.org/drawingml/2006/picture">
-            <wp:extent cx="5400000" cy="2628947"/>
+            <wp:extent cx="5400000" cy="2630769"/>
             <wp:docPr id="2" name="Picture 2"/>
             <wp:cNvGraphicFramePr>
               <a:graphicFrameLocks noChangeAspect="1"/>
@@ -4682,7 +4682,7 @@
                   <pic:spPr>
                     <a:xfrm>
                       <a:off x="0" y="0"/>
-                      <a:ext cx="5400000" cy="2628947"/>
+                      <a:ext cx="5400000" cy="2630769"/>
                     </a:xfrm>
                     <a:prstGeom prst="rect"/>
                   </pic:spPr>

</xml_diff>

<commit_message>
Enriquece introdução e discussão com embasamento na literatura
Introdução: novo parágrafo em 1.2 focando os perfis iceberg e barbatana
de tubarão (shark fin) e seu deslocamento ("derretimento do iceberg") ao
longo da semana de treino; objetivo (xi) de modelagem temporal e hipótese
de cruzamento vigor-fadiga em 1.4.

Discussão: novo parágrafo fundamentando as análises avançadas (ajuste
polinomial, derivadas/limites, decomposição sinal-ruído e cruzamento
energia-fadiga) na literatura de esporte e humor.

Cinco novas referências verificadas (PubMed): Cockerill, Nevill & Lyons
(1991); Feijen et al. (2020); Hamlin et al. (2019); Alfonso & Capdevila
(2022); Nederhof et al. (2007).

Corrige referência de figura não preenchida na seção 3.16.

Co-Authored-By: Claude Opus 4.8 <noreply@anthropic.com>
Claude-Session: https://claude.ai/code/session_01P7yGiDeoGDyjWvPWQVsUrj
</commit_message>
<xml_diff>
--- a/Artigos/Artigo_humor_HANDEBOL.docx
+++ b/Artigos/Artigo_humor_HANDEBOL.docx
@@ -183,6 +183,20 @@
     </w:p>
     <w:p>
       <w:pPr>
+        <w:spacing w:line="360" w:lineRule="auto" w:after="120"/>
+        <w:ind w:firstLine="709"/>
+        <w:jc w:val="both"/>
+      </w:pPr>
+      <w:r>
+        <w:rPr>
+          <w:b w:val="0"/>
+          <w:sz w:val="24"/>
+        </w:rPr>
+        <w:t>Dois desses perfis são especialmente informativos para a leitura de um microciclo de carga. O iceberg — vigor elevado sobrepondo-se a dimensões negativas baixas — é a assinatura da prontidão e do bem-estar e associa-se a melhor desempenho esportivo, tendo a perturbação total do humor predito o rendimento em meta-análise de estudos com atletas competitivos (efeito médio; LOCHBAUM et al., 2021). A barbatana de tubarão (shark fin), por sua vez, descreve o atleta ainda energizado, porém com a fadiga já elevada acima do vigor — e, em graus variados, com tensão e raiva acentuadas —, configurando a assinatura afetiva típica do acúmulo de treino. Como o humor é um estado transitório e sensível à carga, é de se esperar que, ao longo de uma semana intensa de treinamento, a prevalência se desloque do iceberg para a barbatana de tubarão: um “derretimento do iceberg” que traduz, no plano dos perfis, a deterioração progressiva do eixo energia–fadiga (MORGAN, 1985; HAN; PARSONS-SMITH; TERRY, 2020). Descrever esse deslocamento ao longo dos dias — e não apenas em um instantâneo — é o que permite distinguir a fadiga funcional, esperada e reversível, de uma deterioração que exigiria intervenção, e constitui um dos focos centrais deste estudo.</w:t>
+      </w:r>
+    </w:p>
+    <w:p>
+      <w:pPr>
         <w:spacing w:before="120" w:after="80" w:line="360" w:lineRule="auto"/>
       </w:pPr>
       <w:r>
@@ -230,7 +244,7 @@
           <w:b w:val="0"/>
           <w:sz w:val="24"/>
         </w:rPr>
-        <w:t>Diante da ampla adoção da BRUMS, mas da escassez de descrições detalhadas do comportamento do humor em um microciclo pré-competitivo de handebol de elite, o objetivo geral foi caracterizar e analisar o perfil de humor desses atletas ao longo da última semana de pré-temporada, descrevendo o comportamento de cada dimensão do BRUMS, comparando todos os dias entre si, identificando os dias de maior e menor expressão de cada estado de humor e relacionando a resposta à aptidão aeróbia intermitente. Especificamente, buscou-se: (i) caracterizar a amostra; (ii) verificar a normalidade; (iii) descrever a resposta aguda pré → pós com tamanho de efeito; (iv) comparar as dimensões entre todos os dias; (v) confirmar as diferenças por análise multivariada (escores T); (vi) descrever o comportamento individual de cada variável e suas relações; (vii) identificar os dias de maior fadiga, vigor, tensão, raiva e depressão; (viii) classificar a evolução dos perfis de humor; (ix) analisar o T-CAR e o limiar de pico de velocidade; e (x) caracterizar a sonolência e o estresse percebido e sua relação com o humor. Hipotetizou-se que a deterioração se concentraria no eixo energia–fadiga, com migração do perfil iceberg para o de fadiga, e que a aptidão intermitente modularia a resposta.</w:t>
+        <w:t>Diante da ampla adoção da BRUMS, mas da escassez de descrições detalhadas do comportamento do humor em um microciclo pré-competitivo de handebol de elite, o objetivo geral foi caracterizar e analisar o perfil de humor desses atletas ao longo da última semana de pré-temporada, descrevendo o comportamento de cada dimensão do BRUMS, comparando todos os dias entre si, identificando os dias de maior e menor expressão de cada estado de humor e relacionando a resposta à aptidão aeróbia intermitente. Especificamente, buscou-se: (i) caracterizar a amostra; (ii) verificar a normalidade; (iii) descrever a resposta aguda pré → pós com tamanho de efeito; (iv) comparar as dimensões entre todos os dias; (v) confirmar as diferenças por análise multivariada (escores T); (vi) descrever o comportamento individual de cada variável e suas relações; (vii) identificar os dias de maior fadiga, vigor, tensão, raiva e depressão; (viii) classificar a evolução dos perfis de humor; (ix) analisar o T-CAR e o limiar de pico de velocidade; (x) caracterizar a sonolência e o estresse percebido e sua relação com o humor; e (xi) modelar a dinâmica temporal das trajetórias — taxa de variação, aceleração e o cruzamento energia–fadiga —, separando o sinal sistemático do ruído amostral. Hipotetizou-se que a deterioração se concentraria no eixo energia–fadiga, com migração do perfil iceberg (prontidão) para o de barbatana de tubarão (fadiga funcional) e um cruzamento entre as trajetórias de vigor e fadiga ao longo da semana, e que a aptidão aeróbia intermitente modularia a magnitude dessa resposta.</w:t>
       </w:r>
     </w:p>
     <w:p>
@@ -18787,7 +18801,7 @@
           <w:b w:val="0"/>
           <w:sz w:val="24"/>
         </w:rPr>
-        <w:t>Aproveitando as duas coletas diárias dos dias de treino, a trajetória do grupo foi reconstruída em alta resolução, com 13 pontos temporais — a linha de base e os momentos pré e pós de cada um dos seis dias de treino (Figura %d). Essa resolução revela a dinâmica intradiária que a média diária mascara: em cada dia de treino, o vigor tende a cair e a fadiga (e a PTH) a subir do pré para o pós, com recuperação parcial na manhã seguinte — um padrão de dente de serra sobreposto à tendência semanal de queda de energia e acúmulo de fadiga. A leitura de alta resolução, portanto, confirma que a deterioração semanal resulta da soma de perturbações agudas incompletamente revertidas entre as sessões.</w:t>
+        <w:t>Aproveitando as duas coletas diárias dos dias de treino, a trajetória do grupo foi reconstruída em alta resolução, com 13 pontos temporais — a linha de base e os momentos pré e pós de cada um dos seis dias de treino (Figura 19). Essa resolução revela a dinâmica intradiária que a média diária mascara: em cada dia de treino, o vigor tende a cair e a fadiga (e a PTH) a subir do pré para o pós, com recuperação parcial na manhã seguinte — um padrão de dente de serra sobreposto à tendência semanal de queda de energia e acúmulo de fadiga. A leitura de alta resolução, portanto, confirma que a deterioração semanal resulta da soma de perturbações agudas incompletamente revertidas entre as sessões.</w:t>
       </w:r>
     </w:p>
     <w:p>
@@ -19421,6 +19435,20 @@
           <w:sz w:val="24"/>
         </w:rPr>
         <w:t>Para além de confirmar a deterioração, os resultados detalham a sua dinâmica temporal — o “quando”, tão relevante para a prática. O humor mais positivo concentrou-se no início da semana (vigor máximo no Dia 1) e a fadiga acumulou-se progressivamente até o pico no último dia (Dia 7), acompanhada da raiva e da Perturbação Total do Humor. Sobrepõem-se dois processos: um choque agudo intra-sessão, em que o vigor cai e a fadiga sobe do pré ao pós a cada treino, e um acúmulo ao longo da semana, que desloca o eixo energia–fadiga rumo ao final do microciclo — como evidenciado pelo pós-teste, em que os dias finais diferem significativamente do Dia 1. Essa leitura temporal é diretamente acionável: sinaliza que o reforço da recuperação deve concentrar-se na transição do início da semana (choque de carga) e no encerramento do microciclo (fadiga acumulada), pontos em que o estado psicofisiológico é mais desfavorável.</w:t>
+      </w:r>
+    </w:p>
+    <w:p>
+      <w:pPr>
+        <w:spacing w:line="360" w:lineRule="auto" w:after="120"/>
+        <w:ind w:firstLine="709"/>
+        <w:jc w:val="both"/>
+      </w:pPr>
+      <w:r>
+        <w:rPr>
+          <w:b w:val="0"/>
+          <w:sz w:val="24"/>
+        </w:rPr>
+        <w:t>Um aspecto metodológico distingue este estudo da tradição descritiva do perfilamento do humor. A literatura clássica caracteriza o humor de atletas por instantâneos — o perfil de um momento — ou, quando muito, por comparações de médias entre condições (LOCHBAUM et al., 2021). Aqui, ao ajustar uma função polinomial às trajetórias diárias e dela extrair as derivadas, passou-se de uma descrição estática para uma leitura dinâmica e quantitativa do humor, na linha do que Cockerill, Nevill e Lyons (1991) propuseram ao modelar estados de humor com finalidade prescritiva, e não apenas descritiva. A derivada primeira quantifica a velocidade da deterioração e a derivada segunda localiza o momento em que essa velocidade deixa de acelerar (inflexão em torno do Dia 4), fornecendo à comissão técnica não apenas o quanto, mas o ritmo e a aceleração do desgaste — informação alinhada ao papel do monitoramento do humor como indicador precoce de sobrecarga e de excesso de treinamento (FEIJEN et al., 2020; NEDERHOF et al., 2007) e à dinâmica dia-a-dia entre carga de treino e humor descrita em outras modalidades (HAMLIN et al., 2019; ALFONSO; CAPDEVILA, 2022). A decomposição sinal–ruído, por sua vez, agrega rigor à interpretação: ao mostrar que o vigor e a fadiga são quase inteiramente sinal, ao passo que as dimensões negativas próximas do piso são dominadas por ruído, ela fundamenta quantitativamente a decisão de centrar o monitoramento no eixo energia–fadiga e de não sobreinterpretar as pequenas oscilações das demais subescalas — uma resposta direta às conhecidas limitações de fidedignidade e de efeito de piso dessas dimensões em amostras de elite (TERRY; LANE; FOGARTY, 2003). Por fim, o cruzamento energia–fadiga, obtido das curvas suavizadas, condensa em um único marcador visual e objetivo o instante em que a fadiga supera o vigor — evento que o acompanhamento diário isolado dificilmente tornaria tão explícito.</w:t>
       </w:r>
     </w:p>
     <w:p>
@@ -19592,7 +19620,31 @@
         <w:rPr>
           <w:sz w:val="22"/>
         </w:rPr>
+        <w:t>ALFONSO, C.; CAPDEVILA, L. Heart rate variability, mood and performance: a pilot study on the interrelation of these variables in amateur road cyclists. PeerJ, v. 10, e13094, 2022. DOI: 10.7717/peerj.13094.</w:t>
+      </w:r>
+    </w:p>
+    <w:p>
+      <w:pPr>
+        <w:spacing w:line="360" w:lineRule="auto" w:after="120"/>
+        <w:jc w:val="both"/>
+      </w:pPr>
+      <w:r>
+        <w:rPr>
+          <w:sz w:val="22"/>
+        </w:rPr>
         <w:t>BRANDT, R.; BEVILACQUA, G. G.; ANDRADE, A. Perceived sleep quality, mood states, and their relationship with performance among Brazilian elite athletes during a competitive period. Journal of Strength and Conditioning Research, v. 31, n. 4, p. 1033–1039, 2017.</w:t>
+      </w:r>
+    </w:p>
+    <w:p>
+      <w:pPr>
+        <w:spacing w:line="360" w:lineRule="auto" w:after="120"/>
+        <w:jc w:val="both"/>
+      </w:pPr>
+      <w:r>
+        <w:rPr>
+          <w:sz w:val="22"/>
+        </w:rPr>
+        <w:t>COCKERILL, I. M.; NEVILL, A. M.; LYONS, N. Modelling mood states in athletic performance. Journal of Sports Sciences, v. 9, n. 2, p. 205–212, 1991. DOI: 10.1080/02640419108729881.</w:t>
       </w:r>
     </w:p>
     <w:p>
@@ -19640,6 +19692,18 @@
         <w:rPr>
           <w:sz w:val="22"/>
         </w:rPr>
+        <w:t>FEIJEN, S. et al. Monitoring the swimmer’s training load: a narrative review of monitoring strategies applied in research. Scandinavian Journal of Medicine &amp; Science in Sports, v. 30, n. 11, p. 2037–2043, 2020. DOI: 10.1111/sms.13798.</w:t>
+      </w:r>
+    </w:p>
+    <w:p>
+      <w:pPr>
+        <w:spacing w:line="360" w:lineRule="auto" w:after="120"/>
+        <w:jc w:val="both"/>
+      </w:pPr>
+      <w:r>
+        <w:rPr>
+          <w:sz w:val="22"/>
+        </w:rPr>
         <w:t>FERNANDES-DA-SILVA, J. et al. The peak velocity derived from the Carminatti Test is related to physical match performance in young soccer players. Journal of Sports Sciences, v. 34, n. 24, p. 2238–2245, 2016. DOI: 10.1080/02640414.2015.1093646.</w:t>
       </w:r>
     </w:p>
@@ -19653,6 +19717,18 @@
           <w:sz w:val="22"/>
         </w:rPr>
         <w:t>HAN, C.; PARSONS-SMITH, R. L.; TERRY, P. C. Mood profiling in Singapore: cross-cultural validation and potential applications of mood profile clusters. Frontiers in Psychology, v. 11, 665, 2020. DOI: 10.3389/fpsyg.2020.00665.</w:t>
+      </w:r>
+    </w:p>
+    <w:p>
+      <w:pPr>
+        <w:spacing w:line="360" w:lineRule="auto" w:after="120"/>
+        <w:jc w:val="both"/>
+      </w:pPr>
+      <w:r>
+        <w:rPr>
+          <w:sz w:val="22"/>
+        </w:rPr>
+        <w:t>HAMLIN, M. J. et al. Monitoring training loads and perceived stress in young elite university athletes. Frontiers in Physiology, v. 10, 34, 2019. DOI: 10.3389/fphys.2019.00034.</w:t>
       </w:r>
     </w:p>
     <w:p>
@@ -19713,6 +19789,18 @@
           <w:sz w:val="22"/>
         </w:rPr>
         <w:t>MORGAN, W. P. Selected psychological factors limiting performance: a mental health model. In: CLARKE, D. H.; ECKERT, H. M. (Ed.). Limits of human performance. Champaign: Human Kinetics, 1985. p. 70–80.</w:t>
+      </w:r>
+    </w:p>
+    <w:p>
+      <w:pPr>
+        <w:spacing w:line="360" w:lineRule="auto" w:after="120"/>
+        <w:jc w:val="both"/>
+      </w:pPr>
+      <w:r>
+        <w:rPr>
+          <w:sz w:val="22"/>
+        </w:rPr>
+        <w:t>NEDERHOF, E. et al. Different diagnostic tools in nonfunctional overreaching. International Journal of Sports Medicine, v. 29, n. 7, p. 590–597, 2007. DOI: 10.1055/s-2007-989264.</w:t>
       </w:r>
     </w:p>
     <w:p>

</xml_diff>